<commit_message>
0.4.0 feat/refactor: Major restructuring, layout adjustments, and data embedding
</commit_message>
<xml_diff>
--- a/TO DO.docx
+++ b/TO DO.docx
@@ -3,10 +3,352 @@
 <w:document xmlns:wpc="http://schemas.microsoft.com/office/word/2010/wordprocessingCanvas" xmlns:cx="http://schemas.microsoft.com/office/drawing/2014/chartex" xmlns:cx1="http://schemas.microsoft.com/office/drawing/2015/9/8/chartex" xmlns:cx2="http://schemas.microsoft.com/office/drawing/2015/10/21/chartex" xmlns:cx3="http://schemas.microsoft.com/office/drawing/2016/5/9/chartex" xmlns:cx4="http://schemas.microsoft.com/office/drawing/2016/5/10/chartex" xmlns:cx5="http://schemas.microsoft.com/office/drawing/2016/5/11/chartex" xmlns:cx6="http://schemas.microsoft.com/office/drawing/2016/5/12/chartex" xmlns:cx7="http://schemas.microsoft.com/office/drawing/2016/5/13/chartex" xmlns:cx8="http://schemas.microsoft.com/office/drawing/2016/5/14/chartex" xmlns:mc="http://schemas.openxmlformats.org/markup-compatibility/2006" xmlns:aink="http://schemas.microsoft.com/office/drawing/2016/ink" xmlns:am3d="http://schemas.microsoft.com/office/drawing/2017/model3d" xmlns:o="urn:schemas-microsoft-com:office:office" xmlns:oel="http://schemas.microsoft.com/office/2019/extlst" xmlns:r="http://schemas.openxmlformats.org/officeDocument/2006/relationships" xmlns:m="http://schemas.openxmlformats.org/officeDocument/2006/math" xmlns:v="urn:schemas-microsoft-com:vml" xmlns:wp14="http://schemas.microsoft.com/office/word/2010/wordprocessingDrawing" xmlns:wp="http://schemas.openxmlformats.org/drawingml/2006/wordprocessingDrawing" xmlns:w10="urn:schemas-microsoft-com:office:word" xmlns:w="http://schemas.openxmlformats.org/wordprocessingml/2006/main" xmlns:w14="http://schemas.microsoft.com/office/word/2010/wordml" xmlns:w15="http://schemas.microsoft.com/office/word/2012/wordml" xmlns:w16cex="http://schemas.microsoft.com/office/word/2018/wordml/cex" xmlns:w16cid="http://schemas.microsoft.com/office/word/2016/wordml/cid" xmlns:w16="http://schemas.microsoft.com/office/word/2018/wordml" xmlns:w16du="http://schemas.microsoft.com/office/word/2023/wordml/word16du" xmlns:w16sdtdh="http://schemas.microsoft.com/office/word/2020/wordml/sdtdatahash" xmlns:w16sdtfl="http://schemas.microsoft.com/office/word/2024/wordml/sdtformatlock" xmlns:w16se="http://schemas.microsoft.com/office/word/2015/wordml/symex" xmlns:wpg="http://schemas.microsoft.com/office/word/2010/wordprocessingGroup" xmlns:wpi="http://schemas.microsoft.com/office/word/2010/wordprocessingInk" xmlns:wne="http://schemas.microsoft.com/office/word/2006/wordml" xmlns:wps="http://schemas.microsoft.com/office/word/2010/wordprocessingShape" mc:Ignorable="w14 w15 w16se w16cid w16 w16cex w16sdtdh w16sdtfl w16du wp14">
   <w:body>
     <w:p>
+      <w:pPr>
+        <w:pStyle w:val="a9"/>
+        <w:numPr>
+          <w:ilvl w:val="0"/>
+          <w:numId w:val="2"/>
+        </w:numPr>
+      </w:pPr>
+      <w:r>
+        <w:rPr>
+          <w:rFonts w:hint="eastAsia"/>
+        </w:rPr>
+        <w:t>Logo</w:t>
+      </w:r>
+      <w:r>
+        <w:rPr>
+          <w:rFonts w:hint="eastAsia"/>
+        </w:rPr>
+        <w:t>替換</w:t>
+      </w:r>
+    </w:p>
+    <w:p>
+      <w:pPr>
+        <w:pStyle w:val="a9"/>
+        <w:numPr>
+          <w:ilvl w:val="0"/>
+          <w:numId w:val="2"/>
+        </w:numPr>
+      </w:pPr>
+      <w:r>
+        <w:t>S</w:t>
+      </w:r>
+      <w:r>
+        <w:rPr>
+          <w:rFonts w:hint="eastAsia"/>
+        </w:rPr>
+        <w:t>hops</w:t>
+      </w:r>
+      <w:r>
+        <w:rPr>
+          <w:rFonts w:hint="eastAsia"/>
+        </w:rPr>
+        <w:t>替換</w:t>
+      </w:r>
+      <w:r>
+        <w:rPr>
+          <w:rFonts w:hint="eastAsia"/>
+        </w:rPr>
+        <w:t xml:space="preserve"> and </w:t>
+      </w:r>
+      <w:r>
+        <w:rPr>
+          <w:rFonts w:hint="eastAsia"/>
+        </w:rPr>
+        <w:t>頂部留白</w:t>
+      </w:r>
+      <w:r>
+        <w:rPr>
+          <w:rFonts w:hint="eastAsia"/>
+        </w:rPr>
+        <w:t>、寬度縮小、頁面</w:t>
+      </w:r>
+      <w:r>
+        <w:rPr>
+          <w:rFonts w:hint="eastAsia"/>
+        </w:rPr>
+        <w:t>內容</w:t>
+      </w:r>
+      <w:r>
+        <w:rPr>
+          <w:rFonts w:hint="eastAsia"/>
+        </w:rPr>
+        <w:t>布局</w:t>
+      </w:r>
+    </w:p>
+    <w:p>
+      <w:pPr>
+        <w:pStyle w:val="a9"/>
+        <w:numPr>
+          <w:ilvl w:val="0"/>
+          <w:numId w:val="2"/>
+        </w:numPr>
+      </w:pPr>
+      <w:r>
+        <w:rPr>
+          <w:rFonts w:hint="eastAsia"/>
+        </w:rPr>
+        <w:t>篩選框模組化</w:t>
+      </w:r>
+    </w:p>
+    <w:p>
+      <w:pPr>
+        <w:pStyle w:val="a9"/>
+        <w:numPr>
+          <w:ilvl w:val="0"/>
+          <w:numId w:val="2"/>
+        </w:numPr>
+      </w:pPr>
+      <w:r>
+        <w:t>M</w:t>
+      </w:r>
+      <w:r>
+        <w:rPr>
+          <w:rFonts w:hint="eastAsia"/>
+        </w:rPr>
+        <w:t>enu</w:t>
+      </w:r>
+      <w:r>
+        <w:rPr>
+          <w:rFonts w:hint="eastAsia"/>
+        </w:rPr>
+        <w:t>頂部留白</w:t>
+      </w:r>
+      <w:r>
+        <w:rPr>
+          <w:rFonts w:hint="eastAsia"/>
+        </w:rPr>
+        <w:t>、價格部分為空、跳轉</w:t>
+      </w:r>
+      <w:r>
+        <w:rPr>
+          <w:rFonts w:hint="eastAsia"/>
+        </w:rPr>
+        <w:t>shopDetail</w:t>
+      </w:r>
+      <w:r>
+        <w:rPr>
+          <w:rFonts w:hint="eastAsia"/>
+        </w:rPr>
+        <w:t>邏輯沒寫</w:t>
+      </w:r>
+    </w:p>
+    <w:p>
+      <w:pPr>
+        <w:pStyle w:val="a9"/>
+        <w:numPr>
+          <w:ilvl w:val="0"/>
+          <w:numId w:val="2"/>
+        </w:numPr>
+      </w:pPr>
+      <w:r>
+        <w:t>M</w:t>
+      </w:r>
+      <w:r>
+        <w:rPr>
+          <w:rFonts w:hint="eastAsia"/>
+        </w:rPr>
+        <w:t>ap</w:t>
+      </w:r>
+      <w:r>
+        <w:rPr>
+          <w:rFonts w:hint="eastAsia"/>
+        </w:rPr>
+        <w:t>手機端</w:t>
+      </w:r>
+      <w:r>
+        <w:rPr>
+          <w:rFonts w:hint="eastAsia"/>
+        </w:rPr>
+        <w:t>內容及</w:t>
+      </w:r>
+      <w:r>
+        <w:rPr>
+          <w:rFonts w:hint="eastAsia"/>
+        </w:rPr>
+        <w:t>布局、數據串聯</w:t>
+      </w:r>
+    </w:p>
+    <w:p>
+      <w:pPr>
+        <w:pStyle w:val="a9"/>
+        <w:numPr>
+          <w:ilvl w:val="0"/>
+          <w:numId w:val="2"/>
+        </w:numPr>
+      </w:pPr>
+      <w:r>
+        <w:t>I</w:t>
+      </w:r>
+      <w:r>
+        <w:rPr>
+          <w:rFonts w:hint="eastAsia"/>
+        </w:rPr>
+        <w:t>nfo</w:t>
+      </w:r>
+      <w:r>
+        <w:rPr>
+          <w:rFonts w:hint="eastAsia"/>
+        </w:rPr>
+        <w:t>文本及圖片替換、轉場動畫調整</w:t>
+      </w:r>
+    </w:p>
+    <w:p>
+      <w:pPr>
+        <w:pStyle w:val="a9"/>
+        <w:numPr>
+          <w:ilvl w:val="0"/>
+          <w:numId w:val="2"/>
+        </w:numPr>
+      </w:pPr>
+      <w:r>
+        <w:t>B</w:t>
+      </w:r>
+      <w:r>
+        <w:rPr>
+          <w:rFonts w:hint="eastAsia"/>
+        </w:rPr>
+        <w:t xml:space="preserve">ug </w:t>
+      </w:r>
+      <w:r>
+        <w:rPr>
+          <w:rFonts w:hint="eastAsia"/>
+        </w:rPr>
+        <w:t>導航欄</w:t>
+      </w:r>
+      <w:r>
+        <w:rPr>
+          <w:rFonts w:hint="eastAsia"/>
+        </w:rPr>
+        <w:t xml:space="preserve"> </w:t>
+      </w:r>
+      <w:r>
+        <w:rPr>
+          <w:rFonts w:hint="eastAsia"/>
+        </w:rPr>
+        <w:t>跳轉</w:t>
+      </w:r>
+      <w:r>
+        <w:rPr>
+          <w:rFonts w:hint="eastAsia"/>
+        </w:rPr>
+        <w:t xml:space="preserve"> </w:t>
+      </w:r>
+      <w:r>
+        <w:rPr>
+          <w:rFonts w:hint="eastAsia"/>
+        </w:rPr>
+        <w:t>地圖頁維持未選擇店家</w:t>
+      </w:r>
+      <w:r>
+        <w:rPr>
+          <w:rFonts w:hint="eastAsia"/>
+        </w:rPr>
+        <w:t>(</w:t>
+      </w:r>
+      <w:r>
+        <w:rPr>
+          <w:rFonts w:hint="eastAsia"/>
+        </w:rPr>
+        <w:t>店家詳情頁跳轉會自動選取</w:t>
+      </w:r>
+      <w:r>
+        <w:rPr>
+          <w:rFonts w:hint="eastAsia"/>
+        </w:rPr>
+        <w:t>)</w:t>
+      </w:r>
+    </w:p>
+    <w:p>
+      <w:pPr>
+        <w:pStyle w:val="a9"/>
+        <w:numPr>
+          <w:ilvl w:val="0"/>
+          <w:numId w:val="2"/>
+        </w:numPr>
+      </w:pPr>
+      <w:r>
+        <w:rPr>
+          <w:rFonts w:hint="eastAsia"/>
+        </w:rPr>
+        <w:t xml:space="preserve">Bug </w:t>
+      </w:r>
+      <w:r>
+        <w:rPr>
+          <w:rFonts w:hint="eastAsia"/>
+        </w:rPr>
+        <w:t>地圖平板點手機會直接選到店家</w:t>
+      </w:r>
+    </w:p>
+    <w:p>
+      <w:pPr>
+        <w:pStyle w:val="a9"/>
+        <w:numPr>
+          <w:ilvl w:val="0"/>
+          <w:numId w:val="2"/>
+        </w:numPr>
+      </w:pPr>
+      <w:r>
+        <w:t>A</w:t>
+      </w:r>
+      <w:r>
+        <w:rPr>
+          <w:rFonts w:hint="eastAsia"/>
+        </w:rPr>
+        <w:t>bout</w:t>
+      </w:r>
+      <w:r>
+        <w:rPr>
+          <w:rFonts w:hint="eastAsia"/>
+        </w:rPr>
+        <w:t>內容及</w:t>
+      </w:r>
+      <w:r>
+        <w:rPr>
+          <w:rFonts w:hint="eastAsia"/>
+        </w:rPr>
+        <w:t>布局</w:t>
+      </w:r>
+    </w:p>
+    <w:p>
+      <w:pPr>
+        <w:pStyle w:val="a9"/>
+        <w:numPr>
+          <w:ilvl w:val="0"/>
+          <w:numId w:val="2"/>
+        </w:numPr>
+        <w:rPr>
+          <w:rFonts w:hint="eastAsia"/>
+        </w:rPr>
+      </w:pPr>
+      <w:r>
+        <w:rPr>
+          <w:rFonts w:hint="eastAsia"/>
+        </w:rPr>
+        <w:t>Restaurants</w:t>
+      </w:r>
+      <w:r>
+        <w:rPr>
+          <w:rFonts w:hint="eastAsia"/>
+        </w:rPr>
+        <w:t>資料遷出</w:t>
+      </w:r>
+    </w:p>
+    <w:p>
+      <w:pPr>
+        <w:jc w:val="left"/>
+      </w:pPr>
+      <w:r>
+        <w:br w:type="page"/>
+      </w:r>
+    </w:p>
+    <w:p>
       <w:r>
         <w:rPr>
           <w:noProof/>
         </w:rPr>
+        <w:lastRenderedPageBreak/>
         <w:drawing>
           <wp:inline distT="0" distB="0" distL="0" distR="0" wp14:anchorId="5D558D17" wp14:editId="20C03CBC">
             <wp:extent cx="5274310" cy="2911475"/>
@@ -23,7 +365,7 @@
                     <pic:cNvPicPr/>
                   </pic:nvPicPr>
                   <pic:blipFill>
-                    <a:blip r:embed="rId4"/>
+                    <a:blip r:embed="rId5"/>
                     <a:stretch>
                       <a:fillRect/>
                     </a:stretch>
@@ -65,7 +407,7 @@
                     <pic:cNvPicPr/>
                   </pic:nvPicPr>
                   <pic:blipFill>
-                    <a:blip r:embed="rId5"/>
+                    <a:blip r:embed="rId6"/>
                     <a:stretch>
                       <a:fillRect/>
                     </a:stretch>
@@ -121,7 +463,7 @@
                     <pic:cNvPicPr/>
                   </pic:nvPicPr>
                   <pic:blipFill>
-                    <a:blip r:embed="rId6"/>
+                    <a:blip r:embed="rId7"/>
                     <a:stretch>
                       <a:fillRect/>
                     </a:stretch>
@@ -163,7 +505,7 @@
                     <pic:cNvPicPr/>
                   </pic:nvPicPr>
                   <pic:blipFill rotWithShape="1">
-                    <a:blip r:embed="rId7"/>
+                    <a:blip r:embed="rId8"/>
                     <a:srcRect b="10122"/>
                     <a:stretch>
                       <a:fillRect/>
@@ -241,7 +583,7 @@
                     <pic:cNvPicPr/>
                   </pic:nvPicPr>
                   <pic:blipFill>
-                    <a:blip r:embed="rId8"/>
+                    <a:blip r:embed="rId9"/>
                     <a:stretch>
                       <a:fillRect/>
                     </a:stretch>
@@ -297,7 +639,7 @@
                     <pic:cNvPicPr/>
                   </pic:nvPicPr>
                   <pic:blipFill>
-                    <a:blip r:embed="rId9"/>
+                    <a:blip r:embed="rId10"/>
                     <a:stretch>
                       <a:fillRect/>
                     </a:stretch>
@@ -359,7 +701,7 @@
                     <pic:cNvPicPr/>
                   </pic:nvPicPr>
                   <pic:blipFill>
-                    <a:blip r:embed="rId10"/>
+                    <a:blip r:embed="rId11"/>
                     <a:stretch>
                       <a:fillRect/>
                     </a:stretch>
@@ -442,7 +784,7 @@
                     <pic:cNvPicPr/>
                   </pic:nvPicPr>
                   <pic:blipFill>
-                    <a:blip r:embed="rId11"/>
+                    <a:blip r:embed="rId12"/>
                     <a:stretch>
                       <a:fillRect/>
                     </a:stretch>
@@ -499,7 +841,7 @@
                     <pic:cNvPicPr/>
                   </pic:nvPicPr>
                   <pic:blipFill>
-                    <a:blip r:embed="rId12"/>
+                    <a:blip r:embed="rId13"/>
                     <a:stretch>
                       <a:fillRect/>
                     </a:stretch>
@@ -584,7 +926,7 @@
                     <pic:cNvPicPr/>
                   </pic:nvPicPr>
                   <pic:blipFill>
-                    <a:blip r:embed="rId13"/>
+                    <a:blip r:embed="rId14"/>
                     <a:stretch>
                       <a:fillRect/>
                     </a:stretch>
@@ -624,7 +966,7 @@
                     <pic:cNvPicPr/>
                   </pic:nvPicPr>
                   <pic:blipFill>
-                    <a:blip r:embed="rId14"/>
+                    <a:blip r:embed="rId15"/>
                     <a:stretch>
                       <a:fillRect/>
                     </a:stretch>
@@ -665,7 +1007,7 @@
                     <pic:cNvPicPr/>
                   </pic:nvPicPr>
                   <pic:blipFill>
-                    <a:blip r:embed="rId15"/>
+                    <a:blip r:embed="rId16"/>
                     <a:stretch>
                       <a:fillRect/>
                     </a:stretch>
@@ -705,7 +1047,7 @@
                     <pic:cNvPicPr/>
                   </pic:nvPicPr>
                   <pic:blipFill>
-                    <a:blip r:embed="rId16"/>
+                    <a:blip r:embed="rId17"/>
                     <a:stretch>
                       <a:fillRect/>
                     </a:stretch>
@@ -745,7 +1087,7 @@
                     <pic:cNvPicPr/>
                   </pic:nvPicPr>
                   <pic:blipFill>
-                    <a:blip r:embed="rId17"/>
+                    <a:blip r:embed="rId18"/>
                     <a:stretch>
                       <a:fillRect/>
                     </a:stretch>
@@ -785,7 +1127,7 @@
                     <pic:cNvPicPr/>
                   </pic:nvPicPr>
                   <pic:blipFill>
-                    <a:blip r:embed="rId18"/>
+                    <a:blip r:embed="rId19"/>
                     <a:stretch>
                       <a:fillRect/>
                     </a:stretch>
@@ -808,11 +1150,6 @@
     </w:p>
     <w:p/>
     <w:p>
-      <w:pPr>
-        <w:rPr>
-          <w:rFonts w:hint="eastAsia"/>
-        </w:rPr>
-      </w:pPr>
       <w:r>
         <w:rPr>
           <w:noProof/>
@@ -834,7 +1171,7 @@
                     <pic:cNvPicPr/>
                   </pic:nvPicPr>
                   <pic:blipFill>
-                    <a:blip r:embed="rId19"/>
+                    <a:blip r:embed="rId20"/>
                     <a:stretch>
                       <a:fillRect/>
                     </a:stretch>
@@ -874,7 +1211,7 @@
                     <pic:cNvPicPr/>
                   </pic:nvPicPr>
                   <pic:blipFill>
-                    <a:blip r:embed="rId20"/>
+                    <a:blip r:embed="rId21"/>
                     <a:stretch>
                       <a:fillRect/>
                     </a:stretch>
@@ -914,7 +1251,7 @@
                     <pic:cNvPicPr/>
                   </pic:nvPicPr>
                   <pic:blipFill>
-                    <a:blip r:embed="rId21"/>
+                    <a:blip r:embed="rId22"/>
                     <a:stretch>
                       <a:fillRect/>
                     </a:stretch>
@@ -954,7 +1291,7 @@
                     <pic:cNvPicPr/>
                   </pic:nvPicPr>
                   <pic:blipFill>
-                    <a:blip r:embed="rId22"/>
+                    <a:blip r:embed="rId23"/>
                     <a:stretch>
                       <a:fillRect/>
                     </a:stretch>
@@ -983,6 +1320,216 @@
     </w:sectPr>
   </w:body>
 </w:document>
+</file>
+
+<file path=word/numbering.xml><?xml version="1.0" encoding="utf-8"?>
+<w:numbering xmlns:wpc="http://schemas.microsoft.com/office/word/2010/wordprocessingCanvas" xmlns:cx="http://schemas.microsoft.com/office/drawing/2014/chartex" xmlns:cx1="http://schemas.microsoft.com/office/drawing/2015/9/8/chartex" xmlns:cx2="http://schemas.microsoft.com/office/drawing/2015/10/21/chartex" xmlns:cx3="http://schemas.microsoft.com/office/drawing/2016/5/9/chartex" xmlns:cx4="http://schemas.microsoft.com/office/drawing/2016/5/10/chartex" xmlns:cx5="http://schemas.microsoft.com/office/drawing/2016/5/11/chartex" xmlns:cx6="http://schemas.microsoft.com/office/drawing/2016/5/12/chartex" xmlns:cx7="http://schemas.microsoft.com/office/drawing/2016/5/13/chartex" xmlns:cx8="http://schemas.microsoft.com/office/drawing/2016/5/14/chartex" xmlns:mc="http://schemas.openxmlformats.org/markup-compatibility/2006" xmlns:aink="http://schemas.microsoft.com/office/drawing/2016/ink" xmlns:am3d="http://schemas.microsoft.com/office/drawing/2017/model3d" xmlns:o="urn:schemas-microsoft-com:office:office" xmlns:oel="http://schemas.microsoft.com/office/2019/extlst" xmlns:r="http://schemas.openxmlformats.org/officeDocument/2006/relationships" xmlns:m="http://schemas.openxmlformats.org/officeDocument/2006/math" xmlns:v="urn:schemas-microsoft-com:vml" xmlns:wp14="http://schemas.microsoft.com/office/word/2010/wordprocessingDrawing" xmlns:wp="http://schemas.openxmlformats.org/drawingml/2006/wordprocessingDrawing" xmlns:w10="urn:schemas-microsoft-com:office:word" xmlns:w="http://schemas.openxmlformats.org/wordprocessingml/2006/main" xmlns:w14="http://schemas.microsoft.com/office/word/2010/wordml" xmlns:w15="http://schemas.microsoft.com/office/word/2012/wordml" xmlns:w16cex="http://schemas.microsoft.com/office/word/2018/wordml/cex" xmlns:w16cid="http://schemas.microsoft.com/office/word/2016/wordml/cid" xmlns:w16="http://schemas.microsoft.com/office/word/2018/wordml" xmlns:w16du="http://schemas.microsoft.com/office/word/2023/wordml/word16du" xmlns:w16sdtdh="http://schemas.microsoft.com/office/word/2020/wordml/sdtdatahash" xmlns:w16sdtfl="http://schemas.microsoft.com/office/word/2024/wordml/sdtformatlock" xmlns:w16se="http://schemas.microsoft.com/office/word/2015/wordml/symex" xmlns:wpg="http://schemas.microsoft.com/office/word/2010/wordprocessingGroup" xmlns:wpi="http://schemas.microsoft.com/office/word/2010/wordprocessingInk" xmlns:wne="http://schemas.microsoft.com/office/word/2006/wordml" xmlns:wps="http://schemas.microsoft.com/office/word/2010/wordprocessingShape" mc:Ignorable="w14 w15 w16se w16cid w16 w16cex w16sdtdh w16sdtfl w16du wp14">
+  <w:abstractNum w:abstractNumId="0" w15:restartNumberingAfterBreak="0">
+    <w:nsid w:val="08282A54"/>
+    <w:multiLevelType w:val="hybridMultilevel"/>
+    <w:tmpl w:val="0644AC3A"/>
+    <w:lvl w:ilvl="0" w:tplc="04090001">
+      <w:start w:val="1"/>
+      <w:numFmt w:val="bullet"/>
+      <w:lvlText w:val=""/>
+      <w:lvlJc w:val="left"/>
+      <w:pPr>
+        <w:ind w:left="480" w:hanging="480"/>
+      </w:pPr>
+      <w:rPr>
+        <w:rFonts w:ascii="Wingdings" w:hAnsi="Wingdings" w:hint="default"/>
+      </w:rPr>
+    </w:lvl>
+    <w:lvl w:ilvl="1" w:tplc="04090003" w:tentative="1">
+      <w:start w:val="1"/>
+      <w:numFmt w:val="bullet"/>
+      <w:lvlText w:val=""/>
+      <w:lvlJc w:val="left"/>
+      <w:pPr>
+        <w:ind w:left="960" w:hanging="480"/>
+      </w:pPr>
+      <w:rPr>
+        <w:rFonts w:ascii="Wingdings" w:hAnsi="Wingdings" w:hint="default"/>
+      </w:rPr>
+    </w:lvl>
+    <w:lvl w:ilvl="2" w:tplc="04090005" w:tentative="1">
+      <w:start w:val="1"/>
+      <w:numFmt w:val="bullet"/>
+      <w:lvlText w:val=""/>
+      <w:lvlJc w:val="left"/>
+      <w:pPr>
+        <w:ind w:left="1440" w:hanging="480"/>
+      </w:pPr>
+      <w:rPr>
+        <w:rFonts w:ascii="Wingdings" w:hAnsi="Wingdings" w:hint="default"/>
+      </w:rPr>
+    </w:lvl>
+    <w:lvl w:ilvl="3" w:tplc="04090001" w:tentative="1">
+      <w:start w:val="1"/>
+      <w:numFmt w:val="bullet"/>
+      <w:lvlText w:val=""/>
+      <w:lvlJc w:val="left"/>
+      <w:pPr>
+        <w:ind w:left="1920" w:hanging="480"/>
+      </w:pPr>
+      <w:rPr>
+        <w:rFonts w:ascii="Wingdings" w:hAnsi="Wingdings" w:hint="default"/>
+      </w:rPr>
+    </w:lvl>
+    <w:lvl w:ilvl="4" w:tplc="04090003" w:tentative="1">
+      <w:start w:val="1"/>
+      <w:numFmt w:val="bullet"/>
+      <w:lvlText w:val=""/>
+      <w:lvlJc w:val="left"/>
+      <w:pPr>
+        <w:ind w:left="2400" w:hanging="480"/>
+      </w:pPr>
+      <w:rPr>
+        <w:rFonts w:ascii="Wingdings" w:hAnsi="Wingdings" w:hint="default"/>
+      </w:rPr>
+    </w:lvl>
+    <w:lvl w:ilvl="5" w:tplc="04090005" w:tentative="1">
+      <w:start w:val="1"/>
+      <w:numFmt w:val="bullet"/>
+      <w:lvlText w:val=""/>
+      <w:lvlJc w:val="left"/>
+      <w:pPr>
+        <w:ind w:left="2880" w:hanging="480"/>
+      </w:pPr>
+      <w:rPr>
+        <w:rFonts w:ascii="Wingdings" w:hAnsi="Wingdings" w:hint="default"/>
+      </w:rPr>
+    </w:lvl>
+    <w:lvl w:ilvl="6" w:tplc="04090001" w:tentative="1">
+      <w:start w:val="1"/>
+      <w:numFmt w:val="bullet"/>
+      <w:lvlText w:val=""/>
+      <w:lvlJc w:val="left"/>
+      <w:pPr>
+        <w:ind w:left="3360" w:hanging="480"/>
+      </w:pPr>
+      <w:rPr>
+        <w:rFonts w:ascii="Wingdings" w:hAnsi="Wingdings" w:hint="default"/>
+      </w:rPr>
+    </w:lvl>
+    <w:lvl w:ilvl="7" w:tplc="04090003" w:tentative="1">
+      <w:start w:val="1"/>
+      <w:numFmt w:val="bullet"/>
+      <w:lvlText w:val=""/>
+      <w:lvlJc w:val="left"/>
+      <w:pPr>
+        <w:ind w:left="3840" w:hanging="480"/>
+      </w:pPr>
+      <w:rPr>
+        <w:rFonts w:ascii="Wingdings" w:hAnsi="Wingdings" w:hint="default"/>
+      </w:rPr>
+    </w:lvl>
+    <w:lvl w:ilvl="8" w:tplc="04090005" w:tentative="1">
+      <w:start w:val="1"/>
+      <w:numFmt w:val="bullet"/>
+      <w:lvlText w:val=""/>
+      <w:lvlJc w:val="left"/>
+      <w:pPr>
+        <w:ind w:left="4320" w:hanging="480"/>
+      </w:pPr>
+      <w:rPr>
+        <w:rFonts w:ascii="Wingdings" w:hAnsi="Wingdings" w:hint="default"/>
+      </w:rPr>
+    </w:lvl>
+  </w:abstractNum>
+  <w:abstractNum w:abstractNumId="1" w15:restartNumberingAfterBreak="0">
+    <w:nsid w:val="5FE6435D"/>
+    <w:multiLevelType w:val="hybridMultilevel"/>
+    <w:tmpl w:val="2294CACE"/>
+    <w:lvl w:ilvl="0" w:tplc="0409000F">
+      <w:start w:val="1"/>
+      <w:numFmt w:val="decimal"/>
+      <w:lvlText w:val="%1."/>
+      <w:lvlJc w:val="left"/>
+      <w:pPr>
+        <w:ind w:left="480" w:hanging="480"/>
+      </w:pPr>
+    </w:lvl>
+    <w:lvl w:ilvl="1" w:tplc="04090019" w:tentative="1">
+      <w:start w:val="1"/>
+      <w:numFmt w:val="ideographTraditional"/>
+      <w:lvlText w:val="%2、"/>
+      <w:lvlJc w:val="left"/>
+      <w:pPr>
+        <w:ind w:left="960" w:hanging="480"/>
+      </w:pPr>
+    </w:lvl>
+    <w:lvl w:ilvl="2" w:tplc="0409001B" w:tentative="1">
+      <w:start w:val="1"/>
+      <w:numFmt w:val="lowerRoman"/>
+      <w:lvlText w:val="%3."/>
+      <w:lvlJc w:val="right"/>
+      <w:pPr>
+        <w:ind w:left="1440" w:hanging="480"/>
+      </w:pPr>
+    </w:lvl>
+    <w:lvl w:ilvl="3" w:tplc="0409000F" w:tentative="1">
+      <w:start w:val="1"/>
+      <w:numFmt w:val="decimal"/>
+      <w:lvlText w:val="%4."/>
+      <w:lvlJc w:val="left"/>
+      <w:pPr>
+        <w:ind w:left="1920" w:hanging="480"/>
+      </w:pPr>
+    </w:lvl>
+    <w:lvl w:ilvl="4" w:tplc="04090019" w:tentative="1">
+      <w:start w:val="1"/>
+      <w:numFmt w:val="ideographTraditional"/>
+      <w:lvlText w:val="%5、"/>
+      <w:lvlJc w:val="left"/>
+      <w:pPr>
+        <w:ind w:left="2400" w:hanging="480"/>
+      </w:pPr>
+    </w:lvl>
+    <w:lvl w:ilvl="5" w:tplc="0409001B" w:tentative="1">
+      <w:start w:val="1"/>
+      <w:numFmt w:val="lowerRoman"/>
+      <w:lvlText w:val="%6."/>
+      <w:lvlJc w:val="right"/>
+      <w:pPr>
+        <w:ind w:left="2880" w:hanging="480"/>
+      </w:pPr>
+    </w:lvl>
+    <w:lvl w:ilvl="6" w:tplc="0409000F" w:tentative="1">
+      <w:start w:val="1"/>
+      <w:numFmt w:val="decimal"/>
+      <w:lvlText w:val="%7."/>
+      <w:lvlJc w:val="left"/>
+      <w:pPr>
+        <w:ind w:left="3360" w:hanging="480"/>
+      </w:pPr>
+    </w:lvl>
+    <w:lvl w:ilvl="7" w:tplc="04090019" w:tentative="1">
+      <w:start w:val="1"/>
+      <w:numFmt w:val="ideographTraditional"/>
+      <w:lvlText w:val="%8、"/>
+      <w:lvlJc w:val="left"/>
+      <w:pPr>
+        <w:ind w:left="3840" w:hanging="480"/>
+      </w:pPr>
+    </w:lvl>
+    <w:lvl w:ilvl="8" w:tplc="0409001B" w:tentative="1">
+      <w:start w:val="1"/>
+      <w:numFmt w:val="lowerRoman"/>
+      <w:lvlText w:val="%9."/>
+      <w:lvlJc w:val="right"/>
+      <w:pPr>
+        <w:ind w:left="4320" w:hanging="480"/>
+      </w:pPr>
+    </w:lvl>
+  </w:abstractNum>
+  <w:num w:numId="1" w16cid:durableId="1344624432">
+    <w:abstractNumId w:val="0"/>
+  </w:num>
+  <w:num w:numId="2" w16cid:durableId="466123272">
+    <w:abstractNumId w:val="1"/>
+  </w:num>
+</w:numbering>
 </file>
 
 <file path=word/styles.xml><?xml version="1.0" encoding="utf-8"?>

</xml_diff>

<commit_message>
0.4.1 refactor(data): migrate restaurant data to restaurantsData.js
</commit_message>
<xml_diff>
--- a/TO DO.docx
+++ b/TO DO.docx
@@ -3,13 +3,33 @@
 <w:document xmlns:wpc="http://schemas.microsoft.com/office/word/2010/wordprocessingCanvas" xmlns:cx="http://schemas.microsoft.com/office/drawing/2014/chartex" xmlns:cx1="http://schemas.microsoft.com/office/drawing/2015/9/8/chartex" xmlns:cx2="http://schemas.microsoft.com/office/drawing/2015/10/21/chartex" xmlns:cx3="http://schemas.microsoft.com/office/drawing/2016/5/9/chartex" xmlns:cx4="http://schemas.microsoft.com/office/drawing/2016/5/10/chartex" xmlns:cx5="http://schemas.microsoft.com/office/drawing/2016/5/11/chartex" xmlns:cx6="http://schemas.microsoft.com/office/drawing/2016/5/12/chartex" xmlns:cx7="http://schemas.microsoft.com/office/drawing/2016/5/13/chartex" xmlns:cx8="http://schemas.microsoft.com/office/drawing/2016/5/14/chartex" xmlns:mc="http://schemas.openxmlformats.org/markup-compatibility/2006" xmlns:aink="http://schemas.microsoft.com/office/drawing/2016/ink" xmlns:am3d="http://schemas.microsoft.com/office/drawing/2017/model3d" xmlns:o="urn:schemas-microsoft-com:office:office" xmlns:oel="http://schemas.microsoft.com/office/2019/extlst" xmlns:r="http://schemas.openxmlformats.org/officeDocument/2006/relationships" xmlns:m="http://schemas.openxmlformats.org/officeDocument/2006/math" xmlns:v="urn:schemas-microsoft-com:vml" xmlns:wp14="http://schemas.microsoft.com/office/word/2010/wordprocessingDrawing" xmlns:wp="http://schemas.openxmlformats.org/drawingml/2006/wordprocessingDrawing" xmlns:w10="urn:schemas-microsoft-com:office:word" xmlns:w="http://schemas.openxmlformats.org/wordprocessingml/2006/main" xmlns:w14="http://schemas.microsoft.com/office/word/2010/wordml" xmlns:w15="http://schemas.microsoft.com/office/word/2012/wordml" xmlns:w16cex="http://schemas.microsoft.com/office/word/2018/wordml/cex" xmlns:w16cid="http://schemas.microsoft.com/office/word/2016/wordml/cid" xmlns:w16="http://schemas.microsoft.com/office/word/2018/wordml" xmlns:w16du="http://schemas.microsoft.com/office/word/2023/wordml/word16du" xmlns:w16sdtdh="http://schemas.microsoft.com/office/word/2020/wordml/sdtdatahash" xmlns:w16sdtfl="http://schemas.microsoft.com/office/word/2024/wordml/sdtformatlock" xmlns:w16se="http://schemas.microsoft.com/office/word/2015/wordml/symex" xmlns:wpg="http://schemas.microsoft.com/office/word/2010/wordprocessingGroup" xmlns:wpi="http://schemas.microsoft.com/office/word/2010/wordprocessingInk" xmlns:wne="http://schemas.microsoft.com/office/word/2006/wordml" xmlns:wps="http://schemas.microsoft.com/office/word/2010/wordprocessingShape" mc:Ignorable="w14 w15 w16se w16cid w16 w16cex w16sdtdh w16sdtfl w16du wp14">
   <w:body>
     <w:p>
-      <w:pPr>
-        <w:pStyle w:val="a9"/>
-        <w:numPr>
-          <w:ilvl w:val="0"/>
-          <w:numId w:val="2"/>
-        </w:numPr>
-      </w:pPr>
+      <w:sdt>
+        <w:sdtPr>
+          <w:rPr>
+            <w:rFonts w:hint="eastAsia"/>
+          </w:rPr>
+          <w:id w:val="-1177115446"/>
+          <w14:checkbox>
+            <w14:checked w14:val="0"/>
+            <w14:checkedState w14:val="2612" w14:font="MS Gothic"/>
+            <w14:uncheckedState w14:val="2610" w14:font="MS Gothic"/>
+          </w14:checkbox>
+        </w:sdtPr>
+        <w:sdtContent>
+          <w:r>
+            <w:rPr>
+              <w:rFonts w:ascii="MS Gothic" w:eastAsia="MS Gothic" w:hAnsi="MS Gothic" w:hint="eastAsia"/>
+            </w:rPr>
+            <w:t>☐</w:t>
+          </w:r>
+        </w:sdtContent>
+      </w:sdt>
+      <w:r>
+        <w:rPr>
+          <w:rFonts w:eastAsia="DengXian" w:hint="eastAsia"/>
+        </w:rPr>
+        <w:t xml:space="preserve"> </w:t>
+      </w:r>
       <w:r>
         <w:rPr>
           <w:rFonts w:hint="eastAsia"/>
@@ -24,13 +44,33 @@
       </w:r>
     </w:p>
     <w:p>
-      <w:pPr>
-        <w:pStyle w:val="a9"/>
-        <w:numPr>
-          <w:ilvl w:val="0"/>
-          <w:numId w:val="2"/>
-        </w:numPr>
-      </w:pPr>
+      <w:sdt>
+        <w:sdtPr>
+          <w:rPr>
+            <w:rFonts w:hint="eastAsia"/>
+          </w:rPr>
+          <w:id w:val="-127397190"/>
+          <w14:checkbox>
+            <w14:checked w14:val="0"/>
+            <w14:checkedState w14:val="2612" w14:font="MS Gothic"/>
+            <w14:uncheckedState w14:val="2610" w14:font="MS Gothic"/>
+          </w14:checkbox>
+        </w:sdtPr>
+        <w:sdtContent>
+          <w:r>
+            <w:rPr>
+              <w:rFonts w:ascii="MS Gothic" w:eastAsia="MS Gothic" w:hAnsi="MS Gothic" w:hint="eastAsia"/>
+            </w:rPr>
+            <w:t>☐</w:t>
+          </w:r>
+        </w:sdtContent>
+      </w:sdt>
+      <w:r>
+        <w:rPr>
+          <w:rFonts w:eastAsia="DengXian" w:hint="eastAsia"/>
+        </w:rPr>
+        <w:t xml:space="preserve"> </w:t>
+      </w:r>
       <w:r>
         <w:t>S</w:t>
       </w:r>
@@ -78,13 +118,33 @@
       </w:r>
     </w:p>
     <w:p>
-      <w:pPr>
-        <w:pStyle w:val="a9"/>
-        <w:numPr>
-          <w:ilvl w:val="0"/>
-          <w:numId w:val="2"/>
-        </w:numPr>
-      </w:pPr>
+      <w:sdt>
+        <w:sdtPr>
+          <w:rPr>
+            <w:rFonts w:hint="eastAsia"/>
+          </w:rPr>
+          <w:id w:val="-46840429"/>
+          <w14:checkbox>
+            <w14:checked w14:val="0"/>
+            <w14:checkedState w14:val="2612" w14:font="MS Gothic"/>
+            <w14:uncheckedState w14:val="2610" w14:font="MS Gothic"/>
+          </w14:checkbox>
+        </w:sdtPr>
+        <w:sdtContent>
+          <w:r>
+            <w:rPr>
+              <w:rFonts w:ascii="MS Gothic" w:eastAsia="MS Gothic" w:hAnsi="MS Gothic" w:hint="eastAsia"/>
+            </w:rPr>
+            <w:t>☐</w:t>
+          </w:r>
+        </w:sdtContent>
+      </w:sdt>
+      <w:r>
+        <w:rPr>
+          <w:rFonts w:eastAsia="DengXian" w:hint="eastAsia"/>
+        </w:rPr>
+        <w:t xml:space="preserve"> </w:t>
+      </w:r>
       <w:r>
         <w:rPr>
           <w:rFonts w:hint="eastAsia"/>
@@ -93,13 +153,33 @@
       </w:r>
     </w:p>
     <w:p>
-      <w:pPr>
-        <w:pStyle w:val="a9"/>
-        <w:numPr>
-          <w:ilvl w:val="0"/>
-          <w:numId w:val="2"/>
-        </w:numPr>
-      </w:pPr>
+      <w:sdt>
+        <w:sdtPr>
+          <w:rPr>
+            <w:rFonts w:hint="eastAsia"/>
+          </w:rPr>
+          <w:id w:val="-604507506"/>
+          <w14:checkbox>
+            <w14:checked w14:val="0"/>
+            <w14:checkedState w14:val="2612" w14:font="MS Gothic"/>
+            <w14:uncheckedState w14:val="2610" w14:font="MS Gothic"/>
+          </w14:checkbox>
+        </w:sdtPr>
+        <w:sdtContent>
+          <w:r>
+            <w:rPr>
+              <w:rFonts w:ascii="MS Gothic" w:eastAsia="MS Gothic" w:hAnsi="MS Gothic" w:hint="eastAsia"/>
+            </w:rPr>
+            <w:t>☐</w:t>
+          </w:r>
+        </w:sdtContent>
+      </w:sdt>
+      <w:r>
+        <w:rPr>
+          <w:rFonts w:eastAsia="DengXian" w:hint="eastAsia"/>
+        </w:rPr>
+        <w:t xml:space="preserve"> </w:t>
+      </w:r>
       <w:r>
         <w:t>M</w:t>
       </w:r>
@@ -119,14 +199,24 @@
         <w:rPr>
           <w:rFonts w:hint="eastAsia"/>
         </w:rPr>
-        <w:t>、價格部分為空、跳轉</w:t>
-      </w:r>
+        <w:t>、價格部分為空、</w:t>
+      </w:r>
+      <w:proofErr w:type="gramStart"/>
+      <w:r>
+        <w:rPr>
+          <w:rFonts w:hint="eastAsia"/>
+        </w:rPr>
+        <w:t>跳轉</w:t>
+      </w:r>
+      <w:proofErr w:type="spellStart"/>
+      <w:proofErr w:type="gramEnd"/>
       <w:r>
         <w:rPr>
           <w:rFonts w:hint="eastAsia"/>
         </w:rPr>
         <w:t>shopDetail</w:t>
       </w:r>
+      <w:proofErr w:type="spellEnd"/>
       <w:r>
         <w:rPr>
           <w:rFonts w:hint="eastAsia"/>
@@ -135,13 +225,33 @@
       </w:r>
     </w:p>
     <w:p>
-      <w:pPr>
-        <w:pStyle w:val="a9"/>
-        <w:numPr>
-          <w:ilvl w:val="0"/>
-          <w:numId w:val="2"/>
-        </w:numPr>
-      </w:pPr>
+      <w:sdt>
+        <w:sdtPr>
+          <w:rPr>
+            <w:rFonts w:hint="eastAsia"/>
+          </w:rPr>
+          <w:id w:val="1319919900"/>
+          <w14:checkbox>
+            <w14:checked w14:val="0"/>
+            <w14:checkedState w14:val="2612" w14:font="MS Gothic"/>
+            <w14:uncheckedState w14:val="2610" w14:font="MS Gothic"/>
+          </w14:checkbox>
+        </w:sdtPr>
+        <w:sdtContent>
+          <w:r>
+            <w:rPr>
+              <w:rFonts w:ascii="MS Gothic" w:eastAsia="MS Gothic" w:hAnsi="MS Gothic" w:hint="eastAsia"/>
+            </w:rPr>
+            <w:t>☐</w:t>
+          </w:r>
+        </w:sdtContent>
+      </w:sdt>
+      <w:r>
+        <w:rPr>
+          <w:rFonts w:eastAsia="DengXian" w:hint="eastAsia"/>
+        </w:rPr>
+        <w:t xml:space="preserve"> </w:t>
+      </w:r>
       <w:r>
         <w:t>M</w:t>
       </w:r>
@@ -171,13 +281,33 @@
       </w:r>
     </w:p>
     <w:p>
-      <w:pPr>
-        <w:pStyle w:val="a9"/>
-        <w:numPr>
-          <w:ilvl w:val="0"/>
-          <w:numId w:val="2"/>
-        </w:numPr>
-      </w:pPr>
+      <w:sdt>
+        <w:sdtPr>
+          <w:rPr>
+            <w:rFonts w:hint="eastAsia"/>
+          </w:rPr>
+          <w:id w:val="-29498608"/>
+          <w14:checkbox>
+            <w14:checked w14:val="0"/>
+            <w14:checkedState w14:val="2612" w14:font="MS Gothic"/>
+            <w14:uncheckedState w14:val="2610" w14:font="MS Gothic"/>
+          </w14:checkbox>
+        </w:sdtPr>
+        <w:sdtContent>
+          <w:r>
+            <w:rPr>
+              <w:rFonts w:ascii="MS Gothic" w:eastAsia="MS Gothic" w:hAnsi="MS Gothic" w:hint="eastAsia"/>
+            </w:rPr>
+            <w:t>☐</w:t>
+          </w:r>
+        </w:sdtContent>
+      </w:sdt>
+      <w:r>
+        <w:rPr>
+          <w:rFonts w:eastAsia="DengXian" w:hint="eastAsia"/>
+        </w:rPr>
+        <w:t xml:space="preserve"> </w:t>
+      </w:r>
       <w:r>
         <w:t>I</w:t>
       </w:r>
@@ -195,13 +325,33 @@
       </w:r>
     </w:p>
     <w:p>
-      <w:pPr>
-        <w:pStyle w:val="a9"/>
-        <w:numPr>
-          <w:ilvl w:val="0"/>
-          <w:numId w:val="2"/>
-        </w:numPr>
-      </w:pPr>
+      <w:sdt>
+        <w:sdtPr>
+          <w:rPr>
+            <w:rFonts w:hint="eastAsia"/>
+          </w:rPr>
+          <w:id w:val="503790650"/>
+          <w14:checkbox>
+            <w14:checked w14:val="0"/>
+            <w14:checkedState w14:val="2612" w14:font="MS Gothic"/>
+            <w14:uncheckedState w14:val="2610" w14:font="MS Gothic"/>
+          </w14:checkbox>
+        </w:sdtPr>
+        <w:sdtContent>
+          <w:r>
+            <w:rPr>
+              <w:rFonts w:ascii="MS Gothic" w:eastAsia="MS Gothic" w:hAnsi="MS Gothic" w:hint="eastAsia"/>
+            </w:rPr>
+            <w:t>☐</w:t>
+          </w:r>
+        </w:sdtContent>
+      </w:sdt>
+      <w:r>
+        <w:rPr>
+          <w:rFonts w:eastAsia="DengXian" w:hint="eastAsia"/>
+        </w:rPr>
+        <w:t xml:space="preserve"> </w:t>
+      </w:r>
       <w:r>
         <w:t>B</w:t>
       </w:r>
@@ -223,12 +373,14 @@
         </w:rPr>
         <w:t xml:space="preserve"> </w:t>
       </w:r>
+      <w:proofErr w:type="gramStart"/>
       <w:r>
         <w:rPr>
           <w:rFonts w:hint="eastAsia"/>
         </w:rPr>
         <w:t>跳轉</w:t>
       </w:r>
+      <w:proofErr w:type="gramEnd"/>
       <w:r>
         <w:rPr>
           <w:rFonts w:hint="eastAsia"/>
@@ -251,7 +403,21 @@
         <w:rPr>
           <w:rFonts w:hint="eastAsia"/>
         </w:rPr>
-        <w:t>店家詳情頁跳轉會自動選取</w:t>
+        <w:t>店家詳情</w:t>
+      </w:r>
+      <w:proofErr w:type="gramStart"/>
+      <w:r>
+        <w:rPr>
+          <w:rFonts w:hint="eastAsia"/>
+        </w:rPr>
+        <w:t>頁跳轉</w:t>
+      </w:r>
+      <w:proofErr w:type="gramEnd"/>
+      <w:r>
+        <w:rPr>
+          <w:rFonts w:hint="eastAsia"/>
+        </w:rPr>
+        <w:t>會自動選取</w:t>
       </w:r>
       <w:r>
         <w:rPr>
@@ -261,13 +427,33 @@
       </w:r>
     </w:p>
     <w:p>
-      <w:pPr>
-        <w:pStyle w:val="a9"/>
-        <w:numPr>
-          <w:ilvl w:val="0"/>
-          <w:numId w:val="2"/>
-        </w:numPr>
-      </w:pPr>
+      <w:sdt>
+        <w:sdtPr>
+          <w:rPr>
+            <w:rFonts w:hint="eastAsia"/>
+          </w:rPr>
+          <w:id w:val="165526304"/>
+          <w14:checkbox>
+            <w14:checked w14:val="0"/>
+            <w14:checkedState w14:val="2612" w14:font="MS Gothic"/>
+            <w14:uncheckedState w14:val="2610" w14:font="MS Gothic"/>
+          </w14:checkbox>
+        </w:sdtPr>
+        <w:sdtContent>
+          <w:r>
+            <w:rPr>
+              <w:rFonts w:ascii="MS Gothic" w:eastAsia="MS Gothic" w:hAnsi="MS Gothic" w:hint="eastAsia"/>
+            </w:rPr>
+            <w:t>☐</w:t>
+          </w:r>
+        </w:sdtContent>
+      </w:sdt>
+      <w:r>
+        <w:rPr>
+          <w:rFonts w:eastAsia="DengXian" w:hint="eastAsia"/>
+        </w:rPr>
+        <w:t xml:space="preserve"> </w:t>
+      </w:r>
       <w:r>
         <w:rPr>
           <w:rFonts w:hint="eastAsia"/>
@@ -282,13 +468,34 @@
       </w:r>
     </w:p>
     <w:p>
-      <w:pPr>
-        <w:pStyle w:val="a9"/>
-        <w:numPr>
-          <w:ilvl w:val="0"/>
-          <w:numId w:val="2"/>
-        </w:numPr>
-      </w:pPr>
+      <w:sdt>
+        <w:sdtPr>
+          <w:rPr>
+            <w:rFonts w:hint="eastAsia"/>
+          </w:rPr>
+          <w:id w:val="556054424"/>
+          <w14:checkbox>
+            <w14:checked w14:val="0"/>
+            <w14:checkedState w14:val="2612" w14:font="MS Gothic"/>
+            <w14:uncheckedState w14:val="2610" w14:font="MS Gothic"/>
+          </w14:checkbox>
+        </w:sdtPr>
+        <w:sdtContent>
+          <w:r>
+            <w:rPr>
+              <w:rFonts w:ascii="MS Gothic" w:eastAsia="MS Gothic" w:hAnsi="MS Gothic" w:hint="eastAsia"/>
+            </w:rPr>
+            <w:t>☐</w:t>
+          </w:r>
+        </w:sdtContent>
+      </w:sdt>
+      <w:r>
+        <w:rPr>
+          <w:rFonts w:eastAsia="DengXian" w:hint="eastAsia"/>
+          <w:lang w:eastAsia="zh-CN"/>
+        </w:rPr>
+        <w:t xml:space="preserve"> </w:t>
+      </w:r>
       <w:r>
         <w:t>A</w:t>
       </w:r>
@@ -312,16 +519,34 @@
       </w:r>
     </w:p>
     <w:p>
-      <w:pPr>
-        <w:pStyle w:val="a9"/>
-        <w:numPr>
-          <w:ilvl w:val="0"/>
-          <w:numId w:val="2"/>
-        </w:numPr>
-        <w:rPr>
-          <w:rFonts w:hint="eastAsia"/>
-        </w:rPr>
-      </w:pPr>
+      <w:sdt>
+        <w:sdtPr>
+          <w:rPr>
+            <w:rFonts w:hint="eastAsia"/>
+          </w:rPr>
+          <w:id w:val="-1354794724"/>
+          <w14:checkbox>
+            <w14:checked w14:val="1"/>
+            <w14:checkedState w14:val="2612" w14:font="MS Gothic"/>
+            <w14:uncheckedState w14:val="2610" w14:font="MS Gothic"/>
+          </w14:checkbox>
+        </w:sdtPr>
+        <w:sdtContent>
+          <w:r>
+            <w:rPr>
+              <w:rFonts w:ascii="MS Gothic" w:eastAsia="MS Gothic" w:hAnsi="MS Gothic" w:hint="eastAsia"/>
+            </w:rPr>
+            <w:t>☒</w:t>
+          </w:r>
+        </w:sdtContent>
+      </w:sdt>
+      <w:r>
+        <w:rPr>
+          <w:rFonts w:eastAsia="DengXian" w:hint="eastAsia"/>
+          <w:lang w:eastAsia="zh-CN"/>
+        </w:rPr>
+        <w:t xml:space="preserve"> </w:t>
+      </w:r>
       <w:r>
         <w:rPr>
           <w:rFonts w:hint="eastAsia"/>
@@ -333,6 +558,59 @@
           <w:rFonts w:hint="eastAsia"/>
         </w:rPr>
         <w:t>資料遷出</w:t>
+      </w:r>
+    </w:p>
+    <w:p>
+      <w:sdt>
+        <w:sdtPr>
+          <w:rPr>
+            <w:rFonts w:hint="eastAsia"/>
+          </w:rPr>
+          <w:id w:val="1783994970"/>
+          <w14:checkbox>
+            <w14:checked w14:val="0"/>
+            <w14:checkedState w14:val="2612" w14:font="MS Gothic"/>
+            <w14:uncheckedState w14:val="2610" w14:font="MS Gothic"/>
+          </w14:checkbox>
+        </w:sdtPr>
+        <w:sdtContent>
+          <w:r>
+            <w:rPr>
+              <w:rFonts w:ascii="MS Gothic" w:eastAsia="MS Gothic" w:hAnsi="MS Gothic" w:hint="eastAsia"/>
+            </w:rPr>
+            <w:t>☐</w:t>
+          </w:r>
+        </w:sdtContent>
+      </w:sdt>
+      <w:r>
+        <w:rPr>
+          <w:rFonts w:eastAsia="DengXian" w:hint="eastAsia"/>
+          <w:lang w:eastAsia="zh-CN"/>
+        </w:rPr>
+        <w:t xml:space="preserve"> </w:t>
+      </w:r>
+      <w:r>
+        <w:rPr>
+          <w:rFonts w:eastAsia="DengXian" w:hint="eastAsia"/>
+          <w:lang w:eastAsia="zh-CN"/>
+        </w:rPr>
+        <w:t>膠囊點</w:t>
+      </w:r>
+      <w:proofErr w:type="gramStart"/>
+      <w:r>
+        <w:rPr>
+          <w:rFonts w:eastAsia="DengXian" w:hint="eastAsia"/>
+          <w:lang w:eastAsia="zh-CN"/>
+        </w:rPr>
+        <w:t>擊</w:t>
+      </w:r>
+      <w:proofErr w:type="gramEnd"/>
+      <w:r>
+        <w:rPr>
+          <w:rFonts w:eastAsia="DengXian" w:hint="eastAsia"/>
+          <w:lang w:eastAsia="zh-CN"/>
+        </w:rPr>
+        <w:t>回饋區域過小</w:t>
       </w:r>
     </w:p>
     <w:p>
@@ -733,7 +1011,35 @@
         <w:rPr>
           <w:rFonts w:hint="eastAsia"/>
         </w:rPr>
-        <w:t>不要五角圖，放食材、食材圖片和食材功用</w:t>
+        <w:t>不要五角圖，</w:t>
+      </w:r>
+      <w:proofErr w:type="gramStart"/>
+      <w:r>
+        <w:rPr>
+          <w:rFonts w:hint="eastAsia"/>
+        </w:rPr>
+        <w:t>放食材</w:t>
+      </w:r>
+      <w:proofErr w:type="gramEnd"/>
+      <w:r>
+        <w:rPr>
+          <w:rFonts w:hint="eastAsia"/>
+        </w:rPr>
+        <w:t>、食材圖片和</w:t>
+      </w:r>
+      <w:proofErr w:type="gramStart"/>
+      <w:r>
+        <w:rPr>
+          <w:rFonts w:hint="eastAsia"/>
+        </w:rPr>
+        <w:t>食材</w:t>
+      </w:r>
+      <w:proofErr w:type="gramEnd"/>
+      <w:r>
+        <w:rPr>
+          <w:rFonts w:hint="eastAsia"/>
+        </w:rPr>
+        <w:t>功用</w:t>
       </w:r>
       <w:r>
         <w:rPr>
@@ -883,12 +1189,14 @@
         </w:rPr>
         <w:t>8.</w:t>
       </w:r>
+      <w:proofErr w:type="gramStart"/>
       <w:r>
         <w:rPr>
           <w:rFonts w:hint="eastAsia"/>
         </w:rPr>
         <w:t>跳轉邏輯</w:t>
       </w:r>
+      <w:proofErr w:type="gramEnd"/>
     </w:p>
     <w:p>
       <w:r>

</xml_diff>

<commit_message>
0.4.2 feat: implement logo assets; style: optimize page layout
</commit_message>
<xml_diff>
--- a/TO DO.docx
+++ b/TO DO.docx
@@ -8,7 +8,7 @@
           <w:rPr>
             <w:rFonts w:hint="eastAsia"/>
           </w:rPr>
-          <w:id w:val="-1177115446"/>
+          <w:id w:val="-29498608"/>
           <w14:checkbox>
             <w14:checked w14:val="0"/>
             <w14:checkedState w14:val="2612" w14:font="MS Gothic"/>
@@ -31,25 +31,33 @@
         <w:t xml:space="preserve"> </w:t>
       </w:r>
       <w:r>
-        <w:rPr>
-          <w:rFonts w:hint="eastAsia"/>
-        </w:rPr>
-        <w:t>Logo</w:t>
-      </w:r>
-      <w:r>
-        <w:rPr>
-          <w:rFonts w:hint="eastAsia"/>
-        </w:rPr>
-        <w:t>替換</w:t>
-      </w:r>
-    </w:p>
-    <w:p>
+        <w:t>I</w:t>
+      </w:r>
+      <w:r>
+        <w:rPr>
+          <w:rFonts w:hint="eastAsia"/>
+        </w:rPr>
+        <w:t>nfo</w:t>
+      </w:r>
+      <w:r>
+        <w:rPr>
+          <w:rFonts w:hint="eastAsia"/>
+        </w:rPr>
+        <w:t>文本及圖片替換、轉場動畫調整</w:t>
+      </w:r>
+    </w:p>
+    <w:p>
+      <w:pPr>
+        <w:rPr>
+          <w:rFonts w:hint="eastAsia"/>
+        </w:rPr>
+      </w:pPr>
       <w:sdt>
         <w:sdtPr>
           <w:rPr>
             <w:rFonts w:hint="eastAsia"/>
           </w:rPr>
-          <w:id w:val="-127397190"/>
+          <w:id w:val="-137342228"/>
           <w14:checkbox>
             <w14:checked w14:val="0"/>
             <w14:checkedState w14:val="2612" w14:font="MS Gothic"/>
@@ -84,17 +92,97 @@
         <w:rPr>
           <w:rFonts w:hint="eastAsia"/>
         </w:rPr>
+        <w:t>替換、頁面內容布局</w:t>
+      </w:r>
+    </w:p>
+    <w:p>
+      <w:pPr>
+        <w:rPr>
+          <w:rFonts w:eastAsia="DengXian"/>
+          <w:lang w:eastAsia="zh-CN"/>
+        </w:rPr>
+      </w:pPr>
+      <w:sdt>
+        <w:sdtPr>
+          <w:rPr>
+            <w:rFonts w:hint="eastAsia"/>
+          </w:rPr>
+          <w:id w:val="-1177115446"/>
+          <w14:checkbox>
+            <w14:checked w14:val="1"/>
+            <w14:checkedState w14:val="2612" w14:font="MS Gothic"/>
+            <w14:uncheckedState w14:val="2610" w14:font="MS Gothic"/>
+          </w14:checkbox>
+        </w:sdtPr>
+        <w:sdtContent>
+          <w:r>
+            <w:rPr>
+              <w:rFonts w:ascii="MS Gothic" w:eastAsia="MS Gothic" w:hAnsi="MS Gothic" w:hint="eastAsia"/>
+            </w:rPr>
+            <w:t>☒</w:t>
+          </w:r>
+        </w:sdtContent>
+      </w:sdt>
+      <w:r>
+        <w:rPr>
+          <w:rFonts w:hint="eastAsia"/>
+        </w:rPr>
+        <w:t xml:space="preserve"> </w:t>
+      </w:r>
+      <w:r>
+        <w:rPr>
+          <w:rFonts w:hint="eastAsia"/>
+        </w:rPr>
+        <w:t>Logo</w:t>
+      </w:r>
+      <w:r>
+        <w:rPr>
+          <w:rFonts w:hint="eastAsia"/>
+        </w:rPr>
         <w:t>替換</w:t>
       </w:r>
-      <w:r>
-        <w:rPr>
-          <w:rFonts w:hint="eastAsia"/>
-        </w:rPr>
-        <w:t xml:space="preserve"> and </w:t>
-      </w:r>
-      <w:r>
-        <w:rPr>
-          <w:rFonts w:hint="eastAsia"/>
+    </w:p>
+    <w:p>
+      <w:sdt>
+        <w:sdtPr>
+          <w:rPr>
+            <w:rFonts w:hint="eastAsia"/>
+          </w:rPr>
+          <w:id w:val="-127397190"/>
+          <w14:checkbox>
+            <w14:checked w14:val="1"/>
+            <w14:checkedState w14:val="2612" w14:font="MS Gothic"/>
+            <w14:uncheckedState w14:val="2610" w14:font="MS Gothic"/>
+          </w14:checkbox>
+        </w:sdtPr>
+        <w:sdtContent>
+          <w:r>
+            <w:rPr>
+              <w:rFonts w:ascii="MS Gothic" w:eastAsia="MS Gothic" w:hAnsi="MS Gothic" w:hint="eastAsia"/>
+            </w:rPr>
+            <w:t>☒</w:t>
+          </w:r>
+        </w:sdtContent>
+      </w:sdt>
+      <w:r>
+        <w:rPr>
+          <w:rFonts w:eastAsia="DengXian" w:hint="eastAsia"/>
+        </w:rPr>
+        <w:t xml:space="preserve"> </w:t>
+      </w:r>
+      <w:r>
+        <w:t>S</w:t>
+      </w:r>
+      <w:r>
+        <w:rPr>
+          <w:rFonts w:hint="eastAsia"/>
+        </w:rPr>
+        <w:t>hops</w:t>
+      </w:r>
+      <w:r>
+        <w:rPr>
+          <w:rFonts w:hint="eastAsia"/>
+          <w:strike/>
         </w:rPr>
         <w:t>頂部留白</w:t>
       </w:r>
@@ -102,19 +190,14 @@
         <w:rPr>
           <w:rFonts w:hint="eastAsia"/>
         </w:rPr>
-        <w:t>、寬度縮小、頁面</w:t>
-      </w:r>
-      <w:r>
-        <w:rPr>
-          <w:rFonts w:hint="eastAsia"/>
-        </w:rPr>
-        <w:t>內容</w:t>
-      </w:r>
-      <w:r>
-        <w:rPr>
-          <w:rFonts w:hint="eastAsia"/>
-        </w:rPr>
-        <w:t>布局</w:t>
+        <w:t>、</w:t>
+      </w:r>
+      <w:r>
+        <w:rPr>
+          <w:rFonts w:hint="eastAsia"/>
+          <w:strike/>
+        </w:rPr>
+        <w:t>寬度縮小</w:t>
       </w:r>
     </w:p>
     <w:p>
@@ -181,17 +264,22 @@
         <w:t xml:space="preserve"> </w:t>
       </w:r>
       <w:r>
+        <w:rPr>
+          <w:strike/>
+        </w:rPr>
         <w:t>M</w:t>
       </w:r>
       <w:r>
         <w:rPr>
           <w:rFonts w:hint="eastAsia"/>
+          <w:strike/>
         </w:rPr>
         <w:t>enu</w:t>
       </w:r>
       <w:r>
         <w:rPr>
           <w:rFonts w:hint="eastAsia"/>
+          <w:strike/>
         </w:rPr>
         <w:t>頂部留白</w:t>
       </w:r>
@@ -199,7 +287,20 @@
         <w:rPr>
           <w:rFonts w:hint="eastAsia"/>
         </w:rPr>
-        <w:t>、價格部分為空、</w:t>
+        <w:t>、</w:t>
+      </w:r>
+      <w:r>
+        <w:rPr>
+          <w:rFonts w:hint="eastAsia"/>
+          <w:strike/>
+        </w:rPr>
+        <w:t>價格部分為空</w:t>
+      </w:r>
+      <w:r>
+        <w:rPr>
+          <w:rFonts w:hint="eastAsia"/>
+        </w:rPr>
+        <w:t>、</w:t>
       </w:r>
       <w:proofErr w:type="gramStart"/>
       <w:r>
@@ -286,50 +387,6 @@
           <w:rPr>
             <w:rFonts w:hint="eastAsia"/>
           </w:rPr>
-          <w:id w:val="-29498608"/>
-          <w14:checkbox>
-            <w14:checked w14:val="0"/>
-            <w14:checkedState w14:val="2612" w14:font="MS Gothic"/>
-            <w14:uncheckedState w14:val="2610" w14:font="MS Gothic"/>
-          </w14:checkbox>
-        </w:sdtPr>
-        <w:sdtContent>
-          <w:r>
-            <w:rPr>
-              <w:rFonts w:ascii="MS Gothic" w:eastAsia="MS Gothic" w:hAnsi="MS Gothic" w:hint="eastAsia"/>
-            </w:rPr>
-            <w:t>☐</w:t>
-          </w:r>
-        </w:sdtContent>
-      </w:sdt>
-      <w:r>
-        <w:rPr>
-          <w:rFonts w:eastAsia="DengXian" w:hint="eastAsia"/>
-        </w:rPr>
-        <w:t xml:space="preserve"> </w:t>
-      </w:r>
-      <w:r>
-        <w:t>I</w:t>
-      </w:r>
-      <w:r>
-        <w:rPr>
-          <w:rFonts w:hint="eastAsia"/>
-        </w:rPr>
-        <w:t>nfo</w:t>
-      </w:r>
-      <w:r>
-        <w:rPr>
-          <w:rFonts w:hint="eastAsia"/>
-        </w:rPr>
-        <w:t>文本及圖片替換、轉場動畫調整</w:t>
-      </w:r>
-    </w:p>
-    <w:p>
-      <w:sdt>
-        <w:sdtPr>
-          <w:rPr>
-            <w:rFonts w:hint="eastAsia"/>
-          </w:rPr>
           <w:id w:val="503790650"/>
           <w14:checkbox>
             <w14:checked w14:val="0"/>
@@ -612,6 +669,197 @@
         </w:rPr>
         <w:t>回饋區域過小</w:t>
       </w:r>
+    </w:p>
+    <w:p>
+      <w:sdt>
+        <w:sdtPr>
+          <w:rPr>
+            <w:rFonts w:hint="eastAsia"/>
+          </w:rPr>
+          <w:id w:val="1187257994"/>
+          <w14:checkbox>
+            <w14:checked w14:val="0"/>
+            <w14:checkedState w14:val="2612" w14:font="MS Gothic"/>
+            <w14:uncheckedState w14:val="2610" w14:font="MS Gothic"/>
+          </w14:checkbox>
+        </w:sdtPr>
+        <w:sdtContent>
+          <w:r>
+            <w:rPr>
+              <w:rFonts w:ascii="MS Gothic" w:eastAsia="MS Gothic" w:hAnsi="MS Gothic" w:hint="eastAsia"/>
+            </w:rPr>
+            <w:t>☐</w:t>
+          </w:r>
+        </w:sdtContent>
+      </w:sdt>
+      <w:r>
+        <w:rPr>
+          <w:rFonts w:hint="eastAsia"/>
+        </w:rPr>
+        <w:t xml:space="preserve"> </w:t>
+      </w:r>
+      <w:proofErr w:type="spellStart"/>
+      <w:r>
+        <w:rPr>
+          <w:rFonts w:hint="eastAsia"/>
+        </w:rPr>
+        <w:t>shopDetail</w:t>
+      </w:r>
+      <w:proofErr w:type="spellEnd"/>
+      <w:r>
+        <w:rPr>
+          <w:rFonts w:hint="eastAsia"/>
+        </w:rPr>
+        <w:t>中的菜單布局調整</w:t>
+      </w:r>
+    </w:p>
+    <w:p>
+      <w:sdt>
+        <w:sdtPr>
+          <w:rPr>
+            <w:rFonts w:hint="eastAsia"/>
+          </w:rPr>
+          <w:id w:val="812216476"/>
+          <w14:checkbox>
+            <w14:checked w14:val="0"/>
+            <w14:checkedState w14:val="2612" w14:font="MS Gothic"/>
+            <w14:uncheckedState w14:val="2610" w14:font="MS Gothic"/>
+          </w14:checkbox>
+        </w:sdtPr>
+        <w:sdtContent>
+          <w:r>
+            <w:rPr>
+              <w:rFonts w:ascii="MS Gothic" w:eastAsia="MS Gothic" w:hAnsi="MS Gothic" w:hint="eastAsia"/>
+            </w:rPr>
+            <w:t>☐</w:t>
+          </w:r>
+        </w:sdtContent>
+      </w:sdt>
+      <w:r>
+        <w:rPr>
+          <w:rFonts w:hint="eastAsia"/>
+        </w:rPr>
+        <w:t xml:space="preserve"> shops</w:t>
+      </w:r>
+      <w:proofErr w:type="gramStart"/>
+      <w:r>
+        <w:rPr>
+          <w:rFonts w:hint="eastAsia"/>
+        </w:rPr>
+        <w:t>跳轉</w:t>
+      </w:r>
+      <w:proofErr w:type="spellStart"/>
+      <w:proofErr w:type="gramEnd"/>
+      <w:r>
+        <w:rPr>
+          <w:rFonts w:hint="eastAsia"/>
+        </w:rPr>
+        <w:t>shopDetail</w:t>
+      </w:r>
+      <w:proofErr w:type="spellEnd"/>
+      <w:r>
+        <w:rPr>
+          <w:rFonts w:hint="eastAsia"/>
+        </w:rPr>
+        <w:t>未置頂</w:t>
+      </w:r>
+    </w:p>
+    <w:p>
+      <w:sdt>
+        <w:sdtPr>
+          <w:rPr>
+            <w:rFonts w:hint="eastAsia"/>
+          </w:rPr>
+          <w:id w:val="-229227625"/>
+          <w14:checkbox>
+            <w14:checked w14:val="0"/>
+            <w14:checkedState w14:val="2612" w14:font="MS Gothic"/>
+            <w14:uncheckedState w14:val="2610" w14:font="MS Gothic"/>
+          </w14:checkbox>
+        </w:sdtPr>
+        <w:sdtContent>
+          <w:r>
+            <w:rPr>
+              <w:rFonts w:ascii="MS Gothic" w:eastAsia="MS Gothic" w:hAnsi="MS Gothic" w:hint="eastAsia"/>
+            </w:rPr>
+            <w:t>☐</w:t>
+          </w:r>
+        </w:sdtContent>
+      </w:sdt>
+      <w:r>
+        <w:rPr>
+          <w:rFonts w:hint="eastAsia"/>
+        </w:rPr>
+        <w:t xml:space="preserve"> </w:t>
+      </w:r>
+      <w:proofErr w:type="spellStart"/>
+      <w:r>
+        <w:rPr>
+          <w:rFonts w:hint="eastAsia"/>
+        </w:rPr>
+        <w:t>shopDetail</w:t>
+      </w:r>
+      <w:proofErr w:type="spellEnd"/>
+      <w:r>
+        <w:rPr>
+          <w:rFonts w:hint="eastAsia"/>
+        </w:rPr>
+        <w:t>返回</w:t>
+      </w:r>
+      <w:r>
+        <w:rPr>
+          <w:rFonts w:hint="eastAsia"/>
+        </w:rPr>
+        <w:t>shops</w:t>
+      </w:r>
+      <w:r>
+        <w:rPr>
+          <w:rFonts w:hint="eastAsia"/>
+        </w:rPr>
+        <w:t>未維持原位</w:t>
+      </w:r>
+    </w:p>
+    <w:p>
+      <w:pPr>
+        <w:rPr>
+          <w:rFonts w:hint="eastAsia"/>
+        </w:rPr>
+      </w:pPr>
+      <w:sdt>
+        <w:sdtPr>
+          <w:rPr>
+            <w:rFonts w:hint="eastAsia"/>
+          </w:rPr>
+          <w:id w:val="1686014558"/>
+          <w14:checkbox>
+            <w14:checked w14:val="0"/>
+            <w14:checkedState w14:val="2612" w14:font="MS Gothic"/>
+            <w14:uncheckedState w14:val="2610" w14:font="MS Gothic"/>
+          </w14:checkbox>
+        </w:sdtPr>
+        <w:sdtContent>
+          <w:r>
+            <w:rPr>
+              <w:rFonts w:ascii="MS Gothic" w:eastAsia="MS Gothic" w:hAnsi="MS Gothic" w:hint="eastAsia"/>
+            </w:rPr>
+            <w:t>☐</w:t>
+          </w:r>
+        </w:sdtContent>
+      </w:sdt>
+      <w:r>
+        <w:rPr>
+          <w:rFonts w:hint="eastAsia"/>
+        </w:rPr>
+        <w:t xml:space="preserve"> </w:t>
+      </w:r>
+      <w:proofErr w:type="gramStart"/>
+      <w:r>
+        <w:rPr>
+          <w:rFonts w:hint="eastAsia"/>
+        </w:rPr>
+        <w:t>缺少置頂按鍵</w:t>
+      </w:r>
+      <w:proofErr w:type="gramEnd"/>
     </w:p>
     <w:p>
       <w:pPr>

</xml_diff>

<commit_message>
0.4.4 feat: implement click-to-navigate logic for dishes and shop details
</commit_message>
<xml_diff>
--- a/TO DO.docx
+++ b/TO DO.docx
@@ -47,11 +47,6 @@
       </w:r>
     </w:p>
     <w:p>
-      <w:pPr>
-        <w:rPr>
-          <w:rFonts w:hint="eastAsia"/>
-        </w:rPr>
-      </w:pPr>
       <w:sdt>
         <w:sdtPr>
           <w:rPr>
@@ -99,7 +94,6 @@
       <w:pPr>
         <w:rPr>
           <w:rFonts w:eastAsia="DengXian"/>
-          <w:lang w:eastAsia="zh-CN"/>
         </w:rPr>
       </w:pPr>
       <w:sdt>
@@ -143,6 +137,11 @@
       </w:r>
     </w:p>
     <w:p>
+      <w:pPr>
+        <w:rPr>
+          <w:strike/>
+        </w:rPr>
+      </w:pPr>
       <w:sdt>
         <w:sdtPr>
           <w:rPr>
@@ -201,6 +200,58 @@
       </w:r>
     </w:p>
     <w:p>
+      <w:pPr>
+        <w:rPr>
+          <w:rFonts w:eastAsia="DengXian" w:hint="eastAsia"/>
+        </w:rPr>
+      </w:pPr>
+      <w:sdt>
+        <w:sdtPr>
+          <w:rPr>
+            <w:rFonts w:hint="eastAsia"/>
+          </w:rPr>
+          <w:id w:val="788095071"/>
+          <w14:checkbox>
+            <w14:checked w14:val="1"/>
+            <w14:checkedState w14:val="2612" w14:font="MS Gothic"/>
+            <w14:uncheckedState w14:val="2610" w14:font="MS Gothic"/>
+          </w14:checkbox>
+        </w:sdtPr>
+        <w:sdtContent>
+          <w:r>
+            <w:rPr>
+              <w:rFonts w:ascii="MS Gothic" w:eastAsia="MS Gothic" w:hAnsi="MS Gothic" w:hint="eastAsia"/>
+            </w:rPr>
+            <w:t>☒</w:t>
+          </w:r>
+        </w:sdtContent>
+      </w:sdt>
+      <w:r>
+        <w:rPr>
+          <w:rFonts w:hint="eastAsia"/>
+        </w:rPr>
+        <w:t xml:space="preserve"> </w:t>
+      </w:r>
+      <w:r>
+        <w:rPr>
+          <w:rFonts w:hint="eastAsia"/>
+        </w:rPr>
+        <w:t>公用</w:t>
+      </w:r>
+      <w:r>
+        <w:rPr>
+          <w:rFonts w:hint="eastAsia"/>
+        </w:rPr>
+        <w:t>Hooks</w:t>
+      </w:r>
+      <w:r>
+        <w:rPr>
+          <w:rFonts w:hint="eastAsia"/>
+        </w:rPr>
+        <w:t>記得上一頁位置</w:t>
+      </w:r>
+    </w:p>
+    <w:p>
       <w:sdt>
         <w:sdtPr>
           <w:rPr>
@@ -243,7 +294,7 @@
           </w:rPr>
           <w:id w:val="-604507506"/>
           <w14:checkbox>
-            <w14:checked w14:val="0"/>
+            <w14:checked w14:val="1"/>
             <w14:checkedState w14:val="2612" w14:font="MS Gothic"/>
             <w14:uncheckedState w14:val="2610" w14:font="MS Gothic"/>
           </w14:checkbox>
@@ -253,7 +304,7 @@
             <w:rPr>
               <w:rFonts w:ascii="MS Gothic" w:eastAsia="MS Gothic" w:hAnsi="MS Gothic" w:hint="eastAsia"/>
             </w:rPr>
-            <w:t>☐</w:t>
+            <w:t>☒</w:t>
           </w:r>
         </w:sdtContent>
       </w:sdt>
@@ -820,11 +871,6 @@
       </w:r>
     </w:p>
     <w:p>
-      <w:pPr>
-        <w:rPr>
-          <w:rFonts w:hint="eastAsia"/>
-        </w:rPr>
-      </w:pPr>
       <w:sdt>
         <w:sdtPr>
           <w:rPr>

</xml_diff>

<commit_message>
0.4.6 fix: reset scroll position to top when navigating to shop detail view
</commit_message>
<xml_diff>
--- a/TO DO.docx
+++ b/TO DO.docx
@@ -351,24 +351,14 @@
         <w:rPr>
           <w:rFonts w:hint="eastAsia"/>
         </w:rPr>
-        <w:t>、</w:t>
-      </w:r>
-      <w:proofErr w:type="gramStart"/>
-      <w:r>
-        <w:rPr>
-          <w:rFonts w:hint="eastAsia"/>
-        </w:rPr>
-        <w:t>跳轉</w:t>
-      </w:r>
-      <w:proofErr w:type="spellStart"/>
-      <w:proofErr w:type="gramEnd"/>
+        <w:t>、跳轉</w:t>
+      </w:r>
       <w:r>
         <w:rPr>
           <w:rFonts w:hint="eastAsia"/>
         </w:rPr>
         <w:t>shopDetail</w:t>
       </w:r>
-      <w:proofErr w:type="spellEnd"/>
       <w:r>
         <w:rPr>
           <w:rFonts w:hint="eastAsia"/>
@@ -481,14 +471,12 @@
         </w:rPr>
         <w:t xml:space="preserve"> </w:t>
       </w:r>
-      <w:proofErr w:type="gramStart"/>
       <w:r>
         <w:rPr>
           <w:rFonts w:hint="eastAsia"/>
         </w:rPr>
         <w:t>跳轉</w:t>
       </w:r>
-      <w:proofErr w:type="gramEnd"/>
       <w:r>
         <w:rPr>
           <w:rFonts w:hint="eastAsia"/>
@@ -511,21 +499,7 @@
         <w:rPr>
           <w:rFonts w:hint="eastAsia"/>
         </w:rPr>
-        <w:t>店家詳情</w:t>
-      </w:r>
-      <w:proofErr w:type="gramStart"/>
-      <w:r>
-        <w:rPr>
-          <w:rFonts w:hint="eastAsia"/>
-        </w:rPr>
-        <w:t>頁跳轉</w:t>
-      </w:r>
-      <w:proofErr w:type="gramEnd"/>
-      <w:r>
-        <w:rPr>
-          <w:rFonts w:hint="eastAsia"/>
-        </w:rPr>
-        <w:t>會自動選取</w:t>
+        <w:t>店家詳情頁跳轉會自動選取</w:t>
       </w:r>
       <w:r>
         <w:rPr>
@@ -676,7 +650,7 @@
           </w:rPr>
           <w:id w:val="1783994970"/>
           <w14:checkbox>
-            <w14:checked w14:val="0"/>
+            <w14:checked w14:val="1"/>
             <w14:checkedState w14:val="2612" w14:font="MS Gothic"/>
             <w14:uncheckedState w14:val="2610" w14:font="MS Gothic"/>
           </w14:checkbox>
@@ -686,7 +660,7 @@
             <w:rPr>
               <w:rFonts w:ascii="MS Gothic" w:eastAsia="MS Gothic" w:hAnsi="MS Gothic" w:hint="eastAsia"/>
             </w:rPr>
-            <w:t>☐</w:t>
+            <w:t>☒</w:t>
           </w:r>
         </w:sdtContent>
       </w:sdt>
@@ -702,23 +676,7 @@
           <w:rFonts w:eastAsia="DengXian" w:hint="eastAsia"/>
           <w:lang w:eastAsia="zh-CN"/>
         </w:rPr>
-        <w:t>膠囊點</w:t>
-      </w:r>
-      <w:proofErr w:type="gramStart"/>
-      <w:r>
-        <w:rPr>
-          <w:rFonts w:eastAsia="DengXian" w:hint="eastAsia"/>
-          <w:lang w:eastAsia="zh-CN"/>
-        </w:rPr>
-        <w:t>擊</w:t>
-      </w:r>
-      <w:proofErr w:type="gramEnd"/>
-      <w:r>
-        <w:rPr>
-          <w:rFonts w:eastAsia="DengXian" w:hint="eastAsia"/>
-          <w:lang w:eastAsia="zh-CN"/>
-        </w:rPr>
-        <w:t>回饋區域過小</w:t>
+        <w:t>膠囊點擊回饋區域過小</w:t>
       </w:r>
     </w:p>
     <w:p>
@@ -747,16 +705,8 @@
         <w:rPr>
           <w:rFonts w:hint="eastAsia"/>
         </w:rPr>
-        <w:t xml:space="preserve"> </w:t>
-      </w:r>
-      <w:proofErr w:type="spellStart"/>
-      <w:r>
-        <w:rPr>
-          <w:rFonts w:hint="eastAsia"/>
-        </w:rPr>
-        <w:t>shopDetail</w:t>
-      </w:r>
-      <w:proofErr w:type="spellEnd"/>
+        <w:t xml:space="preserve"> shopDetail</w:t>
+      </w:r>
       <w:r>
         <w:rPr>
           <w:rFonts w:hint="eastAsia"/>
@@ -792,22 +742,18 @@
         </w:rPr>
         <w:t xml:space="preserve"> shops</w:t>
       </w:r>
-      <w:proofErr w:type="gramStart"/>
       <w:r>
         <w:rPr>
           <w:rFonts w:hint="eastAsia"/>
         </w:rPr>
         <w:t>跳轉</w:t>
       </w:r>
-      <w:proofErr w:type="spellStart"/>
-      <w:proofErr w:type="gramEnd"/>
       <w:r>
         <w:rPr>
           <w:rFonts w:hint="eastAsia"/>
         </w:rPr>
         <w:t>shopDetail</w:t>
       </w:r>
-      <w:proofErr w:type="spellEnd"/>
       <w:r>
         <w:rPr>
           <w:rFonts w:hint="eastAsia"/>
@@ -841,16 +787,8 @@
         <w:rPr>
           <w:rFonts w:hint="eastAsia"/>
         </w:rPr>
-        <w:t xml:space="preserve"> </w:t>
-      </w:r>
-      <w:proofErr w:type="spellStart"/>
-      <w:r>
-        <w:rPr>
-          <w:rFonts w:hint="eastAsia"/>
-        </w:rPr>
-        <w:t>shopDetail</w:t>
-      </w:r>
-      <w:proofErr w:type="spellEnd"/>
+        <w:t xml:space="preserve"> shopDetail</w:t>
+      </w:r>
       <w:r>
         <w:rPr>
           <w:rFonts w:hint="eastAsia"/>
@@ -871,6 +809,12 @@
       </w:r>
     </w:p>
     <w:p>
+      <w:pPr>
+        <w:rPr>
+          <w:rFonts w:eastAsia="DengXian"/>
+          <w:lang w:eastAsia="zh-CN"/>
+        </w:rPr>
+      </w:pPr>
       <w:sdt>
         <w:sdtPr>
           <w:rPr>
@@ -898,14 +842,48 @@
         </w:rPr>
         <w:t xml:space="preserve"> </w:t>
       </w:r>
-      <w:proofErr w:type="gramStart"/>
       <w:r>
         <w:rPr>
           <w:rFonts w:hint="eastAsia"/>
         </w:rPr>
         <w:t>缺少置頂按鍵</w:t>
       </w:r>
-      <w:proofErr w:type="gramEnd"/>
+    </w:p>
+    <w:p>
+      <w:pPr>
+        <w:rPr>
+          <w:rFonts w:eastAsia="DengXian" w:hint="eastAsia"/>
+          <w:lang w:eastAsia="zh-CN"/>
+        </w:rPr>
+      </w:pPr>
+      <w:sdt>
+        <w:sdtPr>
+          <w:rPr>
+            <w:rFonts w:hint="eastAsia"/>
+          </w:rPr>
+          <w:id w:val="1264033950"/>
+          <w14:checkbox>
+            <w14:checked w14:val="0"/>
+            <w14:checkedState w14:val="2612" w14:font="MS Gothic"/>
+            <w14:uncheckedState w14:val="2610" w14:font="MS Gothic"/>
+          </w14:checkbox>
+        </w:sdtPr>
+        <w:sdtContent>
+          <w:r>
+            <w:rPr>
+              <w:rFonts w:ascii="MS Gothic" w:eastAsia="MS Gothic" w:hAnsi="MS Gothic" w:hint="eastAsia"/>
+            </w:rPr>
+            <w:t>☐</w:t>
+          </w:r>
+        </w:sdtContent>
+      </w:sdt>
+      <w:r>
+        <w:rPr>
+          <w:rFonts w:eastAsia="DengXian" w:hint="eastAsia"/>
+          <w:lang w:eastAsia="zh-CN"/>
+        </w:rPr>
+        <w:t xml:space="preserve"> 营业时间超过5个要换行呈现（如3+3 / 3+4）</w:t>
+      </w:r>
     </w:p>
     <w:p>
       <w:pPr>
@@ -1305,35 +1283,7 @@
         <w:rPr>
           <w:rFonts w:hint="eastAsia"/>
         </w:rPr>
-        <w:t>不要五角圖，</w:t>
-      </w:r>
-      <w:proofErr w:type="gramStart"/>
-      <w:r>
-        <w:rPr>
-          <w:rFonts w:hint="eastAsia"/>
-        </w:rPr>
-        <w:t>放食材</w:t>
-      </w:r>
-      <w:proofErr w:type="gramEnd"/>
-      <w:r>
-        <w:rPr>
-          <w:rFonts w:hint="eastAsia"/>
-        </w:rPr>
-        <w:t>、食材圖片和</w:t>
-      </w:r>
-      <w:proofErr w:type="gramStart"/>
-      <w:r>
-        <w:rPr>
-          <w:rFonts w:hint="eastAsia"/>
-        </w:rPr>
-        <w:t>食材</w:t>
-      </w:r>
-      <w:proofErr w:type="gramEnd"/>
-      <w:r>
-        <w:rPr>
-          <w:rFonts w:hint="eastAsia"/>
-        </w:rPr>
-        <w:t>功用</w:t>
+        <w:t>不要五角圖，放食材、食材圖片和食材功用</w:t>
       </w:r>
       <w:r>
         <w:rPr>
@@ -1483,14 +1433,12 @@
         </w:rPr>
         <w:t>8.</w:t>
       </w:r>
-      <w:proofErr w:type="gramStart"/>
       <w:r>
         <w:rPr>
           <w:rFonts w:hint="eastAsia"/>
         </w:rPr>
         <w:t>跳轉邏輯</w:t>
       </w:r>
-      <w:proofErr w:type="gramEnd"/>
     </w:p>
     <w:p>
       <w:r>

</xml_diff>

<commit_message>
0.4.7 feat: update menu presentation on shopDetail page
</commit_message>
<xml_diff>
--- a/TO DO.docx
+++ b/TO DO.docx
@@ -722,7 +722,7 @@
           </w:rPr>
           <w:id w:val="812216476"/>
           <w14:checkbox>
-            <w14:checked w14:val="0"/>
+            <w14:checked w14:val="1"/>
             <w14:checkedState w14:val="2612" w14:font="MS Gothic"/>
             <w14:uncheckedState w14:val="2610" w14:font="MS Gothic"/>
           </w14:checkbox>
@@ -732,7 +732,7 @@
             <w:rPr>
               <w:rFonts w:ascii="MS Gothic" w:eastAsia="MS Gothic" w:hAnsi="MS Gothic" w:hint="eastAsia"/>
             </w:rPr>
-            <w:t>☐</w:t>
+            <w:t>☒</w:t>
           </w:r>
         </w:sdtContent>
       </w:sdt>
@@ -740,7 +740,7 @@
         <w:rPr>
           <w:rFonts w:hint="eastAsia"/>
         </w:rPr>
-        <w:t xml:space="preserve"> shops</w:t>
+        <w:t xml:space="preserve"> </w:t>
       </w:r>
       <w:r>
         <w:rPr>
@@ -753,6 +753,12 @@
           <w:rFonts w:hint="eastAsia"/>
         </w:rPr>
         <w:t>shopDetail</w:t>
+      </w:r>
+      <w:r>
+        <w:rPr>
+          <w:rFonts w:hint="eastAsia"/>
+        </w:rPr>
+        <w:t>時</w:t>
       </w:r>
       <w:r>
         <w:rPr>
@@ -809,12 +815,6 @@
       </w:r>
     </w:p>
     <w:p>
-      <w:pPr>
-        <w:rPr>
-          <w:rFonts w:eastAsia="DengXian"/>
-          <w:lang w:eastAsia="zh-CN"/>
-        </w:rPr>
-      </w:pPr>
       <w:sdt>
         <w:sdtPr>
           <w:rPr>
@@ -861,7 +861,7 @@
           <w:rPr>
             <w:rFonts w:hint="eastAsia"/>
           </w:rPr>
-          <w:id w:val="1264033950"/>
+          <w:id w:val="-1540818482"/>
           <w14:checkbox>
             <w14:checked w14:val="0"/>
             <w14:checkedState w14:val="2612" w14:font="MS Gothic"/>
@@ -879,17 +879,67 @@
       </w:sdt>
       <w:r>
         <w:rPr>
+          <w:rFonts w:hint="eastAsia"/>
+        </w:rPr>
+        <w:t xml:space="preserve"> </w:t>
+      </w:r>
+      <w:r>
+        <w:rPr>
           <w:rFonts w:eastAsia="DengXian" w:hint="eastAsia"/>
           <w:lang w:eastAsia="zh-CN"/>
         </w:rPr>
+        <w:t>营业时间icon替换</w:t>
+      </w:r>
+    </w:p>
+    <w:p>
+      <w:pPr>
+        <w:rPr>
+          <w:rFonts w:eastAsia="DengXian" w:hint="eastAsia"/>
+          <w:lang w:eastAsia="zh-CN"/>
+        </w:rPr>
+      </w:pPr>
+      <w:sdt>
+        <w:sdtPr>
+          <w:rPr>
+            <w:rFonts w:hint="eastAsia"/>
+            <w:lang w:eastAsia="zh-CN"/>
+          </w:rPr>
+          <w:id w:val="1264033950"/>
+          <w14:checkbox>
+            <w14:checked w14:val="0"/>
+            <w14:checkedState w14:val="2612" w14:font="MS Gothic"/>
+            <w14:uncheckedState w14:val="2610" w14:font="MS Gothic"/>
+          </w14:checkbox>
+        </w:sdtPr>
+        <w:sdtContent>
+          <w:r>
+            <w:rPr>
+              <w:rFonts w:ascii="MS Gothic" w:eastAsia="MS Gothic" w:hAnsi="MS Gothic" w:hint="eastAsia"/>
+              <w:lang w:eastAsia="zh-CN"/>
+            </w:rPr>
+            <w:t>☐</w:t>
+          </w:r>
+        </w:sdtContent>
+      </w:sdt>
+      <w:r>
+        <w:rPr>
+          <w:rFonts w:eastAsia="DengXian" w:hint="eastAsia"/>
+          <w:lang w:eastAsia="zh-CN"/>
+        </w:rPr>
         <w:t xml:space="preserve"> 营业时间超过5个要换行呈现（如3+3 / 3+4）</w:t>
       </w:r>
     </w:p>
     <w:p>
       <w:pPr>
         <w:jc w:val="left"/>
+        <w:rPr>
+          <w:lang w:eastAsia="zh-CN"/>
+        </w:rPr>
       </w:pPr>
       <w:r>
+        <w:rPr>
+          <w:lang w:eastAsia="zh-CN"/>
+        </w:rPr>
         <w:br w:type="page"/>
       </w:r>
     </w:p>

</xml_diff>

<commit_message>
0.4.9 refactor: update business hours icons and centralize mapping in Data
</commit_message>
<xml_diff>
--- a/TO DO.docx
+++ b/TO DO.docx
@@ -353,12 +353,14 @@
         </w:rPr>
         <w:t>、跳轉</w:t>
       </w:r>
+      <w:proofErr w:type="spellStart"/>
       <w:r>
         <w:rPr>
           <w:rFonts w:hint="eastAsia"/>
         </w:rPr>
         <w:t>shopDetail</w:t>
       </w:r>
+      <w:proofErr w:type="spellEnd"/>
       <w:r>
         <w:rPr>
           <w:rFonts w:hint="eastAsia"/>
@@ -667,14 +669,12 @@
       <w:r>
         <w:rPr>
           <w:rFonts w:eastAsia="DengXian" w:hint="eastAsia"/>
-          <w:lang w:eastAsia="zh-CN"/>
         </w:rPr>
         <w:t xml:space="preserve"> </w:t>
       </w:r>
       <w:r>
         <w:rPr>
           <w:rFonts w:eastAsia="DengXian" w:hint="eastAsia"/>
-          <w:lang w:eastAsia="zh-CN"/>
         </w:rPr>
         <w:t>膠囊點擊回饋區域過小</w:t>
       </w:r>
@@ -687,7 +687,7 @@
           </w:rPr>
           <w:id w:val="1187257994"/>
           <w14:checkbox>
-            <w14:checked w14:val="0"/>
+            <w14:checked w14:val="1"/>
             <w14:checkedState w14:val="2612" w14:font="MS Gothic"/>
             <w14:uncheckedState w14:val="2610" w14:font="MS Gothic"/>
           </w14:checkbox>
@@ -697,7 +697,7 @@
             <w:rPr>
               <w:rFonts w:ascii="MS Gothic" w:eastAsia="MS Gothic" w:hAnsi="MS Gothic" w:hint="eastAsia"/>
             </w:rPr>
-            <w:t>☐</w:t>
+            <w:t>☒</w:t>
           </w:r>
         </w:sdtContent>
       </w:sdt>
@@ -705,8 +705,16 @@
         <w:rPr>
           <w:rFonts w:hint="eastAsia"/>
         </w:rPr>
-        <w:t xml:space="preserve"> shopDetail</w:t>
-      </w:r>
+        <w:t xml:space="preserve"> </w:t>
+      </w:r>
+      <w:proofErr w:type="spellStart"/>
+      <w:r>
+        <w:rPr>
+          <w:rFonts w:hint="eastAsia"/>
+        </w:rPr>
+        <w:t>shopDetail</w:t>
+      </w:r>
+      <w:proofErr w:type="spellEnd"/>
       <w:r>
         <w:rPr>
           <w:rFonts w:hint="eastAsia"/>
@@ -748,12 +756,14 @@
         </w:rPr>
         <w:t>跳轉</w:t>
       </w:r>
+      <w:proofErr w:type="spellStart"/>
       <w:r>
         <w:rPr>
           <w:rFonts w:hint="eastAsia"/>
         </w:rPr>
         <w:t>shopDetail</w:t>
       </w:r>
+      <w:proofErr w:type="spellEnd"/>
       <w:r>
         <w:rPr>
           <w:rFonts w:hint="eastAsia"/>
@@ -793,8 +803,16 @@
         <w:rPr>
           <w:rFonts w:hint="eastAsia"/>
         </w:rPr>
-        <w:t xml:space="preserve"> shopDetail</w:t>
-      </w:r>
+        <w:t xml:space="preserve"> </w:t>
+      </w:r>
+      <w:proofErr w:type="spellStart"/>
+      <w:r>
+        <w:rPr>
+          <w:rFonts w:hint="eastAsia"/>
+        </w:rPr>
+        <w:t>shopDetail</w:t>
+      </w:r>
+      <w:proofErr w:type="spellEnd"/>
       <w:r>
         <w:rPr>
           <w:rFonts w:hint="eastAsia"/>
@@ -860,10 +878,11 @@
         <w:sdtPr>
           <w:rPr>
             <w:rFonts w:hint="eastAsia"/>
+            <w:lang w:eastAsia="zh-CN"/>
           </w:rPr>
           <w:id w:val="-1540818482"/>
           <w14:checkbox>
-            <w14:checked w14:val="0"/>
+            <w14:checked w14:val="1"/>
             <w14:checkedState w14:val="2612" w14:font="MS Gothic"/>
             <w14:uncheckedState w14:val="2610" w14:font="MS Gothic"/>
           </w14:checkbox>
@@ -872,14 +891,16 @@
           <w:r>
             <w:rPr>
               <w:rFonts w:ascii="MS Gothic" w:eastAsia="MS Gothic" w:hAnsi="MS Gothic" w:hint="eastAsia"/>
+              <w:lang w:eastAsia="zh-CN"/>
             </w:rPr>
-            <w:t>☐</w:t>
+            <w:t>☒</w:t>
           </w:r>
         </w:sdtContent>
       </w:sdt>
       <w:r>
         <w:rPr>
           <w:rFonts w:hint="eastAsia"/>
+          <w:lang w:eastAsia="zh-CN"/>
         </w:rPr>
         <w:t xml:space="preserve"> </w:t>
       </w:r>
@@ -894,7 +915,7 @@
     <w:p>
       <w:pPr>
         <w:rPr>
-          <w:rFonts w:eastAsia="DengXian" w:hint="eastAsia"/>
+          <w:rFonts w:eastAsia="DengXian"/>
           <w:lang w:eastAsia="zh-CN"/>
         </w:rPr>
       </w:pPr>
@@ -927,6 +948,44 @@
           <w:lang w:eastAsia="zh-CN"/>
         </w:rPr>
         <w:t xml:space="preserve"> 营业时间超过5个要换行呈现（如3+3 / 3+4）</w:t>
+      </w:r>
+    </w:p>
+    <w:p>
+      <w:pPr>
+        <w:rPr>
+          <w:rFonts w:eastAsia="DengXian" w:hint="eastAsia"/>
+          <w:lang w:eastAsia="zh-CN"/>
+        </w:rPr>
+      </w:pPr>
+      <w:sdt>
+        <w:sdtPr>
+          <w:rPr>
+            <w:rFonts w:hint="eastAsia"/>
+            <w:lang w:eastAsia="zh-CN"/>
+          </w:rPr>
+          <w:id w:val="331803082"/>
+          <w14:checkbox>
+            <w14:checked w14:val="0"/>
+            <w14:checkedState w14:val="2612" w14:font="MS Gothic"/>
+            <w14:uncheckedState w14:val="2610" w14:font="MS Gothic"/>
+          </w14:checkbox>
+        </w:sdtPr>
+        <w:sdtContent>
+          <w:r>
+            <w:rPr>
+              <w:rFonts w:ascii="MS Gothic" w:eastAsia="MS Gothic" w:hAnsi="MS Gothic" w:hint="eastAsia"/>
+              <w:lang w:eastAsia="zh-CN"/>
+            </w:rPr>
+            <w:t>☐</w:t>
+          </w:r>
+        </w:sdtContent>
+      </w:sdt>
+      <w:r>
+        <w:rPr>
+          <w:rFonts w:eastAsia="DengXian" w:hint="eastAsia"/>
+          <w:lang w:eastAsia="zh-CN"/>
+        </w:rPr>
+        <w:t xml:space="preserve"> 地标素材更换</w:t>
       </w:r>
     </w:p>
     <w:p>

</xml_diff>

<commit_message>
0.4.10 feat: add global back-to-top button for better navigation
</commit_message>
<xml_diff>
--- a/TO DO.docx
+++ b/TO DO.docx
@@ -353,14 +353,12 @@
         </w:rPr>
         <w:t>、跳轉</w:t>
       </w:r>
-      <w:proofErr w:type="spellStart"/>
       <w:r>
         <w:rPr>
           <w:rFonts w:hint="eastAsia"/>
         </w:rPr>
         <w:t>shopDetail</w:t>
       </w:r>
-      <w:proofErr w:type="spellEnd"/>
       <w:r>
         <w:rPr>
           <w:rFonts w:hint="eastAsia"/>
@@ -705,16 +703,8 @@
         <w:rPr>
           <w:rFonts w:hint="eastAsia"/>
         </w:rPr>
-        <w:t xml:space="preserve"> </w:t>
-      </w:r>
-      <w:proofErr w:type="spellStart"/>
-      <w:r>
-        <w:rPr>
-          <w:rFonts w:hint="eastAsia"/>
-        </w:rPr>
-        <w:t>shopDetail</w:t>
-      </w:r>
-      <w:proofErr w:type="spellEnd"/>
+        <w:t xml:space="preserve"> shopDetail</w:t>
+      </w:r>
       <w:r>
         <w:rPr>
           <w:rFonts w:hint="eastAsia"/>
@@ -756,14 +746,12 @@
         </w:rPr>
         <w:t>跳轉</w:t>
       </w:r>
-      <w:proofErr w:type="spellStart"/>
       <w:r>
         <w:rPr>
           <w:rFonts w:hint="eastAsia"/>
         </w:rPr>
         <w:t>shopDetail</w:t>
       </w:r>
-      <w:proofErr w:type="spellEnd"/>
       <w:r>
         <w:rPr>
           <w:rFonts w:hint="eastAsia"/>
@@ -803,16 +791,8 @@
         <w:rPr>
           <w:rFonts w:hint="eastAsia"/>
         </w:rPr>
-        <w:t xml:space="preserve"> </w:t>
-      </w:r>
-      <w:proofErr w:type="spellStart"/>
-      <w:r>
-        <w:rPr>
-          <w:rFonts w:hint="eastAsia"/>
-        </w:rPr>
-        <w:t>shopDetail</w:t>
-      </w:r>
-      <w:proofErr w:type="spellEnd"/>
+        <w:t xml:space="preserve"> shopDetail</w:t>
+      </w:r>
       <w:r>
         <w:rPr>
           <w:rFonts w:hint="eastAsia"/>
@@ -840,7 +820,7 @@
           </w:rPr>
           <w:id w:val="1686014558"/>
           <w14:checkbox>
-            <w14:checked w14:val="0"/>
+            <w14:checked w14:val="1"/>
             <w14:checkedState w14:val="2612" w14:font="MS Gothic"/>
             <w14:uncheckedState w14:val="2610" w14:font="MS Gothic"/>
           </w14:checkbox>
@@ -850,7 +830,7 @@
             <w:rPr>
               <w:rFonts w:ascii="MS Gothic" w:eastAsia="MS Gothic" w:hAnsi="MS Gothic" w:hint="eastAsia"/>
             </w:rPr>
-            <w:t>☐</w:t>
+            <w:t>☒</w:t>
           </w:r>
         </w:sdtContent>
       </w:sdt>

</xml_diff>

<commit_message>
0.4.12 fix: resolve map marker initialization issue on tablet view
</commit_message>
<xml_diff>
--- a/TO DO.docx
+++ b/TO DO.docx
@@ -200,11 +200,6 @@
       </w:r>
     </w:p>
     <w:p>
-      <w:pPr>
-        <w:rPr>
-          <w:rFonts w:eastAsia="DengXian" w:hint="eastAsia"/>
-        </w:rPr>
-      </w:pPr>
       <w:sdt>
         <w:sdtPr>
           <w:rPr>
@@ -252,6 +247,67 @@
       </w:r>
     </w:p>
     <w:p>
+      <w:pPr>
+        <w:rPr>
+          <w:rFonts w:eastAsia="DengXian" w:hint="eastAsia"/>
+          <w:lang w:eastAsia="zh-CN"/>
+        </w:rPr>
+      </w:pPr>
+      <w:sdt>
+        <w:sdtPr>
+          <w:rPr>
+            <w:rFonts w:hint="eastAsia"/>
+          </w:rPr>
+          <w:id w:val="-229227625"/>
+          <w14:checkbox>
+            <w14:checked w14:val="0"/>
+            <w14:checkedState w14:val="2612" w14:font="MS Gothic"/>
+            <w14:uncheckedState w14:val="2610" w14:font="MS Gothic"/>
+          </w14:checkbox>
+        </w:sdtPr>
+        <w:sdtContent>
+          <w:r>
+            <w:rPr>
+              <w:rFonts w:ascii="MS Gothic" w:eastAsia="MS Gothic" w:hAnsi="MS Gothic" w:hint="eastAsia"/>
+            </w:rPr>
+            <w:t>☐</w:t>
+          </w:r>
+        </w:sdtContent>
+      </w:sdt>
+      <w:r>
+        <w:rPr>
+          <w:rFonts w:hint="eastAsia"/>
+        </w:rPr>
+        <w:t xml:space="preserve"> </w:t>
+      </w:r>
+      <w:proofErr w:type="spellStart"/>
+      <w:r>
+        <w:rPr>
+          <w:rFonts w:hint="eastAsia"/>
+        </w:rPr>
+        <w:t>shopDetail</w:t>
+      </w:r>
+      <w:proofErr w:type="spellEnd"/>
+      <w:r>
+        <w:rPr>
+          <w:rFonts w:hint="eastAsia"/>
+        </w:rPr>
+        <w:t>返回</w:t>
+      </w:r>
+      <w:r>
+        <w:rPr>
+          <w:rFonts w:hint="eastAsia"/>
+        </w:rPr>
+        <w:t>shops</w:t>
+      </w:r>
+      <w:r>
+        <w:rPr>
+          <w:rFonts w:hint="eastAsia"/>
+        </w:rPr>
+        <w:t>未維持原位</w:t>
+      </w:r>
+    </w:p>
+    <w:p>
       <w:sdt>
         <w:sdtPr>
           <w:rPr>
@@ -351,14 +407,24 @@
         <w:rPr>
           <w:rFonts w:hint="eastAsia"/>
         </w:rPr>
-        <w:t>、跳轉</w:t>
-      </w:r>
+        <w:t>、</w:t>
+      </w:r>
+      <w:proofErr w:type="gramStart"/>
+      <w:r>
+        <w:rPr>
+          <w:rFonts w:hint="eastAsia"/>
+        </w:rPr>
+        <w:t>跳轉</w:t>
+      </w:r>
+      <w:proofErr w:type="spellStart"/>
+      <w:proofErr w:type="gramEnd"/>
       <w:r>
         <w:rPr>
           <w:rFonts w:hint="eastAsia"/>
         </w:rPr>
         <w:t>shopDetail</w:t>
       </w:r>
+      <w:proofErr w:type="spellEnd"/>
       <w:r>
         <w:rPr>
           <w:rFonts w:hint="eastAsia"/>
@@ -423,6 +489,12 @@
       </w:r>
     </w:p>
     <w:p>
+      <w:pPr>
+        <w:rPr>
+          <w:rFonts w:eastAsia="DengXian"/>
+          <w:lang w:eastAsia="zh-CN"/>
+        </w:rPr>
+      </w:pPr>
       <w:sdt>
         <w:sdtPr>
           <w:rPr>
@@ -463,49 +535,51 @@
         <w:rPr>
           <w:rFonts w:hint="eastAsia"/>
         </w:rPr>
-        <w:t>導航欄</w:t>
-      </w:r>
-      <w:r>
-        <w:rPr>
-          <w:rFonts w:hint="eastAsia"/>
-        </w:rPr>
-        <w:t xml:space="preserve"> </w:t>
-      </w:r>
-      <w:r>
-        <w:rPr>
-          <w:rFonts w:hint="eastAsia"/>
-        </w:rPr>
-        <w:t>跳轉</w:t>
-      </w:r>
-      <w:r>
-        <w:rPr>
-          <w:rFonts w:hint="eastAsia"/>
-        </w:rPr>
-        <w:t xml:space="preserve"> </w:t>
-      </w:r>
-      <w:r>
-        <w:rPr>
-          <w:rFonts w:hint="eastAsia"/>
-        </w:rPr>
-        <w:t>地圖頁維持未選擇店家</w:t>
-      </w:r>
-      <w:r>
-        <w:rPr>
-          <w:rFonts w:hint="eastAsia"/>
-        </w:rPr>
-        <w:t>(</w:t>
-      </w:r>
-      <w:r>
-        <w:rPr>
-          <w:rFonts w:hint="eastAsia"/>
-        </w:rPr>
-        <w:t>店家詳情頁跳轉會自動選取</w:t>
-      </w:r>
-      <w:r>
-        <w:rPr>
-          <w:rFonts w:hint="eastAsia"/>
-        </w:rPr>
-        <w:t>)</w:t>
+        <w:t>店家詳情</w:t>
+      </w:r>
+      <w:proofErr w:type="gramStart"/>
+      <w:r>
+        <w:rPr>
+          <w:rFonts w:hint="eastAsia"/>
+        </w:rPr>
+        <w:t>頁跳轉</w:t>
+      </w:r>
+      <w:proofErr w:type="gramEnd"/>
+      <w:r>
+        <w:rPr>
+          <w:rFonts w:eastAsia="DengXian" w:hint="eastAsia"/>
+        </w:rPr>
+        <w:t>地图页</w:t>
+      </w:r>
+      <w:r>
+        <w:rPr>
+          <w:rFonts w:eastAsia="DengXian" w:hint="eastAsia"/>
+        </w:rPr>
+        <w:t>手机</w:t>
+      </w:r>
+      <w:r>
+        <w:rPr>
+          <w:rFonts w:hint="eastAsia"/>
+        </w:rPr>
+        <w:t>會自動選取</w:t>
+      </w:r>
+      <w:r>
+        <w:rPr>
+          <w:rFonts w:ascii="DengXian" w:eastAsia="DengXian" w:hAnsi="DengXian" w:hint="eastAsia"/>
+        </w:rPr>
+        <w:t>店家</w:t>
+      </w:r>
+      <w:r>
+        <w:rPr>
+          <w:rFonts w:ascii="DengXian" w:eastAsia="DengXian" w:hAnsi="DengXian" w:hint="eastAsia"/>
+        </w:rPr>
+        <w:t>，平板不会</w:t>
+      </w:r>
+      <w:r>
+        <w:rPr>
+          <w:rFonts w:ascii="DengXian" w:eastAsia="DengXian" w:hAnsi="DengXian" w:hint="eastAsia"/>
+        </w:rPr>
+        <w:t>标出位置</w:t>
       </w:r>
     </w:p>
     <w:p>
@@ -703,8 +777,16 @@
         <w:rPr>
           <w:rFonts w:hint="eastAsia"/>
         </w:rPr>
-        <w:t xml:space="preserve"> shopDetail</w:t>
-      </w:r>
+        <w:t xml:space="preserve"> </w:t>
+      </w:r>
+      <w:proofErr w:type="spellStart"/>
+      <w:r>
+        <w:rPr>
+          <w:rFonts w:hint="eastAsia"/>
+        </w:rPr>
+        <w:t>shopDetail</w:t>
+      </w:r>
+      <w:proofErr w:type="spellEnd"/>
       <w:r>
         <w:rPr>
           <w:rFonts w:hint="eastAsia"/>
@@ -740,18 +822,22 @@
         </w:rPr>
         <w:t xml:space="preserve"> </w:t>
       </w:r>
+      <w:proofErr w:type="gramStart"/>
       <w:r>
         <w:rPr>
           <w:rFonts w:hint="eastAsia"/>
         </w:rPr>
         <w:t>跳轉</w:t>
       </w:r>
+      <w:proofErr w:type="spellStart"/>
+      <w:proofErr w:type="gramEnd"/>
       <w:r>
         <w:rPr>
           <w:rFonts w:hint="eastAsia"/>
         </w:rPr>
         <w:t>shopDetail</w:t>
       </w:r>
+      <w:proofErr w:type="spellEnd"/>
       <w:r>
         <w:rPr>
           <w:rFonts w:hint="eastAsia"/>
@@ -763,53 +849,6 @@
           <w:rFonts w:hint="eastAsia"/>
         </w:rPr>
         <w:t>未置頂</w:t>
-      </w:r>
-    </w:p>
-    <w:p>
-      <w:sdt>
-        <w:sdtPr>
-          <w:rPr>
-            <w:rFonts w:hint="eastAsia"/>
-          </w:rPr>
-          <w:id w:val="-229227625"/>
-          <w14:checkbox>
-            <w14:checked w14:val="0"/>
-            <w14:checkedState w14:val="2612" w14:font="MS Gothic"/>
-            <w14:uncheckedState w14:val="2610" w14:font="MS Gothic"/>
-          </w14:checkbox>
-        </w:sdtPr>
-        <w:sdtContent>
-          <w:r>
-            <w:rPr>
-              <w:rFonts w:ascii="MS Gothic" w:eastAsia="MS Gothic" w:hAnsi="MS Gothic" w:hint="eastAsia"/>
-            </w:rPr>
-            <w:t>☐</w:t>
-          </w:r>
-        </w:sdtContent>
-      </w:sdt>
-      <w:r>
-        <w:rPr>
-          <w:rFonts w:hint="eastAsia"/>
-        </w:rPr>
-        <w:t xml:space="preserve"> shopDetail</w:t>
-      </w:r>
-      <w:r>
-        <w:rPr>
-          <w:rFonts w:hint="eastAsia"/>
-        </w:rPr>
-        <w:t>返回</w:t>
-      </w:r>
-      <w:r>
-        <w:rPr>
-          <w:rFonts w:hint="eastAsia"/>
-        </w:rPr>
-        <w:t>shops</w:t>
-      </w:r>
-      <w:r>
-        <w:rPr>
-          <w:rFonts w:hint="eastAsia"/>
-        </w:rPr>
-        <w:t>未維持原位</w:t>
       </w:r>
     </w:p>
     <w:p>
@@ -840,12 +879,14 @@
         </w:rPr>
         <w:t xml:space="preserve"> </w:t>
       </w:r>
+      <w:proofErr w:type="gramStart"/>
       <w:r>
         <w:rPr>
           <w:rFonts w:hint="eastAsia"/>
         </w:rPr>
         <w:t>缺少置頂按鍵</w:t>
       </w:r>
+      <w:proofErr w:type="gramEnd"/>
     </w:p>
     <w:p>
       <w:pPr>
@@ -907,7 +948,7 @@
           </w:rPr>
           <w:id w:val="1264033950"/>
           <w14:checkbox>
-            <w14:checked w14:val="0"/>
+            <w14:checked w14:val="1"/>
             <w14:checkedState w14:val="2612" w14:font="MS Gothic"/>
             <w14:uncheckedState w14:val="2610" w14:font="MS Gothic"/>
           </w14:checkbox>
@@ -918,7 +959,7 @@
               <w:rFonts w:ascii="MS Gothic" w:eastAsia="MS Gothic" w:hAnsi="MS Gothic" w:hint="eastAsia"/>
               <w:lang w:eastAsia="zh-CN"/>
             </w:rPr>
-            <w:t>☐</w:t>
+            <w:t>☒</w:t>
           </w:r>
         </w:sdtContent>
       </w:sdt>
@@ -1372,7 +1413,35 @@
         <w:rPr>
           <w:rFonts w:hint="eastAsia"/>
         </w:rPr>
-        <w:t>不要五角圖，放食材、食材圖片和食材功用</w:t>
+        <w:t>不要五角圖，</w:t>
+      </w:r>
+      <w:proofErr w:type="gramStart"/>
+      <w:r>
+        <w:rPr>
+          <w:rFonts w:hint="eastAsia"/>
+        </w:rPr>
+        <w:t>放食材</w:t>
+      </w:r>
+      <w:proofErr w:type="gramEnd"/>
+      <w:r>
+        <w:rPr>
+          <w:rFonts w:hint="eastAsia"/>
+        </w:rPr>
+        <w:t>、食材圖片和</w:t>
+      </w:r>
+      <w:proofErr w:type="gramStart"/>
+      <w:r>
+        <w:rPr>
+          <w:rFonts w:hint="eastAsia"/>
+        </w:rPr>
+        <w:t>食材</w:t>
+      </w:r>
+      <w:proofErr w:type="gramEnd"/>
+      <w:r>
+        <w:rPr>
+          <w:rFonts w:hint="eastAsia"/>
+        </w:rPr>
+        <w:t>功用</w:t>
       </w:r>
       <w:r>
         <w:rPr>
@@ -1522,12 +1591,14 @@
         </w:rPr>
         <w:t>8.</w:t>
       </w:r>
+      <w:proofErr w:type="gramStart"/>
       <w:r>
         <w:rPr>
           <w:rFonts w:hint="eastAsia"/>
         </w:rPr>
         <w:t>跳轉邏輯</w:t>
       </w:r>
+      <w:proofErr w:type="gramEnd"/>
     </w:p>
     <w:p>
       <w:r>

</xml_diff>

<commit_message>
0.4.13 fix: block accidental inner clicks when switching between phone and tablet views
</commit_message>
<xml_diff>
--- a/TO DO.docx
+++ b/TO DO.docx
@@ -278,16 +278,8 @@
         <w:rPr>
           <w:rFonts w:hint="eastAsia"/>
         </w:rPr>
-        <w:t xml:space="preserve"> </w:t>
-      </w:r>
-      <w:proofErr w:type="spellStart"/>
-      <w:r>
-        <w:rPr>
-          <w:rFonts w:hint="eastAsia"/>
-        </w:rPr>
-        <w:t>shopDetail</w:t>
-      </w:r>
-      <w:proofErr w:type="spellEnd"/>
+        <w:t xml:space="preserve"> shopDetail</w:t>
+      </w:r>
       <w:r>
         <w:rPr>
           <w:rFonts w:hint="eastAsia"/>
@@ -407,24 +399,14 @@
         <w:rPr>
           <w:rFonts w:hint="eastAsia"/>
         </w:rPr>
-        <w:t>、</w:t>
-      </w:r>
-      <w:proofErr w:type="gramStart"/>
-      <w:r>
-        <w:rPr>
-          <w:rFonts w:hint="eastAsia"/>
-        </w:rPr>
-        <w:t>跳轉</w:t>
-      </w:r>
-      <w:proofErr w:type="spellStart"/>
-      <w:proofErr w:type="gramEnd"/>
+        <w:t>、跳轉</w:t>
+      </w:r>
       <w:r>
         <w:rPr>
           <w:rFonts w:hint="eastAsia"/>
         </w:rPr>
         <w:t>shopDetail</w:t>
       </w:r>
-      <w:proofErr w:type="spellEnd"/>
       <w:r>
         <w:rPr>
           <w:rFonts w:hint="eastAsia"/>
@@ -492,7 +474,6 @@
       <w:pPr>
         <w:rPr>
           <w:rFonts w:eastAsia="DengXian"/>
-          <w:lang w:eastAsia="zh-CN"/>
         </w:rPr>
       </w:pPr>
       <w:sdt>
@@ -502,7 +483,7 @@
           </w:rPr>
           <w:id w:val="503790650"/>
           <w14:checkbox>
-            <w14:checked w14:val="0"/>
+            <w14:checked w14:val="1"/>
             <w14:checkedState w14:val="2612" w14:font="MS Gothic"/>
             <w14:uncheckedState w14:val="2610" w14:font="MS Gothic"/>
           </w14:checkbox>
@@ -512,7 +493,7 @@
             <w:rPr>
               <w:rFonts w:ascii="MS Gothic" w:eastAsia="MS Gothic" w:hAnsi="MS Gothic" w:hint="eastAsia"/>
             </w:rPr>
-            <w:t>☐</w:t>
+            <w:t>☒</w:t>
           </w:r>
         </w:sdtContent>
       </w:sdt>
@@ -535,16 +516,8 @@
         <w:rPr>
           <w:rFonts w:hint="eastAsia"/>
         </w:rPr>
-        <w:t>店家詳情</w:t>
-      </w:r>
-      <w:proofErr w:type="gramStart"/>
-      <w:r>
-        <w:rPr>
-          <w:rFonts w:hint="eastAsia"/>
-        </w:rPr>
-        <w:t>頁跳轉</w:t>
-      </w:r>
-      <w:proofErr w:type="gramEnd"/>
+        <w:t>店家詳情頁跳轉</w:t>
+      </w:r>
       <w:r>
         <w:rPr>
           <w:rFonts w:eastAsia="DengXian" w:hint="eastAsia"/>
@@ -583,6 +556,12 @@
       </w:r>
     </w:p>
     <w:p>
+      <w:pPr>
+        <w:rPr>
+          <w:rFonts w:eastAsia="DengXian"/>
+          <w:lang w:eastAsia="zh-CN"/>
+        </w:rPr>
+      </w:pPr>
       <w:sdt>
         <w:sdtPr>
           <w:rPr>
@@ -620,7 +599,105 @@
         <w:rPr>
           <w:rFonts w:hint="eastAsia"/>
         </w:rPr>
-        <w:t>地圖平板點手機會直接選到店家</w:t>
+        <w:t>平板</w:t>
+      </w:r>
+      <w:r>
+        <w:rPr>
+          <w:rFonts w:ascii="DengXian" w:eastAsia="DengXian" w:hAnsi="DengXian" w:hint="eastAsia"/>
+        </w:rPr>
+        <w:t>主角</w:t>
+      </w:r>
+      <w:r>
+        <w:rPr>
+          <w:rFonts w:hint="eastAsia"/>
+        </w:rPr>
+        <w:t>點手機會直接選到店家</w:t>
+      </w:r>
+    </w:p>
+    <w:p>
+      <w:pPr>
+        <w:rPr>
+          <w:rFonts w:eastAsia="DengXian"/>
+          <w:lang w:eastAsia="zh-CN"/>
+        </w:rPr>
+      </w:pPr>
+      <w:sdt>
+        <w:sdtPr>
+          <w:rPr>
+            <w:rFonts w:hint="eastAsia"/>
+          </w:rPr>
+          <w:id w:val="-647982811"/>
+          <w14:checkbox>
+            <w14:checked w14:val="0"/>
+            <w14:checkedState w14:val="2612" w14:font="MS Gothic"/>
+            <w14:uncheckedState w14:val="2610" w14:font="MS Gothic"/>
+          </w14:checkbox>
+        </w:sdtPr>
+        <w:sdtContent>
+          <w:r>
+            <w:rPr>
+              <w:rFonts w:ascii="MS Gothic" w:eastAsia="MS Gothic" w:hAnsi="MS Gothic" w:hint="eastAsia"/>
+            </w:rPr>
+            <w:t>☐</w:t>
+          </w:r>
+        </w:sdtContent>
+      </w:sdt>
+      <w:r>
+        <w:rPr>
+          <w:rFonts w:eastAsia="DengXian" w:hint="eastAsia"/>
+          <w:lang w:eastAsia="zh-CN"/>
+        </w:rPr>
+        <w:t xml:space="preserve"> 地图页图标选取困难</w:t>
+      </w:r>
+    </w:p>
+    <w:p>
+      <w:pPr>
+        <w:rPr>
+          <w:rFonts w:eastAsia="DengXian" w:hint="eastAsia"/>
+          <w:lang w:eastAsia="zh-CN"/>
+        </w:rPr>
+      </w:pPr>
+      <w:sdt>
+        <w:sdtPr>
+          <w:rPr>
+            <w:rFonts w:hint="eastAsia"/>
+          </w:rPr>
+          <w:id w:val="-877315111"/>
+          <w14:checkbox>
+            <w14:checked w14:val="0"/>
+            <w14:checkedState w14:val="2612" w14:font="MS Gothic"/>
+            <w14:uncheckedState w14:val="2610" w14:font="MS Gothic"/>
+          </w14:checkbox>
+        </w:sdtPr>
+        <w:sdtContent>
+          <w:r>
+            <w:rPr>
+              <w:rFonts w:ascii="MS Gothic" w:eastAsia="MS Gothic" w:hAnsi="MS Gothic" w:hint="eastAsia"/>
+            </w:rPr>
+            <w:t>☐</w:t>
+          </w:r>
+        </w:sdtContent>
+      </w:sdt>
+      <w:r>
+        <w:rPr>
+          <w:rFonts w:eastAsia="DengXian" w:hint="eastAsia"/>
+          <w:lang w:eastAsia="zh-CN"/>
+        </w:rPr>
+        <w:t xml:space="preserve"> </w:t>
+      </w:r>
+      <w:r>
+        <w:rPr>
+          <w:rFonts w:eastAsia="DengXian" w:hint="eastAsia"/>
+          <w:lang w:eastAsia="zh-CN"/>
+        </w:rPr>
+        <w:t>地图页图标选取</w:t>
+      </w:r>
+      <w:r>
+        <w:rPr>
+          <w:rFonts w:eastAsia="DengXian" w:hint="eastAsia"/>
+          <w:lang w:eastAsia="zh-CN"/>
+        </w:rPr>
+        <w:t>后，手机端保持配角呈现选取店家</w:t>
       </w:r>
     </w:p>
     <w:p>
@@ -777,16 +854,8 @@
         <w:rPr>
           <w:rFonts w:hint="eastAsia"/>
         </w:rPr>
-        <w:t xml:space="preserve"> </w:t>
-      </w:r>
-      <w:proofErr w:type="spellStart"/>
-      <w:r>
-        <w:rPr>
-          <w:rFonts w:hint="eastAsia"/>
-        </w:rPr>
-        <w:t>shopDetail</w:t>
-      </w:r>
-      <w:proofErr w:type="spellEnd"/>
+        <w:t xml:space="preserve"> shopDetail</w:t>
+      </w:r>
       <w:r>
         <w:rPr>
           <w:rFonts w:hint="eastAsia"/>
@@ -822,22 +891,18 @@
         </w:rPr>
         <w:t xml:space="preserve"> </w:t>
       </w:r>
-      <w:proofErr w:type="gramStart"/>
       <w:r>
         <w:rPr>
           <w:rFonts w:hint="eastAsia"/>
         </w:rPr>
         <w:t>跳轉</w:t>
       </w:r>
-      <w:proofErr w:type="spellStart"/>
-      <w:proofErr w:type="gramEnd"/>
       <w:r>
         <w:rPr>
           <w:rFonts w:hint="eastAsia"/>
         </w:rPr>
         <w:t>shopDetail</w:t>
       </w:r>
-      <w:proofErr w:type="spellEnd"/>
       <w:r>
         <w:rPr>
           <w:rFonts w:hint="eastAsia"/>
@@ -879,14 +944,12 @@
         </w:rPr>
         <w:t xml:space="preserve"> </w:t>
       </w:r>
-      <w:proofErr w:type="gramStart"/>
       <w:r>
         <w:rPr>
           <w:rFonts w:hint="eastAsia"/>
         </w:rPr>
         <w:t>缺少置頂按鍵</w:t>
       </w:r>
-      <w:proofErr w:type="gramEnd"/>
     </w:p>
     <w:p>
       <w:pPr>
@@ -1413,35 +1476,7 @@
         <w:rPr>
           <w:rFonts w:hint="eastAsia"/>
         </w:rPr>
-        <w:t>不要五角圖，</w:t>
-      </w:r>
-      <w:proofErr w:type="gramStart"/>
-      <w:r>
-        <w:rPr>
-          <w:rFonts w:hint="eastAsia"/>
-        </w:rPr>
-        <w:t>放食材</w:t>
-      </w:r>
-      <w:proofErr w:type="gramEnd"/>
-      <w:r>
-        <w:rPr>
-          <w:rFonts w:hint="eastAsia"/>
-        </w:rPr>
-        <w:t>、食材圖片和</w:t>
-      </w:r>
-      <w:proofErr w:type="gramStart"/>
-      <w:r>
-        <w:rPr>
-          <w:rFonts w:hint="eastAsia"/>
-        </w:rPr>
-        <w:t>食材</w:t>
-      </w:r>
-      <w:proofErr w:type="gramEnd"/>
-      <w:r>
-        <w:rPr>
-          <w:rFonts w:hint="eastAsia"/>
-        </w:rPr>
-        <w:t>功用</w:t>
+        <w:t>不要五角圖，放食材、食材圖片和食材功用</w:t>
       </w:r>
       <w:r>
         <w:rPr>
@@ -1591,14 +1626,12 @@
         </w:rPr>
         <w:t>8.</w:t>
       </w:r>
-      <w:proofErr w:type="gramStart"/>
       <w:r>
         <w:rPr>
           <w:rFonts w:hint="eastAsia"/>
         </w:rPr>
         <w:t>跳轉邏輯</w:t>
       </w:r>
-      <w:proofErr w:type="gramEnd"/>
     </w:p>
     <w:p>
       <w:r>

</xml_diff>

<commit_message>
0.4.14 feat: integrate custom map markers and fix map interactions
</commit_message>
<xml_diff>
--- a/TO DO.docx
+++ b/TO DO.docx
@@ -88,6 +88,402 @@
           <w:rFonts w:hint="eastAsia"/>
         </w:rPr>
         <w:t>替換、頁面內容布局</w:t>
+      </w:r>
+    </w:p>
+    <w:p>
+      <w:pPr>
+        <w:rPr>
+          <w:rFonts w:eastAsia="DengXian" w:hint="eastAsia"/>
+          <w:lang w:eastAsia="zh-CN"/>
+        </w:rPr>
+      </w:pPr>
+      <w:sdt>
+        <w:sdtPr>
+          <w:rPr>
+            <w:rFonts w:hint="eastAsia"/>
+          </w:rPr>
+          <w:id w:val="-229227625"/>
+          <w14:checkbox>
+            <w14:checked w14:val="0"/>
+            <w14:checkedState w14:val="2612" w14:font="MS Gothic"/>
+            <w14:uncheckedState w14:val="2610" w14:font="MS Gothic"/>
+          </w14:checkbox>
+        </w:sdtPr>
+        <w:sdtContent>
+          <w:r>
+            <w:rPr>
+              <w:rFonts w:ascii="MS Gothic" w:eastAsia="MS Gothic" w:hAnsi="MS Gothic" w:hint="eastAsia"/>
+            </w:rPr>
+            <w:t>☐</w:t>
+          </w:r>
+        </w:sdtContent>
+      </w:sdt>
+      <w:r>
+        <w:rPr>
+          <w:rFonts w:hint="eastAsia"/>
+        </w:rPr>
+        <w:t xml:space="preserve"> </w:t>
+      </w:r>
+      <w:proofErr w:type="spellStart"/>
+      <w:r>
+        <w:rPr>
+          <w:rFonts w:hint="eastAsia"/>
+        </w:rPr>
+        <w:t>shopDetail</w:t>
+      </w:r>
+      <w:proofErr w:type="spellEnd"/>
+      <w:r>
+        <w:rPr>
+          <w:rFonts w:hint="eastAsia"/>
+        </w:rPr>
+        <w:t>返回</w:t>
+      </w:r>
+      <w:r>
+        <w:rPr>
+          <w:rFonts w:hint="eastAsia"/>
+        </w:rPr>
+        <w:t>shops</w:t>
+      </w:r>
+      <w:r>
+        <w:rPr>
+          <w:rFonts w:hint="eastAsia"/>
+        </w:rPr>
+        <w:t>未維持原位</w:t>
+      </w:r>
+    </w:p>
+    <w:p>
+      <w:sdt>
+        <w:sdtPr>
+          <w:rPr>
+            <w:rFonts w:hint="eastAsia"/>
+          </w:rPr>
+          <w:id w:val="-46840429"/>
+          <w14:checkbox>
+            <w14:checked w14:val="0"/>
+            <w14:checkedState w14:val="2612" w14:font="MS Gothic"/>
+            <w14:uncheckedState w14:val="2610" w14:font="MS Gothic"/>
+          </w14:checkbox>
+        </w:sdtPr>
+        <w:sdtContent>
+          <w:r>
+            <w:rPr>
+              <w:rFonts w:ascii="MS Gothic" w:eastAsia="MS Gothic" w:hAnsi="MS Gothic" w:hint="eastAsia"/>
+            </w:rPr>
+            <w:t>☐</w:t>
+          </w:r>
+        </w:sdtContent>
+      </w:sdt>
+      <w:r>
+        <w:rPr>
+          <w:rFonts w:eastAsia="DengXian" w:hint="eastAsia"/>
+        </w:rPr>
+        <w:t xml:space="preserve"> </w:t>
+      </w:r>
+      <w:r>
+        <w:rPr>
+          <w:rFonts w:hint="eastAsia"/>
+        </w:rPr>
+        <w:t>篩選框模組化</w:t>
+      </w:r>
+    </w:p>
+    <w:p>
+      <w:pPr>
+        <w:rPr>
+          <w:lang w:eastAsia="zh-CN"/>
+        </w:rPr>
+      </w:pPr>
+      <w:sdt>
+        <w:sdtPr>
+          <w:rPr>
+            <w:rFonts w:hint="eastAsia"/>
+            <w:lang w:eastAsia="zh-CN"/>
+          </w:rPr>
+          <w:id w:val="331803082"/>
+          <w14:checkbox>
+            <w14:checked w14:val="0"/>
+            <w14:checkedState w14:val="2612" w14:font="MS Gothic"/>
+            <w14:uncheckedState w14:val="2610" w14:font="MS Gothic"/>
+          </w14:checkbox>
+        </w:sdtPr>
+        <w:sdtContent>
+          <w:r>
+            <w:rPr>
+              <w:rFonts w:ascii="MS Gothic" w:eastAsia="MS Gothic" w:hAnsi="MS Gothic" w:hint="eastAsia"/>
+              <w:lang w:eastAsia="zh-CN"/>
+            </w:rPr>
+            <w:t>☐</w:t>
+          </w:r>
+        </w:sdtContent>
+      </w:sdt>
+      <w:r>
+        <w:rPr>
+          <w:rFonts w:eastAsia="DengXian" w:hint="eastAsia"/>
+          <w:lang w:eastAsia="zh-CN"/>
+        </w:rPr>
+        <w:t xml:space="preserve"> 地标素材更换</w:t>
+      </w:r>
+    </w:p>
+    <w:p>
+      <w:pPr>
+        <w:rPr>
+          <w:rFonts w:eastAsia="DengXian"/>
+          <w:lang w:eastAsia="zh-CN"/>
+        </w:rPr>
+      </w:pPr>
+      <w:sdt>
+        <w:sdtPr>
+          <w:rPr>
+            <w:rFonts w:hint="eastAsia"/>
+            <w:lang w:eastAsia="zh-CN"/>
+          </w:rPr>
+          <w:id w:val="1279837064"/>
+          <w14:checkbox>
+            <w14:checked w14:val="0"/>
+            <w14:checkedState w14:val="2612" w14:font="MS Gothic"/>
+            <w14:uncheckedState w14:val="2610" w14:font="MS Gothic"/>
+          </w14:checkbox>
+        </w:sdtPr>
+        <w:sdtContent>
+          <w:r>
+            <w:rPr>
+              <w:rFonts w:ascii="MS Gothic" w:eastAsia="MS Gothic" w:hAnsi="MS Gothic" w:hint="eastAsia"/>
+              <w:lang w:eastAsia="zh-CN"/>
+            </w:rPr>
+            <w:t>☐</w:t>
+          </w:r>
+        </w:sdtContent>
+      </w:sdt>
+      <w:r>
+        <w:rPr>
+          <w:rFonts w:hint="eastAsia"/>
+          <w:lang w:eastAsia="zh-CN"/>
+        </w:rPr>
+        <w:t xml:space="preserve"> </w:t>
+      </w:r>
+      <w:r>
+        <w:rPr>
+          <w:rFonts w:eastAsia="DengXian" w:hint="eastAsia"/>
+          <w:lang w:eastAsia="zh-CN"/>
+        </w:rPr>
+        <w:t>分类素材更换</w:t>
+      </w:r>
+    </w:p>
+    <w:p>
+      <w:sdt>
+        <w:sdtPr>
+          <w:rPr>
+            <w:rFonts w:hint="eastAsia"/>
+            <w:lang w:eastAsia="zh-CN"/>
+          </w:rPr>
+          <w:id w:val="-1040277379"/>
+          <w14:checkbox>
+            <w14:checked w14:val="0"/>
+            <w14:checkedState w14:val="2612" w14:font="MS Gothic"/>
+            <w14:uncheckedState w14:val="2610" w14:font="MS Gothic"/>
+          </w14:checkbox>
+        </w:sdtPr>
+        <w:sdtContent>
+          <w:r>
+            <w:rPr>
+              <w:rFonts w:ascii="MS Gothic" w:eastAsia="MS Gothic" w:hAnsi="MS Gothic" w:hint="eastAsia"/>
+              <w:lang w:eastAsia="zh-CN"/>
+            </w:rPr>
+            <w:t>☐</w:t>
+          </w:r>
+        </w:sdtContent>
+      </w:sdt>
+      <w:r>
+        <w:rPr>
+          <w:rFonts w:eastAsia="DengXian" w:hint="eastAsia"/>
+          <w:lang w:eastAsia="zh-CN"/>
+        </w:rPr>
+        <w:t xml:space="preserve"> Info动画调整</w:t>
+      </w:r>
+    </w:p>
+    <w:p>
+      <w:sdt>
+        <w:sdtPr>
+          <w:rPr>
+            <w:rFonts w:hint="eastAsia"/>
+          </w:rPr>
+          <w:id w:val="1319919900"/>
+          <w14:checkbox>
+            <w14:checked w14:val="0"/>
+            <w14:checkedState w14:val="2612" w14:font="MS Gothic"/>
+            <w14:uncheckedState w14:val="2610" w14:font="MS Gothic"/>
+          </w14:checkbox>
+        </w:sdtPr>
+        <w:sdtContent>
+          <w:r>
+            <w:rPr>
+              <w:rFonts w:ascii="MS Gothic" w:eastAsia="MS Gothic" w:hAnsi="MS Gothic" w:hint="eastAsia"/>
+            </w:rPr>
+            <w:t>☐</w:t>
+          </w:r>
+        </w:sdtContent>
+      </w:sdt>
+      <w:r>
+        <w:rPr>
+          <w:rFonts w:eastAsia="DengXian" w:hint="eastAsia"/>
+        </w:rPr>
+        <w:t xml:space="preserve"> </w:t>
+      </w:r>
+      <w:r>
+        <w:t>M</w:t>
+      </w:r>
+      <w:r>
+        <w:rPr>
+          <w:rFonts w:hint="eastAsia"/>
+        </w:rPr>
+        <w:t>ap</w:t>
+      </w:r>
+      <w:r>
+        <w:rPr>
+          <w:rFonts w:hint="eastAsia"/>
+        </w:rPr>
+        <w:t>手機端內容及布局、數據串聯</w:t>
+      </w:r>
+    </w:p>
+    <w:p>
+      <w:pPr>
+        <w:rPr>
+          <w:rFonts w:eastAsia="DengXian"/>
+          <w:lang w:eastAsia="zh-CN"/>
+        </w:rPr>
+      </w:pPr>
+      <w:sdt>
+        <w:sdtPr>
+          <w:rPr>
+            <w:rFonts w:hint="eastAsia"/>
+            <w:lang w:eastAsia="zh-CN"/>
+          </w:rPr>
+          <w:id w:val="-647982811"/>
+          <w14:checkbox>
+            <w14:checked w14:val="0"/>
+            <w14:checkedState w14:val="2612" w14:font="MS Gothic"/>
+            <w14:uncheckedState w14:val="2610" w14:font="MS Gothic"/>
+          </w14:checkbox>
+        </w:sdtPr>
+        <w:sdtContent>
+          <w:r>
+            <w:rPr>
+              <w:rFonts w:ascii="MS Gothic" w:eastAsia="MS Gothic" w:hAnsi="MS Gothic" w:hint="eastAsia"/>
+              <w:lang w:eastAsia="zh-CN"/>
+            </w:rPr>
+            <w:t>☐</w:t>
+          </w:r>
+        </w:sdtContent>
+      </w:sdt>
+      <w:r>
+        <w:rPr>
+          <w:rFonts w:eastAsia="DengXian" w:hint="eastAsia"/>
+          <w:lang w:eastAsia="zh-CN"/>
+        </w:rPr>
+        <w:t xml:space="preserve"> 地图页图标选取困难</w:t>
+      </w:r>
+    </w:p>
+    <w:p>
+      <w:pPr>
+        <w:rPr>
+          <w:rFonts w:eastAsia="DengXian" w:hint="eastAsia"/>
+          <w:lang w:eastAsia="zh-CN"/>
+        </w:rPr>
+      </w:pPr>
+      <w:sdt>
+        <w:sdtPr>
+          <w:rPr>
+            <w:rFonts w:hint="eastAsia"/>
+            <w:lang w:eastAsia="zh-CN"/>
+          </w:rPr>
+          <w:id w:val="-877315111"/>
+          <w14:checkbox>
+            <w14:checked w14:val="0"/>
+            <w14:checkedState w14:val="2612" w14:font="MS Gothic"/>
+            <w14:uncheckedState w14:val="2610" w14:font="MS Gothic"/>
+          </w14:checkbox>
+        </w:sdtPr>
+        <w:sdtContent>
+          <w:r>
+            <w:rPr>
+              <w:rFonts w:ascii="MS Gothic" w:eastAsia="MS Gothic" w:hAnsi="MS Gothic" w:hint="eastAsia"/>
+              <w:lang w:eastAsia="zh-CN"/>
+            </w:rPr>
+            <w:t>☐</w:t>
+          </w:r>
+        </w:sdtContent>
+      </w:sdt>
+      <w:r>
+        <w:rPr>
+          <w:rFonts w:eastAsia="DengXian" w:hint="eastAsia"/>
+          <w:lang w:eastAsia="zh-CN"/>
+        </w:rPr>
+        <w:t xml:space="preserve"> 地图页图标选取后，手机</w:t>
+      </w:r>
+      <w:proofErr w:type="gramStart"/>
+      <w:r>
+        <w:rPr>
+          <w:rFonts w:eastAsia="DengXian" w:hint="eastAsia"/>
+          <w:lang w:eastAsia="zh-CN"/>
+        </w:rPr>
+        <w:t>端保持</w:t>
+      </w:r>
+      <w:proofErr w:type="gramEnd"/>
+      <w:r>
+        <w:rPr>
+          <w:rFonts w:eastAsia="DengXian" w:hint="eastAsia"/>
+          <w:lang w:eastAsia="zh-CN"/>
+        </w:rPr>
+        <w:t>配角呈现选取店家</w:t>
+      </w:r>
+    </w:p>
+    <w:p>
+      <w:pPr>
+        <w:rPr>
+          <w:rFonts w:hint="eastAsia"/>
+        </w:rPr>
+      </w:pPr>
+      <w:sdt>
+        <w:sdtPr>
+          <w:rPr>
+            <w:rFonts w:hint="eastAsia"/>
+          </w:rPr>
+          <w:id w:val="556054424"/>
+          <w14:checkbox>
+            <w14:checked w14:val="0"/>
+            <w14:checkedState w14:val="2612" w14:font="MS Gothic"/>
+            <w14:uncheckedState w14:val="2610" w14:font="MS Gothic"/>
+          </w14:checkbox>
+        </w:sdtPr>
+        <w:sdtContent>
+          <w:r>
+            <w:rPr>
+              <w:rFonts w:ascii="MS Gothic" w:eastAsia="MS Gothic" w:hAnsi="MS Gothic" w:hint="eastAsia"/>
+            </w:rPr>
+            <w:t>☐</w:t>
+          </w:r>
+        </w:sdtContent>
+      </w:sdt>
+      <w:r>
+        <w:rPr>
+          <w:rFonts w:eastAsia="DengXian" w:hint="eastAsia"/>
+          <w:lang w:eastAsia="zh-CN"/>
+        </w:rPr>
+        <w:t xml:space="preserve"> </w:t>
+      </w:r>
+      <w:r>
+        <w:t>A</w:t>
+      </w:r>
+      <w:r>
+        <w:rPr>
+          <w:rFonts w:hint="eastAsia"/>
+        </w:rPr>
+        <w:t>bout</w:t>
+      </w:r>
+      <w:r>
+        <w:rPr>
+          <w:rFonts w:hint="eastAsia"/>
+        </w:rPr>
+        <w:t>內容及布局</w:t>
       </w:r>
     </w:p>
     <w:p>
@@ -247,94 +643,6 @@
       </w:r>
     </w:p>
     <w:p>
-      <w:pPr>
-        <w:rPr>
-          <w:rFonts w:eastAsia="DengXian" w:hint="eastAsia"/>
-          <w:lang w:eastAsia="zh-CN"/>
-        </w:rPr>
-      </w:pPr>
-      <w:sdt>
-        <w:sdtPr>
-          <w:rPr>
-            <w:rFonts w:hint="eastAsia"/>
-          </w:rPr>
-          <w:id w:val="-229227625"/>
-          <w14:checkbox>
-            <w14:checked w14:val="0"/>
-            <w14:checkedState w14:val="2612" w14:font="MS Gothic"/>
-            <w14:uncheckedState w14:val="2610" w14:font="MS Gothic"/>
-          </w14:checkbox>
-        </w:sdtPr>
-        <w:sdtContent>
-          <w:r>
-            <w:rPr>
-              <w:rFonts w:ascii="MS Gothic" w:eastAsia="MS Gothic" w:hAnsi="MS Gothic" w:hint="eastAsia"/>
-            </w:rPr>
-            <w:t>☐</w:t>
-          </w:r>
-        </w:sdtContent>
-      </w:sdt>
-      <w:r>
-        <w:rPr>
-          <w:rFonts w:hint="eastAsia"/>
-        </w:rPr>
-        <w:t xml:space="preserve"> shopDetail</w:t>
-      </w:r>
-      <w:r>
-        <w:rPr>
-          <w:rFonts w:hint="eastAsia"/>
-        </w:rPr>
-        <w:t>返回</w:t>
-      </w:r>
-      <w:r>
-        <w:rPr>
-          <w:rFonts w:hint="eastAsia"/>
-        </w:rPr>
-        <w:t>shops</w:t>
-      </w:r>
-      <w:r>
-        <w:rPr>
-          <w:rFonts w:hint="eastAsia"/>
-        </w:rPr>
-        <w:t>未維持原位</w:t>
-      </w:r>
-    </w:p>
-    <w:p>
-      <w:sdt>
-        <w:sdtPr>
-          <w:rPr>
-            <w:rFonts w:hint="eastAsia"/>
-          </w:rPr>
-          <w:id w:val="-46840429"/>
-          <w14:checkbox>
-            <w14:checked w14:val="0"/>
-            <w14:checkedState w14:val="2612" w14:font="MS Gothic"/>
-            <w14:uncheckedState w14:val="2610" w14:font="MS Gothic"/>
-          </w14:checkbox>
-        </w:sdtPr>
-        <w:sdtContent>
-          <w:r>
-            <w:rPr>
-              <w:rFonts w:ascii="MS Gothic" w:eastAsia="MS Gothic" w:hAnsi="MS Gothic" w:hint="eastAsia"/>
-            </w:rPr>
-            <w:t>☐</w:t>
-          </w:r>
-        </w:sdtContent>
-      </w:sdt>
-      <w:r>
-        <w:rPr>
-          <w:rFonts w:eastAsia="DengXian" w:hint="eastAsia"/>
-        </w:rPr>
-        <w:t xml:space="preserve"> </w:t>
-      </w:r>
-      <w:r>
-        <w:rPr>
-          <w:rFonts w:hint="eastAsia"/>
-        </w:rPr>
-        <w:t>篩選框模組化</w:t>
-      </w:r>
-    </w:p>
-    <w:p>
       <w:sdt>
         <w:sdtPr>
           <w:rPr>
@@ -399,75 +707,29 @@
         <w:rPr>
           <w:rFonts w:hint="eastAsia"/>
         </w:rPr>
-        <w:t>、跳轉</w:t>
-      </w:r>
+        <w:t>、</w:t>
+      </w:r>
+      <w:proofErr w:type="gramStart"/>
+      <w:r>
+        <w:rPr>
+          <w:rFonts w:hint="eastAsia"/>
+        </w:rPr>
+        <w:t>跳轉</w:t>
+      </w:r>
+      <w:proofErr w:type="spellStart"/>
+      <w:proofErr w:type="gramEnd"/>
       <w:r>
         <w:rPr>
           <w:rFonts w:hint="eastAsia"/>
         </w:rPr>
         <w:t>shopDetail</w:t>
       </w:r>
+      <w:proofErr w:type="spellEnd"/>
       <w:r>
         <w:rPr>
           <w:rFonts w:hint="eastAsia"/>
         </w:rPr>
         <w:t>邏輯沒寫</w:t>
-      </w:r>
-    </w:p>
-    <w:p>
-      <w:sdt>
-        <w:sdtPr>
-          <w:rPr>
-            <w:rFonts w:hint="eastAsia"/>
-          </w:rPr>
-          <w:id w:val="1319919900"/>
-          <w14:checkbox>
-            <w14:checked w14:val="0"/>
-            <w14:checkedState w14:val="2612" w14:font="MS Gothic"/>
-            <w14:uncheckedState w14:val="2610" w14:font="MS Gothic"/>
-          </w14:checkbox>
-        </w:sdtPr>
-        <w:sdtContent>
-          <w:r>
-            <w:rPr>
-              <w:rFonts w:ascii="MS Gothic" w:eastAsia="MS Gothic" w:hAnsi="MS Gothic" w:hint="eastAsia"/>
-            </w:rPr>
-            <w:t>☐</w:t>
-          </w:r>
-        </w:sdtContent>
-      </w:sdt>
-      <w:r>
-        <w:rPr>
-          <w:rFonts w:eastAsia="DengXian" w:hint="eastAsia"/>
-        </w:rPr>
-        <w:t xml:space="preserve"> </w:t>
-      </w:r>
-      <w:r>
-        <w:t>M</w:t>
-      </w:r>
-      <w:r>
-        <w:rPr>
-          <w:rFonts w:hint="eastAsia"/>
-        </w:rPr>
-        <w:t>ap</w:t>
-      </w:r>
-      <w:r>
-        <w:rPr>
-          <w:rFonts w:hint="eastAsia"/>
-        </w:rPr>
-        <w:t>手機端</w:t>
-      </w:r>
-      <w:r>
-        <w:rPr>
-          <w:rFonts w:hint="eastAsia"/>
-        </w:rPr>
-        <w:t>內容及</w:t>
-      </w:r>
-      <w:r>
-        <w:rPr>
-          <w:rFonts w:hint="eastAsia"/>
-        </w:rPr>
-        <w:t>布局、數據串聯</w:t>
       </w:r>
     </w:p>
     <w:p>
@@ -516,8 +778,16 @@
         <w:rPr>
           <w:rFonts w:hint="eastAsia"/>
         </w:rPr>
-        <w:t>店家詳情頁跳轉</w:t>
-      </w:r>
+        <w:t>店家詳情</w:t>
+      </w:r>
+      <w:proofErr w:type="gramStart"/>
+      <w:r>
+        <w:rPr>
+          <w:rFonts w:hint="eastAsia"/>
+        </w:rPr>
+        <w:t>頁跳轉</w:t>
+      </w:r>
+      <w:proofErr w:type="gramEnd"/>
       <w:r>
         <w:rPr>
           <w:rFonts w:eastAsia="DengXian" w:hint="eastAsia"/>
@@ -559,7 +829,6 @@
       <w:pPr>
         <w:rPr>
           <w:rFonts w:eastAsia="DengXian"/>
-          <w:lang w:eastAsia="zh-CN"/>
         </w:rPr>
       </w:pPr>
       <w:sdt>
@@ -569,7 +838,7 @@
           </w:rPr>
           <w:id w:val="165526304"/>
           <w14:checkbox>
-            <w14:checked w14:val="0"/>
+            <w14:checked w14:val="1"/>
             <w14:checkedState w14:val="2612" w14:font="MS Gothic"/>
             <w14:uncheckedState w14:val="2610" w14:font="MS Gothic"/>
           </w14:checkbox>
@@ -579,7 +848,7 @@
             <w:rPr>
               <w:rFonts w:ascii="MS Gothic" w:eastAsia="MS Gothic" w:hAnsi="MS Gothic" w:hint="eastAsia"/>
             </w:rPr>
-            <w:t>☐</w:t>
+            <w:t>☒</w:t>
           </w:r>
         </w:sdtContent>
       </w:sdt>
@@ -612,143 +881,6 @@
           <w:rFonts w:hint="eastAsia"/>
         </w:rPr>
         <w:t>點手機會直接選到店家</w:t>
-      </w:r>
-    </w:p>
-    <w:p>
-      <w:pPr>
-        <w:rPr>
-          <w:rFonts w:eastAsia="DengXian"/>
-          <w:lang w:eastAsia="zh-CN"/>
-        </w:rPr>
-      </w:pPr>
-      <w:sdt>
-        <w:sdtPr>
-          <w:rPr>
-            <w:rFonts w:hint="eastAsia"/>
-          </w:rPr>
-          <w:id w:val="-647982811"/>
-          <w14:checkbox>
-            <w14:checked w14:val="0"/>
-            <w14:checkedState w14:val="2612" w14:font="MS Gothic"/>
-            <w14:uncheckedState w14:val="2610" w14:font="MS Gothic"/>
-          </w14:checkbox>
-        </w:sdtPr>
-        <w:sdtContent>
-          <w:r>
-            <w:rPr>
-              <w:rFonts w:ascii="MS Gothic" w:eastAsia="MS Gothic" w:hAnsi="MS Gothic" w:hint="eastAsia"/>
-            </w:rPr>
-            <w:t>☐</w:t>
-          </w:r>
-        </w:sdtContent>
-      </w:sdt>
-      <w:r>
-        <w:rPr>
-          <w:rFonts w:eastAsia="DengXian" w:hint="eastAsia"/>
-          <w:lang w:eastAsia="zh-CN"/>
-        </w:rPr>
-        <w:t xml:space="preserve"> 地图页图标选取困难</w:t>
-      </w:r>
-    </w:p>
-    <w:p>
-      <w:pPr>
-        <w:rPr>
-          <w:rFonts w:eastAsia="DengXian" w:hint="eastAsia"/>
-          <w:lang w:eastAsia="zh-CN"/>
-        </w:rPr>
-      </w:pPr>
-      <w:sdt>
-        <w:sdtPr>
-          <w:rPr>
-            <w:rFonts w:hint="eastAsia"/>
-          </w:rPr>
-          <w:id w:val="-877315111"/>
-          <w14:checkbox>
-            <w14:checked w14:val="0"/>
-            <w14:checkedState w14:val="2612" w14:font="MS Gothic"/>
-            <w14:uncheckedState w14:val="2610" w14:font="MS Gothic"/>
-          </w14:checkbox>
-        </w:sdtPr>
-        <w:sdtContent>
-          <w:r>
-            <w:rPr>
-              <w:rFonts w:ascii="MS Gothic" w:eastAsia="MS Gothic" w:hAnsi="MS Gothic" w:hint="eastAsia"/>
-            </w:rPr>
-            <w:t>☐</w:t>
-          </w:r>
-        </w:sdtContent>
-      </w:sdt>
-      <w:r>
-        <w:rPr>
-          <w:rFonts w:eastAsia="DengXian" w:hint="eastAsia"/>
-          <w:lang w:eastAsia="zh-CN"/>
-        </w:rPr>
-        <w:t xml:space="preserve"> </w:t>
-      </w:r>
-      <w:r>
-        <w:rPr>
-          <w:rFonts w:eastAsia="DengXian" w:hint="eastAsia"/>
-          <w:lang w:eastAsia="zh-CN"/>
-        </w:rPr>
-        <w:t>地图页图标选取</w:t>
-      </w:r>
-      <w:r>
-        <w:rPr>
-          <w:rFonts w:eastAsia="DengXian" w:hint="eastAsia"/>
-          <w:lang w:eastAsia="zh-CN"/>
-        </w:rPr>
-        <w:t>后，手机端保持配角呈现选取店家</w:t>
-      </w:r>
-    </w:p>
-    <w:p>
-      <w:sdt>
-        <w:sdtPr>
-          <w:rPr>
-            <w:rFonts w:hint="eastAsia"/>
-          </w:rPr>
-          <w:id w:val="556054424"/>
-          <w14:checkbox>
-            <w14:checked w14:val="0"/>
-            <w14:checkedState w14:val="2612" w14:font="MS Gothic"/>
-            <w14:uncheckedState w14:val="2610" w14:font="MS Gothic"/>
-          </w14:checkbox>
-        </w:sdtPr>
-        <w:sdtContent>
-          <w:r>
-            <w:rPr>
-              <w:rFonts w:ascii="MS Gothic" w:eastAsia="MS Gothic" w:hAnsi="MS Gothic" w:hint="eastAsia"/>
-            </w:rPr>
-            <w:t>☐</w:t>
-          </w:r>
-        </w:sdtContent>
-      </w:sdt>
-      <w:r>
-        <w:rPr>
-          <w:rFonts w:eastAsia="DengXian" w:hint="eastAsia"/>
-          <w:lang w:eastAsia="zh-CN"/>
-        </w:rPr>
-        <w:t xml:space="preserve"> </w:t>
-      </w:r>
-      <w:r>
-        <w:t>A</w:t>
-      </w:r>
-      <w:r>
-        <w:rPr>
-          <w:rFonts w:hint="eastAsia"/>
-        </w:rPr>
-        <w:t>bout</w:t>
-      </w:r>
-      <w:r>
-        <w:rPr>
-          <w:rFonts w:hint="eastAsia"/>
-        </w:rPr>
-        <w:t>內容及</w:t>
-      </w:r>
-      <w:r>
-        <w:rPr>
-          <w:rFonts w:hint="eastAsia"/>
-        </w:rPr>
-        <w:t>布局</w:t>
       </w:r>
     </w:p>
     <w:p>
@@ -854,8 +986,16 @@
         <w:rPr>
           <w:rFonts w:hint="eastAsia"/>
         </w:rPr>
-        <w:t xml:space="preserve"> shopDetail</w:t>
-      </w:r>
+        <w:t xml:space="preserve"> </w:t>
+      </w:r>
+      <w:proofErr w:type="spellStart"/>
+      <w:r>
+        <w:rPr>
+          <w:rFonts w:hint="eastAsia"/>
+        </w:rPr>
+        <w:t>shopDetail</w:t>
+      </w:r>
+      <w:proofErr w:type="spellEnd"/>
       <w:r>
         <w:rPr>
           <w:rFonts w:hint="eastAsia"/>
@@ -891,18 +1031,22 @@
         </w:rPr>
         <w:t xml:space="preserve"> </w:t>
       </w:r>
+      <w:proofErr w:type="gramStart"/>
       <w:r>
         <w:rPr>
           <w:rFonts w:hint="eastAsia"/>
         </w:rPr>
         <w:t>跳轉</w:t>
       </w:r>
+      <w:proofErr w:type="spellStart"/>
+      <w:proofErr w:type="gramEnd"/>
       <w:r>
         <w:rPr>
           <w:rFonts w:hint="eastAsia"/>
         </w:rPr>
         <w:t>shopDetail</w:t>
       </w:r>
+      <w:proofErr w:type="spellEnd"/>
       <w:r>
         <w:rPr>
           <w:rFonts w:hint="eastAsia"/>
@@ -944,12 +1088,14 @@
         </w:rPr>
         <w:t xml:space="preserve"> </w:t>
       </w:r>
+      <w:proofErr w:type="gramStart"/>
       <w:r>
         <w:rPr>
           <w:rFonts w:hint="eastAsia"/>
         </w:rPr>
         <w:t>缺少置頂按鍵</w:t>
       </w:r>
+      <w:proofErr w:type="gramEnd"/>
     </w:p>
     <w:p>
       <w:pPr>
@@ -1032,44 +1178,6 @@
           <w:lang w:eastAsia="zh-CN"/>
         </w:rPr>
         <w:t xml:space="preserve"> 营业时间超过5个要换行呈现（如3+3 / 3+4）</w:t>
-      </w:r>
-    </w:p>
-    <w:p>
-      <w:pPr>
-        <w:rPr>
-          <w:rFonts w:eastAsia="DengXian" w:hint="eastAsia"/>
-          <w:lang w:eastAsia="zh-CN"/>
-        </w:rPr>
-      </w:pPr>
-      <w:sdt>
-        <w:sdtPr>
-          <w:rPr>
-            <w:rFonts w:hint="eastAsia"/>
-            <w:lang w:eastAsia="zh-CN"/>
-          </w:rPr>
-          <w:id w:val="331803082"/>
-          <w14:checkbox>
-            <w14:checked w14:val="0"/>
-            <w14:checkedState w14:val="2612" w14:font="MS Gothic"/>
-            <w14:uncheckedState w14:val="2610" w14:font="MS Gothic"/>
-          </w14:checkbox>
-        </w:sdtPr>
-        <w:sdtContent>
-          <w:r>
-            <w:rPr>
-              <w:rFonts w:ascii="MS Gothic" w:eastAsia="MS Gothic" w:hAnsi="MS Gothic" w:hint="eastAsia"/>
-              <w:lang w:eastAsia="zh-CN"/>
-            </w:rPr>
-            <w:t>☐</w:t>
-          </w:r>
-        </w:sdtContent>
-      </w:sdt>
-      <w:r>
-        <w:rPr>
-          <w:rFonts w:eastAsia="DengXian" w:hint="eastAsia"/>
-          <w:lang w:eastAsia="zh-CN"/>
-        </w:rPr>
-        <w:t xml:space="preserve"> 地标素材更换</w:t>
       </w:r>
     </w:p>
     <w:p>
@@ -1476,7 +1584,35 @@
         <w:rPr>
           <w:rFonts w:hint="eastAsia"/>
         </w:rPr>
-        <w:t>不要五角圖，放食材、食材圖片和食材功用</w:t>
+        <w:t>不要五角圖，</w:t>
+      </w:r>
+      <w:proofErr w:type="gramStart"/>
+      <w:r>
+        <w:rPr>
+          <w:rFonts w:hint="eastAsia"/>
+        </w:rPr>
+        <w:t>放食材</w:t>
+      </w:r>
+      <w:proofErr w:type="gramEnd"/>
+      <w:r>
+        <w:rPr>
+          <w:rFonts w:hint="eastAsia"/>
+        </w:rPr>
+        <w:t>、食材圖片和</w:t>
+      </w:r>
+      <w:proofErr w:type="gramStart"/>
+      <w:r>
+        <w:rPr>
+          <w:rFonts w:hint="eastAsia"/>
+        </w:rPr>
+        <w:t>食材</w:t>
+      </w:r>
+      <w:proofErr w:type="gramEnd"/>
+      <w:r>
+        <w:rPr>
+          <w:rFonts w:hint="eastAsia"/>
+        </w:rPr>
+        <w:t>功用</w:t>
       </w:r>
       <w:r>
         <w:rPr>
@@ -1626,12 +1762,14 @@
         </w:rPr>
         <w:t>8.</w:t>
       </w:r>
+      <w:proofErr w:type="gramStart"/>
       <w:r>
         <w:rPr>
           <w:rFonts w:hint="eastAsia"/>
         </w:rPr>
         <w:t>跳轉邏輯</w:t>
       </w:r>
+      <w:proofErr w:type="gramEnd"/>
     </w:p>
     <w:p>
       <w:r>

</xml_diff>

<commit_message>
0.4.15 refactor: modularize shop filters and unify transport data
</commit_message>
<xml_diff>
--- a/TO DO.docx
+++ b/TO DO.docx
@@ -93,7 +93,7 @@
     <w:p>
       <w:pPr>
         <w:rPr>
-          <w:rFonts w:eastAsia="DengXian" w:hint="eastAsia"/>
+          <w:rFonts w:eastAsia="DengXian"/>
           <w:lang w:eastAsia="zh-CN"/>
         </w:rPr>
       </w:pPr>
@@ -122,16 +122,8 @@
         <w:rPr>
           <w:rFonts w:hint="eastAsia"/>
         </w:rPr>
-        <w:t xml:space="preserve"> </w:t>
-      </w:r>
-      <w:proofErr w:type="spellStart"/>
-      <w:r>
-        <w:rPr>
-          <w:rFonts w:hint="eastAsia"/>
-        </w:rPr>
-        <w:t>shopDetail</w:t>
-      </w:r>
-      <w:proofErr w:type="spellEnd"/>
+        <w:t xml:space="preserve"> shopDetail</w:t>
+      </w:r>
       <w:r>
         <w:rPr>
           <w:rFonts w:hint="eastAsia"/>
@@ -152,6 +144,12 @@
       </w:r>
     </w:p>
     <w:p>
+      <w:pPr>
+        <w:rPr>
+          <w:rFonts w:eastAsia="DengXian"/>
+          <w:lang w:eastAsia="zh-CN"/>
+        </w:rPr>
+      </w:pPr>
       <w:sdt>
         <w:sdtPr>
           <w:rPr>
@@ -159,7 +157,7 @@
           </w:rPr>
           <w:id w:val="-46840429"/>
           <w14:checkbox>
-            <w14:checked w14:val="0"/>
+            <w14:checked w14:val="1"/>
             <w14:checkedState w14:val="2612" w14:font="MS Gothic"/>
             <w14:uncheckedState w14:val="2610" w14:font="MS Gothic"/>
           </w14:checkbox>
@@ -169,7 +167,7 @@
             <w:rPr>
               <w:rFonts w:ascii="MS Gothic" w:eastAsia="MS Gothic" w:hAnsi="MS Gothic" w:hint="eastAsia"/>
             </w:rPr>
-            <w:t>☐</w:t>
+            <w:t>☒</w:t>
           </w:r>
         </w:sdtContent>
       </w:sdt>
@@ -200,7 +198,7 @@
           </w:rPr>
           <w:id w:val="331803082"/>
           <w14:checkbox>
-            <w14:checked w14:val="0"/>
+            <w14:checked w14:val="1"/>
             <w14:checkedState w14:val="2612" w14:font="MS Gothic"/>
             <w14:uncheckedState w14:val="2610" w14:font="MS Gothic"/>
           </w14:checkbox>
@@ -211,7 +209,7 @@
               <w:rFonts w:ascii="MS Gothic" w:eastAsia="MS Gothic" w:hAnsi="MS Gothic" w:hint="eastAsia"/>
               <w:lang w:eastAsia="zh-CN"/>
             </w:rPr>
-            <w:t>☐</w:t>
+            <w:t>☒</w:t>
           </w:r>
         </w:sdtContent>
       </w:sdt>
@@ -238,7 +236,7 @@
           </w:rPr>
           <w:id w:val="1279837064"/>
           <w14:checkbox>
-            <w14:checked w14:val="0"/>
+            <w14:checked w14:val="1"/>
             <w14:checkedState w14:val="2612" w14:font="MS Gothic"/>
             <w14:uncheckedState w14:val="2610" w14:font="MS Gothic"/>
           </w14:checkbox>
@@ -249,7 +247,7 @@
               <w:rFonts w:ascii="MS Gothic" w:eastAsia="MS Gothic" w:hAnsi="MS Gothic" w:hint="eastAsia"/>
               <w:lang w:eastAsia="zh-CN"/>
             </w:rPr>
-            <w:t>☐</w:t>
+            <w:t>☒</w:t>
           </w:r>
         </w:sdtContent>
       </w:sdt>
@@ -301,6 +299,12 @@
       </w:r>
     </w:p>
     <w:p>
+      <w:pPr>
+        <w:rPr>
+          <w:rFonts w:eastAsia="DengXian"/>
+          <w:lang w:eastAsia="zh-CN"/>
+        </w:rPr>
+      </w:pPr>
       <w:sdt>
         <w:sdtPr>
           <w:rPr>
@@ -357,7 +361,44 @@
             <w:rFonts w:hint="eastAsia"/>
             <w:lang w:eastAsia="zh-CN"/>
           </w:rPr>
-          <w:id w:val="-647982811"/>
+          <w:id w:val="1995292174"/>
+          <w14:checkbox>
+            <w14:checked w14:val="1"/>
+            <w14:checkedState w14:val="2612" w14:font="MS Gothic"/>
+            <w14:uncheckedState w14:val="2610" w14:font="MS Gothic"/>
+          </w14:checkbox>
+        </w:sdtPr>
+        <w:sdtContent>
+          <w:r>
+            <w:rPr>
+              <w:rFonts w:ascii="MS Gothic" w:eastAsia="MS Gothic" w:hAnsi="MS Gothic" w:hint="eastAsia"/>
+              <w:lang w:eastAsia="zh-CN"/>
+            </w:rPr>
+            <w:t>☒</w:t>
+          </w:r>
+        </w:sdtContent>
+      </w:sdt>
+      <w:r>
+        <w:rPr>
+          <w:rFonts w:eastAsia="DengXian" w:hint="eastAsia"/>
+          <w:lang w:eastAsia="zh-CN"/>
+        </w:rPr>
+        <w:t xml:space="preserve"> Map 手机端筛选框逻辑优化</w:t>
+      </w:r>
+    </w:p>
+    <w:p>
+      <w:pPr>
+        <w:rPr>
+          <w:rFonts w:eastAsia="DengXian"/>
+          <w:lang w:eastAsia="zh-CN"/>
+        </w:rPr>
+      </w:pPr>
+      <w:sdt>
+        <w:sdtPr>
+          <w:rPr>
+            <w:rFonts w:hint="eastAsia"/>
+          </w:rPr>
+          <w:id w:val="1972936971"/>
           <w14:checkbox>
             <w14:checked w14:val="0"/>
             <w14:checkedState w14:val="2612" w14:font="MS Gothic"/>
@@ -368,7 +409,6 @@
           <w:r>
             <w:rPr>
               <w:rFonts w:ascii="MS Gothic" w:eastAsia="MS Gothic" w:hAnsi="MS Gothic" w:hint="eastAsia"/>
-              <w:lang w:eastAsia="zh-CN"/>
             </w:rPr>
             <w:t>☐</w:t>
           </w:r>
@@ -379,13 +419,27 @@
           <w:rFonts w:eastAsia="DengXian" w:hint="eastAsia"/>
           <w:lang w:eastAsia="zh-CN"/>
         </w:rPr>
-        <w:t xml:space="preserve"> 地图页图标选取困难</w:t>
+        <w:t xml:space="preserve"> 店家</w:t>
+      </w:r>
+      <w:r>
+        <w:rPr>
+          <w:rFonts w:eastAsia="DengXian" w:hint="eastAsia"/>
+          <w:lang w:eastAsia="zh-CN"/>
+        </w:rPr>
+        <w:t>交通方式及时间</w:t>
+      </w:r>
+      <w:r>
+        <w:rPr>
+          <w:rFonts w:eastAsia="DengXian" w:hint="eastAsia"/>
+          <w:lang w:eastAsia="zh-CN"/>
+        </w:rPr>
+        <w:t>data导入</w:t>
       </w:r>
     </w:p>
     <w:p>
       <w:pPr>
         <w:rPr>
-          <w:rFonts w:eastAsia="DengXian" w:hint="eastAsia"/>
+          <w:rFonts w:eastAsia="DengXian"/>
           <w:lang w:eastAsia="zh-CN"/>
         </w:rPr>
       </w:pPr>
@@ -393,9 +447,8 @@
         <w:sdtPr>
           <w:rPr>
             <w:rFonts w:hint="eastAsia"/>
-            <w:lang w:eastAsia="zh-CN"/>
           </w:rPr>
-          <w:id w:val="-877315111"/>
+          <w:id w:val="-1447921097"/>
           <w14:checkbox>
             <w14:checked w14:val="0"/>
             <w14:checkedState w14:val="2612" w14:font="MS Gothic"/>
@@ -406,7 +459,6 @@
           <w:r>
             <w:rPr>
               <w:rFonts w:ascii="MS Gothic" w:eastAsia="MS Gothic" w:hAnsi="MS Gothic" w:hint="eastAsia"/>
-              <w:lang w:eastAsia="zh-CN"/>
             </w:rPr>
             <w:t>☐</w:t>
           </w:r>
@@ -417,29 +469,126 @@
           <w:rFonts w:eastAsia="DengXian" w:hint="eastAsia"/>
           <w:lang w:eastAsia="zh-CN"/>
         </w:rPr>
-        <w:t xml:space="preserve"> 地图页图标选取后，手机</w:t>
-      </w:r>
-      <w:proofErr w:type="gramStart"/>
-      <w:r>
+        <w:t xml:space="preserve"> 店家页根据当前星期调整营业时间</w:t>
+      </w:r>
+    </w:p>
+    <w:p>
+      <w:pPr>
         <w:rPr>
           <w:rFonts w:eastAsia="DengXian" w:hint="eastAsia"/>
           <w:lang w:eastAsia="zh-CN"/>
         </w:rPr>
-        <w:t>端保持</w:t>
-      </w:r>
-      <w:proofErr w:type="gramEnd"/>
+      </w:pPr>
+      <w:sdt>
+        <w:sdtPr>
+          <w:rPr>
+            <w:rFonts w:hint="eastAsia"/>
+          </w:rPr>
+          <w:id w:val="-1094165772"/>
+          <w14:checkbox>
+            <w14:checked w14:val="0"/>
+            <w14:checkedState w14:val="2612" w14:font="MS Gothic"/>
+            <w14:uncheckedState w14:val="2610" w14:font="MS Gothic"/>
+          </w14:checkbox>
+        </w:sdtPr>
+        <w:sdtContent>
+          <w:r>
+            <w:rPr>
+              <w:rFonts w:ascii="MS Gothic" w:eastAsia="MS Gothic" w:hAnsi="MS Gothic" w:hint="eastAsia"/>
+            </w:rPr>
+            <w:t>☐</w:t>
+          </w:r>
+        </w:sdtContent>
+      </w:sdt>
       <w:r>
         <w:rPr>
           <w:rFonts w:eastAsia="DengXian" w:hint="eastAsia"/>
           <w:lang w:eastAsia="zh-CN"/>
         </w:rPr>
-        <w:t>配角呈现选取店家</w:t>
+        <w:t xml:space="preserve"> 店家详情页交通时间数据调整</w:t>
       </w:r>
     </w:p>
     <w:p>
       <w:pPr>
         <w:rPr>
-          <w:rFonts w:hint="eastAsia"/>
+          <w:rFonts w:eastAsia="DengXian"/>
+          <w:lang w:eastAsia="zh-CN"/>
+        </w:rPr>
+      </w:pPr>
+      <w:sdt>
+        <w:sdtPr>
+          <w:rPr>
+            <w:rFonts w:hint="eastAsia"/>
+            <w:lang w:eastAsia="zh-CN"/>
+          </w:rPr>
+          <w:id w:val="-647982811"/>
+          <w14:checkbox>
+            <w14:checked w14:val="1"/>
+            <w14:checkedState w14:val="2612" w14:font="MS Gothic"/>
+            <w14:uncheckedState w14:val="2610" w14:font="MS Gothic"/>
+          </w14:checkbox>
+        </w:sdtPr>
+        <w:sdtContent>
+          <w:r>
+            <w:rPr>
+              <w:rFonts w:ascii="MS Gothic" w:eastAsia="MS Gothic" w:hAnsi="MS Gothic" w:hint="eastAsia"/>
+              <w:lang w:eastAsia="zh-CN"/>
+            </w:rPr>
+            <w:t>☒</w:t>
+          </w:r>
+        </w:sdtContent>
+      </w:sdt>
+      <w:r>
+        <w:rPr>
+          <w:rFonts w:eastAsia="DengXian" w:hint="eastAsia"/>
+          <w:lang w:eastAsia="zh-CN"/>
+        </w:rPr>
+        <w:t xml:space="preserve"> 地图页图标选取困难</w:t>
+      </w:r>
+    </w:p>
+    <w:p>
+      <w:pPr>
+        <w:rPr>
+          <w:rFonts w:eastAsia="DengXian"/>
+          <w:lang w:eastAsia="zh-CN"/>
+        </w:rPr>
+      </w:pPr>
+      <w:sdt>
+        <w:sdtPr>
+          <w:rPr>
+            <w:rFonts w:hint="eastAsia"/>
+            <w:lang w:eastAsia="zh-CN"/>
+          </w:rPr>
+          <w:id w:val="-877315111"/>
+          <w14:checkbox>
+            <w14:checked w14:val="1"/>
+            <w14:checkedState w14:val="2612" w14:font="MS Gothic"/>
+            <w14:uncheckedState w14:val="2610" w14:font="MS Gothic"/>
+          </w14:checkbox>
+        </w:sdtPr>
+        <w:sdtContent>
+          <w:r>
+            <w:rPr>
+              <w:rFonts w:ascii="MS Gothic" w:eastAsia="MS Gothic" w:hAnsi="MS Gothic" w:hint="eastAsia"/>
+              <w:lang w:eastAsia="zh-CN"/>
+            </w:rPr>
+            <w:t>☒</w:t>
+          </w:r>
+        </w:sdtContent>
+      </w:sdt>
+      <w:r>
+        <w:rPr>
+          <w:rFonts w:eastAsia="DengXian" w:hint="eastAsia"/>
+          <w:lang w:eastAsia="zh-CN"/>
+        </w:rPr>
+        <w:t xml:space="preserve"> 地图页图标选取后，手机端保持配角呈现选取店家</w:t>
+      </w:r>
+    </w:p>
+    <w:p>
+      <w:pPr>
+        <w:rPr>
+          <w:rFonts w:eastAsia="DengXian" w:hint="eastAsia"/>
+          <w:lang w:eastAsia="zh-CN"/>
         </w:rPr>
       </w:pPr>
       <w:sdt>
@@ -707,24 +856,14 @@
         <w:rPr>
           <w:rFonts w:hint="eastAsia"/>
         </w:rPr>
-        <w:t>、</w:t>
-      </w:r>
-      <w:proofErr w:type="gramStart"/>
-      <w:r>
-        <w:rPr>
-          <w:rFonts w:hint="eastAsia"/>
-        </w:rPr>
-        <w:t>跳轉</w:t>
-      </w:r>
-      <w:proofErr w:type="spellStart"/>
-      <w:proofErr w:type="gramEnd"/>
+        <w:t>、跳轉</w:t>
+      </w:r>
       <w:r>
         <w:rPr>
           <w:rFonts w:hint="eastAsia"/>
         </w:rPr>
         <w:t>shopDetail</w:t>
       </w:r>
-      <w:proofErr w:type="spellEnd"/>
       <w:r>
         <w:rPr>
           <w:rFonts w:hint="eastAsia"/>
@@ -778,16 +917,8 @@
         <w:rPr>
           <w:rFonts w:hint="eastAsia"/>
         </w:rPr>
-        <w:t>店家詳情</w:t>
-      </w:r>
-      <w:proofErr w:type="gramStart"/>
-      <w:r>
-        <w:rPr>
-          <w:rFonts w:hint="eastAsia"/>
-        </w:rPr>
-        <w:t>頁跳轉</w:t>
-      </w:r>
-      <w:proofErr w:type="gramEnd"/>
+        <w:t>店家詳情頁跳轉</w:t>
+      </w:r>
       <w:r>
         <w:rPr>
           <w:rFonts w:eastAsia="DengXian" w:hint="eastAsia"/>
@@ -986,16 +1117,8 @@
         <w:rPr>
           <w:rFonts w:hint="eastAsia"/>
         </w:rPr>
-        <w:t xml:space="preserve"> </w:t>
-      </w:r>
-      <w:proofErr w:type="spellStart"/>
-      <w:r>
-        <w:rPr>
-          <w:rFonts w:hint="eastAsia"/>
-        </w:rPr>
-        <w:t>shopDetail</w:t>
-      </w:r>
-      <w:proofErr w:type="spellEnd"/>
+        <w:t xml:space="preserve"> shopDetail</w:t>
+      </w:r>
       <w:r>
         <w:rPr>
           <w:rFonts w:hint="eastAsia"/>
@@ -1031,22 +1154,18 @@
         </w:rPr>
         <w:t xml:space="preserve"> </w:t>
       </w:r>
-      <w:proofErr w:type="gramStart"/>
       <w:r>
         <w:rPr>
           <w:rFonts w:hint="eastAsia"/>
         </w:rPr>
         <w:t>跳轉</w:t>
       </w:r>
-      <w:proofErr w:type="spellStart"/>
-      <w:proofErr w:type="gramEnd"/>
       <w:r>
         <w:rPr>
           <w:rFonts w:hint="eastAsia"/>
         </w:rPr>
         <w:t>shopDetail</w:t>
       </w:r>
-      <w:proofErr w:type="spellEnd"/>
       <w:r>
         <w:rPr>
           <w:rFonts w:hint="eastAsia"/>
@@ -1088,19 +1207,17 @@
         </w:rPr>
         <w:t xml:space="preserve"> </w:t>
       </w:r>
-      <w:proofErr w:type="gramStart"/>
       <w:r>
         <w:rPr>
           <w:rFonts w:hint="eastAsia"/>
         </w:rPr>
         <w:t>缺少置頂按鍵</w:t>
       </w:r>
-      <w:proofErr w:type="gramEnd"/>
     </w:p>
     <w:p>
       <w:pPr>
         <w:rPr>
-          <w:rFonts w:eastAsia="DengXian" w:hint="eastAsia"/>
+          <w:rFonts w:eastAsia="DengXian"/>
           <w:lang w:eastAsia="zh-CN"/>
         </w:rPr>
       </w:pPr>
@@ -1584,35 +1701,7 @@
         <w:rPr>
           <w:rFonts w:hint="eastAsia"/>
         </w:rPr>
-        <w:t>不要五角圖，</w:t>
-      </w:r>
-      <w:proofErr w:type="gramStart"/>
-      <w:r>
-        <w:rPr>
-          <w:rFonts w:hint="eastAsia"/>
-        </w:rPr>
-        <w:t>放食材</w:t>
-      </w:r>
-      <w:proofErr w:type="gramEnd"/>
-      <w:r>
-        <w:rPr>
-          <w:rFonts w:hint="eastAsia"/>
-        </w:rPr>
-        <w:t>、食材圖片和</w:t>
-      </w:r>
-      <w:proofErr w:type="gramStart"/>
-      <w:r>
-        <w:rPr>
-          <w:rFonts w:hint="eastAsia"/>
-        </w:rPr>
-        <w:t>食材</w:t>
-      </w:r>
-      <w:proofErr w:type="gramEnd"/>
-      <w:r>
-        <w:rPr>
-          <w:rFonts w:hint="eastAsia"/>
-        </w:rPr>
-        <w:t>功用</w:t>
+        <w:t>不要五角圖，放食材、食材圖片和食材功用</w:t>
       </w:r>
       <w:r>
         <w:rPr>
@@ -1762,14 +1851,12 @@
         </w:rPr>
         <w:t>8.</w:t>
       </w:r>
-      <w:proofErr w:type="gramStart"/>
       <w:r>
         <w:rPr>
           <w:rFonts w:hint="eastAsia"/>
         </w:rPr>
         <w:t>跳轉邏輯</w:t>
       </w:r>
-      <w:proofErr w:type="gramEnd"/>
     </w:p>
     <w:p>
       <w:r>

</xml_diff>

<commit_message>
0.4.18 fix: resolve persistent scroll position during global tab switching
</commit_message>
<xml_diff>
--- a/TO DO.docx
+++ b/TO DO.docx
@@ -104,7 +104,7 @@
           </w:rPr>
           <w:id w:val="-229227625"/>
           <w14:checkbox>
-            <w14:checked w14:val="0"/>
+            <w14:checked w14:val="1"/>
             <w14:checkedState w14:val="2612" w14:font="MS Gothic"/>
             <w14:uncheckedState w14:val="2610" w14:font="MS Gothic"/>
           </w14:checkbox>
@@ -114,7 +114,7 @@
             <w:rPr>
               <w:rFonts w:ascii="MS Gothic" w:eastAsia="MS Gothic" w:hAnsi="MS Gothic" w:hint="eastAsia"/>
             </w:rPr>
-            <w:t>☐</w:t>
+            <w:t>☒</w:t>
           </w:r>
         </w:sdtContent>
       </w:sdt>
@@ -122,8 +122,16 @@
         <w:rPr>
           <w:rFonts w:hint="eastAsia"/>
         </w:rPr>
-        <w:t xml:space="preserve"> shopDetail</w:t>
-      </w:r>
+        <w:t xml:space="preserve"> </w:t>
+      </w:r>
+      <w:proofErr w:type="spellStart"/>
+      <w:r>
+        <w:rPr>
+          <w:rFonts w:hint="eastAsia"/>
+        </w:rPr>
+        <w:t>shopDetail</w:t>
+      </w:r>
+      <w:proofErr w:type="spellEnd"/>
       <w:r>
         <w:rPr>
           <w:rFonts w:hint="eastAsia"/>
@@ -397,6 +405,7 @@
         <w:sdtPr>
           <w:rPr>
             <w:rFonts w:hint="eastAsia"/>
+            <w:lang w:eastAsia="zh-CN"/>
           </w:rPr>
           <w:id w:val="1972936971"/>
           <w14:checkbox>
@@ -409,6 +418,7 @@
           <w:r>
             <w:rPr>
               <w:rFonts w:ascii="MS Gothic" w:eastAsia="MS Gothic" w:hAnsi="MS Gothic" w:hint="eastAsia"/>
+              <w:lang w:eastAsia="zh-CN"/>
             </w:rPr>
             <w:t>☐</w:t>
           </w:r>
@@ -447,6 +457,7 @@
         <w:sdtPr>
           <w:rPr>
             <w:rFonts w:hint="eastAsia"/>
+            <w:lang w:eastAsia="zh-CN"/>
           </w:rPr>
           <w:id w:val="-1447921097"/>
           <w14:checkbox>
@@ -459,6 +470,7 @@
           <w:r>
             <w:rPr>
               <w:rFonts w:ascii="MS Gothic" w:eastAsia="MS Gothic" w:hAnsi="MS Gothic" w:hint="eastAsia"/>
+              <w:lang w:eastAsia="zh-CN"/>
             </w:rPr>
             <w:t>☐</w:t>
           </w:r>
@@ -469,7 +481,23 @@
           <w:rFonts w:eastAsia="DengXian" w:hint="eastAsia"/>
           <w:lang w:eastAsia="zh-CN"/>
         </w:rPr>
-        <w:t xml:space="preserve"> 店家页根据当前星期调整营业时间</w:t>
+        <w:t xml:space="preserve"> 店家</w:t>
+      </w:r>
+      <w:proofErr w:type="gramStart"/>
+      <w:r>
+        <w:rPr>
+          <w:rFonts w:eastAsia="DengXian" w:hint="eastAsia"/>
+          <w:lang w:eastAsia="zh-CN"/>
+        </w:rPr>
+        <w:t>页根据</w:t>
+      </w:r>
+      <w:proofErr w:type="gramEnd"/>
+      <w:r>
+        <w:rPr>
+          <w:rFonts w:eastAsia="DengXian" w:hint="eastAsia"/>
+          <w:lang w:eastAsia="zh-CN"/>
+        </w:rPr>
+        <w:t>当前星期调整营业时间</w:t>
       </w:r>
     </w:p>
     <w:p>
@@ -505,7 +533,23 @@
           <w:rFonts w:eastAsia="DengXian" w:hint="eastAsia"/>
           <w:lang w:eastAsia="zh-CN"/>
         </w:rPr>
-        <w:t xml:space="preserve"> 店家详情页交通时间数据调整</w:t>
+        <w:t xml:space="preserve"> 店家详情</w:t>
+      </w:r>
+      <w:proofErr w:type="gramStart"/>
+      <w:r>
+        <w:rPr>
+          <w:rFonts w:eastAsia="DengXian" w:hint="eastAsia"/>
+          <w:lang w:eastAsia="zh-CN"/>
+        </w:rPr>
+        <w:t>页交通</w:t>
+      </w:r>
+      <w:proofErr w:type="gramEnd"/>
+      <w:r>
+        <w:rPr>
+          <w:rFonts w:eastAsia="DengXian" w:hint="eastAsia"/>
+          <w:lang w:eastAsia="zh-CN"/>
+        </w:rPr>
+        <w:t>时间数据调整</w:t>
       </w:r>
     </w:p>
     <w:p>
@@ -581,7 +625,23 @@
           <w:rFonts w:eastAsia="DengXian" w:hint="eastAsia"/>
           <w:lang w:eastAsia="zh-CN"/>
         </w:rPr>
-        <w:t xml:space="preserve"> 地图页图标选取后，手机端保持配角呈现选取店家</w:t>
+        <w:t xml:space="preserve"> 地图页图标选取后，手机</w:t>
+      </w:r>
+      <w:proofErr w:type="gramStart"/>
+      <w:r>
+        <w:rPr>
+          <w:rFonts w:eastAsia="DengXian" w:hint="eastAsia"/>
+          <w:lang w:eastAsia="zh-CN"/>
+        </w:rPr>
+        <w:t>端保持</w:t>
+      </w:r>
+      <w:proofErr w:type="gramEnd"/>
+      <w:r>
+        <w:rPr>
+          <w:rFonts w:eastAsia="DengXian" w:hint="eastAsia"/>
+          <w:lang w:eastAsia="zh-CN"/>
+        </w:rPr>
+        <w:t>配角呈现选取店家</w:t>
       </w:r>
     </w:p>
     <w:p>
@@ -856,14 +916,24 @@
         <w:rPr>
           <w:rFonts w:hint="eastAsia"/>
         </w:rPr>
-        <w:t>、跳轉</w:t>
-      </w:r>
+        <w:t>、</w:t>
+      </w:r>
+      <w:proofErr w:type="gramStart"/>
+      <w:r>
+        <w:rPr>
+          <w:rFonts w:hint="eastAsia"/>
+        </w:rPr>
+        <w:t>跳轉</w:t>
+      </w:r>
+      <w:proofErr w:type="spellStart"/>
+      <w:proofErr w:type="gramEnd"/>
       <w:r>
         <w:rPr>
           <w:rFonts w:hint="eastAsia"/>
         </w:rPr>
         <w:t>shopDetail</w:t>
       </w:r>
+      <w:proofErr w:type="spellEnd"/>
       <w:r>
         <w:rPr>
           <w:rFonts w:hint="eastAsia"/>
@@ -917,8 +987,16 @@
         <w:rPr>
           <w:rFonts w:hint="eastAsia"/>
         </w:rPr>
-        <w:t>店家詳情頁跳轉</w:t>
-      </w:r>
+        <w:t>店家詳情</w:t>
+      </w:r>
+      <w:proofErr w:type="gramStart"/>
+      <w:r>
+        <w:rPr>
+          <w:rFonts w:hint="eastAsia"/>
+        </w:rPr>
+        <w:t>頁跳轉</w:t>
+      </w:r>
+      <w:proofErr w:type="gramEnd"/>
       <w:r>
         <w:rPr>
           <w:rFonts w:eastAsia="DengXian" w:hint="eastAsia"/>
@@ -1117,8 +1195,16 @@
         <w:rPr>
           <w:rFonts w:hint="eastAsia"/>
         </w:rPr>
-        <w:t xml:space="preserve"> shopDetail</w:t>
-      </w:r>
+        <w:t xml:space="preserve"> </w:t>
+      </w:r>
+      <w:proofErr w:type="spellStart"/>
+      <w:r>
+        <w:rPr>
+          <w:rFonts w:hint="eastAsia"/>
+        </w:rPr>
+        <w:t>shopDetail</w:t>
+      </w:r>
+      <w:proofErr w:type="spellEnd"/>
       <w:r>
         <w:rPr>
           <w:rFonts w:hint="eastAsia"/>
@@ -1154,18 +1240,22 @@
         </w:rPr>
         <w:t xml:space="preserve"> </w:t>
       </w:r>
+      <w:proofErr w:type="gramStart"/>
       <w:r>
         <w:rPr>
           <w:rFonts w:hint="eastAsia"/>
         </w:rPr>
         <w:t>跳轉</w:t>
       </w:r>
+      <w:proofErr w:type="spellStart"/>
+      <w:proofErr w:type="gramEnd"/>
       <w:r>
         <w:rPr>
           <w:rFonts w:hint="eastAsia"/>
         </w:rPr>
         <w:t>shopDetail</w:t>
       </w:r>
+      <w:proofErr w:type="spellEnd"/>
       <w:r>
         <w:rPr>
           <w:rFonts w:hint="eastAsia"/>
@@ -1207,12 +1297,14 @@
         </w:rPr>
         <w:t xml:space="preserve"> </w:t>
       </w:r>
+      <w:proofErr w:type="gramStart"/>
       <w:r>
         <w:rPr>
           <w:rFonts w:hint="eastAsia"/>
         </w:rPr>
         <w:t>缺少置頂按鍵</w:t>
       </w:r>
+      <w:proofErr w:type="gramEnd"/>
     </w:p>
     <w:p>
       <w:pPr>
@@ -1701,7 +1793,35 @@
         <w:rPr>
           <w:rFonts w:hint="eastAsia"/>
         </w:rPr>
-        <w:t>不要五角圖，放食材、食材圖片和食材功用</w:t>
+        <w:t>不要五角圖，</w:t>
+      </w:r>
+      <w:proofErr w:type="gramStart"/>
+      <w:r>
+        <w:rPr>
+          <w:rFonts w:hint="eastAsia"/>
+        </w:rPr>
+        <w:t>放食材</w:t>
+      </w:r>
+      <w:proofErr w:type="gramEnd"/>
+      <w:r>
+        <w:rPr>
+          <w:rFonts w:hint="eastAsia"/>
+        </w:rPr>
+        <w:t>、食材圖片和</w:t>
+      </w:r>
+      <w:proofErr w:type="gramStart"/>
+      <w:r>
+        <w:rPr>
+          <w:rFonts w:hint="eastAsia"/>
+        </w:rPr>
+        <w:t>食材</w:t>
+      </w:r>
+      <w:proofErr w:type="gramEnd"/>
+      <w:r>
+        <w:rPr>
+          <w:rFonts w:hint="eastAsia"/>
+        </w:rPr>
+        <w:t>功用</w:t>
       </w:r>
       <w:r>
         <w:rPr>
@@ -1851,12 +1971,14 @@
         </w:rPr>
         <w:t>8.</w:t>
       </w:r>
+      <w:proofErr w:type="gramStart"/>
       <w:r>
         <w:rPr>
           <w:rFonts w:hint="eastAsia"/>
         </w:rPr>
         <w:t>跳轉邏輯</w:t>
       </w:r>
+      <w:proofErr w:type="gramEnd"/>
     </w:p>
     <w:p>
       <w:r>

</xml_diff>

<commit_message>
0.4.20 refactor: isolate info view animation layers and add tuning comments
</commit_message>
<xml_diff>
--- a/TO DO.docx
+++ b/TO DO.docx
@@ -47,6 +47,12 @@
       </w:r>
     </w:p>
     <w:p>
+      <w:pPr>
+        <w:rPr>
+          <w:rFonts w:eastAsia="DengXian"/>
+          <w:lang w:eastAsia="zh-CN"/>
+        </w:rPr>
+      </w:pPr>
       <w:sdt>
         <w:sdtPr>
           <w:rPr>
@@ -94,6 +100,233 @@
       <w:pPr>
         <w:rPr>
           <w:rFonts w:eastAsia="DengXian"/>
+        </w:rPr>
+      </w:pPr>
+      <w:sdt>
+        <w:sdtPr>
+          <w:rPr>
+            <w:rFonts w:hint="eastAsia"/>
+          </w:rPr>
+          <w:id w:val="1319919900"/>
+          <w14:checkbox>
+            <w14:checked w14:val="0"/>
+            <w14:checkedState w14:val="2612" w14:font="MS Gothic"/>
+            <w14:uncheckedState w14:val="2610" w14:font="MS Gothic"/>
+          </w14:checkbox>
+        </w:sdtPr>
+        <w:sdtContent>
+          <w:r>
+            <w:rPr>
+              <w:rFonts w:ascii="MS Gothic" w:eastAsia="MS Gothic" w:hAnsi="MS Gothic" w:hint="eastAsia"/>
+            </w:rPr>
+            <w:t>☐</w:t>
+          </w:r>
+        </w:sdtContent>
+      </w:sdt>
+      <w:r>
+        <w:rPr>
+          <w:rFonts w:eastAsia="DengXian" w:hint="eastAsia"/>
+        </w:rPr>
+        <w:t xml:space="preserve"> </w:t>
+      </w:r>
+      <w:r>
+        <w:t>M</w:t>
+      </w:r>
+      <w:r>
+        <w:rPr>
+          <w:rFonts w:hint="eastAsia"/>
+        </w:rPr>
+        <w:t>ap</w:t>
+      </w:r>
+      <w:r>
+        <w:rPr>
+          <w:rFonts w:hint="eastAsia"/>
+        </w:rPr>
+        <w:t>手機端內容及布局、數據串聯</w:t>
+      </w:r>
+    </w:p>
+    <w:p>
+      <w:pPr>
+        <w:rPr>
+          <w:rFonts w:eastAsia="DengXian"/>
+          <w:lang w:eastAsia="zh-CN"/>
+        </w:rPr>
+      </w:pPr>
+      <w:sdt>
+        <w:sdtPr>
+          <w:rPr>
+            <w:rFonts w:hint="eastAsia"/>
+            <w:lang w:eastAsia="zh-CN"/>
+          </w:rPr>
+          <w:id w:val="1972936971"/>
+          <w14:checkbox>
+            <w14:checked w14:val="0"/>
+            <w14:checkedState w14:val="2612" w14:font="MS Gothic"/>
+            <w14:uncheckedState w14:val="2610" w14:font="MS Gothic"/>
+          </w14:checkbox>
+        </w:sdtPr>
+        <w:sdtContent>
+          <w:r>
+            <w:rPr>
+              <w:rFonts w:ascii="MS Gothic" w:eastAsia="MS Gothic" w:hAnsi="MS Gothic" w:hint="eastAsia"/>
+              <w:lang w:eastAsia="zh-CN"/>
+            </w:rPr>
+            <w:t>☐</w:t>
+          </w:r>
+        </w:sdtContent>
+      </w:sdt>
+      <w:r>
+        <w:rPr>
+          <w:rFonts w:eastAsia="DengXian" w:hint="eastAsia"/>
+          <w:lang w:eastAsia="zh-CN"/>
+        </w:rPr>
+        <w:t xml:space="preserve"> 店家交通方式及时间data导入</w:t>
+      </w:r>
+    </w:p>
+    <w:p>
+      <w:pPr>
+        <w:rPr>
+          <w:rFonts w:eastAsia="DengXian" w:hint="eastAsia"/>
+          <w:lang w:eastAsia="zh-CN"/>
+        </w:rPr>
+      </w:pPr>
+      <w:sdt>
+        <w:sdtPr>
+          <w:rPr>
+            <w:rFonts w:hint="eastAsia"/>
+            <w:lang w:eastAsia="zh-CN"/>
+          </w:rPr>
+          <w:id w:val="-1094165772"/>
+          <w14:checkbox>
+            <w14:checked w14:val="0"/>
+            <w14:checkedState w14:val="2612" w14:font="MS Gothic"/>
+            <w14:uncheckedState w14:val="2610" w14:font="MS Gothic"/>
+          </w14:checkbox>
+        </w:sdtPr>
+        <w:sdtContent>
+          <w:r>
+            <w:rPr>
+              <w:rFonts w:ascii="MS Gothic" w:eastAsia="MS Gothic" w:hAnsi="MS Gothic" w:hint="eastAsia"/>
+              <w:lang w:eastAsia="zh-CN"/>
+            </w:rPr>
+            <w:t>☐</w:t>
+          </w:r>
+        </w:sdtContent>
+      </w:sdt>
+      <w:r>
+        <w:rPr>
+          <w:rFonts w:eastAsia="DengXian" w:hint="eastAsia"/>
+          <w:lang w:eastAsia="zh-CN"/>
+        </w:rPr>
+        <w:t xml:space="preserve"> 店家详情</w:t>
+      </w:r>
+      <w:proofErr w:type="gramStart"/>
+      <w:r>
+        <w:rPr>
+          <w:rFonts w:eastAsia="DengXian" w:hint="eastAsia"/>
+          <w:lang w:eastAsia="zh-CN"/>
+        </w:rPr>
+        <w:t>页交通</w:t>
+      </w:r>
+      <w:proofErr w:type="gramEnd"/>
+      <w:r>
+        <w:rPr>
+          <w:rFonts w:eastAsia="DengXian" w:hint="eastAsia"/>
+          <w:lang w:eastAsia="zh-CN"/>
+        </w:rPr>
+        <w:t>时间数据动态调整</w:t>
+      </w:r>
+    </w:p>
+    <w:p>
+      <w:pPr>
+        <w:rPr>
+          <w:rFonts w:eastAsia="DengXian"/>
+          <w:lang w:eastAsia="zh-CN"/>
+        </w:rPr>
+      </w:pPr>
+      <w:sdt>
+        <w:sdtPr>
+          <w:rPr>
+            <w:rFonts w:hint="eastAsia"/>
+          </w:rPr>
+          <w:id w:val="556054424"/>
+          <w14:checkbox>
+            <w14:checked w14:val="0"/>
+            <w14:checkedState w14:val="2612" w14:font="MS Gothic"/>
+            <w14:uncheckedState w14:val="2610" w14:font="MS Gothic"/>
+          </w14:checkbox>
+        </w:sdtPr>
+        <w:sdtContent>
+          <w:r>
+            <w:rPr>
+              <w:rFonts w:ascii="MS Gothic" w:eastAsia="MS Gothic" w:hAnsi="MS Gothic" w:hint="eastAsia"/>
+            </w:rPr>
+            <w:t>☐</w:t>
+          </w:r>
+        </w:sdtContent>
+      </w:sdt>
+      <w:r>
+        <w:rPr>
+          <w:rFonts w:eastAsia="DengXian" w:hint="eastAsia"/>
+          <w:lang w:eastAsia="zh-CN"/>
+        </w:rPr>
+        <w:t xml:space="preserve"> </w:t>
+      </w:r>
+      <w:r>
+        <w:t>A</w:t>
+      </w:r>
+      <w:r>
+        <w:rPr>
+          <w:rFonts w:hint="eastAsia"/>
+        </w:rPr>
+        <w:t>bout</w:t>
+      </w:r>
+      <w:r>
+        <w:rPr>
+          <w:rFonts w:hint="eastAsia"/>
+        </w:rPr>
+        <w:t>內容及布局</w:t>
+      </w:r>
+    </w:p>
+    <w:p>
+      <w:pPr>
+        <w:rPr>
+          <w:rFonts w:eastAsia="DengXian" w:hint="eastAsia"/>
+          <w:lang w:eastAsia="zh-CN"/>
+        </w:rPr>
+      </w:pPr>
+      <w:sdt>
+        <w:sdtPr>
+          <w:rPr>
+            <w:rFonts w:hint="eastAsia"/>
+          </w:rPr>
+          <w:id w:val="-1040277379"/>
+          <w14:checkbox>
+            <w14:checked w14:val="1"/>
+            <w14:checkedState w14:val="2612" w14:font="MS Gothic"/>
+            <w14:uncheckedState w14:val="2610" w14:font="MS Gothic"/>
+          </w14:checkbox>
+        </w:sdtPr>
+        <w:sdtContent>
+          <w:r>
+            <w:rPr>
+              <w:rFonts w:ascii="MS Gothic" w:eastAsia="MS Gothic" w:hAnsi="MS Gothic" w:hint="eastAsia"/>
+            </w:rPr>
+            <w:t>☒</w:t>
+          </w:r>
+        </w:sdtContent>
+      </w:sdt>
+      <w:r>
+        <w:rPr>
+          <w:rFonts w:eastAsia="DengXian" w:hint="eastAsia"/>
+        </w:rPr>
+        <w:t xml:space="preserve"> Info动画调整</w:t>
+      </w:r>
+    </w:p>
+    <w:p>
+      <w:pPr>
+        <w:rPr>
+          <w:rFonts w:eastAsia="DengXian"/>
           <w:lang w:eastAsia="zh-CN"/>
         </w:rPr>
       </w:pPr>
@@ -122,16 +355,8 @@
         <w:rPr>
           <w:rFonts w:hint="eastAsia"/>
         </w:rPr>
-        <w:t xml:space="preserve"> </w:t>
-      </w:r>
-      <w:proofErr w:type="spellStart"/>
-      <w:r>
-        <w:rPr>
-          <w:rFonts w:hint="eastAsia"/>
-        </w:rPr>
-        <w:t>shopDetail</w:t>
-      </w:r>
-      <w:proofErr w:type="spellEnd"/>
+        <w:t xml:space="preserve"> shopDetail</w:t>
+      </w:r>
       <w:r>
         <w:rPr>
           <w:rFonts w:hint="eastAsia"/>
@@ -275,88 +500,6 @@
       </w:r>
     </w:p>
     <w:p>
-      <w:sdt>
-        <w:sdtPr>
-          <w:rPr>
-            <w:rFonts w:hint="eastAsia"/>
-            <w:lang w:eastAsia="zh-CN"/>
-          </w:rPr>
-          <w:id w:val="-1040277379"/>
-          <w14:checkbox>
-            <w14:checked w14:val="0"/>
-            <w14:checkedState w14:val="2612" w14:font="MS Gothic"/>
-            <w14:uncheckedState w14:val="2610" w14:font="MS Gothic"/>
-          </w14:checkbox>
-        </w:sdtPr>
-        <w:sdtContent>
-          <w:r>
-            <w:rPr>
-              <w:rFonts w:ascii="MS Gothic" w:eastAsia="MS Gothic" w:hAnsi="MS Gothic" w:hint="eastAsia"/>
-              <w:lang w:eastAsia="zh-CN"/>
-            </w:rPr>
-            <w:t>☐</w:t>
-          </w:r>
-        </w:sdtContent>
-      </w:sdt>
-      <w:r>
-        <w:rPr>
-          <w:rFonts w:eastAsia="DengXian" w:hint="eastAsia"/>
-          <w:lang w:eastAsia="zh-CN"/>
-        </w:rPr>
-        <w:t xml:space="preserve"> Info动画调整</w:t>
-      </w:r>
-    </w:p>
-    <w:p>
-      <w:pPr>
-        <w:rPr>
-          <w:rFonts w:eastAsia="DengXian"/>
-          <w:lang w:eastAsia="zh-CN"/>
-        </w:rPr>
-      </w:pPr>
-      <w:sdt>
-        <w:sdtPr>
-          <w:rPr>
-            <w:rFonts w:hint="eastAsia"/>
-          </w:rPr>
-          <w:id w:val="1319919900"/>
-          <w14:checkbox>
-            <w14:checked w14:val="0"/>
-            <w14:checkedState w14:val="2612" w14:font="MS Gothic"/>
-            <w14:uncheckedState w14:val="2610" w14:font="MS Gothic"/>
-          </w14:checkbox>
-        </w:sdtPr>
-        <w:sdtContent>
-          <w:r>
-            <w:rPr>
-              <w:rFonts w:ascii="MS Gothic" w:eastAsia="MS Gothic" w:hAnsi="MS Gothic" w:hint="eastAsia"/>
-            </w:rPr>
-            <w:t>☐</w:t>
-          </w:r>
-        </w:sdtContent>
-      </w:sdt>
-      <w:r>
-        <w:rPr>
-          <w:rFonts w:eastAsia="DengXian" w:hint="eastAsia"/>
-        </w:rPr>
-        <w:t xml:space="preserve"> </w:t>
-      </w:r>
-      <w:r>
-        <w:t>M</w:t>
-      </w:r>
-      <w:r>
-        <w:rPr>
-          <w:rFonts w:hint="eastAsia"/>
-        </w:rPr>
-        <w:t>ap</w:t>
-      </w:r>
-      <w:r>
-        <w:rPr>
-          <w:rFonts w:hint="eastAsia"/>
-        </w:rPr>
-        <w:t>手機端內容及布局、數據串聯</w:t>
-      </w:r>
-    </w:p>
-    <w:p>
       <w:pPr>
         <w:rPr>
           <w:rFonts w:eastAsia="DengXian"/>
@@ -407,9 +550,9 @@
             <w:rFonts w:hint="eastAsia"/>
             <w:lang w:eastAsia="zh-CN"/>
           </w:rPr>
-          <w:id w:val="1972936971"/>
+          <w:id w:val="-1447921097"/>
           <w14:checkbox>
-            <w14:checked w14:val="0"/>
+            <w14:checked w14:val="1"/>
             <w14:checkedState w14:val="2612" w14:font="MS Gothic"/>
             <w14:uncheckedState w14:val="2610" w14:font="MS Gothic"/>
           </w14:checkbox>
@@ -420,7 +563,7 @@
               <w:rFonts w:ascii="MS Gothic" w:eastAsia="MS Gothic" w:hAnsi="MS Gothic" w:hint="eastAsia"/>
               <w:lang w:eastAsia="zh-CN"/>
             </w:rPr>
-            <w:t>☐</w:t>
+            <w:t>☒</w:t>
           </w:r>
         </w:sdtContent>
       </w:sdt>
@@ -431,125 +574,21 @@
         </w:rPr>
         <w:t xml:space="preserve"> 店家</w:t>
       </w:r>
+      <w:proofErr w:type="gramStart"/>
       <w:r>
         <w:rPr>
           <w:rFonts w:eastAsia="DengXian" w:hint="eastAsia"/>
           <w:lang w:eastAsia="zh-CN"/>
         </w:rPr>
-        <w:t>交通方式及时间</w:t>
-      </w:r>
+        <w:t>页根据</w:t>
+      </w:r>
+      <w:proofErr w:type="gramEnd"/>
       <w:r>
         <w:rPr>
           <w:rFonts w:eastAsia="DengXian" w:hint="eastAsia"/>
           <w:lang w:eastAsia="zh-CN"/>
         </w:rPr>
-        <w:t>data导入</w:t>
-      </w:r>
-    </w:p>
-    <w:p>
-      <w:pPr>
-        <w:rPr>
-          <w:rFonts w:eastAsia="DengXian"/>
-          <w:lang w:eastAsia="zh-CN"/>
-        </w:rPr>
-      </w:pPr>
-      <w:sdt>
-        <w:sdtPr>
-          <w:rPr>
-            <w:rFonts w:hint="eastAsia"/>
-            <w:lang w:eastAsia="zh-CN"/>
-          </w:rPr>
-          <w:id w:val="-1447921097"/>
-          <w14:checkbox>
-            <w14:checked w14:val="0"/>
-            <w14:checkedState w14:val="2612" w14:font="MS Gothic"/>
-            <w14:uncheckedState w14:val="2610" w14:font="MS Gothic"/>
-          </w14:checkbox>
-        </w:sdtPr>
-        <w:sdtContent>
-          <w:r>
-            <w:rPr>
-              <w:rFonts w:ascii="MS Gothic" w:eastAsia="MS Gothic" w:hAnsi="MS Gothic" w:hint="eastAsia"/>
-              <w:lang w:eastAsia="zh-CN"/>
-            </w:rPr>
-            <w:t>☐</w:t>
-          </w:r>
-        </w:sdtContent>
-      </w:sdt>
-      <w:r>
-        <w:rPr>
-          <w:rFonts w:eastAsia="DengXian" w:hint="eastAsia"/>
-          <w:lang w:eastAsia="zh-CN"/>
-        </w:rPr>
-        <w:t xml:space="preserve"> 店家</w:t>
-      </w:r>
-      <w:proofErr w:type="gramStart"/>
-      <w:r>
-        <w:rPr>
-          <w:rFonts w:eastAsia="DengXian" w:hint="eastAsia"/>
-          <w:lang w:eastAsia="zh-CN"/>
-        </w:rPr>
-        <w:t>页根据</w:t>
-      </w:r>
-      <w:proofErr w:type="gramEnd"/>
-      <w:r>
-        <w:rPr>
-          <w:rFonts w:eastAsia="DengXian" w:hint="eastAsia"/>
-          <w:lang w:eastAsia="zh-CN"/>
-        </w:rPr>
         <w:t>当前星期调整营业时间</w:t>
-      </w:r>
-    </w:p>
-    <w:p>
-      <w:pPr>
-        <w:rPr>
-          <w:rFonts w:eastAsia="DengXian" w:hint="eastAsia"/>
-          <w:lang w:eastAsia="zh-CN"/>
-        </w:rPr>
-      </w:pPr>
-      <w:sdt>
-        <w:sdtPr>
-          <w:rPr>
-            <w:rFonts w:hint="eastAsia"/>
-          </w:rPr>
-          <w:id w:val="-1094165772"/>
-          <w14:checkbox>
-            <w14:checked w14:val="0"/>
-            <w14:checkedState w14:val="2612" w14:font="MS Gothic"/>
-            <w14:uncheckedState w14:val="2610" w14:font="MS Gothic"/>
-          </w14:checkbox>
-        </w:sdtPr>
-        <w:sdtContent>
-          <w:r>
-            <w:rPr>
-              <w:rFonts w:ascii="MS Gothic" w:eastAsia="MS Gothic" w:hAnsi="MS Gothic" w:hint="eastAsia"/>
-            </w:rPr>
-            <w:t>☐</w:t>
-          </w:r>
-        </w:sdtContent>
-      </w:sdt>
-      <w:r>
-        <w:rPr>
-          <w:rFonts w:eastAsia="DengXian" w:hint="eastAsia"/>
-          <w:lang w:eastAsia="zh-CN"/>
-        </w:rPr>
-        <w:t xml:space="preserve"> 店家详情</w:t>
-      </w:r>
-      <w:proofErr w:type="gramStart"/>
-      <w:r>
-        <w:rPr>
-          <w:rFonts w:eastAsia="DengXian" w:hint="eastAsia"/>
-          <w:lang w:eastAsia="zh-CN"/>
-        </w:rPr>
-        <w:t>页交通</w:t>
-      </w:r>
-      <w:proofErr w:type="gramEnd"/>
-      <w:r>
-        <w:rPr>
-          <w:rFonts w:eastAsia="DengXian" w:hint="eastAsia"/>
-          <w:lang w:eastAsia="zh-CN"/>
-        </w:rPr>
-        <w:t>时间数据调整</w:t>
       </w:r>
     </w:p>
     <w:p>
@@ -647,57 +686,6 @@
     <w:p>
       <w:pPr>
         <w:rPr>
-          <w:rFonts w:eastAsia="DengXian" w:hint="eastAsia"/>
-          <w:lang w:eastAsia="zh-CN"/>
-        </w:rPr>
-      </w:pPr>
-      <w:sdt>
-        <w:sdtPr>
-          <w:rPr>
-            <w:rFonts w:hint="eastAsia"/>
-          </w:rPr>
-          <w:id w:val="556054424"/>
-          <w14:checkbox>
-            <w14:checked w14:val="0"/>
-            <w14:checkedState w14:val="2612" w14:font="MS Gothic"/>
-            <w14:uncheckedState w14:val="2610" w14:font="MS Gothic"/>
-          </w14:checkbox>
-        </w:sdtPr>
-        <w:sdtContent>
-          <w:r>
-            <w:rPr>
-              <w:rFonts w:ascii="MS Gothic" w:eastAsia="MS Gothic" w:hAnsi="MS Gothic" w:hint="eastAsia"/>
-            </w:rPr>
-            <w:t>☐</w:t>
-          </w:r>
-        </w:sdtContent>
-      </w:sdt>
-      <w:r>
-        <w:rPr>
-          <w:rFonts w:eastAsia="DengXian" w:hint="eastAsia"/>
-          <w:lang w:eastAsia="zh-CN"/>
-        </w:rPr>
-        <w:t xml:space="preserve"> </w:t>
-      </w:r>
-      <w:r>
-        <w:t>A</w:t>
-      </w:r>
-      <w:r>
-        <w:rPr>
-          <w:rFonts w:hint="eastAsia"/>
-        </w:rPr>
-        <w:t>bout</w:t>
-      </w:r>
-      <w:r>
-        <w:rPr>
-          <w:rFonts w:hint="eastAsia"/>
-        </w:rPr>
-        <w:t>內容及布局</w:t>
-      </w:r>
-    </w:p>
-    <w:p>
-      <w:pPr>
-        <w:rPr>
           <w:rFonts w:eastAsia="DengXian"/>
         </w:rPr>
       </w:pPr>
@@ -925,7 +913,6 @@
         </w:rPr>
         <w:t>跳轉</w:t>
       </w:r>
-      <w:proofErr w:type="spellStart"/>
       <w:proofErr w:type="gramEnd"/>
       <w:r>
         <w:rPr>
@@ -933,7 +920,6 @@
         </w:rPr>
         <w:t>shopDetail</w:t>
       </w:r>
-      <w:proofErr w:type="spellEnd"/>
       <w:r>
         <w:rPr>
           <w:rFonts w:hint="eastAsia"/>
@@ -1195,16 +1181,8 @@
         <w:rPr>
           <w:rFonts w:hint="eastAsia"/>
         </w:rPr>
-        <w:t xml:space="preserve"> </w:t>
-      </w:r>
-      <w:proofErr w:type="spellStart"/>
-      <w:r>
-        <w:rPr>
-          <w:rFonts w:hint="eastAsia"/>
-        </w:rPr>
-        <w:t>shopDetail</w:t>
-      </w:r>
-      <w:proofErr w:type="spellEnd"/>
+        <w:t xml:space="preserve"> shopDetail</w:t>
+      </w:r>
       <w:r>
         <w:rPr>
           <w:rFonts w:hint="eastAsia"/>
@@ -1247,7 +1225,6 @@
         </w:rPr>
         <w:t>跳轉</w:t>
       </w:r>
-      <w:proofErr w:type="spellStart"/>
       <w:proofErr w:type="gramEnd"/>
       <w:r>
         <w:rPr>
@@ -1255,7 +1232,6 @@
         </w:rPr>
         <w:t>shopDetail</w:t>
       </w:r>
-      <w:proofErr w:type="spellEnd"/>
       <w:r>
         <w:rPr>
           <w:rFonts w:hint="eastAsia"/>

</xml_diff>

<commit_message>
0.4.21 feat: optimize shop transit data and refine filter categories
</commit_message>
<xml_diff>
--- a/TO DO.docx
+++ b/TO DO.docx
@@ -43,16 +43,43 @@
         <w:rPr>
           <w:rFonts w:hint="eastAsia"/>
         </w:rPr>
-        <w:t>文本及圖片替換、轉場動畫調整</w:t>
-      </w:r>
-    </w:p>
-    <w:p>
-      <w:pPr>
-        <w:rPr>
-          <w:rFonts w:eastAsia="DengXian"/>
-          <w:lang w:eastAsia="zh-CN"/>
-        </w:rPr>
-      </w:pPr>
+        <w:t>文本及圖片替換</w:t>
+      </w:r>
+      <w:r>
+        <w:rPr>
+          <w:rFonts w:hint="eastAsia"/>
+        </w:rPr>
+        <w:t>成</w:t>
+      </w:r>
+      <w:proofErr w:type="spellStart"/>
+      <w:r>
+        <w:rPr>
+          <w:rFonts w:hint="eastAsia"/>
+        </w:rPr>
+        <w:t>figma</w:t>
+      </w:r>
+      <w:proofErr w:type="spellEnd"/>
+      <w:r>
+        <w:rPr>
+          <w:rFonts w:hint="eastAsia"/>
+        </w:rPr>
+        <w:t>上的</w:t>
+      </w:r>
+      <w:r>
+        <w:rPr>
+          <w:rFonts w:hint="eastAsia"/>
+        </w:rPr>
+        <w:t>、</w:t>
+      </w:r>
+      <w:r>
+        <w:rPr>
+          <w:rFonts w:hint="eastAsia"/>
+          <w:strike/>
+        </w:rPr>
+        <w:t>轉場動畫調整</w:t>
+      </w:r>
+    </w:p>
+    <w:p>
       <w:sdt>
         <w:sdtPr>
           <w:rPr>
@@ -81,6 +108,60 @@
         <w:t xml:space="preserve"> </w:t>
       </w:r>
       <w:r>
+        <w:rPr>
+          <w:rFonts w:hint="eastAsia"/>
+        </w:rPr>
+        <w:t>生成</w:t>
+      </w:r>
+      <w:r>
+        <w:rPr>
+          <w:rFonts w:hint="eastAsia"/>
+        </w:rPr>
+        <w:t>12</w:t>
+      </w:r>
+      <w:r>
+        <w:rPr>
+          <w:rFonts w:hint="eastAsia"/>
+        </w:rPr>
+        <w:t>家</w:t>
+      </w:r>
+      <w:r>
+        <w:rPr>
+          <w:rFonts w:hint="eastAsia"/>
+        </w:rPr>
+        <w:t>店</w:t>
+      </w:r>
+      <w:r>
+        <w:rPr>
+          <w:rFonts w:hint="eastAsia"/>
+        </w:rPr>
+        <w:t>圓形</w:t>
+      </w:r>
+      <w:r>
+        <w:rPr>
+          <w:rFonts w:hint="eastAsia"/>
+        </w:rPr>
+        <w:t>Logo</w:t>
+      </w:r>
+      <w:r>
+        <w:rPr>
+          <w:rFonts w:hint="eastAsia"/>
+        </w:rPr>
+        <w:t>，使用</w:t>
+      </w:r>
+      <w:r>
+        <w:rPr>
+          <w:rFonts w:hint="eastAsia"/>
+        </w:rPr>
+        <w:t>MCP</w:t>
+      </w:r>
+      <w:r>
+        <w:rPr>
+          <w:rFonts w:hint="eastAsia"/>
+        </w:rPr>
+        <w:t>替換</w:t>
+      </w:r>
+      <w:r>
         <w:t>S</w:t>
       </w:r>
       <w:r>
@@ -93,8 +174,30 @@
         <w:rPr>
           <w:rFonts w:hint="eastAsia"/>
         </w:rPr>
-        <w:t>替換、頁面內容布局</w:t>
-      </w:r>
+        <w:t>頁面內容布局</w:t>
+      </w:r>
+    </w:p>
+    <w:p>
+      <w:r>
+        <w:rPr>
+          <w:rFonts w:hint="eastAsia"/>
+        </w:rPr>
+        <w:t>「素食分類」改成「交通方式」</w:t>
+      </w:r>
+    </w:p>
+    <w:p>
+      <w:pPr>
+        <w:rPr>
+          <w:rFonts w:hint="eastAsia"/>
+        </w:rPr>
+      </w:pPr>
+    </w:p>
+    <w:p>
+      <w:pPr>
+        <w:rPr>
+          <w:rFonts w:eastAsia="DengXian" w:hint="eastAsia"/>
+        </w:rPr>
+      </w:pPr>
     </w:p>
     <w:p>
       <w:pPr>
@@ -109,7 +212,7 @@
           </w:rPr>
           <w:id w:val="1319919900"/>
           <w14:checkbox>
-            <w14:checked w14:val="0"/>
+            <w14:checked w14:val="1"/>
             <w14:checkedState w14:val="2612" w14:font="MS Gothic"/>
             <w14:uncheckedState w14:val="2610" w14:font="MS Gothic"/>
           </w14:checkbox>
@@ -119,7 +222,7 @@
             <w:rPr>
               <w:rFonts w:ascii="MS Gothic" w:eastAsia="MS Gothic" w:hAnsi="MS Gothic" w:hint="eastAsia"/>
             </w:rPr>
-            <w:t>☐</w:t>
+            <w:t>☒</w:t>
           </w:r>
         </w:sdtContent>
       </w:sdt>
@@ -160,7 +263,7 @@
           </w:rPr>
           <w:id w:val="1972936971"/>
           <w14:checkbox>
-            <w14:checked w14:val="0"/>
+            <w14:checked w14:val="1"/>
             <w14:checkedState w14:val="2612" w14:font="MS Gothic"/>
             <w14:uncheckedState w14:val="2610" w14:font="MS Gothic"/>
           </w14:checkbox>
@@ -171,7 +274,7 @@
               <w:rFonts w:ascii="MS Gothic" w:eastAsia="MS Gothic" w:hAnsi="MS Gothic" w:hint="eastAsia"/>
               <w:lang w:eastAsia="zh-CN"/>
             </w:rPr>
-            <w:t>☐</w:t>
+            <w:t>☒</w:t>
           </w:r>
         </w:sdtContent>
       </w:sdt>
@@ -186,7 +289,7 @@
     <w:p>
       <w:pPr>
         <w:rPr>
-          <w:rFonts w:eastAsia="DengXian" w:hint="eastAsia"/>
+          <w:rFonts w:eastAsia="DengXian"/>
           <w:lang w:eastAsia="zh-CN"/>
         </w:rPr>
       </w:pPr>
@@ -238,12 +341,6 @@
       </w:r>
     </w:p>
     <w:p>
-      <w:pPr>
-        <w:rPr>
-          <w:rFonts w:eastAsia="DengXian"/>
-          <w:lang w:eastAsia="zh-CN"/>
-        </w:rPr>
-      </w:pPr>
       <w:sdt>
         <w:sdtPr>
           <w:rPr>
@@ -289,9 +386,105 @@
       </w:r>
     </w:p>
     <w:p>
+      <w:sdt>
+        <w:sdtPr>
+          <w:rPr>
+            <w:rFonts w:hint="eastAsia"/>
+          </w:rPr>
+          <w:id w:val="-1970196375"/>
+          <w14:checkbox>
+            <w14:checked w14:val="0"/>
+            <w14:checkedState w14:val="2612" w14:font="MS Gothic"/>
+            <w14:uncheckedState w14:val="2610" w14:font="MS Gothic"/>
+          </w14:checkbox>
+        </w:sdtPr>
+        <w:sdtContent>
+          <w:r>
+            <w:rPr>
+              <w:rFonts w:ascii="MS Gothic" w:eastAsia="MS Gothic" w:hAnsi="MS Gothic" w:hint="eastAsia"/>
+            </w:rPr>
+            <w:t>☐</w:t>
+          </w:r>
+        </w:sdtContent>
+      </w:sdt>
+      <w:r>
+        <w:rPr>
+          <w:rFonts w:hint="eastAsia"/>
+        </w:rPr>
+        <w:t xml:space="preserve"> </w:t>
+      </w:r>
+      <w:r>
+        <w:rPr>
+          <w:rFonts w:hint="eastAsia"/>
+        </w:rPr>
+        <w:t>步行、機車、腳踏車</w:t>
+      </w:r>
+      <w:r>
+        <w:t>i</w:t>
+      </w:r>
+      <w:r>
+        <w:rPr>
+          <w:rFonts w:hint="eastAsia"/>
+        </w:rPr>
+        <w:t>con(</w:t>
+      </w:r>
+      <w:r>
+        <w:rPr>
+          <w:rFonts w:hint="eastAsia"/>
+        </w:rPr>
+        <w:t>或文本圖替代</w:t>
+      </w:r>
+      <w:r>
+        <w:rPr>
+          <w:rFonts w:hint="eastAsia"/>
+        </w:rPr>
+        <w:t>)</w:t>
+      </w:r>
+    </w:p>
+    <w:p>
       <w:pPr>
         <w:rPr>
-          <w:rFonts w:eastAsia="DengXian" w:hint="eastAsia"/>
+          <w:rFonts w:hint="eastAsia"/>
+        </w:rPr>
+      </w:pPr>
+      <w:sdt>
+        <w:sdtPr>
+          <w:rPr>
+            <w:rFonts w:hint="eastAsia"/>
+          </w:rPr>
+          <w:id w:val="-471976989"/>
+          <w14:checkbox>
+            <w14:checked w14:val="0"/>
+            <w14:checkedState w14:val="2612" w14:font="MS Gothic"/>
+            <w14:uncheckedState w14:val="2610" w14:font="MS Gothic"/>
+          </w14:checkbox>
+        </w:sdtPr>
+        <w:sdtContent>
+          <w:r>
+            <w:rPr>
+              <w:rFonts w:ascii="MS Gothic" w:eastAsia="MS Gothic" w:hAnsi="MS Gothic" w:hint="eastAsia"/>
+            </w:rPr>
+            <w:t>☐</w:t>
+          </w:r>
+        </w:sdtContent>
+      </w:sdt>
+      <w:r>
+        <w:rPr>
+          <w:rFonts w:hint="eastAsia"/>
+        </w:rPr>
+        <w:t xml:space="preserve"> </w:t>
+      </w:r>
+      <w:r>
+        <w:rPr>
+          <w:rFonts w:hint="eastAsia"/>
+        </w:rPr>
+        <w:t>封面樣式</w:t>
+      </w:r>
+    </w:p>
+    <w:p>
+      <w:pPr>
+        <w:rPr>
+          <w:rFonts w:eastAsia="DengXian"/>
           <w:lang w:eastAsia="zh-CN"/>
         </w:rPr>
       </w:pPr>
@@ -355,8 +548,16 @@
         <w:rPr>
           <w:rFonts w:hint="eastAsia"/>
         </w:rPr>
-        <w:t xml:space="preserve"> shopDetail</w:t>
-      </w:r>
+        <w:t xml:space="preserve"> </w:t>
+      </w:r>
+      <w:proofErr w:type="spellStart"/>
+      <w:r>
+        <w:rPr>
+          <w:rFonts w:hint="eastAsia"/>
+        </w:rPr>
+        <w:t>shopDetail</w:t>
+      </w:r>
+      <w:proofErr w:type="spellEnd"/>
       <w:r>
         <w:rPr>
           <w:rFonts w:hint="eastAsia"/>
@@ -836,6 +1037,12 @@
         <w:rPr>
           <w:rFonts w:hint="eastAsia"/>
         </w:rPr>
+        <w:t xml:space="preserve"> memory</w:t>
+      </w:r>
+      <w:r>
+        <w:rPr>
+          <w:rFonts w:hint="eastAsia"/>
+        </w:rPr>
         <w:t>記得上一頁位置</w:t>
       </w:r>
     </w:p>
@@ -913,6 +1120,7 @@
         </w:rPr>
         <w:t>跳轉</w:t>
       </w:r>
+      <w:proofErr w:type="spellStart"/>
       <w:proofErr w:type="gramEnd"/>
       <w:r>
         <w:rPr>
@@ -920,6 +1128,7 @@
         </w:rPr>
         <w:t>shopDetail</w:t>
       </w:r>
+      <w:proofErr w:type="spellEnd"/>
       <w:r>
         <w:rPr>
           <w:rFonts w:hint="eastAsia"/>
@@ -1181,8 +1390,16 @@
         <w:rPr>
           <w:rFonts w:hint="eastAsia"/>
         </w:rPr>
-        <w:t xml:space="preserve"> shopDetail</w:t>
-      </w:r>
+        <w:t xml:space="preserve"> </w:t>
+      </w:r>
+      <w:proofErr w:type="spellStart"/>
+      <w:r>
+        <w:rPr>
+          <w:rFonts w:hint="eastAsia"/>
+        </w:rPr>
+        <w:t>shopDetail</w:t>
+      </w:r>
+      <w:proofErr w:type="spellEnd"/>
       <w:r>
         <w:rPr>
           <w:rFonts w:hint="eastAsia"/>
@@ -1225,6 +1442,7 @@
         </w:rPr>
         <w:t>跳轉</w:t>
       </w:r>
+      <w:proofErr w:type="spellStart"/>
       <w:proofErr w:type="gramEnd"/>
       <w:r>
         <w:rPr>
@@ -1232,6 +1450,7 @@
         </w:rPr>
         <w:t>shopDetail</w:t>
       </w:r>
+      <w:proofErr w:type="spellEnd"/>
       <w:r>
         <w:rPr>
           <w:rFonts w:hint="eastAsia"/>
@@ -1401,7 +1620,7 @@
                     <pic:cNvPicPr/>
                   </pic:nvPicPr>
                   <pic:blipFill>
-                    <a:blip r:embed="rId5"/>
+                    <a:blip r:embed="rId7"/>
                     <a:stretch>
                       <a:fillRect/>
                     </a:stretch>
@@ -1443,7 +1662,7 @@
                     <pic:cNvPicPr/>
                   </pic:nvPicPr>
                   <pic:blipFill>
-                    <a:blip r:embed="rId6"/>
+                    <a:blip r:embed="rId8"/>
                     <a:stretch>
                       <a:fillRect/>
                     </a:stretch>
@@ -1499,7 +1718,7 @@
                     <pic:cNvPicPr/>
                   </pic:nvPicPr>
                   <pic:blipFill>
-                    <a:blip r:embed="rId7"/>
+                    <a:blip r:embed="rId9"/>
                     <a:stretch>
                       <a:fillRect/>
                     </a:stretch>
@@ -1541,7 +1760,7 @@
                     <pic:cNvPicPr/>
                   </pic:nvPicPr>
                   <pic:blipFill rotWithShape="1">
-                    <a:blip r:embed="rId8"/>
+                    <a:blip r:embed="rId10"/>
                     <a:srcRect b="10122"/>
                     <a:stretch>
                       <a:fillRect/>
@@ -1619,7 +1838,7 @@
                     <pic:cNvPicPr/>
                   </pic:nvPicPr>
                   <pic:blipFill>
-                    <a:blip r:embed="rId9"/>
+                    <a:blip r:embed="rId11"/>
                     <a:stretch>
                       <a:fillRect/>
                     </a:stretch>
@@ -1675,7 +1894,7 @@
                     <pic:cNvPicPr/>
                   </pic:nvPicPr>
                   <pic:blipFill>
-                    <a:blip r:embed="rId10"/>
+                    <a:blip r:embed="rId12"/>
                     <a:stretch>
                       <a:fillRect/>
                     </a:stretch>
@@ -1737,7 +1956,7 @@
                     <pic:cNvPicPr/>
                   </pic:nvPicPr>
                   <pic:blipFill>
-                    <a:blip r:embed="rId11"/>
+                    <a:blip r:embed="rId13"/>
                     <a:stretch>
                       <a:fillRect/>
                     </a:stretch>
@@ -1848,7 +2067,7 @@
                     <pic:cNvPicPr/>
                   </pic:nvPicPr>
                   <pic:blipFill>
-                    <a:blip r:embed="rId12"/>
+                    <a:blip r:embed="rId14"/>
                     <a:stretch>
                       <a:fillRect/>
                     </a:stretch>
@@ -1905,7 +2124,7 @@
                     <pic:cNvPicPr/>
                   </pic:nvPicPr>
                   <pic:blipFill>
-                    <a:blip r:embed="rId13"/>
+                    <a:blip r:embed="rId15"/>
                     <a:stretch>
                       <a:fillRect/>
                     </a:stretch>
@@ -1992,7 +2211,7 @@
                     <pic:cNvPicPr/>
                   </pic:nvPicPr>
                   <pic:blipFill>
-                    <a:blip r:embed="rId14"/>
+                    <a:blip r:embed="rId16"/>
                     <a:stretch>
                       <a:fillRect/>
                     </a:stretch>
@@ -2032,7 +2251,7 @@
                     <pic:cNvPicPr/>
                   </pic:nvPicPr>
                   <pic:blipFill>
-                    <a:blip r:embed="rId15"/>
+                    <a:blip r:embed="rId17"/>
                     <a:stretch>
                       <a:fillRect/>
                     </a:stretch>
@@ -2073,7 +2292,7 @@
                     <pic:cNvPicPr/>
                   </pic:nvPicPr>
                   <pic:blipFill>
-                    <a:blip r:embed="rId16"/>
+                    <a:blip r:embed="rId18"/>
                     <a:stretch>
                       <a:fillRect/>
                     </a:stretch>
@@ -2113,7 +2332,7 @@
                     <pic:cNvPicPr/>
                   </pic:nvPicPr>
                   <pic:blipFill>
-                    <a:blip r:embed="rId17"/>
+                    <a:blip r:embed="rId19"/>
                     <a:stretch>
                       <a:fillRect/>
                     </a:stretch>
@@ -2153,7 +2372,7 @@
                     <pic:cNvPicPr/>
                   </pic:nvPicPr>
                   <pic:blipFill>
-                    <a:blip r:embed="rId18"/>
+                    <a:blip r:embed="rId20"/>
                     <a:stretch>
                       <a:fillRect/>
                     </a:stretch>
@@ -2193,7 +2412,7 @@
                     <pic:cNvPicPr/>
                   </pic:nvPicPr>
                   <pic:blipFill>
-                    <a:blip r:embed="rId19"/>
+                    <a:blip r:embed="rId21"/>
                     <a:stretch>
                       <a:fillRect/>
                     </a:stretch>
@@ -2237,7 +2456,7 @@
                     <pic:cNvPicPr/>
                   </pic:nvPicPr>
                   <pic:blipFill>
-                    <a:blip r:embed="rId20"/>
+                    <a:blip r:embed="rId22"/>
                     <a:stretch>
                       <a:fillRect/>
                     </a:stretch>
@@ -2277,7 +2496,7 @@
                     <pic:cNvPicPr/>
                   </pic:nvPicPr>
                   <pic:blipFill>
-                    <a:blip r:embed="rId21"/>
+                    <a:blip r:embed="rId23"/>
                     <a:stretch>
                       <a:fillRect/>
                     </a:stretch>
@@ -2317,7 +2536,7 @@
                     <pic:cNvPicPr/>
                   </pic:nvPicPr>
                   <pic:blipFill>
-                    <a:blip r:embed="rId22"/>
+                    <a:blip r:embed="rId24"/>
                     <a:stretch>
                       <a:fillRect/>
                     </a:stretch>
@@ -2357,7 +2576,7 @@
                     <pic:cNvPicPr/>
                   </pic:nvPicPr>
                   <pic:blipFill>
-                    <a:blip r:embed="rId23"/>
+                    <a:blip r:embed="rId25"/>
                     <a:stretch>
                       <a:fillRect/>
                     </a:stretch>
@@ -2386,6 +2605,44 @@
     </w:sectPr>
   </w:body>
 </w:document>
+</file>
+
+<file path=word/endnotes.xml><?xml version="1.0" encoding="utf-8"?>
+<w:endnotes xmlns:wpc="http://schemas.microsoft.com/office/word/2010/wordprocessingCanvas" xmlns:cx="http://schemas.microsoft.com/office/drawing/2014/chartex" xmlns:cx1="http://schemas.microsoft.com/office/drawing/2015/9/8/chartex" xmlns:cx2="http://schemas.microsoft.com/office/drawing/2015/10/21/chartex" xmlns:cx3="http://schemas.microsoft.com/office/drawing/2016/5/9/chartex" xmlns:cx4="http://schemas.microsoft.com/office/drawing/2016/5/10/chartex" xmlns:cx5="http://schemas.microsoft.com/office/drawing/2016/5/11/chartex" xmlns:cx6="http://schemas.microsoft.com/office/drawing/2016/5/12/chartex" xmlns:cx7="http://schemas.microsoft.com/office/drawing/2016/5/13/chartex" xmlns:cx8="http://schemas.microsoft.com/office/drawing/2016/5/14/chartex" xmlns:mc="http://schemas.openxmlformats.org/markup-compatibility/2006" xmlns:aink="http://schemas.microsoft.com/office/drawing/2016/ink" xmlns:am3d="http://schemas.microsoft.com/office/drawing/2017/model3d" xmlns:o="urn:schemas-microsoft-com:office:office" xmlns:oel="http://schemas.microsoft.com/office/2019/extlst" xmlns:r="http://schemas.openxmlformats.org/officeDocument/2006/relationships" xmlns:m="http://schemas.openxmlformats.org/officeDocument/2006/math" xmlns:v="urn:schemas-microsoft-com:vml" xmlns:wp14="http://schemas.microsoft.com/office/word/2010/wordprocessingDrawing" xmlns:wp="http://schemas.openxmlformats.org/drawingml/2006/wordprocessingDrawing" xmlns:w10="urn:schemas-microsoft-com:office:word" xmlns:w="http://schemas.openxmlformats.org/wordprocessingml/2006/main" xmlns:w14="http://schemas.microsoft.com/office/word/2010/wordml" xmlns:w15="http://schemas.microsoft.com/office/word/2012/wordml" xmlns:w16cex="http://schemas.microsoft.com/office/word/2018/wordml/cex" xmlns:w16cid="http://schemas.microsoft.com/office/word/2016/wordml/cid" xmlns:w16="http://schemas.microsoft.com/office/word/2018/wordml" xmlns:w16du="http://schemas.microsoft.com/office/word/2023/wordml/word16du" xmlns:w16sdtdh="http://schemas.microsoft.com/office/word/2020/wordml/sdtdatahash" xmlns:w16sdtfl="http://schemas.microsoft.com/office/word/2024/wordml/sdtformatlock" xmlns:w16se="http://schemas.microsoft.com/office/word/2015/wordml/symex" xmlns:wpg="http://schemas.microsoft.com/office/word/2010/wordprocessingGroup" xmlns:wpi="http://schemas.microsoft.com/office/word/2010/wordprocessingInk" xmlns:wne="http://schemas.microsoft.com/office/word/2006/wordml" xmlns:wps="http://schemas.microsoft.com/office/word/2010/wordprocessingShape" mc:Ignorable="w14 w15 w16se w16cid w16 w16cex w16sdtdh w16sdtfl w16du wp14">
+  <w:endnote w:type="separator" w:id="-1">
+    <w:p>
+      <w:r>
+        <w:separator/>
+      </w:r>
+    </w:p>
+  </w:endnote>
+  <w:endnote w:type="continuationSeparator" w:id="0">
+    <w:p>
+      <w:r>
+        <w:continuationSeparator/>
+      </w:r>
+    </w:p>
+  </w:endnote>
+</w:endnotes>
+</file>
+
+<file path=word/footnotes.xml><?xml version="1.0" encoding="utf-8"?>
+<w:footnotes xmlns:wpc="http://schemas.microsoft.com/office/word/2010/wordprocessingCanvas" xmlns:cx="http://schemas.microsoft.com/office/drawing/2014/chartex" xmlns:cx1="http://schemas.microsoft.com/office/drawing/2015/9/8/chartex" xmlns:cx2="http://schemas.microsoft.com/office/drawing/2015/10/21/chartex" xmlns:cx3="http://schemas.microsoft.com/office/drawing/2016/5/9/chartex" xmlns:cx4="http://schemas.microsoft.com/office/drawing/2016/5/10/chartex" xmlns:cx5="http://schemas.microsoft.com/office/drawing/2016/5/11/chartex" xmlns:cx6="http://schemas.microsoft.com/office/drawing/2016/5/12/chartex" xmlns:cx7="http://schemas.microsoft.com/office/drawing/2016/5/13/chartex" xmlns:cx8="http://schemas.microsoft.com/office/drawing/2016/5/14/chartex" xmlns:mc="http://schemas.openxmlformats.org/markup-compatibility/2006" xmlns:aink="http://schemas.microsoft.com/office/drawing/2016/ink" xmlns:am3d="http://schemas.microsoft.com/office/drawing/2017/model3d" xmlns:o="urn:schemas-microsoft-com:office:office" xmlns:oel="http://schemas.microsoft.com/office/2019/extlst" xmlns:r="http://schemas.openxmlformats.org/officeDocument/2006/relationships" xmlns:m="http://schemas.openxmlformats.org/officeDocument/2006/math" xmlns:v="urn:schemas-microsoft-com:vml" xmlns:wp14="http://schemas.microsoft.com/office/word/2010/wordprocessingDrawing" xmlns:wp="http://schemas.openxmlformats.org/drawingml/2006/wordprocessingDrawing" xmlns:w10="urn:schemas-microsoft-com:office:word" xmlns:w="http://schemas.openxmlformats.org/wordprocessingml/2006/main" xmlns:w14="http://schemas.microsoft.com/office/word/2010/wordml" xmlns:w15="http://schemas.microsoft.com/office/word/2012/wordml" xmlns:w16cex="http://schemas.microsoft.com/office/word/2018/wordml/cex" xmlns:w16cid="http://schemas.microsoft.com/office/word/2016/wordml/cid" xmlns:w16="http://schemas.microsoft.com/office/word/2018/wordml" xmlns:w16du="http://schemas.microsoft.com/office/word/2023/wordml/word16du" xmlns:w16sdtdh="http://schemas.microsoft.com/office/word/2020/wordml/sdtdatahash" xmlns:w16sdtfl="http://schemas.microsoft.com/office/word/2024/wordml/sdtformatlock" xmlns:w16se="http://schemas.microsoft.com/office/word/2015/wordml/symex" xmlns:wpg="http://schemas.microsoft.com/office/word/2010/wordprocessingGroup" xmlns:wpi="http://schemas.microsoft.com/office/word/2010/wordprocessingInk" xmlns:wne="http://schemas.microsoft.com/office/word/2006/wordml" xmlns:wps="http://schemas.microsoft.com/office/word/2010/wordprocessingShape" mc:Ignorable="w14 w15 w16se w16cid w16 w16cex w16sdtdh w16sdtfl w16du wp14">
+  <w:footnote w:type="separator" w:id="-1">
+    <w:p>
+      <w:r>
+        <w:separator/>
+      </w:r>
+    </w:p>
+  </w:footnote>
+  <w:footnote w:type="continuationSeparator" w:id="0">
+    <w:p>
+      <w:r>
+        <w:continuationSeparator/>
+      </w:r>
+    </w:p>
+  </w:footnote>
+</w:footnotes>
 </file>
 
 <file path=word/numbering.xml><?xml version="1.0" encoding="utf-8"?>
@@ -3515,6 +3772,66 @@
       <w:spacing w:val="5"/>
     </w:rPr>
   </w:style>
+  <w:style w:type="paragraph" w:styleId="ae">
+    <w:name w:val="header"/>
+    <w:basedOn w:val="a"/>
+    <w:link w:val="af"/>
+    <w:uiPriority w:val="99"/>
+    <w:unhideWhenUsed/>
+    <w:rsid w:val="004A5A14"/>
+    <w:pPr>
+      <w:tabs>
+        <w:tab w:val="center" w:pos="4153"/>
+        <w:tab w:val="right" w:pos="8306"/>
+      </w:tabs>
+      <w:snapToGrid w:val="0"/>
+    </w:pPr>
+    <w:rPr>
+      <w:sz w:val="20"/>
+      <w:szCs w:val="20"/>
+    </w:rPr>
+  </w:style>
+  <w:style w:type="character" w:customStyle="1" w:styleId="af">
+    <w:name w:val="頁首 字元"/>
+    <w:basedOn w:val="a0"/>
+    <w:link w:val="ae"/>
+    <w:uiPriority w:val="99"/>
+    <w:rsid w:val="004A5A14"/>
+    <w:rPr>
+      <w:sz w:val="20"/>
+      <w:szCs w:val="20"/>
+    </w:rPr>
+  </w:style>
+  <w:style w:type="paragraph" w:styleId="af0">
+    <w:name w:val="footer"/>
+    <w:basedOn w:val="a"/>
+    <w:link w:val="af1"/>
+    <w:uiPriority w:val="99"/>
+    <w:unhideWhenUsed/>
+    <w:rsid w:val="004A5A14"/>
+    <w:pPr>
+      <w:tabs>
+        <w:tab w:val="center" w:pos="4153"/>
+        <w:tab w:val="right" w:pos="8306"/>
+      </w:tabs>
+      <w:snapToGrid w:val="0"/>
+    </w:pPr>
+    <w:rPr>
+      <w:sz w:val="20"/>
+      <w:szCs w:val="20"/>
+    </w:rPr>
+  </w:style>
+  <w:style w:type="character" w:customStyle="1" w:styleId="af1">
+    <w:name w:val="頁尾 字元"/>
+    <w:basedOn w:val="a0"/>
+    <w:link w:val="af0"/>
+    <w:uiPriority w:val="99"/>
+    <w:rsid w:val="004A5A14"/>
+    <w:rPr>
+      <w:sz w:val="20"/>
+      <w:szCs w:val="20"/>
+    </w:rPr>
+  </w:style>
 </w:styles>
 </file>
 

</xml_diff>

<commit_message>
0.4.22 refactor: replace dropdown filters with horizontal scroll chips
</commit_message>
<xml_diff>
--- a/TO DO.docx
+++ b/TO DO.docx
@@ -51,14 +51,12 @@
         </w:rPr>
         <w:t>成</w:t>
       </w:r>
-      <w:proofErr w:type="spellStart"/>
       <w:r>
         <w:rPr>
           <w:rFonts w:hint="eastAsia"/>
         </w:rPr>
         <w:t>figma</w:t>
       </w:r>
-      <w:proofErr w:type="spellEnd"/>
       <w:r>
         <w:rPr>
           <w:rFonts w:hint="eastAsia"/>
@@ -185,17 +183,11 @@
         <w:t>「素食分類」改成「交通方式」</w:t>
       </w:r>
     </w:p>
-    <w:p>
-      <w:pPr>
-        <w:rPr>
-          <w:rFonts w:hint="eastAsia"/>
-        </w:rPr>
-      </w:pPr>
-    </w:p>
-    <w:p>
-      <w:pPr>
-        <w:rPr>
-          <w:rFonts w:eastAsia="DengXian" w:hint="eastAsia"/>
+    <w:p/>
+    <w:p>
+      <w:pPr>
+        <w:rPr>
+          <w:rFonts w:eastAsia="DengXian"/>
         </w:rPr>
       </w:pPr>
     </w:p>
@@ -321,23 +313,7 @@
           <w:rFonts w:eastAsia="DengXian" w:hint="eastAsia"/>
           <w:lang w:eastAsia="zh-CN"/>
         </w:rPr>
-        <w:t xml:space="preserve"> 店家详情</w:t>
-      </w:r>
-      <w:proofErr w:type="gramStart"/>
-      <w:r>
-        <w:rPr>
-          <w:rFonts w:eastAsia="DengXian" w:hint="eastAsia"/>
-          <w:lang w:eastAsia="zh-CN"/>
-        </w:rPr>
-        <w:t>页交通</w:t>
-      </w:r>
-      <w:proofErr w:type="gramEnd"/>
-      <w:r>
-        <w:rPr>
-          <w:rFonts w:eastAsia="DengXian" w:hint="eastAsia"/>
-          <w:lang w:eastAsia="zh-CN"/>
-        </w:rPr>
-        <w:t>时间数据动态调整</w:t>
+        <w:t xml:space="preserve"> 店家详情页交通时间数据动态调整</w:t>
       </w:r>
     </w:p>
     <w:p>
@@ -365,7 +341,6 @@
       <w:r>
         <w:rPr>
           <w:rFonts w:eastAsia="DengXian" w:hint="eastAsia"/>
-          <w:lang w:eastAsia="zh-CN"/>
         </w:rPr>
         <w:t xml:space="preserve"> </w:t>
       </w:r>
@@ -386,6 +361,11 @@
       </w:r>
     </w:p>
     <w:p>
+      <w:pPr>
+        <w:rPr>
+          <w:rFonts w:eastAsia="DengXian"/>
+        </w:rPr>
+      </w:pPr>
       <w:sdt>
         <w:sdtPr>
           <w:rPr>
@@ -393,7 +373,7 @@
           </w:rPr>
           <w:id w:val="-1970196375"/>
           <w14:checkbox>
-            <w14:checked w14:val="0"/>
+            <w14:checked w14:val="1"/>
             <w14:checkedState w14:val="2612" w14:font="MS Gothic"/>
             <w14:uncheckedState w14:val="2610" w14:font="MS Gothic"/>
           </w14:checkbox>
@@ -403,7 +383,7 @@
             <w:rPr>
               <w:rFonts w:ascii="MS Gothic" w:eastAsia="MS Gothic" w:hAnsi="MS Gothic" w:hint="eastAsia"/>
             </w:rPr>
-            <w:t>☐</w:t>
+            <w:t>☒</w:t>
           </w:r>
         </w:sdtContent>
       </w:sdt>
@@ -440,13 +420,90 @@
         </w:rPr>
         <w:t>)</w:t>
       </w:r>
-    </w:p>
-    <w:p>
-      <w:pPr>
-        <w:rPr>
-          <w:rFonts w:hint="eastAsia"/>
-        </w:rPr>
-      </w:pPr>
+      <w:r>
+        <w:rPr>
+          <w:rFonts w:eastAsia="DengXian" w:hint="eastAsia"/>
+        </w:rPr>
+        <w:t>——</w:t>
+      </w:r>
+    </w:p>
+    <w:p>
+      <w:pPr>
+        <w:ind w:firstLine="480"/>
+        <w:rPr>
+          <w:rFonts w:eastAsia="DengXian"/>
+          <w:lang w:eastAsia="zh-CN"/>
+        </w:rPr>
+      </w:pPr>
+      <w:r>
+        <w:rPr>
+          <w:rFonts w:eastAsia="DengXian" w:hint="eastAsia"/>
+          <w:lang w:eastAsia="zh-CN"/>
+        </w:rPr>
+        <w:t>问题：</w:t>
+      </w:r>
+      <w:r>
+        <w:rPr>
+          <w:rFonts w:eastAsia="DengXian" w:hint="eastAsia"/>
+          <w:lang w:eastAsia="zh-CN"/>
+        </w:rPr>
+        <w:t>1.原生select中的option无法使用img。</w:t>
+      </w:r>
+    </w:p>
+    <w:p>
+      <w:pPr>
+        <w:ind w:left="480" w:firstLineChars="300" w:firstLine="720"/>
+        <w:rPr>
+          <w:rFonts w:eastAsia="DengXian"/>
+          <w:lang w:eastAsia="zh-CN"/>
+        </w:rPr>
+      </w:pPr>
+      <w:r>
+        <w:rPr>
+          <w:rFonts w:eastAsia="DengXian" w:hint="eastAsia"/>
+          <w:lang w:eastAsia="zh-CN"/>
+        </w:rPr>
+        <w:t>2.div模拟选单在3D旋转后的版面会被吃掉,导致点不到选项?</w:t>
+      </w:r>
+    </w:p>
+    <w:p>
+      <w:pPr>
+        <w:ind w:firstLine="480"/>
+        <w:rPr>
+          <w:rFonts w:eastAsia="DengXian"/>
+          <w:lang w:eastAsia="zh-CN"/>
+        </w:rPr>
+      </w:pPr>
+      <w:r>
+        <w:rPr>
+          <w:rFonts w:eastAsia="DengXian" w:hint="eastAsia"/>
+          <w:lang w:eastAsia="zh-CN"/>
+        </w:rPr>
+        <w:t>替代：</w:t>
+      </w:r>
+      <w:r>
+        <w:rPr>
+          <w:rFonts w:eastAsia="DengXian"/>
+          <w:lang w:eastAsia="zh-CN"/>
+        </w:rPr>
+        <w:t>簡化成「1 鍵」的平面化標籤</w:t>
+      </w:r>
+      <w:r>
+        <w:rPr>
+          <w:rFonts w:eastAsia="DengXian" w:hint="eastAsia"/>
+          <w:lang w:eastAsia="zh-CN"/>
+        </w:rPr>
+        <w:t>，改用</w:t>
+      </w:r>
+      <w:r>
+        <w:rPr>
+          <w:rFonts w:eastAsia="DengXian"/>
+          <w:lang w:eastAsia="zh-CN"/>
+        </w:rPr>
+        <w:t>橫向膠囊標籤（Pill/Chip Buttons）</w:t>
+      </w:r>
+    </w:p>
+    <w:p>
       <w:sdt>
         <w:sdtPr>
           <w:rPr>
@@ -493,6 +550,136 @@
           <w:rPr>
             <w:rFonts w:hint="eastAsia"/>
           </w:rPr>
+          <w:id w:val="-222674239"/>
+          <w14:checkbox>
+            <w14:checked w14:val="0"/>
+            <w14:checkedState w14:val="2612" w14:font="MS Gothic"/>
+            <w14:uncheckedState w14:val="2610" w14:font="MS Gothic"/>
+          </w14:checkbox>
+        </w:sdtPr>
+        <w:sdtContent>
+          <w:r>
+            <w:rPr>
+              <w:rFonts w:ascii="MS Gothic" w:eastAsia="MS Gothic" w:hAnsi="MS Gothic" w:hint="eastAsia"/>
+            </w:rPr>
+            <w:t>☐</w:t>
+          </w:r>
+        </w:sdtContent>
+      </w:sdt>
+      <w:r>
+        <w:rPr>
+          <w:rFonts w:hint="eastAsia"/>
+        </w:rPr>
+        <w:t xml:space="preserve"> </w:t>
+      </w:r>
+      <w:r>
+        <w:t>線上菜單放大燈箱</w:t>
+      </w:r>
+      <w:r>
+        <w:rPr>
+          <w:rFonts w:hint="eastAsia"/>
+        </w:rPr>
+        <w:t>，</w:t>
+      </w:r>
+      <w:r>
+        <w:rPr>
+          <w:rFonts w:eastAsia="DengXian" w:hint="eastAsia"/>
+        </w:rPr>
+        <w:t>左键无法拖动</w:t>
+      </w:r>
+    </w:p>
+    <w:p>
+      <w:pPr>
+        <w:rPr>
+          <w:rFonts w:ascii="DengXian" w:eastAsia="DengXian" w:hAnsi="DengXian"/>
+        </w:rPr>
+      </w:pPr>
+      <w:sdt>
+        <w:sdtPr>
+          <w:rPr>
+            <w:rFonts w:hint="eastAsia"/>
+          </w:rPr>
+          <w:id w:val="871115449"/>
+          <w14:checkbox>
+            <w14:checked w14:val="0"/>
+            <w14:checkedState w14:val="2612" w14:font="MS Gothic"/>
+            <w14:uncheckedState w14:val="2610" w14:font="MS Gothic"/>
+          </w14:checkbox>
+        </w:sdtPr>
+        <w:sdtContent>
+          <w:r>
+            <w:rPr>
+              <w:rFonts w:ascii="MS Gothic" w:eastAsia="MS Gothic" w:hAnsi="MS Gothic" w:hint="eastAsia"/>
+            </w:rPr>
+            <w:t>☐</w:t>
+          </w:r>
+        </w:sdtContent>
+      </w:sdt>
+      <w:r>
+        <w:rPr>
+          <w:rFonts w:hint="eastAsia"/>
+        </w:rPr>
+        <w:t xml:space="preserve"> </w:t>
+      </w:r>
+      <w:r>
+        <w:t>線上菜單放大燈箱</w:t>
+      </w:r>
+      <w:r>
+        <w:rPr>
+          <w:rFonts w:ascii="DengXian" w:eastAsia="DengXian" w:hAnsi="DengXian" w:hint="eastAsia"/>
+        </w:rPr>
+        <w:t>，视觉统一</w:t>
+      </w:r>
+    </w:p>
+    <w:p>
+      <w:pPr>
+        <w:rPr>
+          <w:rFonts w:eastAsia="DengXian" w:hint="eastAsia"/>
+          <w:lang w:eastAsia="zh-CN"/>
+        </w:rPr>
+      </w:pPr>
+      <w:sdt>
+        <w:sdtPr>
+          <w:rPr>
+            <w:rFonts w:hint="eastAsia"/>
+          </w:rPr>
+          <w:id w:val="-981071932"/>
+          <w14:checkbox>
+            <w14:checked w14:val="0"/>
+            <w14:checkedState w14:val="2612" w14:font="MS Gothic"/>
+            <w14:uncheckedState w14:val="2610" w14:font="MS Gothic"/>
+          </w14:checkbox>
+        </w:sdtPr>
+        <w:sdtContent>
+          <w:r>
+            <w:rPr>
+              <w:rFonts w:ascii="MS Gothic" w:eastAsia="MS Gothic" w:hAnsi="MS Gothic" w:hint="eastAsia"/>
+            </w:rPr>
+            <w:t>☐</w:t>
+          </w:r>
+        </w:sdtContent>
+      </w:sdt>
+      <w:r>
+        <w:rPr>
+          <w:rFonts w:eastAsia="DengXian" w:hint="eastAsia"/>
+          <w:lang w:eastAsia="zh-CN"/>
+        </w:rPr>
+        <w:t xml:space="preserve"> 店家页特色餐点放大检视，文字描述</w:t>
+      </w:r>
+    </w:p>
+    <w:p>
+      <w:pPr>
+        <w:rPr>
+          <w:rFonts w:eastAsia="DengXian"/>
+          <w:lang w:eastAsia="zh-CN"/>
+        </w:rPr>
+      </w:pPr>
+      <w:sdt>
+        <w:sdtPr>
+          <w:rPr>
+            <w:rFonts w:hint="eastAsia"/>
+            <w:lang w:eastAsia="zh-CN"/>
+          </w:rPr>
           <w:id w:val="-1040277379"/>
           <w14:checkbox>
             <w14:checked w14:val="1"/>
@@ -504,6 +691,7 @@
           <w:r>
             <w:rPr>
               <w:rFonts w:ascii="MS Gothic" w:eastAsia="MS Gothic" w:hAnsi="MS Gothic" w:hint="eastAsia"/>
+              <w:lang w:eastAsia="zh-CN"/>
             </w:rPr>
             <w:t>☒</w:t>
           </w:r>
@@ -512,6 +700,7 @@
       <w:r>
         <w:rPr>
           <w:rFonts w:eastAsia="DengXian" w:hint="eastAsia"/>
+          <w:lang w:eastAsia="zh-CN"/>
         </w:rPr>
         <w:t xml:space="preserve"> Info动画调整</w:t>
       </w:r>
@@ -548,16 +737,8 @@
         <w:rPr>
           <w:rFonts w:hint="eastAsia"/>
         </w:rPr>
-        <w:t xml:space="preserve"> </w:t>
-      </w:r>
-      <w:proofErr w:type="spellStart"/>
-      <w:r>
-        <w:rPr>
-          <w:rFonts w:hint="eastAsia"/>
-        </w:rPr>
-        <w:t>shopDetail</w:t>
-      </w:r>
-      <w:proofErr w:type="spellEnd"/>
+        <w:t xml:space="preserve"> shopDetail</w:t>
+      </w:r>
       <w:r>
         <w:rPr>
           <w:rFonts w:hint="eastAsia"/>
@@ -773,23 +954,7 @@
           <w:rFonts w:eastAsia="DengXian" w:hint="eastAsia"/>
           <w:lang w:eastAsia="zh-CN"/>
         </w:rPr>
-        <w:t xml:space="preserve"> 店家</w:t>
-      </w:r>
-      <w:proofErr w:type="gramStart"/>
-      <w:r>
-        <w:rPr>
-          <w:rFonts w:eastAsia="DengXian" w:hint="eastAsia"/>
-          <w:lang w:eastAsia="zh-CN"/>
-        </w:rPr>
-        <w:t>页根据</w:t>
-      </w:r>
-      <w:proofErr w:type="gramEnd"/>
-      <w:r>
-        <w:rPr>
-          <w:rFonts w:eastAsia="DengXian" w:hint="eastAsia"/>
-          <w:lang w:eastAsia="zh-CN"/>
-        </w:rPr>
-        <w:t>当前星期调整营业时间</w:t>
+        <w:t xml:space="preserve"> 店家页根据当前星期调整营业时间</w:t>
       </w:r>
     </w:p>
     <w:p>
@@ -865,23 +1030,7 @@
           <w:rFonts w:eastAsia="DengXian" w:hint="eastAsia"/>
           <w:lang w:eastAsia="zh-CN"/>
         </w:rPr>
-        <w:t xml:space="preserve"> 地图页图标选取后，手机</w:t>
-      </w:r>
-      <w:proofErr w:type="gramStart"/>
-      <w:r>
-        <w:rPr>
-          <w:rFonts w:eastAsia="DengXian" w:hint="eastAsia"/>
-          <w:lang w:eastAsia="zh-CN"/>
-        </w:rPr>
-        <w:t>端保持</w:t>
-      </w:r>
-      <w:proofErr w:type="gramEnd"/>
-      <w:r>
-        <w:rPr>
-          <w:rFonts w:eastAsia="DengXian" w:hint="eastAsia"/>
-          <w:lang w:eastAsia="zh-CN"/>
-        </w:rPr>
-        <w:t>配角呈现选取店家</w:t>
+        <w:t xml:space="preserve"> 地图页图标选取后，手机端保持配角呈现选取店家</w:t>
       </w:r>
     </w:p>
     <w:p>
@@ -1111,24 +1260,14 @@
         <w:rPr>
           <w:rFonts w:hint="eastAsia"/>
         </w:rPr>
-        <w:t>、</w:t>
-      </w:r>
-      <w:proofErr w:type="gramStart"/>
-      <w:r>
-        <w:rPr>
-          <w:rFonts w:hint="eastAsia"/>
-        </w:rPr>
-        <w:t>跳轉</w:t>
-      </w:r>
-      <w:proofErr w:type="spellStart"/>
-      <w:proofErr w:type="gramEnd"/>
+        <w:t>、跳轉</w:t>
+      </w:r>
       <w:r>
         <w:rPr>
           <w:rFonts w:hint="eastAsia"/>
         </w:rPr>
         <w:t>shopDetail</w:t>
       </w:r>
-      <w:proofErr w:type="spellEnd"/>
       <w:r>
         <w:rPr>
           <w:rFonts w:hint="eastAsia"/>
@@ -1182,16 +1321,8 @@
         <w:rPr>
           <w:rFonts w:hint="eastAsia"/>
         </w:rPr>
-        <w:t>店家詳情</w:t>
-      </w:r>
-      <w:proofErr w:type="gramStart"/>
-      <w:r>
-        <w:rPr>
-          <w:rFonts w:hint="eastAsia"/>
-        </w:rPr>
-        <w:t>頁跳轉</w:t>
-      </w:r>
-      <w:proofErr w:type="gramEnd"/>
+        <w:t>店家詳情頁跳轉</w:t>
+      </w:r>
       <w:r>
         <w:rPr>
           <w:rFonts w:eastAsia="DengXian" w:hint="eastAsia"/>
@@ -1390,16 +1521,8 @@
         <w:rPr>
           <w:rFonts w:hint="eastAsia"/>
         </w:rPr>
-        <w:t xml:space="preserve"> </w:t>
-      </w:r>
-      <w:proofErr w:type="spellStart"/>
-      <w:r>
-        <w:rPr>
-          <w:rFonts w:hint="eastAsia"/>
-        </w:rPr>
-        <w:t>shopDetail</w:t>
-      </w:r>
-      <w:proofErr w:type="spellEnd"/>
+        <w:t xml:space="preserve"> shopDetail</w:t>
+      </w:r>
       <w:r>
         <w:rPr>
           <w:rFonts w:hint="eastAsia"/>
@@ -1435,22 +1558,18 @@
         </w:rPr>
         <w:t xml:space="preserve"> </w:t>
       </w:r>
-      <w:proofErr w:type="gramStart"/>
       <w:r>
         <w:rPr>
           <w:rFonts w:hint="eastAsia"/>
         </w:rPr>
         <w:t>跳轉</w:t>
       </w:r>
-      <w:proofErr w:type="spellStart"/>
-      <w:proofErr w:type="gramEnd"/>
       <w:r>
         <w:rPr>
           <w:rFonts w:hint="eastAsia"/>
         </w:rPr>
         <w:t>shopDetail</w:t>
       </w:r>
-      <w:proofErr w:type="spellEnd"/>
       <w:r>
         <w:rPr>
           <w:rFonts w:hint="eastAsia"/>
@@ -1465,10 +1584,16 @@
       </w:r>
     </w:p>
     <w:p>
+      <w:pPr>
+        <w:rPr>
+          <w:lang w:eastAsia="zh-CN"/>
+        </w:rPr>
+      </w:pPr>
       <w:sdt>
         <w:sdtPr>
           <w:rPr>
             <w:rFonts w:hint="eastAsia"/>
+            <w:lang w:eastAsia="zh-CN"/>
           </w:rPr>
           <w:id w:val="1686014558"/>
           <w14:checkbox>
@@ -1481,6 +1606,7 @@
           <w:r>
             <w:rPr>
               <w:rFonts w:ascii="MS Gothic" w:eastAsia="MS Gothic" w:hAnsi="MS Gothic" w:hint="eastAsia"/>
+              <w:lang w:eastAsia="zh-CN"/>
             </w:rPr>
             <w:t>☒</w:t>
           </w:r>
@@ -1489,17 +1615,17 @@
       <w:r>
         <w:rPr>
           <w:rFonts w:hint="eastAsia"/>
+          <w:lang w:eastAsia="zh-CN"/>
         </w:rPr>
         <w:t xml:space="preserve"> </w:t>
       </w:r>
-      <w:proofErr w:type="gramStart"/>
-      <w:r>
-        <w:rPr>
-          <w:rFonts w:hint="eastAsia"/>
+      <w:r>
+        <w:rPr>
+          <w:rFonts w:hint="eastAsia"/>
+          <w:lang w:eastAsia="zh-CN"/>
         </w:rPr>
         <w:t>缺少置頂按鍵</w:t>
       </w:r>
-      <w:proofErr w:type="gramEnd"/>
     </w:p>
     <w:p>
       <w:pPr>
@@ -1988,35 +2114,7 @@
         <w:rPr>
           <w:rFonts w:hint="eastAsia"/>
         </w:rPr>
-        <w:t>不要五角圖，</w:t>
-      </w:r>
-      <w:proofErr w:type="gramStart"/>
-      <w:r>
-        <w:rPr>
-          <w:rFonts w:hint="eastAsia"/>
-        </w:rPr>
-        <w:t>放食材</w:t>
-      </w:r>
-      <w:proofErr w:type="gramEnd"/>
-      <w:r>
-        <w:rPr>
-          <w:rFonts w:hint="eastAsia"/>
-        </w:rPr>
-        <w:t>、食材圖片和</w:t>
-      </w:r>
-      <w:proofErr w:type="gramStart"/>
-      <w:r>
-        <w:rPr>
-          <w:rFonts w:hint="eastAsia"/>
-        </w:rPr>
-        <w:t>食材</w:t>
-      </w:r>
-      <w:proofErr w:type="gramEnd"/>
-      <w:r>
-        <w:rPr>
-          <w:rFonts w:hint="eastAsia"/>
-        </w:rPr>
-        <w:t>功用</w:t>
+        <w:t>不要五角圖，放食材、食材圖片和食材功用</w:t>
       </w:r>
       <w:r>
         <w:rPr>
@@ -2166,14 +2264,12 @@
         </w:rPr>
         <w:t>8.</w:t>
       </w:r>
-      <w:proofErr w:type="gramStart"/>
       <w:r>
         <w:rPr>
           <w:rFonts w:hint="eastAsia"/>
         </w:rPr>
         <w:t>跳轉邏輯</w:t>
       </w:r>
-      <w:proofErr w:type="gramEnd"/>
     </w:p>
     <w:p>
       <w:r>

</xml_diff>

<commit_message>
0.4.23 refactor(ui): extract menu lightbox into standalone component and apply to all views
</commit_message>
<xml_diff>
--- a/TO DO.docx
+++ b/TO DO.docx
@@ -313,7 +313,23 @@
           <w:rFonts w:eastAsia="DengXian" w:hint="eastAsia"/>
           <w:lang w:eastAsia="zh-CN"/>
         </w:rPr>
-        <w:t xml:space="preserve"> 店家详情页交通时间数据动态调整</w:t>
+        <w:t xml:space="preserve"> 店家详情</w:t>
+      </w:r>
+      <w:proofErr w:type="gramStart"/>
+      <w:r>
+        <w:rPr>
+          <w:rFonts w:eastAsia="DengXian" w:hint="eastAsia"/>
+          <w:lang w:eastAsia="zh-CN"/>
+        </w:rPr>
+        <w:t>页交通</w:t>
+      </w:r>
+      <w:proofErr w:type="gramEnd"/>
+      <w:r>
+        <w:rPr>
+          <w:rFonts w:eastAsia="DengXian" w:hint="eastAsia"/>
+          <w:lang w:eastAsia="zh-CN"/>
+        </w:rPr>
+        <w:t>时间数据动态调整</w:t>
       </w:r>
     </w:p>
     <w:p>
@@ -420,12 +436,14 @@
         </w:rPr>
         <w:t>)</w:t>
       </w:r>
+      <w:proofErr w:type="gramStart"/>
       <w:r>
         <w:rPr>
           <w:rFonts w:eastAsia="DengXian" w:hint="eastAsia"/>
         </w:rPr>
         <w:t>——</w:t>
       </w:r>
+      <w:proofErr w:type="gramEnd"/>
     </w:p>
     <w:p>
       <w:pPr>
@@ -486,7 +504,23 @@
           <w:rFonts w:eastAsia="DengXian"/>
           <w:lang w:eastAsia="zh-CN"/>
         </w:rPr>
-        <w:t>簡化成「1 鍵」的平面化標籤</w:t>
+        <w:t>簡化成「1 鍵」的平面化</w:t>
+      </w:r>
+      <w:proofErr w:type="gramStart"/>
+      <w:r>
+        <w:rPr>
+          <w:rFonts w:eastAsia="DengXian"/>
+          <w:lang w:eastAsia="zh-CN"/>
+        </w:rPr>
+        <w:t>標</w:t>
+      </w:r>
+      <w:proofErr w:type="gramEnd"/>
+      <w:r>
+        <w:rPr>
+          <w:rFonts w:eastAsia="DengXian"/>
+          <w:lang w:eastAsia="zh-CN"/>
+        </w:rPr>
+        <w:t>籤</w:t>
       </w:r>
       <w:r>
         <w:rPr>
@@ -500,7 +534,23 @@
           <w:rFonts w:eastAsia="DengXian"/>
           <w:lang w:eastAsia="zh-CN"/>
         </w:rPr>
-        <w:t>橫向膠囊標籤（Pill/Chip Buttons）</w:t>
+        <w:t>橫向膠囊</w:t>
+      </w:r>
+      <w:proofErr w:type="gramStart"/>
+      <w:r>
+        <w:rPr>
+          <w:rFonts w:eastAsia="DengXian"/>
+          <w:lang w:eastAsia="zh-CN"/>
+        </w:rPr>
+        <w:t>標</w:t>
+      </w:r>
+      <w:proofErr w:type="gramEnd"/>
+      <w:r>
+        <w:rPr>
+          <w:rFonts w:eastAsia="DengXian"/>
+          <w:lang w:eastAsia="zh-CN"/>
+        </w:rPr>
+        <w:t>籤（Pill/Chip Buttons）</w:t>
       </w:r>
     </w:p>
     <w:p>
@@ -542,7 +592,6 @@
       <w:pPr>
         <w:rPr>
           <w:rFonts w:eastAsia="DengXian"/>
-          <w:lang w:eastAsia="zh-CN"/>
         </w:rPr>
       </w:pPr>
       <w:sdt>
@@ -552,7 +601,7 @@
           </w:rPr>
           <w:id w:val="-222674239"/>
           <w14:checkbox>
-            <w14:checked w14:val="0"/>
+            <w14:checked w14:val="1"/>
             <w14:checkedState w14:val="2612" w14:font="MS Gothic"/>
             <w14:uncheckedState w14:val="2610" w14:font="MS Gothic"/>
           </w14:checkbox>
@@ -562,7 +611,7 @@
             <w:rPr>
               <w:rFonts w:ascii="MS Gothic" w:eastAsia="MS Gothic" w:hAnsi="MS Gothic" w:hint="eastAsia"/>
             </w:rPr>
-            <w:t>☐</w:t>
+            <w:t>☒</w:t>
           </w:r>
         </w:sdtContent>
       </w:sdt>
@@ -572,8 +621,13 @@
         </w:rPr>
         <w:t xml:space="preserve"> </w:t>
       </w:r>
-      <w:r>
-        <w:t>線上菜單放大燈箱</w:t>
+      <w:proofErr w:type="gramStart"/>
+      <w:r>
+        <w:t>線上菜單</w:t>
+      </w:r>
+      <w:proofErr w:type="gramEnd"/>
+      <w:r>
+        <w:t>放大燈箱</w:t>
       </w:r>
       <w:r>
         <w:rPr>
@@ -592,16 +646,18 @@
       <w:pPr>
         <w:rPr>
           <w:rFonts w:ascii="DengXian" w:eastAsia="DengXian" w:hAnsi="DengXian"/>
+          <w:lang w:eastAsia="zh-CN"/>
         </w:rPr>
       </w:pPr>
       <w:sdt>
         <w:sdtPr>
           <w:rPr>
             <w:rFonts w:hint="eastAsia"/>
+            <w:lang w:eastAsia="zh-CN"/>
           </w:rPr>
           <w:id w:val="871115449"/>
           <w14:checkbox>
-            <w14:checked w14:val="0"/>
+            <w14:checked w14:val="1"/>
             <w14:checkedState w14:val="2612" w14:font="MS Gothic"/>
             <w14:uncheckedState w14:val="2610" w14:font="MS Gothic"/>
           </w14:checkbox>
@@ -610,23 +666,57 @@
           <w:r>
             <w:rPr>
               <w:rFonts w:ascii="MS Gothic" w:eastAsia="MS Gothic" w:hAnsi="MS Gothic" w:hint="eastAsia"/>
+              <w:lang w:eastAsia="zh-CN"/>
             </w:rPr>
-            <w:t>☐</w:t>
+            <w:t>☒</w:t>
           </w:r>
         </w:sdtContent>
       </w:sdt>
       <w:r>
         <w:rPr>
           <w:rFonts w:hint="eastAsia"/>
+          <w:lang w:eastAsia="zh-CN"/>
         </w:rPr>
         <w:t xml:space="preserve"> </w:t>
       </w:r>
       <w:r>
-        <w:t>線上菜單放大燈箱</w:t>
+        <w:rPr>
+          <w:lang w:eastAsia="zh-CN"/>
+        </w:rPr>
+        <w:t>線上菜</w:t>
+      </w:r>
+      <w:proofErr w:type="gramStart"/>
+      <w:r>
+        <w:rPr>
+          <w:lang w:eastAsia="zh-CN"/>
+        </w:rPr>
+        <w:t>單</w:t>
+      </w:r>
+      <w:proofErr w:type="gramEnd"/>
+      <w:r>
+        <w:rPr>
+          <w:lang w:eastAsia="zh-CN"/>
+        </w:rPr>
+        <w:t>放大</w:t>
+      </w:r>
+      <w:proofErr w:type="gramStart"/>
+      <w:r>
+        <w:rPr>
+          <w:lang w:eastAsia="zh-CN"/>
+        </w:rPr>
+        <w:t>燈</w:t>
+      </w:r>
+      <w:proofErr w:type="gramEnd"/>
+      <w:r>
+        <w:rPr>
+          <w:lang w:eastAsia="zh-CN"/>
+        </w:rPr>
+        <w:t>箱</w:t>
       </w:r>
       <w:r>
         <w:rPr>
           <w:rFonts w:ascii="DengXian" w:eastAsia="DengXian" w:hAnsi="DengXian" w:hint="eastAsia"/>
+          <w:lang w:eastAsia="zh-CN"/>
         </w:rPr>
         <w:t>，视觉统一</w:t>
       </w:r>
@@ -634,7 +724,7 @@
     <w:p>
       <w:pPr>
         <w:rPr>
-          <w:rFonts w:eastAsia="DengXian" w:hint="eastAsia"/>
+          <w:rFonts w:eastAsia="DengXian"/>
           <w:lang w:eastAsia="zh-CN"/>
         </w:rPr>
       </w:pPr>
@@ -642,6 +732,7 @@
         <w:sdtPr>
           <w:rPr>
             <w:rFonts w:hint="eastAsia"/>
+            <w:lang w:eastAsia="zh-CN"/>
           </w:rPr>
           <w:id w:val="-981071932"/>
           <w14:checkbox>
@@ -654,6 +745,7 @@
           <w:r>
             <w:rPr>
               <w:rFonts w:ascii="MS Gothic" w:eastAsia="MS Gothic" w:hAnsi="MS Gothic" w:hint="eastAsia"/>
+              <w:lang w:eastAsia="zh-CN"/>
             </w:rPr>
             <w:t>☐</w:t>
           </w:r>
@@ -664,7 +756,23 @@
           <w:rFonts w:eastAsia="DengXian" w:hint="eastAsia"/>
           <w:lang w:eastAsia="zh-CN"/>
         </w:rPr>
-        <w:t xml:space="preserve"> 店家页特色餐点放大检视，文字描述</w:t>
+        <w:t xml:space="preserve"> 店家</w:t>
+      </w:r>
+      <w:proofErr w:type="gramStart"/>
+      <w:r>
+        <w:rPr>
+          <w:rFonts w:eastAsia="DengXian" w:hint="eastAsia"/>
+          <w:lang w:eastAsia="zh-CN"/>
+        </w:rPr>
+        <w:t>页特色餐点</w:t>
+      </w:r>
+      <w:proofErr w:type="gramEnd"/>
+      <w:r>
+        <w:rPr>
+          <w:rFonts w:eastAsia="DengXian" w:hint="eastAsia"/>
+          <w:lang w:eastAsia="zh-CN"/>
+        </w:rPr>
+        <w:t>放大检视，文字描述</w:t>
       </w:r>
     </w:p>
     <w:p>
@@ -954,7 +1062,23 @@
           <w:rFonts w:eastAsia="DengXian" w:hint="eastAsia"/>
           <w:lang w:eastAsia="zh-CN"/>
         </w:rPr>
-        <w:t xml:space="preserve"> 店家页根据当前星期调整营业时间</w:t>
+        <w:t xml:space="preserve"> 店家</w:t>
+      </w:r>
+      <w:proofErr w:type="gramStart"/>
+      <w:r>
+        <w:rPr>
+          <w:rFonts w:eastAsia="DengXian" w:hint="eastAsia"/>
+          <w:lang w:eastAsia="zh-CN"/>
+        </w:rPr>
+        <w:t>页根据</w:t>
+      </w:r>
+      <w:proofErr w:type="gramEnd"/>
+      <w:r>
+        <w:rPr>
+          <w:rFonts w:eastAsia="DengXian" w:hint="eastAsia"/>
+          <w:lang w:eastAsia="zh-CN"/>
+        </w:rPr>
+        <w:t>当前星期调整营业时间</w:t>
       </w:r>
     </w:p>
     <w:p>
@@ -1030,7 +1154,23 @@
           <w:rFonts w:eastAsia="DengXian" w:hint="eastAsia"/>
           <w:lang w:eastAsia="zh-CN"/>
         </w:rPr>
-        <w:t xml:space="preserve"> 地图页图标选取后，手机端保持配角呈现选取店家</w:t>
+        <w:t xml:space="preserve"> 地图页图标选取后，手机</w:t>
+      </w:r>
+      <w:proofErr w:type="gramStart"/>
+      <w:r>
+        <w:rPr>
+          <w:rFonts w:eastAsia="DengXian" w:hint="eastAsia"/>
+          <w:lang w:eastAsia="zh-CN"/>
+        </w:rPr>
+        <w:t>端保持</w:t>
+      </w:r>
+      <w:proofErr w:type="gramEnd"/>
+      <w:r>
+        <w:rPr>
+          <w:rFonts w:eastAsia="DengXian" w:hint="eastAsia"/>
+          <w:lang w:eastAsia="zh-CN"/>
+        </w:rPr>
+        <w:t>配角呈现选取店家</w:t>
       </w:r>
     </w:p>
     <w:p>
@@ -1260,8 +1400,16 @@
         <w:rPr>
           <w:rFonts w:hint="eastAsia"/>
         </w:rPr>
-        <w:t>、跳轉</w:t>
-      </w:r>
+        <w:t>、</w:t>
+      </w:r>
+      <w:proofErr w:type="gramStart"/>
+      <w:r>
+        <w:rPr>
+          <w:rFonts w:hint="eastAsia"/>
+        </w:rPr>
+        <w:t>跳轉</w:t>
+      </w:r>
+      <w:proofErr w:type="gramEnd"/>
       <w:r>
         <w:rPr>
           <w:rFonts w:hint="eastAsia"/>
@@ -1321,8 +1469,16 @@
         <w:rPr>
           <w:rFonts w:hint="eastAsia"/>
         </w:rPr>
-        <w:t>店家詳情頁跳轉</w:t>
-      </w:r>
+        <w:t>店家詳情</w:t>
+      </w:r>
+      <w:proofErr w:type="gramStart"/>
+      <w:r>
+        <w:rPr>
+          <w:rFonts w:hint="eastAsia"/>
+        </w:rPr>
+        <w:t>頁跳轉</w:t>
+      </w:r>
+      <w:proofErr w:type="gramEnd"/>
       <w:r>
         <w:rPr>
           <w:rFonts w:eastAsia="DengXian" w:hint="eastAsia"/>
@@ -1558,12 +1714,14 @@
         </w:rPr>
         <w:t xml:space="preserve"> </w:t>
       </w:r>
+      <w:proofErr w:type="gramStart"/>
       <w:r>
         <w:rPr>
           <w:rFonts w:hint="eastAsia"/>
         </w:rPr>
         <w:t>跳轉</w:t>
       </w:r>
+      <w:proofErr w:type="gramEnd"/>
       <w:r>
         <w:rPr>
           <w:rFonts w:hint="eastAsia"/>
@@ -2114,7 +2272,35 @@
         <w:rPr>
           <w:rFonts w:hint="eastAsia"/>
         </w:rPr>
-        <w:t>不要五角圖，放食材、食材圖片和食材功用</w:t>
+        <w:t>不要五角圖，</w:t>
+      </w:r>
+      <w:proofErr w:type="gramStart"/>
+      <w:r>
+        <w:rPr>
+          <w:rFonts w:hint="eastAsia"/>
+        </w:rPr>
+        <w:t>放食材</w:t>
+      </w:r>
+      <w:proofErr w:type="gramEnd"/>
+      <w:r>
+        <w:rPr>
+          <w:rFonts w:hint="eastAsia"/>
+        </w:rPr>
+        <w:t>、食材圖片和</w:t>
+      </w:r>
+      <w:proofErr w:type="gramStart"/>
+      <w:r>
+        <w:rPr>
+          <w:rFonts w:hint="eastAsia"/>
+        </w:rPr>
+        <w:t>食材</w:t>
+      </w:r>
+      <w:proofErr w:type="gramEnd"/>
+      <w:r>
+        <w:rPr>
+          <w:rFonts w:hint="eastAsia"/>
+        </w:rPr>
+        <w:t>功用</w:t>
       </w:r>
       <w:r>
         <w:rPr>
@@ -2264,12 +2450,14 @@
         </w:rPr>
         <w:t>8.</w:t>
       </w:r>
+      <w:proofErr w:type="gramStart"/>
       <w:r>
         <w:rPr>
           <w:rFonts w:hint="eastAsia"/>
         </w:rPr>
         <w:t>跳轉邏輯</w:t>
       </w:r>
+      <w:proofErr w:type="gramEnd"/>
     </w:p>
     <w:p>
       <w:r>

</xml_diff>

<commit_message>
0.4.25 refactor(ui): optimize AboutView layout for perfect vertical centering
</commit_message>
<xml_diff>
--- a/TO DO.docx
+++ b/TO DO.docx
@@ -2,81 +2,6 @@
 <file path=word/document.xml><?xml version="1.0" encoding="utf-8"?>
 <w:document xmlns:wpc="http://schemas.microsoft.com/office/word/2010/wordprocessingCanvas" xmlns:cx="http://schemas.microsoft.com/office/drawing/2014/chartex" xmlns:cx1="http://schemas.microsoft.com/office/drawing/2015/9/8/chartex" xmlns:cx2="http://schemas.microsoft.com/office/drawing/2015/10/21/chartex" xmlns:cx3="http://schemas.microsoft.com/office/drawing/2016/5/9/chartex" xmlns:cx4="http://schemas.microsoft.com/office/drawing/2016/5/10/chartex" xmlns:cx5="http://schemas.microsoft.com/office/drawing/2016/5/11/chartex" xmlns:cx6="http://schemas.microsoft.com/office/drawing/2016/5/12/chartex" xmlns:cx7="http://schemas.microsoft.com/office/drawing/2016/5/13/chartex" xmlns:cx8="http://schemas.microsoft.com/office/drawing/2016/5/14/chartex" xmlns:mc="http://schemas.openxmlformats.org/markup-compatibility/2006" xmlns:aink="http://schemas.microsoft.com/office/drawing/2016/ink" xmlns:am3d="http://schemas.microsoft.com/office/drawing/2017/model3d" xmlns:o="urn:schemas-microsoft-com:office:office" xmlns:oel="http://schemas.microsoft.com/office/2019/extlst" xmlns:r="http://schemas.openxmlformats.org/officeDocument/2006/relationships" xmlns:m="http://schemas.openxmlformats.org/officeDocument/2006/math" xmlns:v="urn:schemas-microsoft-com:vml" xmlns:wp14="http://schemas.microsoft.com/office/word/2010/wordprocessingDrawing" xmlns:wp="http://schemas.openxmlformats.org/drawingml/2006/wordprocessingDrawing" xmlns:w10="urn:schemas-microsoft-com:office:word" xmlns:w="http://schemas.openxmlformats.org/wordprocessingml/2006/main" xmlns:w14="http://schemas.microsoft.com/office/word/2010/wordml" xmlns:w15="http://schemas.microsoft.com/office/word/2012/wordml" xmlns:w16cex="http://schemas.microsoft.com/office/word/2018/wordml/cex" xmlns:w16cid="http://schemas.microsoft.com/office/word/2016/wordml/cid" xmlns:w16="http://schemas.microsoft.com/office/word/2018/wordml" xmlns:w16du="http://schemas.microsoft.com/office/word/2023/wordml/word16du" xmlns:w16sdtdh="http://schemas.microsoft.com/office/word/2020/wordml/sdtdatahash" xmlns:w16sdtfl="http://schemas.microsoft.com/office/word/2024/wordml/sdtformatlock" xmlns:w16se="http://schemas.microsoft.com/office/word/2015/wordml/symex" xmlns:wpg="http://schemas.microsoft.com/office/word/2010/wordprocessingGroup" xmlns:wpi="http://schemas.microsoft.com/office/word/2010/wordprocessingInk" xmlns:wne="http://schemas.microsoft.com/office/word/2006/wordml" xmlns:wps="http://schemas.microsoft.com/office/word/2010/wordprocessingShape" mc:Ignorable="w14 w15 w16se w16cid w16 w16cex w16sdtdh w16sdtfl w16du wp14">
   <w:body>
-    <w:p>
-      <w:sdt>
-        <w:sdtPr>
-          <w:rPr>
-            <w:rFonts w:hint="eastAsia"/>
-          </w:rPr>
-          <w:id w:val="-29498608"/>
-          <w14:checkbox>
-            <w14:checked w14:val="0"/>
-            <w14:checkedState w14:val="2612" w14:font="MS Gothic"/>
-            <w14:uncheckedState w14:val="2610" w14:font="MS Gothic"/>
-          </w14:checkbox>
-        </w:sdtPr>
-        <w:sdtContent>
-          <w:r>
-            <w:rPr>
-              <w:rFonts w:ascii="MS Gothic" w:eastAsia="MS Gothic" w:hAnsi="MS Gothic" w:hint="eastAsia"/>
-            </w:rPr>
-            <w:t>☐</w:t>
-          </w:r>
-        </w:sdtContent>
-      </w:sdt>
-      <w:r>
-        <w:rPr>
-          <w:rFonts w:eastAsia="DengXian" w:hint="eastAsia"/>
-        </w:rPr>
-        <w:t xml:space="preserve"> </w:t>
-      </w:r>
-      <w:r>
-        <w:t>I</w:t>
-      </w:r>
-      <w:r>
-        <w:rPr>
-          <w:rFonts w:hint="eastAsia"/>
-        </w:rPr>
-        <w:t>nfo</w:t>
-      </w:r>
-      <w:r>
-        <w:rPr>
-          <w:rFonts w:hint="eastAsia"/>
-        </w:rPr>
-        <w:t>文本及圖片替換</w:t>
-      </w:r>
-      <w:r>
-        <w:rPr>
-          <w:rFonts w:hint="eastAsia"/>
-        </w:rPr>
-        <w:t>成</w:t>
-      </w:r>
-      <w:r>
-        <w:rPr>
-          <w:rFonts w:hint="eastAsia"/>
-        </w:rPr>
-        <w:t>figma</w:t>
-      </w:r>
-      <w:r>
-        <w:rPr>
-          <w:rFonts w:hint="eastAsia"/>
-        </w:rPr>
-        <w:t>上的</w:t>
-      </w:r>
-      <w:r>
-        <w:rPr>
-          <w:rFonts w:hint="eastAsia"/>
-        </w:rPr>
-        <w:t>、</w:t>
-      </w:r>
-      <w:r>
-        <w:rPr>
-          <w:rFonts w:hint="eastAsia"/>
-          <w:strike/>
-        </w:rPr>
-        <w:t>轉場動畫調整</w:t>
-      </w:r>
-    </w:p>
     <w:p>
       <w:sdt>
         <w:sdtPr>
@@ -183,13 +108,286 @@
         <w:t>「素食分類」改成「交通方式」</w:t>
       </w:r>
     </w:p>
+    <w:p>
+      <w:sdt>
+        <w:sdtPr>
+          <w:rPr>
+            <w:rFonts w:hint="eastAsia"/>
+            <w:lang w:eastAsia="zh-CN"/>
+          </w:rPr>
+          <w:id w:val="-471976989"/>
+          <w14:checkbox>
+            <w14:checked w14:val="0"/>
+            <w14:checkedState w14:val="2612" w14:font="MS Gothic"/>
+            <w14:uncheckedState w14:val="2610" w14:font="MS Gothic"/>
+          </w14:checkbox>
+        </w:sdtPr>
+        <w:sdtContent>
+          <w:r>
+            <w:rPr>
+              <w:rFonts w:ascii="MS Gothic" w:eastAsia="MS Gothic" w:hAnsi="MS Gothic" w:hint="eastAsia"/>
+              <w:lang w:eastAsia="zh-CN"/>
+            </w:rPr>
+            <w:t>☐</w:t>
+          </w:r>
+        </w:sdtContent>
+      </w:sdt>
+      <w:r>
+        <w:rPr>
+          <w:rFonts w:hint="eastAsia"/>
+          <w:lang w:eastAsia="zh-CN"/>
+        </w:rPr>
+        <w:t xml:space="preserve"> </w:t>
+      </w:r>
+      <w:r>
+        <w:rPr>
+          <w:rFonts w:hint="eastAsia"/>
+          <w:lang w:eastAsia="zh-CN"/>
+        </w:rPr>
+        <w:t>封面</w:t>
+      </w:r>
+      <w:proofErr w:type="gramStart"/>
+      <w:r>
+        <w:rPr>
+          <w:rFonts w:hint="eastAsia"/>
+          <w:lang w:eastAsia="zh-CN"/>
+        </w:rPr>
+        <w:t>樣</w:t>
+      </w:r>
+      <w:proofErr w:type="gramEnd"/>
+      <w:r>
+        <w:rPr>
+          <w:rFonts w:hint="eastAsia"/>
+          <w:lang w:eastAsia="zh-CN"/>
+        </w:rPr>
+        <w:t>式</w:t>
+      </w:r>
+    </w:p>
+    <w:p>
+      <w:pPr>
+        <w:rPr>
+          <w:rFonts w:eastAsia="DengXian"/>
+          <w:lang w:eastAsia="zh-CN"/>
+        </w:rPr>
+      </w:pPr>
+      <w:sdt>
+        <w:sdtPr>
+          <w:rPr>
+            <w:rFonts w:hint="eastAsia"/>
+            <w:lang w:eastAsia="zh-CN"/>
+          </w:rPr>
+          <w:id w:val="-1094165772"/>
+          <w14:checkbox>
+            <w14:checked w14:val="0"/>
+            <w14:checkedState w14:val="2612" w14:font="MS Gothic"/>
+            <w14:uncheckedState w14:val="2610" w14:font="MS Gothic"/>
+          </w14:checkbox>
+        </w:sdtPr>
+        <w:sdtContent>
+          <w:r>
+            <w:rPr>
+              <w:rFonts w:ascii="MS Gothic" w:eastAsia="MS Gothic" w:hAnsi="MS Gothic" w:hint="eastAsia"/>
+              <w:lang w:eastAsia="zh-CN"/>
+            </w:rPr>
+            <w:t>☐</w:t>
+          </w:r>
+        </w:sdtContent>
+      </w:sdt>
+      <w:r>
+        <w:rPr>
+          <w:rFonts w:eastAsia="DengXian" w:hint="eastAsia"/>
+          <w:lang w:eastAsia="zh-CN"/>
+        </w:rPr>
+        <w:t xml:space="preserve"> 店家详情</w:t>
+      </w:r>
+      <w:proofErr w:type="gramStart"/>
+      <w:r>
+        <w:rPr>
+          <w:rFonts w:eastAsia="DengXian" w:hint="eastAsia"/>
+          <w:lang w:eastAsia="zh-CN"/>
+        </w:rPr>
+        <w:t>页交通</w:t>
+      </w:r>
+      <w:proofErr w:type="gramEnd"/>
+      <w:r>
+        <w:rPr>
+          <w:rFonts w:eastAsia="DengXian" w:hint="eastAsia"/>
+          <w:lang w:eastAsia="zh-CN"/>
+        </w:rPr>
+        <w:t>时间数据动态调整</w:t>
+      </w:r>
+    </w:p>
+    <w:p>
+      <w:pPr>
+        <w:rPr>
+          <w:rFonts w:eastAsia="DengXian"/>
+          <w:lang w:eastAsia="zh-CN"/>
+        </w:rPr>
+      </w:pPr>
+      <w:sdt>
+        <w:sdtPr>
+          <w:rPr>
+            <w:rFonts w:hint="eastAsia"/>
+            <w:lang w:eastAsia="zh-CN"/>
+          </w:rPr>
+          <w:id w:val="-981071932"/>
+          <w14:checkbox>
+            <w14:checked w14:val="0"/>
+            <w14:checkedState w14:val="2612" w14:font="MS Gothic"/>
+            <w14:uncheckedState w14:val="2610" w14:font="MS Gothic"/>
+          </w14:checkbox>
+        </w:sdtPr>
+        <w:sdtContent>
+          <w:r>
+            <w:rPr>
+              <w:rFonts w:ascii="MS Gothic" w:eastAsia="MS Gothic" w:hAnsi="MS Gothic" w:hint="eastAsia"/>
+              <w:lang w:eastAsia="zh-CN"/>
+            </w:rPr>
+            <w:t>☐</w:t>
+          </w:r>
+        </w:sdtContent>
+      </w:sdt>
+      <w:r>
+        <w:rPr>
+          <w:rFonts w:eastAsia="DengXian" w:hint="eastAsia"/>
+          <w:lang w:eastAsia="zh-CN"/>
+        </w:rPr>
+        <w:t xml:space="preserve"> 店家</w:t>
+      </w:r>
+      <w:proofErr w:type="gramStart"/>
+      <w:r>
+        <w:rPr>
+          <w:rFonts w:eastAsia="DengXian" w:hint="eastAsia"/>
+          <w:lang w:eastAsia="zh-CN"/>
+        </w:rPr>
+        <w:t>页特色餐点</w:t>
+      </w:r>
+      <w:proofErr w:type="gramEnd"/>
+      <w:r>
+        <w:rPr>
+          <w:rFonts w:eastAsia="DengXian" w:hint="eastAsia"/>
+          <w:lang w:eastAsia="zh-CN"/>
+        </w:rPr>
+        <w:t>放大检视，文字描述</w:t>
+      </w:r>
+    </w:p>
     <w:p/>
     <w:p>
       <w:pPr>
         <w:rPr>
-          <w:rFonts w:eastAsia="DengXian"/>
-        </w:rPr>
-      </w:pPr>
+          <w:rFonts w:hint="eastAsia"/>
+        </w:rPr>
+      </w:pPr>
+      <w:sdt>
+        <w:sdtPr>
+          <w:rPr>
+            <w:rFonts w:hint="eastAsia"/>
+          </w:rPr>
+          <w:id w:val="556054424"/>
+          <w14:checkbox>
+            <w14:checked w14:val="1"/>
+            <w14:checkedState w14:val="2612" w14:font="MS Gothic"/>
+            <w14:uncheckedState w14:val="2610" w14:font="MS Gothic"/>
+          </w14:checkbox>
+        </w:sdtPr>
+        <w:sdtContent>
+          <w:r>
+            <w:rPr>
+              <w:rFonts w:ascii="MS Gothic" w:eastAsia="MS Gothic" w:hAnsi="MS Gothic" w:hint="eastAsia"/>
+            </w:rPr>
+            <w:t>☒</w:t>
+          </w:r>
+        </w:sdtContent>
+      </w:sdt>
+      <w:r>
+        <w:rPr>
+          <w:rFonts w:eastAsia="DengXian" w:hint="eastAsia"/>
+        </w:rPr>
+        <w:t xml:space="preserve"> </w:t>
+      </w:r>
+      <w:r>
+        <w:t>A</w:t>
+      </w:r>
+      <w:r>
+        <w:rPr>
+          <w:rFonts w:hint="eastAsia"/>
+        </w:rPr>
+        <w:t>bout</w:t>
+      </w:r>
+      <w:r>
+        <w:rPr>
+          <w:rFonts w:hint="eastAsia"/>
+        </w:rPr>
+        <w:t>內容及布局</w:t>
+      </w:r>
+    </w:p>
+    <w:p>
+      <w:pPr>
+        <w:rPr>
+          <w:rFonts w:hint="eastAsia"/>
+        </w:rPr>
+      </w:pPr>
+      <w:sdt>
+        <w:sdtPr>
+          <w:rPr>
+            <w:rFonts w:hint="eastAsia"/>
+          </w:rPr>
+          <w:id w:val="-29498608"/>
+          <w14:checkbox>
+            <w14:checked w14:val="1"/>
+            <w14:checkedState w14:val="2612" w14:font="MS Gothic"/>
+            <w14:uncheckedState w14:val="2610" w14:font="MS Gothic"/>
+          </w14:checkbox>
+        </w:sdtPr>
+        <w:sdtContent>
+          <w:r>
+            <w:rPr>
+              <w:rFonts w:ascii="MS Gothic" w:eastAsia="MS Gothic" w:hAnsi="MS Gothic" w:hint="eastAsia"/>
+            </w:rPr>
+            <w:t>☒</w:t>
+          </w:r>
+        </w:sdtContent>
+      </w:sdt>
+      <w:r>
+        <w:rPr>
+          <w:rFonts w:eastAsia="DengXian" w:hint="eastAsia"/>
+        </w:rPr>
+        <w:t xml:space="preserve"> </w:t>
+      </w:r>
+      <w:r>
+        <w:t>I</w:t>
+      </w:r>
+      <w:r>
+        <w:rPr>
+          <w:rFonts w:hint="eastAsia"/>
+        </w:rPr>
+        <w:t>nfo</w:t>
+      </w:r>
+      <w:r>
+        <w:rPr>
+          <w:rFonts w:hint="eastAsia"/>
+        </w:rPr>
+        <w:t>文本及圖片替換成</w:t>
+      </w:r>
+      <w:r>
+        <w:rPr>
+          <w:rFonts w:hint="eastAsia"/>
+        </w:rPr>
+        <w:t>figma</w:t>
+      </w:r>
+      <w:r>
+        <w:rPr>
+          <w:rFonts w:hint="eastAsia"/>
+        </w:rPr>
+        <w:t>上的、</w:t>
+      </w:r>
+      <w:r>
+        <w:rPr>
+          <w:rFonts w:hint="eastAsia"/>
+          <w:strike/>
+        </w:rPr>
+        <w:t>轉場動畫調整</w:t>
+      </w:r>
     </w:p>
     <w:p>
       <w:pPr>
@@ -282,104 +480,6 @@
       <w:pPr>
         <w:rPr>
           <w:rFonts w:eastAsia="DengXian"/>
-          <w:lang w:eastAsia="zh-CN"/>
-        </w:rPr>
-      </w:pPr>
-      <w:sdt>
-        <w:sdtPr>
-          <w:rPr>
-            <w:rFonts w:hint="eastAsia"/>
-            <w:lang w:eastAsia="zh-CN"/>
-          </w:rPr>
-          <w:id w:val="-1094165772"/>
-          <w14:checkbox>
-            <w14:checked w14:val="0"/>
-            <w14:checkedState w14:val="2612" w14:font="MS Gothic"/>
-            <w14:uncheckedState w14:val="2610" w14:font="MS Gothic"/>
-          </w14:checkbox>
-        </w:sdtPr>
-        <w:sdtContent>
-          <w:r>
-            <w:rPr>
-              <w:rFonts w:ascii="MS Gothic" w:eastAsia="MS Gothic" w:hAnsi="MS Gothic" w:hint="eastAsia"/>
-              <w:lang w:eastAsia="zh-CN"/>
-            </w:rPr>
-            <w:t>☐</w:t>
-          </w:r>
-        </w:sdtContent>
-      </w:sdt>
-      <w:r>
-        <w:rPr>
-          <w:rFonts w:eastAsia="DengXian" w:hint="eastAsia"/>
-          <w:lang w:eastAsia="zh-CN"/>
-        </w:rPr>
-        <w:t xml:space="preserve"> 店家详情</w:t>
-      </w:r>
-      <w:proofErr w:type="gramStart"/>
-      <w:r>
-        <w:rPr>
-          <w:rFonts w:eastAsia="DengXian" w:hint="eastAsia"/>
-          <w:lang w:eastAsia="zh-CN"/>
-        </w:rPr>
-        <w:t>页交通</w:t>
-      </w:r>
-      <w:proofErr w:type="gramEnd"/>
-      <w:r>
-        <w:rPr>
-          <w:rFonts w:eastAsia="DengXian" w:hint="eastAsia"/>
-          <w:lang w:eastAsia="zh-CN"/>
-        </w:rPr>
-        <w:t>时间数据动态调整</w:t>
-      </w:r>
-    </w:p>
-    <w:p>
-      <w:sdt>
-        <w:sdtPr>
-          <w:rPr>
-            <w:rFonts w:hint="eastAsia"/>
-          </w:rPr>
-          <w:id w:val="556054424"/>
-          <w14:checkbox>
-            <w14:checked w14:val="0"/>
-            <w14:checkedState w14:val="2612" w14:font="MS Gothic"/>
-            <w14:uncheckedState w14:val="2610" w14:font="MS Gothic"/>
-          </w14:checkbox>
-        </w:sdtPr>
-        <w:sdtContent>
-          <w:r>
-            <w:rPr>
-              <w:rFonts w:ascii="MS Gothic" w:eastAsia="MS Gothic" w:hAnsi="MS Gothic" w:hint="eastAsia"/>
-            </w:rPr>
-            <w:t>☐</w:t>
-          </w:r>
-        </w:sdtContent>
-      </w:sdt>
-      <w:r>
-        <w:rPr>
-          <w:rFonts w:eastAsia="DengXian" w:hint="eastAsia"/>
-        </w:rPr>
-        <w:t xml:space="preserve"> </w:t>
-      </w:r>
-      <w:r>
-        <w:t>A</w:t>
-      </w:r>
-      <w:r>
-        <w:rPr>
-          <w:rFonts w:hint="eastAsia"/>
-        </w:rPr>
-        <w:t>bout</w:t>
-      </w:r>
-      <w:r>
-        <w:rPr>
-          <w:rFonts w:hint="eastAsia"/>
-        </w:rPr>
-        <w:t>內容及布局</w:t>
-      </w:r>
-    </w:p>
-    <w:p>
-      <w:pPr>
-        <w:rPr>
-          <w:rFonts w:eastAsia="DengXian"/>
         </w:rPr>
       </w:pPr>
       <w:sdt>
@@ -551,41 +651,6 @@
           <w:lang w:eastAsia="zh-CN"/>
         </w:rPr>
         <w:t>籤（Pill/Chip Buttons）</w:t>
-      </w:r>
-    </w:p>
-    <w:p>
-      <w:sdt>
-        <w:sdtPr>
-          <w:rPr>
-            <w:rFonts w:hint="eastAsia"/>
-          </w:rPr>
-          <w:id w:val="-471976989"/>
-          <w14:checkbox>
-            <w14:checked w14:val="0"/>
-            <w14:checkedState w14:val="2612" w14:font="MS Gothic"/>
-            <w14:uncheckedState w14:val="2610" w14:font="MS Gothic"/>
-          </w14:checkbox>
-        </w:sdtPr>
-        <w:sdtContent>
-          <w:r>
-            <w:rPr>
-              <w:rFonts w:ascii="MS Gothic" w:eastAsia="MS Gothic" w:hAnsi="MS Gothic" w:hint="eastAsia"/>
-            </w:rPr>
-            <w:t>☐</w:t>
-          </w:r>
-        </w:sdtContent>
-      </w:sdt>
-      <w:r>
-        <w:rPr>
-          <w:rFonts w:hint="eastAsia"/>
-        </w:rPr>
-        <w:t xml:space="preserve"> </w:t>
-      </w:r>
-      <w:r>
-        <w:rPr>
-          <w:rFonts w:hint="eastAsia"/>
-        </w:rPr>
-        <w:t>封面樣式</w:t>
       </w:r>
     </w:p>
     <w:p>
@@ -734,60 +799,6 @@
             <w:rFonts w:hint="eastAsia"/>
             <w:lang w:eastAsia="zh-CN"/>
           </w:rPr>
-          <w:id w:val="-981071932"/>
-          <w14:checkbox>
-            <w14:checked w14:val="0"/>
-            <w14:checkedState w14:val="2612" w14:font="MS Gothic"/>
-            <w14:uncheckedState w14:val="2610" w14:font="MS Gothic"/>
-          </w14:checkbox>
-        </w:sdtPr>
-        <w:sdtContent>
-          <w:r>
-            <w:rPr>
-              <w:rFonts w:ascii="MS Gothic" w:eastAsia="MS Gothic" w:hAnsi="MS Gothic" w:hint="eastAsia"/>
-              <w:lang w:eastAsia="zh-CN"/>
-            </w:rPr>
-            <w:t>☐</w:t>
-          </w:r>
-        </w:sdtContent>
-      </w:sdt>
-      <w:r>
-        <w:rPr>
-          <w:rFonts w:eastAsia="DengXian" w:hint="eastAsia"/>
-          <w:lang w:eastAsia="zh-CN"/>
-        </w:rPr>
-        <w:t xml:space="preserve"> 店家</w:t>
-      </w:r>
-      <w:proofErr w:type="gramStart"/>
-      <w:r>
-        <w:rPr>
-          <w:rFonts w:eastAsia="DengXian" w:hint="eastAsia"/>
-          <w:lang w:eastAsia="zh-CN"/>
-        </w:rPr>
-        <w:t>页特色餐点</w:t>
-      </w:r>
-      <w:proofErr w:type="gramEnd"/>
-      <w:r>
-        <w:rPr>
-          <w:rFonts w:eastAsia="DengXian" w:hint="eastAsia"/>
-          <w:lang w:eastAsia="zh-CN"/>
-        </w:rPr>
-        <w:t>放大检视，文字描述</w:t>
-      </w:r>
-    </w:p>
-    <w:p>
-      <w:pPr>
-        <w:rPr>
-          <w:rFonts w:eastAsia="DengXian"/>
-          <w:lang w:eastAsia="zh-CN"/>
-        </w:rPr>
-      </w:pPr>
-      <w:sdt>
-        <w:sdtPr>
-          <w:rPr>
-            <w:rFonts w:hint="eastAsia"/>
-            <w:lang w:eastAsia="zh-CN"/>
-          </w:rPr>
           <w:id w:val="-1040277379"/>
           <w14:checkbox>
             <w14:checked w14:val="1"/>
@@ -1879,6 +1890,7 @@
         <w:rPr>
           <w:lang w:eastAsia="zh-CN"/>
         </w:rPr>
+        <w:lastRenderedPageBreak/>
         <w:br w:type="page"/>
       </w:r>
     </w:p>

</xml_diff>

<commit_message>
0.4.26 style: remove hover effects from meal images in shop detail
</commit_message>
<xml_diff>
--- a/TO DO.docx
+++ b/TO DO.docx
@@ -109,6 +109,11 @@
       </w:r>
     </w:p>
     <w:p>
+      <w:pPr>
+        <w:rPr>
+          <w:lang w:eastAsia="zh-CN"/>
+        </w:rPr>
+      </w:pPr>
       <w:sdt>
         <w:sdtPr>
           <w:rPr>
@@ -232,6 +237,67 @@
           </w:rPr>
           <w:id w:val="-981071932"/>
           <w14:checkbox>
+            <w14:checked w14:val="1"/>
+            <w14:checkedState w14:val="2612" w14:font="MS Gothic"/>
+            <w14:uncheckedState w14:val="2610" w14:font="MS Gothic"/>
+          </w14:checkbox>
+        </w:sdtPr>
+        <w:sdtContent>
+          <w:r>
+            <w:rPr>
+              <w:rFonts w:ascii="MS Gothic" w:eastAsia="MS Gothic" w:hAnsi="MS Gothic" w:hint="eastAsia"/>
+              <w:lang w:eastAsia="zh-CN"/>
+            </w:rPr>
+            <w:t>☒</w:t>
+          </w:r>
+        </w:sdtContent>
+      </w:sdt>
+      <w:r>
+        <w:rPr>
+          <w:rFonts w:eastAsia="DengXian" w:hint="eastAsia"/>
+          <w:lang w:eastAsia="zh-CN"/>
+        </w:rPr>
+        <w:t xml:space="preserve"> 店家</w:t>
+      </w:r>
+      <w:proofErr w:type="gramStart"/>
+      <w:r>
+        <w:rPr>
+          <w:rFonts w:eastAsia="DengXian" w:hint="eastAsia"/>
+          <w:lang w:eastAsia="zh-CN"/>
+        </w:rPr>
+        <w:t>页特色餐点</w:t>
+      </w:r>
+      <w:proofErr w:type="gramEnd"/>
+      <w:r>
+        <w:rPr>
+          <w:rFonts w:eastAsia="DengXian" w:hint="eastAsia"/>
+          <w:lang w:eastAsia="zh-CN"/>
+        </w:rPr>
+        <w:t>放大检视，文字描述</w:t>
+      </w:r>
+      <w:r>
+        <w:rPr>
+          <w:rFonts w:eastAsia="DengXian" w:hint="eastAsia"/>
+          <w:lang w:eastAsia="zh-CN"/>
+        </w:rPr>
+        <w:t>（不修改）</w:t>
+      </w:r>
+    </w:p>
+    <w:p>
+      <w:pPr>
+        <w:rPr>
+          <w:rFonts w:eastAsia="DengXian"/>
+          <w:lang w:eastAsia="zh-CN"/>
+        </w:rPr>
+      </w:pPr>
+      <w:sdt>
+        <w:sdtPr>
+          <w:rPr>
+            <w:rFonts w:hint="eastAsia"/>
+            <w:lang w:eastAsia="zh-CN"/>
+          </w:rPr>
+          <w:id w:val="-389503469"/>
+          <w14:checkbox>
             <w14:checked w14:val="0"/>
             <w14:checkedState w14:val="2612" w14:font="MS Gothic"/>
             <w14:uncheckedState w14:val="2610" w14:font="MS Gothic"/>
@@ -249,10 +315,17 @@
       </w:sdt>
       <w:r>
         <w:rPr>
-          <w:rFonts w:eastAsia="DengXian" w:hint="eastAsia"/>
-          <w:lang w:eastAsia="zh-CN"/>
-        </w:rPr>
-        <w:t xml:space="preserve"> 店家</w:t>
+          <w:rFonts w:hint="eastAsia"/>
+          <w:lang w:eastAsia="zh-CN"/>
+        </w:rPr>
+        <w:t xml:space="preserve"> </w:t>
+      </w:r>
+      <w:r>
+        <w:rPr>
+          <w:rFonts w:eastAsia="DengXian" w:hint="eastAsia"/>
+          <w:lang w:eastAsia="zh-CN"/>
+        </w:rPr>
+        <w:t>菜单灯箱置顶</w:t>
       </w:r>
       <w:proofErr w:type="gramStart"/>
       <w:r>
@@ -260,6 +333,60 @@
           <w:rFonts w:eastAsia="DengXian" w:hint="eastAsia"/>
           <w:lang w:eastAsia="zh-CN"/>
         </w:rPr>
+        <w:t>纽</w:t>
+      </w:r>
+      <w:proofErr w:type="gramEnd"/>
+      <w:r>
+        <w:rPr>
+          <w:rFonts w:eastAsia="DengXian" w:hint="eastAsia"/>
+          <w:lang w:eastAsia="zh-CN"/>
+        </w:rPr>
+        <w:t>不该出现</w:t>
+      </w:r>
+    </w:p>
+    <w:p>
+      <w:pPr>
+        <w:rPr>
+          <w:rFonts w:eastAsia="DengXian"/>
+          <w:lang w:eastAsia="zh-CN"/>
+        </w:rPr>
+      </w:pPr>
+      <w:sdt>
+        <w:sdtPr>
+          <w:rPr>
+            <w:rFonts w:hint="eastAsia"/>
+            <w:lang w:eastAsia="zh-CN"/>
+          </w:rPr>
+          <w:id w:val="1527064512"/>
+          <w14:checkbox>
+            <w14:checked w14:val="1"/>
+            <w14:checkedState w14:val="2612" w14:font="MS Gothic"/>
+            <w14:uncheckedState w14:val="2610" w14:font="MS Gothic"/>
+          </w14:checkbox>
+        </w:sdtPr>
+        <w:sdtContent>
+          <w:r>
+            <w:rPr>
+              <w:rFonts w:ascii="MS Gothic" w:eastAsia="MS Gothic" w:hAnsi="MS Gothic" w:hint="eastAsia"/>
+              <w:lang w:eastAsia="zh-CN"/>
+            </w:rPr>
+            <w:t>☒</w:t>
+          </w:r>
+        </w:sdtContent>
+      </w:sdt>
+      <w:r>
+        <w:rPr>
+          <w:rFonts w:eastAsia="DengXian" w:hint="eastAsia"/>
+          <w:lang w:eastAsia="zh-CN"/>
+        </w:rPr>
+        <w:t xml:space="preserve"> 店家详情</w:t>
+      </w:r>
+      <w:proofErr w:type="gramStart"/>
+      <w:r>
+        <w:rPr>
+          <w:rFonts w:eastAsia="DengXian" w:hint="eastAsia"/>
+          <w:lang w:eastAsia="zh-CN"/>
+        </w:rPr>
         <w:t>页特色餐点</w:t>
       </w:r>
       <w:proofErr w:type="gramEnd"/>
@@ -268,16 +395,102 @@
           <w:rFonts w:eastAsia="DengXian" w:hint="eastAsia"/>
           <w:lang w:eastAsia="zh-CN"/>
         </w:rPr>
-        <w:t>放大检视，文字描述</w:t>
-      </w:r>
-    </w:p>
-    <w:p/>
-    <w:p>
-      <w:pPr>
-        <w:rPr>
-          <w:rFonts w:hint="eastAsia"/>
-        </w:rPr>
-      </w:pPr>
+        <w:t>hover效果去除</w:t>
+      </w:r>
+    </w:p>
+    <w:p>
+      <w:pPr>
+        <w:rPr>
+          <w:rFonts w:eastAsia="DengXian"/>
+          <w:lang w:eastAsia="zh-CN"/>
+        </w:rPr>
+      </w:pPr>
+      <w:sdt>
+        <w:sdtPr>
+          <w:rPr>
+            <w:rFonts w:hint="eastAsia"/>
+            <w:lang w:eastAsia="zh-CN"/>
+          </w:rPr>
+          <w:id w:val="32860994"/>
+          <w14:checkbox>
+            <w14:checked w14:val="0"/>
+            <w14:checkedState w14:val="2612" w14:font="MS Gothic"/>
+            <w14:uncheckedState w14:val="2610" w14:font="MS Gothic"/>
+          </w14:checkbox>
+        </w:sdtPr>
+        <w:sdtContent>
+          <w:r>
+            <w:rPr>
+              <w:rFonts w:ascii="MS Gothic" w:eastAsia="MS Gothic" w:hAnsi="MS Gothic" w:hint="eastAsia"/>
+              <w:lang w:eastAsia="zh-CN"/>
+            </w:rPr>
+            <w:t>☐</w:t>
+          </w:r>
+        </w:sdtContent>
+      </w:sdt>
+      <w:r>
+        <w:rPr>
+          <w:rFonts w:eastAsia="DengXian" w:hint="eastAsia"/>
+          <w:lang w:eastAsia="zh-CN"/>
+        </w:rPr>
+        <w:t xml:space="preserve"> 返回</w:t>
+      </w:r>
+      <w:proofErr w:type="gramStart"/>
+      <w:r>
+        <w:rPr>
+          <w:rFonts w:eastAsia="DengXian" w:hint="eastAsia"/>
+          <w:lang w:eastAsia="zh-CN"/>
+        </w:rPr>
+        <w:t>纽</w:t>
+      </w:r>
+      <w:proofErr w:type="gramEnd"/>
+    </w:p>
+    <w:p>
+      <w:pPr>
+        <w:rPr>
+          <w:rFonts w:eastAsia="DengXian"/>
+          <w:lang w:eastAsia="zh-CN"/>
+        </w:rPr>
+      </w:pPr>
+      <w:sdt>
+        <w:sdtPr>
+          <w:rPr>
+            <w:rFonts w:hint="eastAsia"/>
+            <w:lang w:eastAsia="zh-CN"/>
+          </w:rPr>
+          <w:id w:val="-68273334"/>
+          <w14:checkbox>
+            <w14:checked w14:val="0"/>
+            <w14:checkedState w14:val="2612" w14:font="MS Gothic"/>
+            <w14:uncheckedState w14:val="2610" w14:font="MS Gothic"/>
+          </w14:checkbox>
+        </w:sdtPr>
+        <w:sdtContent>
+          <w:r>
+            <w:rPr>
+              <w:rFonts w:ascii="MS Gothic" w:eastAsia="MS Gothic" w:hAnsi="MS Gothic" w:hint="eastAsia"/>
+              <w:lang w:eastAsia="zh-CN"/>
+            </w:rPr>
+            <w:t>☐</w:t>
+          </w:r>
+        </w:sdtContent>
+      </w:sdt>
+      <w:r>
+        <w:rPr>
+          <w:rFonts w:eastAsia="DengXian" w:hint="eastAsia"/>
+          <w:lang w:eastAsia="zh-CN"/>
+        </w:rPr>
+        <w:t xml:space="preserve"> 导航栏跳页不能连续点击</w:t>
+      </w:r>
+    </w:p>
+    <w:p>
+      <w:pPr>
+        <w:rPr>
+          <w:lang w:eastAsia="zh-CN"/>
+        </w:rPr>
+      </w:pPr>
+    </w:p>
+    <w:p>
       <w:sdt>
         <w:sdtPr>
           <w:rPr>
@@ -322,11 +535,6 @@
       </w:r>
     </w:p>
     <w:p>
-      <w:pPr>
-        <w:rPr>
-          <w:rFonts w:hint="eastAsia"/>
-        </w:rPr>
-      </w:pPr>
       <w:sdt>
         <w:sdtPr>
           <w:rPr>
@@ -369,12 +577,14 @@
         </w:rPr>
         <w:t>文本及圖片替換成</w:t>
       </w:r>
+      <w:proofErr w:type="spellStart"/>
       <w:r>
         <w:rPr>
           <w:rFonts w:hint="eastAsia"/>
         </w:rPr>
         <w:t>figma</w:t>
       </w:r>
+      <w:proofErr w:type="spellEnd"/>
       <w:r>
         <w:rPr>
           <w:rFonts w:hint="eastAsia"/>
@@ -565,7 +775,23 @@
           <w:rFonts w:eastAsia="DengXian" w:hint="eastAsia"/>
           <w:lang w:eastAsia="zh-CN"/>
         </w:rPr>
-        <w:t>1.原生select中的option无法使用img。</w:t>
+        <w:t>1.原生select中的option无法使用</w:t>
+      </w:r>
+      <w:proofErr w:type="spellStart"/>
+      <w:r>
+        <w:rPr>
+          <w:rFonts w:eastAsia="DengXian" w:hint="eastAsia"/>
+          <w:lang w:eastAsia="zh-CN"/>
+        </w:rPr>
+        <w:t>img</w:t>
+      </w:r>
+      <w:proofErr w:type="spellEnd"/>
+      <w:r>
+        <w:rPr>
+          <w:rFonts w:eastAsia="DengXian" w:hint="eastAsia"/>
+          <w:lang w:eastAsia="zh-CN"/>
+        </w:rPr>
+        <w:t>。</w:t>
       </w:r>
     </w:p>
     <w:p>
@@ -856,8 +1082,16 @@
         <w:rPr>
           <w:rFonts w:hint="eastAsia"/>
         </w:rPr>
-        <w:t xml:space="preserve"> shopDetail</w:t>
-      </w:r>
+        <w:t xml:space="preserve"> </w:t>
+      </w:r>
+      <w:proofErr w:type="spellStart"/>
+      <w:r>
+        <w:rPr>
+          <w:rFonts w:hint="eastAsia"/>
+        </w:rPr>
+        <w:t>shopDetail</w:t>
+      </w:r>
+      <w:proofErr w:type="spellEnd"/>
       <w:r>
         <w:rPr>
           <w:rFonts w:hint="eastAsia"/>
@@ -1294,6 +1528,12 @@
       </w:r>
     </w:p>
     <w:p>
+      <w:pPr>
+        <w:rPr>
+          <w:rFonts w:eastAsia="DengXian"/>
+          <w:lang w:eastAsia="zh-CN"/>
+        </w:rPr>
+      </w:pPr>
       <w:sdt>
         <w:sdtPr>
           <w:rPr>
@@ -1420,6 +1660,7 @@
         </w:rPr>
         <w:t>跳轉</w:t>
       </w:r>
+      <w:proofErr w:type="spellStart"/>
       <w:proofErr w:type="gramEnd"/>
       <w:r>
         <w:rPr>
@@ -1427,6 +1668,7 @@
         </w:rPr>
         <w:t>shopDetail</w:t>
       </w:r>
+      <w:proofErr w:type="spellEnd"/>
       <w:r>
         <w:rPr>
           <w:rFonts w:hint="eastAsia"/>
@@ -1688,8 +1930,16 @@
         <w:rPr>
           <w:rFonts w:hint="eastAsia"/>
         </w:rPr>
-        <w:t xml:space="preserve"> shopDetail</w:t>
-      </w:r>
+        <w:t xml:space="preserve"> </w:t>
+      </w:r>
+      <w:proofErr w:type="spellStart"/>
+      <w:r>
+        <w:rPr>
+          <w:rFonts w:hint="eastAsia"/>
+        </w:rPr>
+        <w:t>shopDetail</w:t>
+      </w:r>
+      <w:proofErr w:type="spellEnd"/>
       <w:r>
         <w:rPr>
           <w:rFonts w:hint="eastAsia"/>
@@ -1732,6 +1982,7 @@
         </w:rPr>
         <w:t>跳轉</w:t>
       </w:r>
+      <w:proofErr w:type="spellStart"/>
       <w:proofErr w:type="gramEnd"/>
       <w:r>
         <w:rPr>
@@ -1739,6 +1990,7 @@
         </w:rPr>
         <w:t>shopDetail</w:t>
       </w:r>
+      <w:proofErr w:type="spellEnd"/>
       <w:r>
         <w:rPr>
           <w:rFonts w:hint="eastAsia"/>
@@ -1890,7 +2142,6 @@
         <w:rPr>
           <w:lang w:eastAsia="zh-CN"/>
         </w:rPr>
-        <w:lastRenderedPageBreak/>
         <w:br w:type="page"/>
       </w:r>
     </w:p>

</xml_diff>

<commit_message>
0.4.28 refactor(shop-detail): replace closed status icon with pure text label
</commit_message>
<xml_diff>
--- a/TO DO.docx
+++ b/TO DO.docx
@@ -149,23 +149,7 @@
           <w:rFonts w:hint="eastAsia"/>
           <w:lang w:eastAsia="zh-CN"/>
         </w:rPr>
-        <w:t>封面</w:t>
-      </w:r>
-      <w:proofErr w:type="gramStart"/>
-      <w:r>
-        <w:rPr>
-          <w:rFonts w:hint="eastAsia"/>
-          <w:lang w:eastAsia="zh-CN"/>
-        </w:rPr>
-        <w:t>樣</w:t>
-      </w:r>
-      <w:proofErr w:type="gramEnd"/>
-      <w:r>
-        <w:rPr>
-          <w:rFonts w:hint="eastAsia"/>
-          <w:lang w:eastAsia="zh-CN"/>
-        </w:rPr>
-        <w:t>式</w:t>
+        <w:t>封面樣式</w:t>
       </w:r>
     </w:p>
     <w:p>
@@ -203,23 +187,7 @@
           <w:rFonts w:eastAsia="DengXian" w:hint="eastAsia"/>
           <w:lang w:eastAsia="zh-CN"/>
         </w:rPr>
-        <w:t xml:space="preserve"> 店家详情</w:t>
-      </w:r>
-      <w:proofErr w:type="gramStart"/>
-      <w:r>
-        <w:rPr>
-          <w:rFonts w:eastAsia="DengXian" w:hint="eastAsia"/>
-          <w:lang w:eastAsia="zh-CN"/>
-        </w:rPr>
-        <w:t>页交通</w:t>
-      </w:r>
-      <w:proofErr w:type="gramEnd"/>
-      <w:r>
-        <w:rPr>
-          <w:rFonts w:eastAsia="DengXian" w:hint="eastAsia"/>
-          <w:lang w:eastAsia="zh-CN"/>
-        </w:rPr>
-        <w:t>时间数据动态调整</w:t>
+        <w:t xml:space="preserve"> 店家详情页交通时间数据动态调整</w:t>
       </w:r>
     </w:p>
     <w:p>
@@ -257,23 +225,7 @@
           <w:rFonts w:eastAsia="DengXian" w:hint="eastAsia"/>
           <w:lang w:eastAsia="zh-CN"/>
         </w:rPr>
-        <w:t xml:space="preserve"> 店家</w:t>
-      </w:r>
-      <w:proofErr w:type="gramStart"/>
-      <w:r>
-        <w:rPr>
-          <w:rFonts w:eastAsia="DengXian" w:hint="eastAsia"/>
-          <w:lang w:eastAsia="zh-CN"/>
-        </w:rPr>
-        <w:t>页特色餐点</w:t>
-      </w:r>
-      <w:proofErr w:type="gramEnd"/>
-      <w:r>
-        <w:rPr>
-          <w:rFonts w:eastAsia="DengXian" w:hint="eastAsia"/>
-          <w:lang w:eastAsia="zh-CN"/>
-        </w:rPr>
-        <w:t>放大检视，文字描述</w:t>
+        <w:t xml:space="preserve"> 店家页特色餐点放大检视，文字描述</w:t>
       </w:r>
       <w:r>
         <w:rPr>
@@ -298,7 +250,7 @@
           </w:rPr>
           <w:id w:val="-389503469"/>
           <w14:checkbox>
-            <w14:checked w14:val="0"/>
+            <w14:checked w14:val="1"/>
             <w14:checkedState w14:val="2612" w14:font="MS Gothic"/>
             <w14:uncheckedState w14:val="2610" w14:font="MS Gothic"/>
           </w14:checkbox>
@@ -309,7 +261,7 @@
               <w:rFonts w:ascii="MS Gothic" w:eastAsia="MS Gothic" w:hAnsi="MS Gothic" w:hint="eastAsia"/>
               <w:lang w:eastAsia="zh-CN"/>
             </w:rPr>
-            <w:t>☐</w:t>
+            <w:t>☒</w:t>
           </w:r>
         </w:sdtContent>
       </w:sdt>
@@ -325,23 +277,7 @@
           <w:rFonts w:eastAsia="DengXian" w:hint="eastAsia"/>
           <w:lang w:eastAsia="zh-CN"/>
         </w:rPr>
-        <w:t>菜单灯箱置顶</w:t>
-      </w:r>
-      <w:proofErr w:type="gramStart"/>
-      <w:r>
-        <w:rPr>
-          <w:rFonts w:eastAsia="DengXian" w:hint="eastAsia"/>
-          <w:lang w:eastAsia="zh-CN"/>
-        </w:rPr>
-        <w:t>纽</w:t>
-      </w:r>
-      <w:proofErr w:type="gramEnd"/>
-      <w:r>
-        <w:rPr>
-          <w:rFonts w:eastAsia="DengXian" w:hint="eastAsia"/>
-          <w:lang w:eastAsia="zh-CN"/>
-        </w:rPr>
-        <w:t>不该出现</w:t>
+        <w:t>菜单灯箱置顶纽不该出现</w:t>
       </w:r>
     </w:p>
     <w:p>
@@ -379,23 +315,7 @@
           <w:rFonts w:eastAsia="DengXian" w:hint="eastAsia"/>
           <w:lang w:eastAsia="zh-CN"/>
         </w:rPr>
-        <w:t xml:space="preserve"> 店家详情</w:t>
-      </w:r>
-      <w:proofErr w:type="gramStart"/>
-      <w:r>
-        <w:rPr>
-          <w:rFonts w:eastAsia="DengXian" w:hint="eastAsia"/>
-          <w:lang w:eastAsia="zh-CN"/>
-        </w:rPr>
-        <w:t>页特色餐点</w:t>
-      </w:r>
-      <w:proofErr w:type="gramEnd"/>
-      <w:r>
-        <w:rPr>
-          <w:rFonts w:eastAsia="DengXian" w:hint="eastAsia"/>
-          <w:lang w:eastAsia="zh-CN"/>
-        </w:rPr>
-        <w:t>hover效果去除</w:t>
+        <w:t xml:space="preserve"> 店家详情页特色餐点hover效果去除</w:t>
       </w:r>
     </w:p>
     <w:p>
@@ -433,25 +353,10 @@
           <w:rFonts w:eastAsia="DengXian" w:hint="eastAsia"/>
           <w:lang w:eastAsia="zh-CN"/>
         </w:rPr>
-        <w:t xml:space="preserve"> 返回</w:t>
-      </w:r>
-      <w:proofErr w:type="gramStart"/>
-      <w:r>
-        <w:rPr>
-          <w:rFonts w:eastAsia="DengXian" w:hint="eastAsia"/>
-          <w:lang w:eastAsia="zh-CN"/>
-        </w:rPr>
-        <w:t>纽</w:t>
-      </w:r>
-      <w:proofErr w:type="gramEnd"/>
-    </w:p>
-    <w:p>
-      <w:pPr>
-        <w:rPr>
-          <w:rFonts w:eastAsia="DengXian"/>
-          <w:lang w:eastAsia="zh-CN"/>
-        </w:rPr>
-      </w:pPr>
+        <w:t xml:space="preserve"> 返回纽</w:t>
+      </w:r>
+    </w:p>
+    <w:p>
       <w:sdt>
         <w:sdtPr>
           <w:rPr>
@@ -486,6 +391,49 @@
     <w:p>
       <w:pPr>
         <w:rPr>
+          <w:rFonts w:hint="eastAsia"/>
+        </w:rPr>
+      </w:pPr>
+      <w:sdt>
+        <w:sdtPr>
+          <w:rPr>
+            <w:rFonts w:hint="eastAsia"/>
+            <w:lang w:eastAsia="zh-CN"/>
+          </w:rPr>
+          <w:id w:val="1424606974"/>
+          <w14:checkbox>
+            <w14:checked w14:val="1"/>
+            <w14:checkedState w14:val="2612" w14:font="MS Gothic"/>
+            <w14:uncheckedState w14:val="2610" w14:font="MS Gothic"/>
+          </w14:checkbox>
+        </w:sdtPr>
+        <w:sdtContent>
+          <w:r>
+            <w:rPr>
+              <w:rFonts w:ascii="MS Gothic" w:eastAsia="MS Gothic" w:hAnsi="MS Gothic" w:hint="eastAsia"/>
+              <w:lang w:eastAsia="zh-CN"/>
+            </w:rPr>
+            <w:t>☒</w:t>
+          </w:r>
+        </w:sdtContent>
+      </w:sdt>
+      <w:r>
+        <w:rPr>
+          <w:rFonts w:hint="eastAsia"/>
+        </w:rPr>
+        <w:t xml:space="preserve"> </w:t>
+      </w:r>
+      <w:r>
+        <w:rPr>
+          <w:rFonts w:hint="eastAsia"/>
+          <w:lang w:eastAsia="zh-CN"/>
+        </w:rPr>
+        <w:t>公休圖標換成純文字</w:t>
+      </w:r>
+    </w:p>
+    <w:p>
+      <w:pPr>
+        <w:rPr>
           <w:lang w:eastAsia="zh-CN"/>
         </w:rPr>
       </w:pPr>
@@ -577,14 +525,12 @@
         </w:rPr>
         <w:t>文本及圖片替換成</w:t>
       </w:r>
-      <w:proofErr w:type="spellStart"/>
       <w:r>
         <w:rPr>
           <w:rFonts w:hint="eastAsia"/>
         </w:rPr>
         <w:t>figma</w:t>
       </w:r>
-      <w:proofErr w:type="spellEnd"/>
       <w:r>
         <w:rPr>
           <w:rFonts w:hint="eastAsia"/>
@@ -746,14 +692,12 @@
         </w:rPr>
         <w:t>)</w:t>
       </w:r>
-      <w:proofErr w:type="gramStart"/>
       <w:r>
         <w:rPr>
           <w:rFonts w:eastAsia="DengXian" w:hint="eastAsia"/>
         </w:rPr>
         <w:t>——</w:t>
       </w:r>
-      <w:proofErr w:type="gramEnd"/>
     </w:p>
     <w:p>
       <w:pPr>
@@ -775,108 +719,60 @@
           <w:rFonts w:eastAsia="DengXian" w:hint="eastAsia"/>
           <w:lang w:eastAsia="zh-CN"/>
         </w:rPr>
-        <w:t>1.原生select中的option无法使用</w:t>
-      </w:r>
-      <w:proofErr w:type="spellStart"/>
+        <w:t>1.原生select中的option无法使用img。</w:t>
+      </w:r>
+    </w:p>
+    <w:p>
+      <w:pPr>
+        <w:ind w:left="480" w:firstLineChars="300" w:firstLine="720"/>
+        <w:rPr>
+          <w:rFonts w:eastAsia="DengXian"/>
+          <w:lang w:eastAsia="zh-CN"/>
+        </w:rPr>
+      </w:pPr>
       <w:r>
         <w:rPr>
           <w:rFonts w:eastAsia="DengXian" w:hint="eastAsia"/>
           <w:lang w:eastAsia="zh-CN"/>
         </w:rPr>
-        <w:t>img</w:t>
-      </w:r>
-      <w:proofErr w:type="spellEnd"/>
+        <w:t>2.div模拟选单在3D旋转后的版面会被吃掉,导致点不到选项?</w:t>
+      </w:r>
+    </w:p>
+    <w:p>
+      <w:pPr>
+        <w:ind w:firstLine="480"/>
+        <w:rPr>
+          <w:rFonts w:eastAsia="DengXian"/>
+          <w:lang w:eastAsia="zh-CN"/>
+        </w:rPr>
+      </w:pPr>
       <w:r>
         <w:rPr>
           <w:rFonts w:eastAsia="DengXian" w:hint="eastAsia"/>
           <w:lang w:eastAsia="zh-CN"/>
         </w:rPr>
-        <w:t>。</w:t>
-      </w:r>
-    </w:p>
-    <w:p>
-      <w:pPr>
-        <w:ind w:left="480" w:firstLineChars="300" w:firstLine="720"/>
+        <w:t>替代：</w:t>
+      </w:r>
+      <w:r>
         <w:rPr>
           <w:rFonts w:eastAsia="DengXian"/>
           <w:lang w:eastAsia="zh-CN"/>
         </w:rPr>
-      </w:pPr>
+        <w:t>簡化成「1 鍵」的平面化標籤</w:t>
+      </w:r>
       <w:r>
         <w:rPr>
           <w:rFonts w:eastAsia="DengXian" w:hint="eastAsia"/>
           <w:lang w:eastAsia="zh-CN"/>
         </w:rPr>
-        <w:t>2.div模拟选单在3D旋转后的版面会被吃掉,导致点不到选项?</w:t>
-      </w:r>
-    </w:p>
-    <w:p>
-      <w:pPr>
-        <w:ind w:firstLine="480"/>
+        <w:t>，改用</w:t>
+      </w:r>
+      <w:r>
         <w:rPr>
           <w:rFonts w:eastAsia="DengXian"/>
           <w:lang w:eastAsia="zh-CN"/>
         </w:rPr>
-      </w:pPr>
-      <w:r>
-        <w:rPr>
-          <w:rFonts w:eastAsia="DengXian" w:hint="eastAsia"/>
-          <w:lang w:eastAsia="zh-CN"/>
-        </w:rPr>
-        <w:t>替代：</w:t>
-      </w:r>
-      <w:r>
-        <w:rPr>
-          <w:rFonts w:eastAsia="DengXian"/>
-          <w:lang w:eastAsia="zh-CN"/>
-        </w:rPr>
-        <w:t>簡化成「1 鍵」的平面化</w:t>
-      </w:r>
-      <w:proofErr w:type="gramStart"/>
-      <w:r>
-        <w:rPr>
-          <w:rFonts w:eastAsia="DengXian"/>
-          <w:lang w:eastAsia="zh-CN"/>
-        </w:rPr>
-        <w:t>標</w:t>
-      </w:r>
-      <w:proofErr w:type="gramEnd"/>
-      <w:r>
-        <w:rPr>
-          <w:rFonts w:eastAsia="DengXian"/>
-          <w:lang w:eastAsia="zh-CN"/>
-        </w:rPr>
-        <w:t>籤</w:t>
-      </w:r>
-      <w:r>
-        <w:rPr>
-          <w:rFonts w:eastAsia="DengXian" w:hint="eastAsia"/>
-          <w:lang w:eastAsia="zh-CN"/>
-        </w:rPr>
-        <w:t>，改用</w:t>
-      </w:r>
-      <w:r>
-        <w:rPr>
-          <w:rFonts w:eastAsia="DengXian"/>
-          <w:lang w:eastAsia="zh-CN"/>
-        </w:rPr>
-        <w:t>橫向膠囊</w:t>
-      </w:r>
-      <w:proofErr w:type="gramStart"/>
-      <w:r>
-        <w:rPr>
-          <w:rFonts w:eastAsia="DengXian"/>
-          <w:lang w:eastAsia="zh-CN"/>
-        </w:rPr>
-        <w:t>標</w:t>
-      </w:r>
-      <w:proofErr w:type="gramEnd"/>
-      <w:r>
-        <w:rPr>
-          <w:rFonts w:eastAsia="DengXian"/>
-          <w:lang w:eastAsia="zh-CN"/>
-        </w:rPr>
-        <w:t>籤（Pill/Chip Buttons）</w:t>
+        <w:t>橫向膠囊標籤（Pill/Chip Buttons）</w:t>
       </w:r>
     </w:p>
     <w:p>
@@ -912,13 +808,8 @@
         </w:rPr>
         <w:t xml:space="preserve"> </w:t>
       </w:r>
-      <w:proofErr w:type="gramStart"/>
-      <w:r>
-        <w:t>線上菜單</w:t>
-      </w:r>
-      <w:proofErr w:type="gramEnd"/>
-      <w:r>
-        <w:t>放大燈箱</w:t>
+      <w:r>
+        <w:t>線上菜單放大燈箱</w:t>
       </w:r>
       <w:r>
         <w:rPr>
@@ -974,35 +865,7 @@
         <w:rPr>
           <w:lang w:eastAsia="zh-CN"/>
         </w:rPr>
-        <w:t>線上菜</w:t>
-      </w:r>
-      <w:proofErr w:type="gramStart"/>
-      <w:r>
-        <w:rPr>
-          <w:lang w:eastAsia="zh-CN"/>
-        </w:rPr>
-        <w:t>單</w:t>
-      </w:r>
-      <w:proofErr w:type="gramEnd"/>
-      <w:r>
-        <w:rPr>
-          <w:lang w:eastAsia="zh-CN"/>
-        </w:rPr>
-        <w:t>放大</w:t>
-      </w:r>
-      <w:proofErr w:type="gramStart"/>
-      <w:r>
-        <w:rPr>
-          <w:lang w:eastAsia="zh-CN"/>
-        </w:rPr>
-        <w:t>燈</w:t>
-      </w:r>
-      <w:proofErr w:type="gramEnd"/>
-      <w:r>
-        <w:rPr>
-          <w:lang w:eastAsia="zh-CN"/>
-        </w:rPr>
-        <w:t>箱</w:t>
+        <w:t>線上菜單放大燈箱</w:t>
       </w:r>
       <w:r>
         <w:rPr>
@@ -1082,16 +945,8 @@
         <w:rPr>
           <w:rFonts w:hint="eastAsia"/>
         </w:rPr>
-        <w:t xml:space="preserve"> </w:t>
-      </w:r>
-      <w:proofErr w:type="spellStart"/>
-      <w:r>
-        <w:rPr>
-          <w:rFonts w:hint="eastAsia"/>
-        </w:rPr>
-        <w:t>shopDetail</w:t>
-      </w:r>
-      <w:proofErr w:type="spellEnd"/>
+        <w:t xml:space="preserve"> shopDetail</w:t>
+      </w:r>
       <w:r>
         <w:rPr>
           <w:rFonts w:hint="eastAsia"/>
@@ -1307,23 +1162,7 @@
           <w:rFonts w:eastAsia="DengXian" w:hint="eastAsia"/>
           <w:lang w:eastAsia="zh-CN"/>
         </w:rPr>
-        <w:t xml:space="preserve"> 店家</w:t>
-      </w:r>
-      <w:proofErr w:type="gramStart"/>
-      <w:r>
-        <w:rPr>
-          <w:rFonts w:eastAsia="DengXian" w:hint="eastAsia"/>
-          <w:lang w:eastAsia="zh-CN"/>
-        </w:rPr>
-        <w:t>页根据</w:t>
-      </w:r>
-      <w:proofErr w:type="gramEnd"/>
-      <w:r>
-        <w:rPr>
-          <w:rFonts w:eastAsia="DengXian" w:hint="eastAsia"/>
-          <w:lang w:eastAsia="zh-CN"/>
-        </w:rPr>
-        <w:t>当前星期调整营业时间</w:t>
+        <w:t xml:space="preserve"> 店家页根据当前星期调整营业时间</w:t>
       </w:r>
     </w:p>
     <w:p>
@@ -1399,23 +1238,7 @@
           <w:rFonts w:eastAsia="DengXian" w:hint="eastAsia"/>
           <w:lang w:eastAsia="zh-CN"/>
         </w:rPr>
-        <w:t xml:space="preserve"> 地图页图标选取后，手机</w:t>
-      </w:r>
-      <w:proofErr w:type="gramStart"/>
-      <w:r>
-        <w:rPr>
-          <w:rFonts w:eastAsia="DengXian" w:hint="eastAsia"/>
-          <w:lang w:eastAsia="zh-CN"/>
-        </w:rPr>
-        <w:t>端保持</w:t>
-      </w:r>
-      <w:proofErr w:type="gramEnd"/>
-      <w:r>
-        <w:rPr>
-          <w:rFonts w:eastAsia="DengXian" w:hint="eastAsia"/>
-          <w:lang w:eastAsia="zh-CN"/>
-        </w:rPr>
-        <w:t>配角呈现选取店家</w:t>
+        <w:t xml:space="preserve"> 地图页图标选取后，手机端保持配角呈现选取店家</w:t>
       </w:r>
     </w:p>
     <w:p>
@@ -1651,24 +1474,14 @@
         <w:rPr>
           <w:rFonts w:hint="eastAsia"/>
         </w:rPr>
-        <w:t>、</w:t>
-      </w:r>
-      <w:proofErr w:type="gramStart"/>
-      <w:r>
-        <w:rPr>
-          <w:rFonts w:hint="eastAsia"/>
-        </w:rPr>
-        <w:t>跳轉</w:t>
-      </w:r>
-      <w:proofErr w:type="spellStart"/>
-      <w:proofErr w:type="gramEnd"/>
+        <w:t>、跳轉</w:t>
+      </w:r>
       <w:r>
         <w:rPr>
           <w:rFonts w:hint="eastAsia"/>
         </w:rPr>
         <w:t>shopDetail</w:t>
       </w:r>
-      <w:proofErr w:type="spellEnd"/>
       <w:r>
         <w:rPr>
           <w:rFonts w:hint="eastAsia"/>
@@ -1722,16 +1535,8 @@
         <w:rPr>
           <w:rFonts w:hint="eastAsia"/>
         </w:rPr>
-        <w:t>店家詳情</w:t>
-      </w:r>
-      <w:proofErr w:type="gramStart"/>
-      <w:r>
-        <w:rPr>
-          <w:rFonts w:hint="eastAsia"/>
-        </w:rPr>
-        <w:t>頁跳轉</w:t>
-      </w:r>
-      <w:proofErr w:type="gramEnd"/>
+        <w:t>店家詳情頁跳轉</w:t>
+      </w:r>
       <w:r>
         <w:rPr>
           <w:rFonts w:eastAsia="DengXian" w:hint="eastAsia"/>
@@ -1930,16 +1735,8 @@
         <w:rPr>
           <w:rFonts w:hint="eastAsia"/>
         </w:rPr>
-        <w:t xml:space="preserve"> </w:t>
-      </w:r>
-      <w:proofErr w:type="spellStart"/>
-      <w:r>
-        <w:rPr>
-          <w:rFonts w:hint="eastAsia"/>
-        </w:rPr>
-        <w:t>shopDetail</w:t>
-      </w:r>
-      <w:proofErr w:type="spellEnd"/>
+        <w:t xml:space="preserve"> shopDetail</w:t>
+      </w:r>
       <w:r>
         <w:rPr>
           <w:rFonts w:hint="eastAsia"/>
@@ -1975,22 +1772,18 @@
         </w:rPr>
         <w:t xml:space="preserve"> </w:t>
       </w:r>
-      <w:proofErr w:type="gramStart"/>
       <w:r>
         <w:rPr>
           <w:rFonts w:hint="eastAsia"/>
         </w:rPr>
         <w:t>跳轉</w:t>
       </w:r>
-      <w:proofErr w:type="spellStart"/>
-      <w:proofErr w:type="gramEnd"/>
       <w:r>
         <w:rPr>
           <w:rFonts w:hint="eastAsia"/>
         </w:rPr>
         <w:t>shopDetail</w:t>
       </w:r>
-      <w:proofErr w:type="spellEnd"/>
       <w:r>
         <w:rPr>
           <w:rFonts w:hint="eastAsia"/>
@@ -2535,35 +2328,7 @@
         <w:rPr>
           <w:rFonts w:hint="eastAsia"/>
         </w:rPr>
-        <w:t>不要五角圖，</w:t>
-      </w:r>
-      <w:proofErr w:type="gramStart"/>
-      <w:r>
-        <w:rPr>
-          <w:rFonts w:hint="eastAsia"/>
-        </w:rPr>
-        <w:t>放食材</w:t>
-      </w:r>
-      <w:proofErr w:type="gramEnd"/>
-      <w:r>
-        <w:rPr>
-          <w:rFonts w:hint="eastAsia"/>
-        </w:rPr>
-        <w:t>、食材圖片和</w:t>
-      </w:r>
-      <w:proofErr w:type="gramStart"/>
-      <w:r>
-        <w:rPr>
-          <w:rFonts w:hint="eastAsia"/>
-        </w:rPr>
-        <w:t>食材</w:t>
-      </w:r>
-      <w:proofErr w:type="gramEnd"/>
-      <w:r>
-        <w:rPr>
-          <w:rFonts w:hint="eastAsia"/>
-        </w:rPr>
-        <w:t>功用</w:t>
+        <w:t>不要五角圖，放食材、食材圖片和食材功用</w:t>
       </w:r>
       <w:r>
         <w:rPr>
@@ -2713,14 +2478,12 @@
         </w:rPr>
         <w:t>8.</w:t>
       </w:r>
-      <w:proofErr w:type="gramStart"/>
       <w:r>
         <w:rPr>
           <w:rFonts w:hint="eastAsia"/>
         </w:rPr>
         <w:t>跳轉邏輯</w:t>
       </w:r>
-      <w:proofErr w:type="gramEnd"/>
     </w:p>
     <w:p>
       <w:r>

</xml_diff>

<commit_message>
0.4.29 fix(nav): prevent rapid consecutive clicks on navbar tabs
</commit_message>
<xml_diff>
--- a/TO DO.docx
+++ b/TO DO.docx
@@ -355,8 +355,20 @@
         </w:rPr>
         <w:t xml:space="preserve"> 返回纽</w:t>
       </w:r>
-    </w:p>
-    <w:p>
+      <w:r>
+        <w:rPr>
+          <w:rFonts w:asciiTheme="minorEastAsia" w:hAnsiTheme="minorEastAsia" w:hint="eastAsia"/>
+          <w:lang w:eastAsia="zh-CN"/>
+        </w:rPr>
+        <w:t>實裝</w:t>
+      </w:r>
+    </w:p>
+    <w:p>
+      <w:pPr>
+        <w:rPr>
+          <w:lang w:eastAsia="zh-CN"/>
+        </w:rPr>
+      </w:pPr>
       <w:sdt>
         <w:sdtPr>
           <w:rPr>
@@ -365,7 +377,7 @@
           </w:rPr>
           <w:id w:val="-68273334"/>
           <w14:checkbox>
-            <w14:checked w14:val="0"/>
+            <w14:checked w14:val="1"/>
             <w14:checkedState w14:val="2612" w14:font="MS Gothic"/>
             <w14:uncheckedState w14:val="2610" w14:font="MS Gothic"/>
           </w14:checkbox>
@@ -376,7 +388,7 @@
               <w:rFonts w:ascii="MS Gothic" w:eastAsia="MS Gothic" w:hAnsi="MS Gothic" w:hint="eastAsia"/>
               <w:lang w:eastAsia="zh-CN"/>
             </w:rPr>
-            <w:t>☐</w:t>
+            <w:t>☒</w:t>
           </w:r>
         </w:sdtContent>
       </w:sdt>

</xml_diff>

<commit_message>
0.4.30 feat(data): add shop logo and environment asset paths to restaurantsData
</commit_message>
<xml_diff>
--- a/TO DO.docx
+++ b/TO DO.docx
@@ -111,6 +111,7 @@
     <w:p>
       <w:pPr>
         <w:rPr>
+          <w:rFonts w:eastAsia="DengXian"/>
           <w:lang w:eastAsia="zh-CN"/>
         </w:rPr>
       </w:pPr>
@@ -150,6 +151,44 @@
           <w:lang w:eastAsia="zh-CN"/>
         </w:rPr>
         <w:t>封面樣式</w:t>
+      </w:r>
+    </w:p>
+    <w:p>
+      <w:pPr>
+        <w:rPr>
+          <w:rFonts w:eastAsia="DengXian" w:hint="eastAsia"/>
+          <w:lang w:eastAsia="zh-CN"/>
+        </w:rPr>
+      </w:pPr>
+      <w:sdt>
+        <w:sdtPr>
+          <w:rPr>
+            <w:rFonts w:hint="eastAsia"/>
+            <w:lang w:eastAsia="zh-CN"/>
+          </w:rPr>
+          <w:id w:val="-626470076"/>
+          <w14:checkbox>
+            <w14:checked w14:val="0"/>
+            <w14:checkedState w14:val="2612" w14:font="MS Gothic"/>
+            <w14:uncheckedState w14:val="2610" w14:font="MS Gothic"/>
+          </w14:checkbox>
+        </w:sdtPr>
+        <w:sdtContent>
+          <w:r>
+            <w:rPr>
+              <w:rFonts w:ascii="MS Gothic" w:eastAsia="MS Gothic" w:hAnsi="MS Gothic" w:hint="eastAsia"/>
+              <w:lang w:eastAsia="zh-CN"/>
+            </w:rPr>
+            <w:t>☐</w:t>
+          </w:r>
+        </w:sdtContent>
+      </w:sdt>
+      <w:r>
+        <w:rPr>
+          <w:rFonts w:eastAsia="DengXian" w:hint="eastAsia"/>
+          <w:lang w:eastAsia="zh-CN"/>
+        </w:rPr>
+        <w:t xml:space="preserve"> 营业中筛选纽实装</w:t>
       </w:r>
     </w:p>
     <w:p>

</xml_diff>

<commit_message>
0.4.32 feat(shops): implement global flashlight mask and restrict hover trigger to logo
</commit_message>
<xml_diff>
--- a/TO DO.docx
+++ b/TO DO.docx
@@ -9,6 +9,88 @@
             <w:rFonts w:hint="eastAsia"/>
           </w:rPr>
           <w:id w:val="-137342228"/>
+          <w14:checkbox>
+            <w14:checked w14:val="1"/>
+            <w14:checkedState w14:val="2612" w14:font="MS Gothic"/>
+            <w14:uncheckedState w14:val="2610" w14:font="MS Gothic"/>
+          </w14:checkbox>
+        </w:sdtPr>
+        <w:sdtContent>
+          <w:r>
+            <w:rPr>
+              <w:rFonts w:ascii="MS Gothic" w:eastAsia="MS Gothic" w:hAnsi="MS Gothic" w:hint="eastAsia"/>
+            </w:rPr>
+            <w:t>☒</w:t>
+          </w:r>
+        </w:sdtContent>
+      </w:sdt>
+      <w:r>
+        <w:rPr>
+          <w:rFonts w:eastAsia="DengXian" w:hint="eastAsia"/>
+        </w:rPr>
+        <w:t xml:space="preserve"> </w:t>
+      </w:r>
+      <w:r>
+        <w:rPr>
+          <w:rFonts w:hint="eastAsia"/>
+        </w:rPr>
+        <w:t>12</w:t>
+      </w:r>
+      <w:r>
+        <w:rPr>
+          <w:rFonts w:hint="eastAsia"/>
+        </w:rPr>
+        <w:t>家</w:t>
+      </w:r>
+      <w:r>
+        <w:rPr>
+          <w:rFonts w:hint="eastAsia"/>
+        </w:rPr>
+        <w:t>店</w:t>
+      </w:r>
+      <w:r>
+        <w:rPr>
+          <w:rFonts w:hint="eastAsia"/>
+        </w:rPr>
+        <w:t>圓形</w:t>
+      </w:r>
+      <w:r>
+        <w:rPr>
+          <w:rFonts w:hint="eastAsia"/>
+        </w:rPr>
+        <w:t>Logo</w:t>
+      </w:r>
+      <w:r>
+        <w:rPr>
+          <w:rFonts w:hint="eastAsia"/>
+        </w:rPr>
+        <w:t>，</w:t>
+      </w:r>
+      <w:r>
+        <w:rPr>
+          <w:rFonts w:hint="eastAsia"/>
+        </w:rPr>
+        <w:t>店家頁</w:t>
+      </w:r>
+      <w:r>
+        <w:rPr>
+          <w:rFonts w:hint="eastAsia"/>
+        </w:rPr>
+        <w:t>內容布局</w:t>
+      </w:r>
+    </w:p>
+    <w:p>
+      <w:pPr>
+        <w:rPr>
+          <w:rFonts w:hint="eastAsia"/>
+        </w:rPr>
+      </w:pPr>
+      <w:sdt>
+        <w:sdtPr>
+          <w:rPr>
+            <w:rFonts w:hint="eastAsia"/>
+          </w:rPr>
+          <w:id w:val="347538002"/>
           <w14:checkbox>
             <w14:checked w14:val="0"/>
             <w14:checkedState w14:val="2612" w14:font="MS Gothic"/>
@@ -26,7 +108,7 @@
       </w:sdt>
       <w:r>
         <w:rPr>
-          <w:rFonts w:eastAsia="DengXian" w:hint="eastAsia"/>
+          <w:rFonts w:hint="eastAsia"/>
         </w:rPr>
         <w:t xml:space="preserve"> </w:t>
       </w:r>
@@ -34,78 +116,19 @@
         <w:rPr>
           <w:rFonts w:hint="eastAsia"/>
         </w:rPr>
-        <w:t>生成</w:t>
-      </w:r>
-      <w:r>
-        <w:rPr>
-          <w:rFonts w:hint="eastAsia"/>
-        </w:rPr>
-        <w:t>12</w:t>
-      </w:r>
-      <w:r>
-        <w:rPr>
-          <w:rFonts w:hint="eastAsia"/>
-        </w:rPr>
-        <w:t>家</w:t>
-      </w:r>
-      <w:r>
-        <w:rPr>
-          <w:rFonts w:hint="eastAsia"/>
-        </w:rPr>
-        <w:t>店</w:t>
-      </w:r>
-      <w:r>
-        <w:rPr>
-          <w:rFonts w:hint="eastAsia"/>
-        </w:rPr>
-        <w:t>圓形</w:t>
-      </w:r>
-      <w:r>
-        <w:rPr>
-          <w:rFonts w:hint="eastAsia"/>
-        </w:rPr>
-        <w:t>Logo</w:t>
-      </w:r>
-      <w:r>
-        <w:rPr>
-          <w:rFonts w:hint="eastAsia"/>
-        </w:rPr>
-        <w:t>，使用</w:t>
-      </w:r>
-      <w:r>
-        <w:rPr>
-          <w:rFonts w:hint="eastAsia"/>
-        </w:rPr>
-        <w:t>MCP</w:t>
-      </w:r>
-      <w:r>
-        <w:rPr>
-          <w:rFonts w:hint="eastAsia"/>
-        </w:rPr>
-        <w:t>替換</w:t>
-      </w:r>
-      <w:r>
-        <w:t>S</w:t>
-      </w:r>
-      <w:r>
-        <w:rPr>
-          <w:rFonts w:hint="eastAsia"/>
-        </w:rPr>
-        <w:t>hops</w:t>
-      </w:r>
-      <w:r>
-        <w:rPr>
-          <w:rFonts w:hint="eastAsia"/>
-        </w:rPr>
-        <w:t>頁面內容布局</w:t>
-      </w:r>
-    </w:p>
-    <w:p>
-      <w:r>
-        <w:rPr>
-          <w:rFonts w:hint="eastAsia"/>
-        </w:rPr>
-        <w:t>「素食分類」改成「交通方式」</w:t>
+        <w:t>店家頁店家</w:t>
+      </w:r>
+      <w:r>
+        <w:rPr>
+          <w:rFonts w:hint="eastAsia"/>
+        </w:rPr>
+        <w:t>hover</w:t>
+      </w:r>
+      <w:r>
+        <w:rPr>
+          <w:rFonts w:hint="eastAsia"/>
+        </w:rPr>
+        <w:t>效果</w:t>
       </w:r>
     </w:p>
     <w:p>
@@ -156,8 +179,7 @@
     <w:p>
       <w:pPr>
         <w:rPr>
-          <w:rFonts w:eastAsia="DengXian" w:hint="eastAsia"/>
-          <w:lang w:eastAsia="zh-CN"/>
+          <w:rFonts w:hint="eastAsia"/>
         </w:rPr>
       </w:pPr>
       <w:sdt>

</xml_diff>

<commit_message>
0.4.33 feat(filters): sync 3-state status toggle to shops view and map view
</commit_message>
<xml_diff>
--- a/TO DO.docx
+++ b/TO DO.docx
@@ -3,141 +3,6 @@
 <w:document xmlns:wpc="http://schemas.microsoft.com/office/word/2010/wordprocessingCanvas" xmlns:cx="http://schemas.microsoft.com/office/drawing/2014/chartex" xmlns:cx1="http://schemas.microsoft.com/office/drawing/2015/9/8/chartex" xmlns:cx2="http://schemas.microsoft.com/office/drawing/2015/10/21/chartex" xmlns:cx3="http://schemas.microsoft.com/office/drawing/2016/5/9/chartex" xmlns:cx4="http://schemas.microsoft.com/office/drawing/2016/5/10/chartex" xmlns:cx5="http://schemas.microsoft.com/office/drawing/2016/5/11/chartex" xmlns:cx6="http://schemas.microsoft.com/office/drawing/2016/5/12/chartex" xmlns:cx7="http://schemas.microsoft.com/office/drawing/2016/5/13/chartex" xmlns:cx8="http://schemas.microsoft.com/office/drawing/2016/5/14/chartex" xmlns:mc="http://schemas.openxmlformats.org/markup-compatibility/2006" xmlns:aink="http://schemas.microsoft.com/office/drawing/2016/ink" xmlns:am3d="http://schemas.microsoft.com/office/drawing/2017/model3d" xmlns:o="urn:schemas-microsoft-com:office:office" xmlns:oel="http://schemas.microsoft.com/office/2019/extlst" xmlns:r="http://schemas.openxmlformats.org/officeDocument/2006/relationships" xmlns:m="http://schemas.openxmlformats.org/officeDocument/2006/math" xmlns:v="urn:schemas-microsoft-com:vml" xmlns:wp14="http://schemas.microsoft.com/office/word/2010/wordprocessingDrawing" xmlns:wp="http://schemas.openxmlformats.org/drawingml/2006/wordprocessingDrawing" xmlns:w10="urn:schemas-microsoft-com:office:word" xmlns:w="http://schemas.openxmlformats.org/wordprocessingml/2006/main" xmlns:w14="http://schemas.microsoft.com/office/word/2010/wordml" xmlns:w15="http://schemas.microsoft.com/office/word/2012/wordml" xmlns:w16cex="http://schemas.microsoft.com/office/word/2018/wordml/cex" xmlns:w16cid="http://schemas.microsoft.com/office/word/2016/wordml/cid" xmlns:w16="http://schemas.microsoft.com/office/word/2018/wordml" xmlns:w16du="http://schemas.microsoft.com/office/word/2023/wordml/word16du" xmlns:w16sdtdh="http://schemas.microsoft.com/office/word/2020/wordml/sdtdatahash" xmlns:w16sdtfl="http://schemas.microsoft.com/office/word/2024/wordml/sdtformatlock" xmlns:w16se="http://schemas.microsoft.com/office/word/2015/wordml/symex" xmlns:wpg="http://schemas.microsoft.com/office/word/2010/wordprocessingGroup" xmlns:wpi="http://schemas.microsoft.com/office/word/2010/wordprocessingInk" xmlns:wne="http://schemas.microsoft.com/office/word/2006/wordml" xmlns:wps="http://schemas.microsoft.com/office/word/2010/wordprocessingShape" mc:Ignorable="w14 w15 w16se w16cid w16 w16cex w16sdtdh w16sdtfl w16du wp14">
   <w:body>
     <w:p>
-      <w:sdt>
-        <w:sdtPr>
-          <w:rPr>
-            <w:rFonts w:hint="eastAsia"/>
-          </w:rPr>
-          <w:id w:val="-137342228"/>
-          <w14:checkbox>
-            <w14:checked w14:val="1"/>
-            <w14:checkedState w14:val="2612" w14:font="MS Gothic"/>
-            <w14:uncheckedState w14:val="2610" w14:font="MS Gothic"/>
-          </w14:checkbox>
-        </w:sdtPr>
-        <w:sdtContent>
-          <w:r>
-            <w:rPr>
-              <w:rFonts w:ascii="MS Gothic" w:eastAsia="MS Gothic" w:hAnsi="MS Gothic" w:hint="eastAsia"/>
-            </w:rPr>
-            <w:t>☒</w:t>
-          </w:r>
-        </w:sdtContent>
-      </w:sdt>
-      <w:r>
-        <w:rPr>
-          <w:rFonts w:eastAsia="DengXian" w:hint="eastAsia"/>
-        </w:rPr>
-        <w:t xml:space="preserve"> </w:t>
-      </w:r>
-      <w:r>
-        <w:rPr>
-          <w:rFonts w:hint="eastAsia"/>
-        </w:rPr>
-        <w:t>12</w:t>
-      </w:r>
-      <w:r>
-        <w:rPr>
-          <w:rFonts w:hint="eastAsia"/>
-        </w:rPr>
-        <w:t>家</w:t>
-      </w:r>
-      <w:r>
-        <w:rPr>
-          <w:rFonts w:hint="eastAsia"/>
-        </w:rPr>
-        <w:t>店</w:t>
-      </w:r>
-      <w:r>
-        <w:rPr>
-          <w:rFonts w:hint="eastAsia"/>
-        </w:rPr>
-        <w:t>圓形</w:t>
-      </w:r>
-      <w:r>
-        <w:rPr>
-          <w:rFonts w:hint="eastAsia"/>
-        </w:rPr>
-        <w:t>Logo</w:t>
-      </w:r>
-      <w:r>
-        <w:rPr>
-          <w:rFonts w:hint="eastAsia"/>
-        </w:rPr>
-        <w:t>，</w:t>
-      </w:r>
-      <w:r>
-        <w:rPr>
-          <w:rFonts w:hint="eastAsia"/>
-        </w:rPr>
-        <w:t>店家頁</w:t>
-      </w:r>
-      <w:r>
-        <w:rPr>
-          <w:rFonts w:hint="eastAsia"/>
-        </w:rPr>
-        <w:t>內容布局</w:t>
-      </w:r>
-    </w:p>
-    <w:p>
-      <w:pPr>
-        <w:rPr>
-          <w:rFonts w:hint="eastAsia"/>
-        </w:rPr>
-      </w:pPr>
-      <w:sdt>
-        <w:sdtPr>
-          <w:rPr>
-            <w:rFonts w:hint="eastAsia"/>
-          </w:rPr>
-          <w:id w:val="347538002"/>
-          <w14:checkbox>
-            <w14:checked w14:val="0"/>
-            <w14:checkedState w14:val="2612" w14:font="MS Gothic"/>
-            <w14:uncheckedState w14:val="2610" w14:font="MS Gothic"/>
-          </w14:checkbox>
-        </w:sdtPr>
-        <w:sdtContent>
-          <w:r>
-            <w:rPr>
-              <w:rFonts w:ascii="MS Gothic" w:eastAsia="MS Gothic" w:hAnsi="MS Gothic" w:hint="eastAsia"/>
-            </w:rPr>
-            <w:t>☐</w:t>
-          </w:r>
-        </w:sdtContent>
-      </w:sdt>
-      <w:r>
-        <w:rPr>
-          <w:rFonts w:hint="eastAsia"/>
-        </w:rPr>
-        <w:t xml:space="preserve"> </w:t>
-      </w:r>
-      <w:r>
-        <w:rPr>
-          <w:rFonts w:hint="eastAsia"/>
-        </w:rPr>
-        <w:t>店家頁店家</w:t>
-      </w:r>
-      <w:r>
-        <w:rPr>
-          <w:rFonts w:hint="eastAsia"/>
-        </w:rPr>
-        <w:t>hover</w:t>
-      </w:r>
-      <w:r>
-        <w:rPr>
-          <w:rFonts w:hint="eastAsia"/>
-        </w:rPr>
-        <w:t>效果</w:t>
-      </w:r>
-    </w:p>
-    <w:p>
-      <w:pPr>
-        <w:rPr>
-          <w:rFonts w:eastAsia="DengXian"/>
-          <w:lang w:eastAsia="zh-CN"/>
-        </w:rPr>
-      </w:pPr>
       <w:sdt>
         <w:sdtPr>
           <w:rPr>
@@ -179,7 +44,7 @@
     <w:p>
       <w:pPr>
         <w:rPr>
-          <w:rFonts w:hint="eastAsia"/>
+          <w:rFonts w:eastAsia="DengXian" w:hint="eastAsia"/>
         </w:rPr>
       </w:pPr>
       <w:sdt>
@@ -188,7 +53,7 @@
             <w:rFonts w:hint="eastAsia"/>
             <w:lang w:eastAsia="zh-CN"/>
           </w:rPr>
-          <w:id w:val="-626470076"/>
+          <w:id w:val="-1346937487"/>
           <w14:checkbox>
             <w14:checked w14:val="0"/>
             <w14:checkedState w14:val="2612" w14:font="MS Gothic"/>
@@ -207,6 +72,49 @@
       </w:sdt>
       <w:r>
         <w:rPr>
+          <w:rFonts w:hint="eastAsia"/>
+        </w:rPr>
+        <w:t xml:space="preserve"> </w:t>
+      </w:r>
+      <w:r>
+        <w:rPr>
+          <w:rFonts w:hint="eastAsia"/>
+          <w:lang w:eastAsia="zh-CN"/>
+        </w:rPr>
+        <w:t>地圖頁店家營業狀態標註</w:t>
+      </w:r>
+    </w:p>
+    <w:p>
+      <w:pPr>
+        <w:rPr>
+          <w:rFonts w:hint="eastAsia"/>
+        </w:rPr>
+      </w:pPr>
+      <w:sdt>
+        <w:sdtPr>
+          <w:rPr>
+            <w:rFonts w:hint="eastAsia"/>
+            <w:lang w:eastAsia="zh-CN"/>
+          </w:rPr>
+          <w:id w:val="-626470076"/>
+          <w14:checkbox>
+            <w14:checked w14:val="1"/>
+            <w14:checkedState w14:val="2612" w14:font="MS Gothic"/>
+            <w14:uncheckedState w14:val="2610" w14:font="MS Gothic"/>
+          </w14:checkbox>
+        </w:sdtPr>
+        <w:sdtContent>
+          <w:r>
+            <w:rPr>
+              <w:rFonts w:ascii="MS Gothic" w:eastAsia="MS Gothic" w:hAnsi="MS Gothic" w:hint="eastAsia"/>
+              <w:lang w:eastAsia="zh-CN"/>
+            </w:rPr>
+            <w:t>☒</w:t>
+          </w:r>
+        </w:sdtContent>
+      </w:sdt>
+      <w:r>
+        <w:rPr>
           <w:rFonts w:eastAsia="DengXian" w:hint="eastAsia"/>
           <w:lang w:eastAsia="zh-CN"/>
         </w:rPr>
@@ -214,12 +122,6 @@
       </w:r>
     </w:p>
     <w:p>
-      <w:pPr>
-        <w:rPr>
-          <w:rFonts w:eastAsia="DengXian"/>
-          <w:lang w:eastAsia="zh-CN"/>
-        </w:rPr>
-      </w:pPr>
       <w:sdt>
         <w:sdtPr>
           <w:rPr>
@@ -254,6 +156,155 @@
     <w:p>
       <w:pPr>
         <w:rPr>
+          <w:rFonts w:asciiTheme="minorEastAsia" w:hAnsiTheme="minorEastAsia"/>
+        </w:rPr>
+      </w:pPr>
+      <w:sdt>
+        <w:sdtPr>
+          <w:rPr>
+            <w:rFonts w:hint="eastAsia"/>
+            <w:lang w:eastAsia="zh-CN"/>
+          </w:rPr>
+          <w:id w:val="32860994"/>
+          <w14:checkbox>
+            <w14:checked w14:val="0"/>
+            <w14:checkedState w14:val="2612" w14:font="MS Gothic"/>
+            <w14:uncheckedState w14:val="2610" w14:font="MS Gothic"/>
+          </w14:checkbox>
+        </w:sdtPr>
+        <w:sdtContent>
+          <w:r>
+            <w:rPr>
+              <w:rFonts w:ascii="MS Gothic" w:eastAsia="MS Gothic" w:hAnsi="MS Gothic" w:hint="eastAsia"/>
+              <w:lang w:eastAsia="zh-CN"/>
+            </w:rPr>
+            <w:t>☐</w:t>
+          </w:r>
+        </w:sdtContent>
+      </w:sdt>
+      <w:r>
+        <w:rPr>
+          <w:rFonts w:eastAsia="DengXian" w:hint="eastAsia"/>
+          <w:lang w:eastAsia="zh-CN"/>
+        </w:rPr>
+        <w:t xml:space="preserve"> 返回纽</w:t>
+      </w:r>
+      <w:r>
+        <w:rPr>
+          <w:rFonts w:asciiTheme="minorEastAsia" w:hAnsiTheme="minorEastAsia" w:hint="eastAsia"/>
+          <w:lang w:eastAsia="zh-CN"/>
+        </w:rPr>
+        <w:t>實裝</w:t>
+      </w:r>
+    </w:p>
+    <w:p>
+      <w:sdt>
+        <w:sdtPr>
+          <w:rPr>
+            <w:rFonts w:hint="eastAsia"/>
+          </w:rPr>
+          <w:id w:val="-137342228"/>
+          <w14:checkbox>
+            <w14:checked w14:val="1"/>
+            <w14:checkedState w14:val="2612" w14:font="MS Gothic"/>
+            <w14:uncheckedState w14:val="2610" w14:font="MS Gothic"/>
+          </w14:checkbox>
+        </w:sdtPr>
+        <w:sdtContent>
+          <w:r>
+            <w:rPr>
+              <w:rFonts w:ascii="MS Gothic" w:eastAsia="MS Gothic" w:hAnsi="MS Gothic" w:hint="eastAsia"/>
+            </w:rPr>
+            <w:t>☒</w:t>
+          </w:r>
+        </w:sdtContent>
+      </w:sdt>
+      <w:r>
+        <w:rPr>
+          <w:rFonts w:eastAsia="DengXian" w:hint="eastAsia"/>
+        </w:rPr>
+        <w:t xml:space="preserve"> </w:t>
+      </w:r>
+      <w:r>
+        <w:rPr>
+          <w:rFonts w:hint="eastAsia"/>
+        </w:rPr>
+        <w:t>12</w:t>
+      </w:r>
+      <w:r>
+        <w:rPr>
+          <w:rFonts w:hint="eastAsia"/>
+        </w:rPr>
+        <w:t>家店圓形</w:t>
+      </w:r>
+      <w:r>
+        <w:rPr>
+          <w:rFonts w:hint="eastAsia"/>
+        </w:rPr>
+        <w:t>Logo</w:t>
+      </w:r>
+      <w:r>
+        <w:rPr>
+          <w:rFonts w:hint="eastAsia"/>
+        </w:rPr>
+        <w:t>，店家頁內容布局</w:t>
+      </w:r>
+    </w:p>
+    <w:p>
+      <w:pPr>
+        <w:rPr>
+          <w:rFonts w:hint="eastAsia"/>
+        </w:rPr>
+      </w:pPr>
+      <w:sdt>
+        <w:sdtPr>
+          <w:rPr>
+            <w:rFonts w:hint="eastAsia"/>
+          </w:rPr>
+          <w:id w:val="347538002"/>
+          <w14:checkbox>
+            <w14:checked w14:val="1"/>
+            <w14:checkedState w14:val="2612" w14:font="MS Gothic"/>
+            <w14:uncheckedState w14:val="2610" w14:font="MS Gothic"/>
+          </w14:checkbox>
+        </w:sdtPr>
+        <w:sdtContent>
+          <w:r>
+            <w:rPr>
+              <w:rFonts w:ascii="MS Gothic" w:eastAsia="MS Gothic" w:hAnsi="MS Gothic" w:hint="eastAsia"/>
+            </w:rPr>
+            <w:t>☒</w:t>
+          </w:r>
+        </w:sdtContent>
+      </w:sdt>
+      <w:r>
+        <w:rPr>
+          <w:rFonts w:hint="eastAsia"/>
+        </w:rPr>
+        <w:t xml:space="preserve"> </w:t>
+      </w:r>
+      <w:r>
+        <w:rPr>
+          <w:rFonts w:hint="eastAsia"/>
+        </w:rPr>
+        <w:t>店家頁店家</w:t>
+      </w:r>
+      <w:r>
+        <w:rPr>
+          <w:rFonts w:hint="eastAsia"/>
+        </w:rPr>
+        <w:t>hover</w:t>
+      </w:r>
+      <w:r>
+        <w:rPr>
+          <w:rFonts w:hint="eastAsia"/>
+        </w:rPr>
+        <w:t>效果</w:t>
+      </w:r>
+    </w:p>
+    <w:p>
+      <w:pPr>
+        <w:rPr>
           <w:rFonts w:eastAsia="DengXian"/>
           <w:lang w:eastAsia="zh-CN"/>
         </w:rPr>
@@ -382,51 +433,6 @@
     <w:p>
       <w:pPr>
         <w:rPr>
-          <w:rFonts w:eastAsia="DengXian"/>
-          <w:lang w:eastAsia="zh-CN"/>
-        </w:rPr>
-      </w:pPr>
-      <w:sdt>
-        <w:sdtPr>
-          <w:rPr>
-            <w:rFonts w:hint="eastAsia"/>
-            <w:lang w:eastAsia="zh-CN"/>
-          </w:rPr>
-          <w:id w:val="32860994"/>
-          <w14:checkbox>
-            <w14:checked w14:val="0"/>
-            <w14:checkedState w14:val="2612" w14:font="MS Gothic"/>
-            <w14:uncheckedState w14:val="2610" w14:font="MS Gothic"/>
-          </w14:checkbox>
-        </w:sdtPr>
-        <w:sdtContent>
-          <w:r>
-            <w:rPr>
-              <w:rFonts w:ascii="MS Gothic" w:eastAsia="MS Gothic" w:hAnsi="MS Gothic" w:hint="eastAsia"/>
-              <w:lang w:eastAsia="zh-CN"/>
-            </w:rPr>
-            <w:t>☐</w:t>
-          </w:r>
-        </w:sdtContent>
-      </w:sdt>
-      <w:r>
-        <w:rPr>
-          <w:rFonts w:eastAsia="DengXian" w:hint="eastAsia"/>
-          <w:lang w:eastAsia="zh-CN"/>
-        </w:rPr>
-        <w:t xml:space="preserve"> 返回纽</w:t>
-      </w:r>
-      <w:r>
-        <w:rPr>
-          <w:rFonts w:asciiTheme="minorEastAsia" w:hAnsiTheme="minorEastAsia" w:hint="eastAsia"/>
-          <w:lang w:eastAsia="zh-CN"/>
-        </w:rPr>
-        <w:t>實裝</w:t>
-      </w:r>
-    </w:p>
-    <w:p>
-      <w:pPr>
-        <w:rPr>
           <w:lang w:eastAsia="zh-CN"/>
         </w:rPr>
       </w:pPr>
@@ -503,13 +509,6 @@
         </w:rPr>
         <w:t>公休圖標換成純文字</w:t>
       </w:r>
-    </w:p>
-    <w:p>
-      <w:pPr>
-        <w:rPr>
-          <w:lang w:eastAsia="zh-CN"/>
-        </w:rPr>
-      </w:pPr>
     </w:p>
     <w:p>
       <w:sdt>

</xml_diff>

<commit_message>
0.4.44 refactor: remove redundant code and clean up unused variables
</commit_message>
<xml_diff>
--- a/TO DO.docx
+++ b/TO DO.docx
@@ -2,6 +2,86 @@
 <file path=word/document.xml><?xml version="1.0" encoding="utf-8"?>
 <w:document xmlns:wpc="http://schemas.microsoft.com/office/word/2010/wordprocessingCanvas" xmlns:cx="http://schemas.microsoft.com/office/drawing/2014/chartex" xmlns:cx1="http://schemas.microsoft.com/office/drawing/2015/9/8/chartex" xmlns:cx2="http://schemas.microsoft.com/office/drawing/2015/10/21/chartex" xmlns:cx3="http://schemas.microsoft.com/office/drawing/2016/5/9/chartex" xmlns:cx4="http://schemas.microsoft.com/office/drawing/2016/5/10/chartex" xmlns:cx5="http://schemas.microsoft.com/office/drawing/2016/5/11/chartex" xmlns:cx6="http://schemas.microsoft.com/office/drawing/2016/5/12/chartex" xmlns:cx7="http://schemas.microsoft.com/office/drawing/2016/5/13/chartex" xmlns:cx8="http://schemas.microsoft.com/office/drawing/2016/5/14/chartex" xmlns:mc="http://schemas.openxmlformats.org/markup-compatibility/2006" xmlns:aink="http://schemas.microsoft.com/office/drawing/2016/ink" xmlns:am3d="http://schemas.microsoft.com/office/drawing/2017/model3d" xmlns:o="urn:schemas-microsoft-com:office:office" xmlns:oel="http://schemas.microsoft.com/office/2019/extlst" xmlns:r="http://schemas.openxmlformats.org/officeDocument/2006/relationships" xmlns:m="http://schemas.openxmlformats.org/officeDocument/2006/math" xmlns:v="urn:schemas-microsoft-com:vml" xmlns:wp14="http://schemas.microsoft.com/office/word/2010/wordprocessingDrawing" xmlns:wp="http://schemas.openxmlformats.org/drawingml/2006/wordprocessingDrawing" xmlns:w10="urn:schemas-microsoft-com:office:word" xmlns:w="http://schemas.openxmlformats.org/wordprocessingml/2006/main" xmlns:w14="http://schemas.microsoft.com/office/word/2010/wordml" xmlns:w15="http://schemas.microsoft.com/office/word/2012/wordml" xmlns:w16cex="http://schemas.microsoft.com/office/word/2018/wordml/cex" xmlns:w16cid="http://schemas.microsoft.com/office/word/2016/wordml/cid" xmlns:w16="http://schemas.microsoft.com/office/word/2018/wordml" xmlns:w16du="http://schemas.microsoft.com/office/word/2023/wordml/word16du" xmlns:w16sdtdh="http://schemas.microsoft.com/office/word/2020/wordml/sdtdatahash" xmlns:w16sdtfl="http://schemas.microsoft.com/office/word/2024/wordml/sdtformatlock" xmlns:w16se="http://schemas.microsoft.com/office/word/2015/wordml/symex" xmlns:wpg="http://schemas.microsoft.com/office/word/2010/wordprocessingGroup" xmlns:wpi="http://schemas.microsoft.com/office/word/2010/wordprocessingInk" xmlns:wne="http://schemas.microsoft.com/office/word/2006/wordml" xmlns:wps="http://schemas.microsoft.com/office/word/2010/wordprocessingShape" mc:Ignorable="w14 w15 w16se w16cid w16 w16cex w16sdtdh w16sdtfl w16du wp14">
   <w:body>
+    <w:p>
+      <w:pPr>
+        <w:rPr>
+          <w:rFonts w:hint="eastAsia"/>
+        </w:rPr>
+      </w:pPr>
+      <w:sdt>
+        <w:sdtPr>
+          <w:rPr>
+            <w:rFonts w:hint="eastAsia"/>
+          </w:rPr>
+          <w:id w:val="32860994"/>
+          <w14:checkbox>
+            <w14:checked w14:val="0"/>
+            <w14:checkedState w14:val="2612" w14:font="MS Gothic"/>
+            <w14:uncheckedState w14:val="2610" w14:font="MS Gothic"/>
+          </w14:checkbox>
+        </w:sdtPr>
+        <w:sdtContent>
+          <w:r>
+            <w:rPr>
+              <w:rFonts w:ascii="MS Gothic" w:eastAsia="MS Gothic" w:hAnsi="MS Gothic" w:hint="eastAsia"/>
+            </w:rPr>
+            <w:t>☐</w:t>
+          </w:r>
+        </w:sdtContent>
+      </w:sdt>
+      <w:r>
+        <w:rPr>
+          <w:rFonts w:eastAsia="DengXian" w:hint="eastAsia"/>
+        </w:rPr>
+        <w:t xml:space="preserve"> 返回纽</w:t>
+      </w:r>
+      <w:r>
+        <w:rPr>
+          <w:rFonts w:asciiTheme="minorEastAsia" w:hAnsiTheme="minorEastAsia" w:hint="eastAsia"/>
+        </w:rPr>
+        <w:t>實裝(或者只修改返回方式)</w:t>
+      </w:r>
+    </w:p>
+    <w:p>
+      <w:pPr>
+        <w:rPr>
+          <w:lang w:eastAsia="zh-CN"/>
+        </w:rPr>
+      </w:pPr>
+      <w:sdt>
+        <w:sdtPr>
+          <w:rPr>
+            <w:rFonts w:hint="eastAsia"/>
+          </w:rPr>
+          <w:id w:val="-1346937487"/>
+          <w14:checkbox>
+            <w14:checked w14:val="0"/>
+            <w14:checkedState w14:val="2612" w14:font="MS Gothic"/>
+            <w14:uncheckedState w14:val="2610" w14:font="MS Gothic"/>
+          </w14:checkbox>
+        </w:sdtPr>
+        <w:sdtContent>
+          <w:r>
+            <w:rPr>
+              <w:rFonts w:ascii="MS Gothic" w:eastAsia="MS Gothic" w:hAnsi="MS Gothic" w:hint="eastAsia"/>
+            </w:rPr>
+            <w:t>☐</w:t>
+          </w:r>
+        </w:sdtContent>
+      </w:sdt>
+      <w:r>
+        <w:rPr>
+          <w:rFonts w:hint="eastAsia"/>
+        </w:rPr>
+        <w:t xml:space="preserve"> </w:t>
+      </w:r>
+      <w:r>
+        <w:rPr>
+          <w:rFonts w:hint="eastAsia"/>
+        </w:rPr>
+        <w:t>地圖頁店家營業狀態標註</w:t>
+      </w:r>
+    </w:p>
     <w:p>
       <w:sdt>
         <w:sdtPr>
@@ -9,7 +89,7 @@
             <w:rFonts w:hint="eastAsia"/>
             <w:lang w:eastAsia="zh-CN"/>
           </w:rPr>
-          <w:id w:val="-471976989"/>
+          <w:id w:val="-1094165772"/>
           <w14:checkbox>
             <w14:checked w14:val="0"/>
             <w14:checkedState w14:val="2612" w14:font="MS Gothic"/>
@@ -28,23 +108,16 @@
       </w:sdt>
       <w:r>
         <w:rPr>
-          <w:rFonts w:hint="eastAsia"/>
-          <w:lang w:eastAsia="zh-CN"/>
-        </w:rPr>
-        <w:t xml:space="preserve"> </w:t>
-      </w:r>
-      <w:r>
-        <w:rPr>
-          <w:rFonts w:hint="eastAsia"/>
-          <w:lang w:eastAsia="zh-CN"/>
-        </w:rPr>
-        <w:t>封面樣式</w:t>
-      </w:r>
-    </w:p>
-    <w:p>
-      <w:pPr>
-        <w:rPr>
           <w:rFonts w:eastAsia="DengXian" w:hint="eastAsia"/>
+          <w:lang w:eastAsia="zh-CN"/>
+        </w:rPr>
+        <w:t xml:space="preserve"> 店家详情页交通时间数据动态调整</w:t>
+      </w:r>
+    </w:p>
+    <w:p>
+      <w:pPr>
+        <w:rPr>
+          <w:rFonts w:asciiTheme="minorEastAsia" w:hAnsiTheme="minorEastAsia" w:hint="eastAsia"/>
         </w:rPr>
       </w:pPr>
       <w:sdt>
@@ -53,7 +126,7 @@
             <w:rFonts w:hint="eastAsia"/>
             <w:lang w:eastAsia="zh-CN"/>
           </w:rPr>
-          <w:id w:val="-1346937487"/>
+          <w:id w:val="-954710799"/>
           <w14:checkbox>
             <w14:checked w14:val="0"/>
             <w14:checkedState w14:val="2612" w14:font="MS Gothic"/>
@@ -81,13 +154,72 @@
           <w:rFonts w:hint="eastAsia"/>
           <w:lang w:eastAsia="zh-CN"/>
         </w:rPr>
-        <w:t>地圖頁店家營業狀態標註</w:t>
-      </w:r>
-    </w:p>
-    <w:p>
-      <w:pPr>
-        <w:rPr>
-          <w:rFonts w:hint="eastAsia"/>
+        <w:t>營業狀態</w:t>
+      </w:r>
+    </w:p>
+    <w:p>
+      <w:pPr>
+        <w:rPr>
+          <w:rFonts w:asciiTheme="minorEastAsia" w:eastAsia="DengXian" w:hAnsiTheme="minorEastAsia"/>
+          <w:lang w:eastAsia="zh-CN"/>
+        </w:rPr>
+      </w:pPr>
+      <w:sdt>
+        <w:sdtPr>
+          <w:rPr>
+            <w:rFonts w:hint="eastAsia"/>
+          </w:rPr>
+          <w:id w:val="-471976989"/>
+          <w14:checkbox>
+            <w14:checked w14:val="1"/>
+            <w14:checkedState w14:val="2612" w14:font="MS Gothic"/>
+            <w14:uncheckedState w14:val="2610" w14:font="MS Gothic"/>
+          </w14:checkbox>
+        </w:sdtPr>
+        <w:sdtContent>
+          <w:r>
+            <w:rPr>
+              <w:rFonts w:ascii="MS Gothic" w:eastAsia="MS Gothic" w:hAnsi="MS Gothic" w:hint="eastAsia"/>
+            </w:rPr>
+            <w:t>☒</w:t>
+          </w:r>
+        </w:sdtContent>
+      </w:sdt>
+      <w:r>
+        <w:rPr>
+          <w:rFonts w:hint="eastAsia"/>
+        </w:rPr>
+        <w:t xml:space="preserve"> </w:t>
+      </w:r>
+      <w:r>
+        <w:rPr>
+          <w:rFonts w:hint="eastAsia"/>
+        </w:rPr>
+        <w:t>封面樣式</w:t>
+      </w:r>
+      <w:r>
+        <w:rPr>
+          <w:rFonts w:hint="eastAsia"/>
+        </w:rPr>
+        <w:t>(</w:t>
+      </w:r>
+      <w:r>
+        <w:rPr>
+          <w:rFonts w:hint="eastAsia"/>
+        </w:rPr>
+        <w:t>可不修改</w:t>
+      </w:r>
+      <w:r>
+        <w:rPr>
+          <w:rFonts w:hint="eastAsia"/>
+        </w:rPr>
+        <w:t>)</w:t>
+      </w:r>
+    </w:p>
+    <w:p>
+      <w:pPr>
+        <w:rPr>
+          <w:lang w:eastAsia="zh-CN"/>
         </w:rPr>
       </w:pPr>
       <w:sdt>
@@ -122,15 +254,21 @@
       </w:r>
     </w:p>
     <w:p>
+      <w:pPr>
+        <w:rPr>
+          <w:rFonts w:asciiTheme="minorEastAsia" w:eastAsia="DengXian" w:hAnsiTheme="minorEastAsia"/>
+          <w:lang w:eastAsia="zh-CN"/>
+        </w:rPr>
+      </w:pPr>
       <w:sdt>
         <w:sdtPr>
           <w:rPr>
             <w:rFonts w:hint="eastAsia"/>
             <w:lang w:eastAsia="zh-CN"/>
           </w:rPr>
-          <w:id w:val="-1094165772"/>
+          <w:id w:val="-1296750659"/>
           <w14:checkbox>
-            <w14:checked w14:val="0"/>
+            <w14:checked w14:val="1"/>
             <w14:checkedState w14:val="2612" w14:font="MS Gothic"/>
             <w14:uncheckedState w14:val="2610" w14:font="MS Gothic"/>
           </w14:checkbox>
@@ -141,7 +279,7 @@
               <w:rFonts w:ascii="MS Gothic" w:eastAsia="MS Gothic" w:hAnsi="MS Gothic" w:hint="eastAsia"/>
               <w:lang w:eastAsia="zh-CN"/>
             </w:rPr>
-            <w:t>☐</w:t>
+            <w:t>☒</w:t>
           </w:r>
         </w:sdtContent>
       </w:sdt>
@@ -150,13 +288,35 @@
           <w:rFonts w:eastAsia="DengXian" w:hint="eastAsia"/>
           <w:lang w:eastAsia="zh-CN"/>
         </w:rPr>
-        <w:t xml:space="preserve"> 店家详情页交通时间数据动态调整</w:t>
-      </w:r>
-    </w:p>
-    <w:p>
-      <w:pPr>
-        <w:rPr>
-          <w:rFonts w:asciiTheme="minorEastAsia" w:hAnsiTheme="minorEastAsia"/>
+        <w:t xml:space="preserve"> 菜单不止一张</w:t>
+      </w:r>
+      <w:r>
+        <w:rPr>
+          <w:rFonts w:asciiTheme="minorEastAsia" w:hAnsiTheme="minorEastAsia" w:hint="eastAsia"/>
+          <w:lang w:eastAsia="zh-CN"/>
+        </w:rPr>
+        <w:t>(輪播方式</w:t>
+      </w:r>
+      <w:r>
+        <w:rPr>
+          <w:rFonts w:asciiTheme="minorEastAsia" w:hAnsiTheme="minorEastAsia" w:hint="eastAsia"/>
+          <w:lang w:eastAsia="zh-CN"/>
+        </w:rPr>
+        <w:t>，可不修改</w:t>
+      </w:r>
+      <w:r>
+        <w:rPr>
+          <w:rFonts w:asciiTheme="minorEastAsia" w:hAnsiTheme="minorEastAsia" w:hint="eastAsia"/>
+          <w:lang w:eastAsia="zh-CN"/>
+        </w:rPr>
+        <w:t>)</w:t>
+      </w:r>
+    </w:p>
+    <w:p>
+      <w:pPr>
+        <w:rPr>
+          <w:rFonts w:eastAsia="DengXian"/>
+          <w:lang w:eastAsia="zh-CN"/>
         </w:rPr>
       </w:pPr>
       <w:sdt>
@@ -165,9 +325,9 @@
             <w:rFonts w:hint="eastAsia"/>
             <w:lang w:eastAsia="zh-CN"/>
           </w:rPr>
-          <w:id w:val="32860994"/>
+          <w:id w:val="1462000435"/>
           <w14:checkbox>
-            <w14:checked w14:val="0"/>
+            <w14:checked w14:val="1"/>
             <w14:checkedState w14:val="2612" w14:font="MS Gothic"/>
             <w14:uncheckedState w14:val="2610" w14:font="MS Gothic"/>
           </w14:checkbox>
@@ -178,7 +338,7 @@
               <w:rFonts w:ascii="MS Gothic" w:eastAsia="MS Gothic" w:hAnsi="MS Gothic" w:hint="eastAsia"/>
               <w:lang w:eastAsia="zh-CN"/>
             </w:rPr>
-            <w:t>☐</w:t>
+            <w:t>☒</w:t>
           </w:r>
         </w:sdtContent>
       </w:sdt>
@@ -187,14 +347,7 @@
           <w:rFonts w:eastAsia="DengXian" w:hint="eastAsia"/>
           <w:lang w:eastAsia="zh-CN"/>
         </w:rPr>
-        <w:t xml:space="preserve"> 返回纽</w:t>
-      </w:r>
-      <w:r>
-        <w:rPr>
-          <w:rFonts w:asciiTheme="minorEastAsia" w:hAnsiTheme="minorEastAsia" w:hint="eastAsia"/>
-          <w:lang w:eastAsia="zh-CN"/>
-        </w:rPr>
-        <w:t>實裝</w:t>
+        <w:t xml:space="preserve"> 地图页店家选取时，其他店家地标logo消失（可不修改）</w:t>
       </w:r>
     </w:p>
     <w:p>
@@ -253,13 +406,14 @@
     <w:p>
       <w:pPr>
         <w:rPr>
-          <w:rFonts w:hint="eastAsia"/>
+          <w:lang w:eastAsia="zh-CN"/>
         </w:rPr>
       </w:pPr>
       <w:sdt>
         <w:sdtPr>
           <w:rPr>
             <w:rFonts w:hint="eastAsia"/>
+            <w:lang w:eastAsia="zh-CN"/>
           </w:rPr>
           <w:id w:val="347538002"/>
           <w14:checkbox>
@@ -272,6 +426,7 @@
           <w:r>
             <w:rPr>
               <w:rFonts w:ascii="MS Gothic" w:eastAsia="MS Gothic" w:hAnsi="MS Gothic" w:hint="eastAsia"/>
+              <w:lang w:eastAsia="zh-CN"/>
             </w:rPr>
             <w:t>☒</w:t>
           </w:r>
@@ -280,24 +435,28 @@
       <w:r>
         <w:rPr>
           <w:rFonts w:hint="eastAsia"/>
+          <w:lang w:eastAsia="zh-CN"/>
         </w:rPr>
         <w:t xml:space="preserve"> </w:t>
       </w:r>
       <w:r>
         <w:rPr>
           <w:rFonts w:hint="eastAsia"/>
+          <w:lang w:eastAsia="zh-CN"/>
         </w:rPr>
         <w:t>店家頁店家</w:t>
       </w:r>
       <w:r>
         <w:rPr>
           <w:rFonts w:hint="eastAsia"/>
+          <w:lang w:eastAsia="zh-CN"/>
         </w:rPr>
         <w:t>hover</w:t>
       </w:r>
       <w:r>
         <w:rPr>
           <w:rFonts w:hint="eastAsia"/>
+          <w:lang w:eastAsia="zh-CN"/>
         </w:rPr>
         <w:t>效果</w:t>
       </w:r>
@@ -468,16 +627,10 @@
       </w:r>
     </w:p>
     <w:p>
-      <w:pPr>
-        <w:rPr>
-          <w:rFonts w:hint="eastAsia"/>
-        </w:rPr>
-      </w:pPr>
       <w:sdt>
         <w:sdtPr>
           <w:rPr>
             <w:rFonts w:hint="eastAsia"/>
-            <w:lang w:eastAsia="zh-CN"/>
           </w:rPr>
           <w:id w:val="1424606974"/>
           <w14:checkbox>
@@ -490,7 +643,6 @@
           <w:r>
             <w:rPr>
               <w:rFonts w:ascii="MS Gothic" w:eastAsia="MS Gothic" w:hAnsi="MS Gothic" w:hint="eastAsia"/>
-              <w:lang w:eastAsia="zh-CN"/>
             </w:rPr>
             <w:t>☒</w:t>
           </w:r>
@@ -505,7 +657,6 @@
       <w:r>
         <w:rPr>
           <w:rFonts w:hint="eastAsia"/>
-          <w:lang w:eastAsia="zh-CN"/>
         </w:rPr>
         <w:t>公休圖標換成純文字</w:t>
       </w:r>

</xml_diff>

<commit_message>
feat(hooks): complete dynamic routing memory for accurate source page return v0.4.46
</commit_message>
<xml_diff>
--- a/TO DO.docx
+++ b/TO DO.docx
@@ -3,11 +3,6 @@
 <w:document xmlns:wpc="http://schemas.microsoft.com/office/word/2010/wordprocessingCanvas" xmlns:cx="http://schemas.microsoft.com/office/drawing/2014/chartex" xmlns:cx1="http://schemas.microsoft.com/office/drawing/2015/9/8/chartex" xmlns:cx2="http://schemas.microsoft.com/office/drawing/2015/10/21/chartex" xmlns:cx3="http://schemas.microsoft.com/office/drawing/2016/5/9/chartex" xmlns:cx4="http://schemas.microsoft.com/office/drawing/2016/5/10/chartex" xmlns:cx5="http://schemas.microsoft.com/office/drawing/2016/5/11/chartex" xmlns:cx6="http://schemas.microsoft.com/office/drawing/2016/5/12/chartex" xmlns:cx7="http://schemas.microsoft.com/office/drawing/2016/5/13/chartex" xmlns:cx8="http://schemas.microsoft.com/office/drawing/2016/5/14/chartex" xmlns:mc="http://schemas.openxmlformats.org/markup-compatibility/2006" xmlns:aink="http://schemas.microsoft.com/office/drawing/2016/ink" xmlns:am3d="http://schemas.microsoft.com/office/drawing/2017/model3d" xmlns:o="urn:schemas-microsoft-com:office:office" xmlns:oel="http://schemas.microsoft.com/office/2019/extlst" xmlns:r="http://schemas.openxmlformats.org/officeDocument/2006/relationships" xmlns:m="http://schemas.openxmlformats.org/officeDocument/2006/math" xmlns:v="urn:schemas-microsoft-com:vml" xmlns:wp14="http://schemas.microsoft.com/office/word/2010/wordprocessingDrawing" xmlns:wp="http://schemas.openxmlformats.org/drawingml/2006/wordprocessingDrawing" xmlns:w10="urn:schemas-microsoft-com:office:word" xmlns:w="http://schemas.openxmlformats.org/wordprocessingml/2006/main" xmlns:w14="http://schemas.microsoft.com/office/word/2010/wordml" xmlns:w15="http://schemas.microsoft.com/office/word/2012/wordml" xmlns:w16cex="http://schemas.microsoft.com/office/word/2018/wordml/cex" xmlns:w16cid="http://schemas.microsoft.com/office/word/2016/wordml/cid" xmlns:w16="http://schemas.microsoft.com/office/word/2018/wordml" xmlns:w16du="http://schemas.microsoft.com/office/word/2023/wordml/word16du" xmlns:w16sdtdh="http://schemas.microsoft.com/office/word/2020/wordml/sdtdatahash" xmlns:w16sdtfl="http://schemas.microsoft.com/office/word/2024/wordml/sdtformatlock" xmlns:w16se="http://schemas.microsoft.com/office/word/2015/wordml/symex" xmlns:wpg="http://schemas.microsoft.com/office/word/2010/wordprocessingGroup" xmlns:wpi="http://schemas.microsoft.com/office/word/2010/wordprocessingInk" xmlns:wne="http://schemas.microsoft.com/office/word/2006/wordml" xmlns:wps="http://schemas.microsoft.com/office/word/2010/wordprocessingShape" mc:Ignorable="w14 w15 w16se w16cid w16 w16cex w16sdtdh w16sdtfl w16du wp14">
   <w:body>
     <w:p>
-      <w:pPr>
-        <w:rPr>
-          <w:rFonts w:hint="eastAsia"/>
-        </w:rPr>
-      </w:pPr>
       <w:sdt>
         <w:sdtPr>
           <w:rPr>
@@ -43,11 +38,6 @@
       </w:r>
     </w:p>
     <w:p>
-      <w:pPr>
-        <w:rPr>
-          <w:lang w:eastAsia="zh-CN"/>
-        </w:rPr>
-      </w:pPr>
       <w:sdt>
         <w:sdtPr>
           <w:rPr>
@@ -83,6 +73,11 @@
       </w:r>
     </w:p>
     <w:p>
+      <w:pPr>
+        <w:rPr>
+          <w:lang w:eastAsia="zh-CN"/>
+        </w:rPr>
+      </w:pPr>
       <w:sdt>
         <w:sdtPr>
           <w:rPr>
@@ -117,14 +112,14 @@
     <w:p>
       <w:pPr>
         <w:rPr>
-          <w:rFonts w:asciiTheme="minorEastAsia" w:hAnsiTheme="minorEastAsia" w:hint="eastAsia"/>
+          <w:rFonts w:eastAsia="DengXian"/>
+          <w:lang w:eastAsia="zh-CN"/>
         </w:rPr>
       </w:pPr>
       <w:sdt>
         <w:sdtPr>
           <w:rPr>
             <w:rFonts w:hint="eastAsia"/>
-            <w:lang w:eastAsia="zh-CN"/>
           </w:rPr>
           <w:id w:val="-954710799"/>
           <w14:checkbox>
@@ -137,7 +132,6 @@
           <w:r>
             <w:rPr>
               <w:rFonts w:ascii="MS Gothic" w:eastAsia="MS Gothic" w:hAnsi="MS Gothic" w:hint="eastAsia"/>
-              <w:lang w:eastAsia="zh-CN"/>
             </w:rPr>
             <w:t>☐</w:t>
           </w:r>
@@ -152,7 +146,6 @@
       <w:r>
         <w:rPr>
           <w:rFonts w:hint="eastAsia"/>
-          <w:lang w:eastAsia="zh-CN"/>
         </w:rPr>
         <w:t>營業狀態</w:t>
       </w:r>
@@ -160,8 +153,57 @@
     <w:p>
       <w:pPr>
         <w:rPr>
+          <w:rFonts w:asciiTheme="minorEastAsia" w:eastAsia="DengXian" w:hAnsiTheme="minorEastAsia" w:hint="eastAsia"/>
+          <w:lang w:eastAsia="zh-CN"/>
+        </w:rPr>
+      </w:pPr>
+      <w:sdt>
+        <w:sdtPr>
+          <w:rPr>
+            <w:rFonts w:hint="eastAsia"/>
+          </w:rPr>
+          <w:id w:val="-1404599310"/>
+          <w14:checkbox>
+            <w14:checked w14:val="0"/>
+            <w14:checkedState w14:val="2612" w14:font="MS Gothic"/>
+            <w14:uncheckedState w14:val="2610" w14:font="MS Gothic"/>
+          </w14:checkbox>
+        </w:sdtPr>
+        <w:sdtContent>
+          <w:r>
+            <w:rPr>
+              <w:rFonts w:ascii="MS Gothic" w:eastAsia="MS Gothic" w:hAnsi="MS Gothic" w:hint="eastAsia"/>
+            </w:rPr>
+            <w:t>☐</w:t>
+          </w:r>
+        </w:sdtContent>
+      </w:sdt>
+      <w:r>
+        <w:rPr>
+          <w:rFonts w:eastAsia="DengXian" w:hint="eastAsia"/>
+          <w:lang w:eastAsia="zh-CN"/>
+        </w:rPr>
+        <w:t xml:space="preserve"> </w:t>
+      </w:r>
+      <w:r>
+        <w:rPr>
+          <w:rFonts w:eastAsia="DengXian" w:hint="eastAsia"/>
+          <w:lang w:eastAsia="zh-CN"/>
+        </w:rPr>
+        <w:t>营业时间</w:t>
+      </w:r>
+      <w:r>
+        <w:rPr>
+          <w:rFonts w:eastAsia="DengXian" w:hint="eastAsia"/>
+          <w:lang w:eastAsia="zh-CN"/>
+        </w:rPr>
+        <w:t>没有对齐</w:t>
+      </w:r>
+    </w:p>
+    <w:p>
+      <w:pPr>
+        <w:rPr>
           <w:rFonts w:asciiTheme="minorEastAsia" w:eastAsia="DengXian" w:hAnsiTheme="minorEastAsia"/>
-          <w:lang w:eastAsia="zh-CN"/>
         </w:rPr>
       </w:pPr>
       <w:sdt>

</xml_diff>

<commit_message>
style(ui): unify business status badge styles across all views v0.4.47
</commit_message>
<xml_diff>
--- a/TO DO.docx
+++ b/TO DO.docx
@@ -10,7 +10,7 @@
           </w:rPr>
           <w:id w:val="32860994"/>
           <w14:checkbox>
-            <w14:checked w14:val="0"/>
+            <w14:checked w14:val="1"/>
             <w14:checkedState w14:val="2612" w14:font="MS Gothic"/>
             <w14:uncheckedState w14:val="2610" w14:font="MS Gothic"/>
           </w14:checkbox>
@@ -20,7 +20,7 @@
             <w:rPr>
               <w:rFonts w:ascii="MS Gothic" w:eastAsia="MS Gothic" w:hAnsi="MS Gothic" w:hint="eastAsia"/>
             </w:rPr>
-            <w:t>☐</w:t>
+            <w:t>☒</w:t>
           </w:r>
         </w:sdtContent>
       </w:sdt>
@@ -120,6 +120,7 @@
         <w:sdtPr>
           <w:rPr>
             <w:rFonts w:hint="eastAsia"/>
+            <w:lang w:eastAsia="zh-CN"/>
           </w:rPr>
           <w:id w:val="-954710799"/>
           <w14:checkbox>
@@ -132,6 +133,7 @@
           <w:r>
             <w:rPr>
               <w:rFonts w:ascii="MS Gothic" w:eastAsia="MS Gothic" w:hAnsi="MS Gothic" w:hint="eastAsia"/>
+              <w:lang w:eastAsia="zh-CN"/>
             </w:rPr>
             <w:t>☐</w:t>
           </w:r>
@@ -140,27 +142,24 @@
       <w:r>
         <w:rPr>
           <w:rFonts w:hint="eastAsia"/>
+          <w:lang w:eastAsia="zh-CN"/>
         </w:rPr>
         <w:t xml:space="preserve"> </w:t>
       </w:r>
       <w:r>
         <w:rPr>
           <w:rFonts w:hint="eastAsia"/>
+          <w:lang w:eastAsia="zh-CN"/>
         </w:rPr>
         <w:t>營業狀態</w:t>
       </w:r>
     </w:p>
     <w:p>
-      <w:pPr>
-        <w:rPr>
-          <w:rFonts w:asciiTheme="minorEastAsia" w:eastAsia="DengXian" w:hAnsiTheme="minorEastAsia" w:hint="eastAsia"/>
-          <w:lang w:eastAsia="zh-CN"/>
-        </w:rPr>
-      </w:pPr>
       <w:sdt>
         <w:sdtPr>
           <w:rPr>
             <w:rFonts w:hint="eastAsia"/>
+            <w:lang w:eastAsia="zh-CN"/>
           </w:rPr>
           <w:id w:val="-1404599310"/>
           <w14:checkbox>
@@ -173,6 +172,7 @@
           <w:r>
             <w:rPr>
               <w:rFonts w:ascii="MS Gothic" w:eastAsia="MS Gothic" w:hAnsi="MS Gothic" w:hint="eastAsia"/>
+              <w:lang w:eastAsia="zh-CN"/>
             </w:rPr>
             <w:t>☐</w:t>
           </w:r>
@@ -183,33 +183,64 @@
           <w:rFonts w:eastAsia="DengXian" w:hint="eastAsia"/>
           <w:lang w:eastAsia="zh-CN"/>
         </w:rPr>
-        <w:t xml:space="preserve"> </w:t>
-      </w:r>
-      <w:r>
-        <w:rPr>
-          <w:rFonts w:eastAsia="DengXian" w:hint="eastAsia"/>
-          <w:lang w:eastAsia="zh-CN"/>
-        </w:rPr>
-        <w:t>营业时间</w:t>
-      </w:r>
-      <w:r>
-        <w:rPr>
-          <w:rFonts w:eastAsia="DengXian" w:hint="eastAsia"/>
-          <w:lang w:eastAsia="zh-CN"/>
-        </w:rPr>
-        <w:t>没有对齐</w:t>
-      </w:r>
-    </w:p>
-    <w:p>
-      <w:pPr>
-        <w:rPr>
-          <w:rFonts w:asciiTheme="minorEastAsia" w:eastAsia="DengXian" w:hAnsiTheme="minorEastAsia"/>
+        <w:t xml:space="preserve"> 营业时间没有对齐</w:t>
+      </w:r>
+    </w:p>
+    <w:p>
+      <w:pPr>
+        <w:rPr>
+          <w:rFonts w:asciiTheme="minorEastAsia" w:hAnsiTheme="minorEastAsia" w:hint="eastAsia"/>
         </w:rPr>
       </w:pPr>
       <w:sdt>
         <w:sdtPr>
           <w:rPr>
             <w:rFonts w:hint="eastAsia"/>
+            <w:lang w:eastAsia="zh-CN"/>
+          </w:rPr>
+          <w:id w:val="1938634204"/>
+          <w14:checkbox>
+            <w14:checked w14:val="0"/>
+            <w14:checkedState w14:val="2612" w14:font="MS Gothic"/>
+            <w14:uncheckedState w14:val="2610" w14:font="MS Gothic"/>
+          </w14:checkbox>
+        </w:sdtPr>
+        <w:sdtContent>
+          <w:r>
+            <w:rPr>
+              <w:rFonts w:ascii="MS Gothic" w:eastAsia="MS Gothic" w:hAnsi="MS Gothic" w:hint="eastAsia"/>
+              <w:lang w:eastAsia="zh-CN"/>
+            </w:rPr>
+            <w:t>☐</w:t>
+          </w:r>
+        </w:sdtContent>
+      </w:sdt>
+      <w:r>
+        <w:rPr>
+          <w:rFonts w:hint="eastAsia"/>
+        </w:rPr>
+        <w:t xml:space="preserve"> </w:t>
+      </w:r>
+      <w:r>
+        <w:rPr>
+          <w:rFonts w:hint="eastAsia"/>
+          <w:lang w:eastAsia="zh-CN"/>
+        </w:rPr>
+        <w:t>團體成員</w:t>
+      </w:r>
+    </w:p>
+    <w:p>
+      <w:pPr>
+        <w:rPr>
+          <w:rFonts w:asciiTheme="minorEastAsia" w:eastAsia="DengXian" w:hAnsiTheme="minorEastAsia"/>
+          <w:lang w:eastAsia="zh-CN"/>
+        </w:rPr>
+      </w:pPr>
+      <w:sdt>
+        <w:sdtPr>
+          <w:rPr>
+            <w:rFonts w:hint="eastAsia"/>
+            <w:lang w:eastAsia="zh-CN"/>
           </w:rPr>
           <w:id w:val="-471976989"/>
           <w14:checkbox>
@@ -222,6 +253,7 @@
           <w:r>
             <w:rPr>
               <w:rFonts w:ascii="MS Gothic" w:eastAsia="MS Gothic" w:hAnsi="MS Gothic" w:hint="eastAsia"/>
+              <w:lang w:eastAsia="zh-CN"/>
             </w:rPr>
             <w:t>☒</w:t>
           </w:r>
@@ -230,30 +262,35 @@
       <w:r>
         <w:rPr>
           <w:rFonts w:hint="eastAsia"/>
+          <w:lang w:eastAsia="zh-CN"/>
         </w:rPr>
         <w:t xml:space="preserve"> </w:t>
       </w:r>
       <w:r>
         <w:rPr>
           <w:rFonts w:hint="eastAsia"/>
+          <w:lang w:eastAsia="zh-CN"/>
         </w:rPr>
         <w:t>封面樣式</w:t>
       </w:r>
       <w:r>
         <w:rPr>
           <w:rFonts w:hint="eastAsia"/>
+          <w:lang w:eastAsia="zh-CN"/>
         </w:rPr>
         <w:t>(</w:t>
       </w:r>
       <w:r>
         <w:rPr>
           <w:rFonts w:hint="eastAsia"/>
+          <w:lang w:eastAsia="zh-CN"/>
         </w:rPr>
         <w:t>可不修改</w:t>
       </w:r>
       <w:r>
         <w:rPr>
           <w:rFonts w:hint="eastAsia"/>
+          <w:lang w:eastAsia="zh-CN"/>
         </w:rPr>
         <w:t>)</w:t>
       </w:r>

</xml_diff>

<commit_message>
feat(location): implement dynamic distance calculation based on user's real-time geolocation v0.4.48
</commit_message>
<xml_diff>
--- a/TO DO.docx
+++ b/TO DO.docx
@@ -45,7 +45,7 @@
           </w:rPr>
           <w:id w:val="-1346937487"/>
           <w14:checkbox>
-            <w14:checked w14:val="0"/>
+            <w14:checked w14:val="1"/>
             <w14:checkedState w14:val="2612" w14:font="MS Gothic"/>
             <w14:uncheckedState w14:val="2610" w14:font="MS Gothic"/>
           </w14:checkbox>
@@ -55,7 +55,7 @@
             <w:rPr>
               <w:rFonts w:ascii="MS Gothic" w:eastAsia="MS Gothic" w:hAnsi="MS Gothic" w:hint="eastAsia"/>
             </w:rPr>
-            <w:t>☐</w:t>
+            <w:t>☒</w:t>
           </w:r>
         </w:sdtContent>
       </w:sdt>
@@ -112,49 +112,9 @@
     <w:p>
       <w:pPr>
         <w:rPr>
-          <w:rFonts w:eastAsia="DengXian"/>
-          <w:lang w:eastAsia="zh-CN"/>
-        </w:rPr>
-      </w:pPr>
-      <w:sdt>
-        <w:sdtPr>
-          <w:rPr>
-            <w:rFonts w:hint="eastAsia"/>
-            <w:lang w:eastAsia="zh-CN"/>
-          </w:rPr>
-          <w:id w:val="-954710799"/>
-          <w14:checkbox>
-            <w14:checked w14:val="0"/>
-            <w14:checkedState w14:val="2612" w14:font="MS Gothic"/>
-            <w14:uncheckedState w14:val="2610" w14:font="MS Gothic"/>
-          </w14:checkbox>
-        </w:sdtPr>
-        <w:sdtContent>
-          <w:r>
-            <w:rPr>
-              <w:rFonts w:ascii="MS Gothic" w:eastAsia="MS Gothic" w:hAnsi="MS Gothic" w:hint="eastAsia"/>
-              <w:lang w:eastAsia="zh-CN"/>
-            </w:rPr>
-            <w:t>☐</w:t>
-          </w:r>
-        </w:sdtContent>
-      </w:sdt>
-      <w:r>
-        <w:rPr>
-          <w:rFonts w:hint="eastAsia"/>
-          <w:lang w:eastAsia="zh-CN"/>
-        </w:rPr>
-        <w:t xml:space="preserve"> </w:t>
-      </w:r>
-      <w:r>
-        <w:rPr>
-          <w:rFonts w:hint="eastAsia"/>
-          <w:lang w:eastAsia="zh-CN"/>
-        </w:rPr>
-        <w:t>營業狀態</w:t>
-      </w:r>
-    </w:p>
-    <w:p>
+          <w:lang w:eastAsia="zh-CN"/>
+        </w:rPr>
+      </w:pPr>
       <w:sdt>
         <w:sdtPr>
           <w:rPr>
@@ -189,14 +149,13 @@
     <w:p>
       <w:pPr>
         <w:rPr>
-          <w:rFonts w:asciiTheme="minorEastAsia" w:hAnsiTheme="minorEastAsia" w:hint="eastAsia"/>
+          <w:rFonts w:asciiTheme="minorEastAsia" w:hAnsiTheme="minorEastAsia"/>
         </w:rPr>
       </w:pPr>
       <w:sdt>
         <w:sdtPr>
           <w:rPr>
             <w:rFonts w:hint="eastAsia"/>
-            <w:lang w:eastAsia="zh-CN"/>
           </w:rPr>
           <w:id w:val="1938634204"/>
           <w14:checkbox>
@@ -209,7 +168,6 @@
           <w:r>
             <w:rPr>
               <w:rFonts w:ascii="MS Gothic" w:eastAsia="MS Gothic" w:hAnsi="MS Gothic" w:hint="eastAsia"/>
-              <w:lang w:eastAsia="zh-CN"/>
             </w:rPr>
             <w:t>☐</w:t>
           </w:r>
@@ -224,7 +182,6 @@
       <w:r>
         <w:rPr>
           <w:rFonts w:hint="eastAsia"/>
-          <w:lang w:eastAsia="zh-CN"/>
         </w:rPr>
         <w:t>團體成員</w:t>
       </w:r>
@@ -233,14 +190,12 @@
       <w:pPr>
         <w:rPr>
           <w:rFonts w:asciiTheme="minorEastAsia" w:eastAsia="DengXian" w:hAnsiTheme="minorEastAsia"/>
-          <w:lang w:eastAsia="zh-CN"/>
         </w:rPr>
       </w:pPr>
       <w:sdt>
         <w:sdtPr>
           <w:rPr>
             <w:rFonts w:hint="eastAsia"/>
-            <w:lang w:eastAsia="zh-CN"/>
           </w:rPr>
           <w:id w:val="-471976989"/>
           <w14:checkbox>
@@ -253,7 +208,6 @@
           <w:r>
             <w:rPr>
               <w:rFonts w:ascii="MS Gothic" w:eastAsia="MS Gothic" w:hAnsi="MS Gothic" w:hint="eastAsia"/>
-              <w:lang w:eastAsia="zh-CN"/>
             </w:rPr>
             <w:t>☒</w:t>
           </w:r>
@@ -262,35 +216,30 @@
       <w:r>
         <w:rPr>
           <w:rFonts w:hint="eastAsia"/>
-          <w:lang w:eastAsia="zh-CN"/>
         </w:rPr>
         <w:t xml:space="preserve"> </w:t>
       </w:r>
       <w:r>
         <w:rPr>
           <w:rFonts w:hint="eastAsia"/>
-          <w:lang w:eastAsia="zh-CN"/>
         </w:rPr>
         <w:t>封面樣式</w:t>
       </w:r>
       <w:r>
         <w:rPr>
           <w:rFonts w:hint="eastAsia"/>
-          <w:lang w:eastAsia="zh-CN"/>
         </w:rPr>
         <w:t>(</w:t>
       </w:r>
       <w:r>
         <w:rPr>
           <w:rFonts w:hint="eastAsia"/>
-          <w:lang w:eastAsia="zh-CN"/>
         </w:rPr>
         <w:t>可不修改</w:t>
       </w:r>
       <w:r>
         <w:rPr>
           <w:rFonts w:hint="eastAsia"/>
-          <w:lang w:eastAsia="zh-CN"/>
         </w:rPr>
         <w:t>)</w:t>
       </w:r>

</xml_diff>

<commit_message>
fix(ui): correct business status logic and unify badge styles v0.4.50
</commit_message>
<xml_diff>
--- a/TO DO.docx
+++ b/TO DO.docx
@@ -69,8 +69,16 @@
         <w:rPr>
           <w:rFonts w:hint="eastAsia"/>
         </w:rPr>
-        <w:t>地圖頁店家營業狀態標註</w:t>
-      </w:r>
+        <w:t>地圖頁店家營業狀態標</w:t>
+      </w:r>
+      <w:proofErr w:type="gramStart"/>
+      <w:r>
+        <w:rPr>
+          <w:rFonts w:hint="eastAsia"/>
+        </w:rPr>
+        <w:t>註</w:t>
+      </w:r>
+      <w:proofErr w:type="gramEnd"/>
     </w:p>
     <w:p>
       <w:pPr>
@@ -106,7 +114,23 @@
           <w:rFonts w:eastAsia="DengXian" w:hint="eastAsia"/>
           <w:lang w:eastAsia="zh-CN"/>
         </w:rPr>
-        <w:t xml:space="preserve"> 店家详情页交通时间数据动态调整</w:t>
+        <w:t xml:space="preserve"> 店家详情</w:t>
+      </w:r>
+      <w:proofErr w:type="gramStart"/>
+      <w:r>
+        <w:rPr>
+          <w:rFonts w:eastAsia="DengXian" w:hint="eastAsia"/>
+          <w:lang w:eastAsia="zh-CN"/>
+        </w:rPr>
+        <w:t>页交通</w:t>
+      </w:r>
+      <w:proofErr w:type="gramEnd"/>
+      <w:r>
+        <w:rPr>
+          <w:rFonts w:eastAsia="DengXian" w:hint="eastAsia"/>
+          <w:lang w:eastAsia="zh-CN"/>
+        </w:rPr>
+        <w:t>时间数据动态调整</w:t>
       </w:r>
     </w:p>
     <w:p>
@@ -150,12 +174,14 @@
       <w:pPr>
         <w:rPr>
           <w:rFonts w:asciiTheme="minorEastAsia" w:hAnsiTheme="minorEastAsia"/>
+          <w:lang w:eastAsia="zh-CN"/>
         </w:rPr>
       </w:pPr>
       <w:sdt>
         <w:sdtPr>
           <w:rPr>
             <w:rFonts w:hint="eastAsia"/>
+            <w:lang w:eastAsia="zh-CN"/>
           </w:rPr>
           <w:id w:val="1938634204"/>
           <w14:checkbox>
@@ -168,6 +194,7 @@
           <w:r>
             <w:rPr>
               <w:rFonts w:ascii="MS Gothic" w:eastAsia="MS Gothic" w:hAnsi="MS Gothic" w:hint="eastAsia"/>
+              <w:lang w:eastAsia="zh-CN"/>
             </w:rPr>
             <w:t>☐</w:t>
           </w:r>
@@ -176,12 +203,14 @@
       <w:r>
         <w:rPr>
           <w:rFonts w:hint="eastAsia"/>
+          <w:lang w:eastAsia="zh-CN"/>
         </w:rPr>
         <w:t xml:space="preserve"> </w:t>
       </w:r>
       <w:r>
         <w:rPr>
           <w:rFonts w:hint="eastAsia"/>
+          <w:lang w:eastAsia="zh-CN"/>
         </w:rPr>
         <w:t>團體成員</w:t>
       </w:r>
@@ -190,12 +219,14 @@
       <w:pPr>
         <w:rPr>
           <w:rFonts w:asciiTheme="minorEastAsia" w:eastAsia="DengXian" w:hAnsiTheme="minorEastAsia"/>
+          <w:lang w:eastAsia="zh-CN"/>
         </w:rPr>
       </w:pPr>
       <w:sdt>
         <w:sdtPr>
           <w:rPr>
             <w:rFonts w:hint="eastAsia"/>
+            <w:lang w:eastAsia="zh-CN"/>
           </w:rPr>
           <w:id w:val="-471976989"/>
           <w14:checkbox>
@@ -208,6 +239,7 @@
           <w:r>
             <w:rPr>
               <w:rFonts w:ascii="MS Gothic" w:eastAsia="MS Gothic" w:hAnsi="MS Gothic" w:hint="eastAsia"/>
+              <w:lang w:eastAsia="zh-CN"/>
             </w:rPr>
             <w:t>☒</w:t>
           </w:r>
@@ -216,30 +248,51 @@
       <w:r>
         <w:rPr>
           <w:rFonts w:hint="eastAsia"/>
+          <w:lang w:eastAsia="zh-CN"/>
         </w:rPr>
         <w:t xml:space="preserve"> </w:t>
       </w:r>
       <w:r>
         <w:rPr>
           <w:rFonts w:hint="eastAsia"/>
-        </w:rPr>
-        <w:t>封面樣式</w:t>
-      </w:r>
-      <w:r>
-        <w:rPr>
-          <w:rFonts w:hint="eastAsia"/>
+          <w:lang w:eastAsia="zh-CN"/>
+        </w:rPr>
+        <w:t>封面</w:t>
+      </w:r>
+      <w:proofErr w:type="gramStart"/>
+      <w:r>
+        <w:rPr>
+          <w:rFonts w:hint="eastAsia"/>
+          <w:lang w:eastAsia="zh-CN"/>
+        </w:rPr>
+        <w:t>樣</w:t>
+      </w:r>
+      <w:proofErr w:type="gramEnd"/>
+      <w:r>
+        <w:rPr>
+          <w:rFonts w:hint="eastAsia"/>
+          <w:lang w:eastAsia="zh-CN"/>
+        </w:rPr>
+        <w:t>式</w:t>
+      </w:r>
+      <w:r>
+        <w:rPr>
+          <w:rFonts w:hint="eastAsia"/>
+          <w:lang w:eastAsia="zh-CN"/>
         </w:rPr>
         <w:t>(</w:t>
       </w:r>
       <w:r>
         <w:rPr>
           <w:rFonts w:hint="eastAsia"/>
+          <w:lang w:eastAsia="zh-CN"/>
         </w:rPr>
         <w:t>可不修改</w:t>
       </w:r>
       <w:r>
         <w:rPr>
           <w:rFonts w:hint="eastAsia"/>
+          <w:lang w:eastAsia="zh-CN"/>
         </w:rPr>
         <w:t>)</w:t>
       </w:r>
@@ -278,7 +331,23 @@
           <w:rFonts w:eastAsia="DengXian" w:hint="eastAsia"/>
           <w:lang w:eastAsia="zh-CN"/>
         </w:rPr>
-        <w:t xml:space="preserve"> 营业中筛选纽实装</w:t>
+        <w:t xml:space="preserve"> 营业中筛选</w:t>
+      </w:r>
+      <w:proofErr w:type="gramStart"/>
+      <w:r>
+        <w:rPr>
+          <w:rFonts w:eastAsia="DengXian" w:hint="eastAsia"/>
+          <w:lang w:eastAsia="zh-CN"/>
+        </w:rPr>
+        <w:t>纽</w:t>
+      </w:r>
+      <w:proofErr w:type="gramEnd"/>
+      <w:r>
+        <w:rPr>
+          <w:rFonts w:eastAsia="DengXian" w:hint="eastAsia"/>
+          <w:lang w:eastAsia="zh-CN"/>
+        </w:rPr>
+        <w:t>实装</w:t>
       </w:r>
     </w:p>
     <w:p>
@@ -524,7 +593,23 @@
           <w:rFonts w:eastAsia="DengXian" w:hint="eastAsia"/>
           <w:lang w:eastAsia="zh-CN"/>
         </w:rPr>
-        <w:t xml:space="preserve"> 店家页特色餐点放大检视，文字描述</w:t>
+        <w:t xml:space="preserve"> 店家</w:t>
+      </w:r>
+      <w:proofErr w:type="gramStart"/>
+      <w:r>
+        <w:rPr>
+          <w:rFonts w:eastAsia="DengXian" w:hint="eastAsia"/>
+          <w:lang w:eastAsia="zh-CN"/>
+        </w:rPr>
+        <w:t>页特色餐点</w:t>
+      </w:r>
+      <w:proofErr w:type="gramEnd"/>
+      <w:r>
+        <w:rPr>
+          <w:rFonts w:eastAsia="DengXian" w:hint="eastAsia"/>
+          <w:lang w:eastAsia="zh-CN"/>
+        </w:rPr>
+        <w:t>放大检视，文字描述</w:t>
       </w:r>
       <w:r>
         <w:rPr>
@@ -576,7 +661,23 @@
           <w:rFonts w:eastAsia="DengXian" w:hint="eastAsia"/>
           <w:lang w:eastAsia="zh-CN"/>
         </w:rPr>
-        <w:t>菜单灯箱置顶纽不该出现</w:t>
+        <w:t>菜单灯箱置顶</w:t>
+      </w:r>
+      <w:proofErr w:type="gramStart"/>
+      <w:r>
+        <w:rPr>
+          <w:rFonts w:eastAsia="DengXian" w:hint="eastAsia"/>
+          <w:lang w:eastAsia="zh-CN"/>
+        </w:rPr>
+        <w:t>纽</w:t>
+      </w:r>
+      <w:proofErr w:type="gramEnd"/>
+      <w:r>
+        <w:rPr>
+          <w:rFonts w:eastAsia="DengXian" w:hint="eastAsia"/>
+          <w:lang w:eastAsia="zh-CN"/>
+        </w:rPr>
+        <w:t>不该出现</w:t>
       </w:r>
     </w:p>
     <w:p>
@@ -614,7 +715,23 @@
           <w:rFonts w:eastAsia="DengXian" w:hint="eastAsia"/>
           <w:lang w:eastAsia="zh-CN"/>
         </w:rPr>
-        <w:t xml:space="preserve"> 店家详情页特色餐点hover效果去除</w:t>
+        <w:t xml:space="preserve"> 店家详情</w:t>
+      </w:r>
+      <w:proofErr w:type="gramStart"/>
+      <w:r>
+        <w:rPr>
+          <w:rFonts w:eastAsia="DengXian" w:hint="eastAsia"/>
+          <w:lang w:eastAsia="zh-CN"/>
+        </w:rPr>
+        <w:t>页特色餐点</w:t>
+      </w:r>
+      <w:proofErr w:type="gramEnd"/>
+      <w:r>
+        <w:rPr>
+          <w:rFonts w:eastAsia="DengXian" w:hint="eastAsia"/>
+          <w:lang w:eastAsia="zh-CN"/>
+        </w:rPr>
+        <w:t>hover效果去除</w:t>
       </w:r>
     </w:p>
     <w:p>
@@ -686,7 +803,21 @@
         <w:rPr>
           <w:rFonts w:hint="eastAsia"/>
         </w:rPr>
-        <w:t>公休圖標換成純文字</w:t>
+        <w:t>公休</w:t>
+      </w:r>
+      <w:proofErr w:type="gramStart"/>
+      <w:r>
+        <w:rPr>
+          <w:rFonts w:hint="eastAsia"/>
+        </w:rPr>
+        <w:t>圖標換成</w:t>
+      </w:r>
+      <w:proofErr w:type="gramEnd"/>
+      <w:r>
+        <w:rPr>
+          <w:rFonts w:hint="eastAsia"/>
+        </w:rPr>
+        <w:t>純文字</w:t>
       </w:r>
     </w:p>
     <w:p>
@@ -776,12 +907,14 @@
         </w:rPr>
         <w:t>文本及圖片替換成</w:t>
       </w:r>
+      <w:proofErr w:type="spellStart"/>
       <w:r>
         <w:rPr>
           <w:rFonts w:hint="eastAsia"/>
         </w:rPr>
         <w:t>figma</w:t>
       </w:r>
+      <w:proofErr w:type="spellEnd"/>
       <w:r>
         <w:rPr>
           <w:rFonts w:hint="eastAsia"/>
@@ -943,12 +1076,14 @@
         </w:rPr>
         <w:t>)</w:t>
       </w:r>
+      <w:proofErr w:type="gramStart"/>
       <w:r>
         <w:rPr>
           <w:rFonts w:eastAsia="DengXian" w:hint="eastAsia"/>
         </w:rPr>
         <w:t>——</w:t>
       </w:r>
+      <w:proofErr w:type="gramEnd"/>
     </w:p>
     <w:p>
       <w:pPr>
@@ -970,7 +1105,23 @@
           <w:rFonts w:eastAsia="DengXian" w:hint="eastAsia"/>
           <w:lang w:eastAsia="zh-CN"/>
         </w:rPr>
-        <w:t>1.原生select中的option无法使用img。</w:t>
+        <w:t>1.原生select中的option无法使用</w:t>
+      </w:r>
+      <w:proofErr w:type="spellStart"/>
+      <w:r>
+        <w:rPr>
+          <w:rFonts w:eastAsia="DengXian" w:hint="eastAsia"/>
+          <w:lang w:eastAsia="zh-CN"/>
+        </w:rPr>
+        <w:t>img</w:t>
+      </w:r>
+      <w:proofErr w:type="spellEnd"/>
+      <w:r>
+        <w:rPr>
+          <w:rFonts w:eastAsia="DengXian" w:hint="eastAsia"/>
+          <w:lang w:eastAsia="zh-CN"/>
+        </w:rPr>
+        <w:t>。</w:t>
       </w:r>
     </w:p>
     <w:p>
@@ -1009,7 +1160,23 @@
           <w:rFonts w:eastAsia="DengXian"/>
           <w:lang w:eastAsia="zh-CN"/>
         </w:rPr>
-        <w:t>簡化成「1 鍵」的平面化標籤</w:t>
+        <w:t>簡化成「1 鍵」的平面化</w:t>
+      </w:r>
+      <w:proofErr w:type="gramStart"/>
+      <w:r>
+        <w:rPr>
+          <w:rFonts w:eastAsia="DengXian"/>
+          <w:lang w:eastAsia="zh-CN"/>
+        </w:rPr>
+        <w:t>標</w:t>
+      </w:r>
+      <w:proofErr w:type="gramEnd"/>
+      <w:r>
+        <w:rPr>
+          <w:rFonts w:eastAsia="DengXian"/>
+          <w:lang w:eastAsia="zh-CN"/>
+        </w:rPr>
+        <w:t>籤</w:t>
       </w:r>
       <w:r>
         <w:rPr>
@@ -1023,7 +1190,23 @@
           <w:rFonts w:eastAsia="DengXian"/>
           <w:lang w:eastAsia="zh-CN"/>
         </w:rPr>
-        <w:t>橫向膠囊標籤（Pill/Chip Buttons）</w:t>
+        <w:t>橫向膠囊</w:t>
+      </w:r>
+      <w:proofErr w:type="gramStart"/>
+      <w:r>
+        <w:rPr>
+          <w:rFonts w:eastAsia="DengXian"/>
+          <w:lang w:eastAsia="zh-CN"/>
+        </w:rPr>
+        <w:t>標</w:t>
+      </w:r>
+      <w:proofErr w:type="gramEnd"/>
+      <w:r>
+        <w:rPr>
+          <w:rFonts w:eastAsia="DengXian"/>
+          <w:lang w:eastAsia="zh-CN"/>
+        </w:rPr>
+        <w:t>籤（Pill/Chip Buttons）</w:t>
       </w:r>
     </w:p>
     <w:p>
@@ -1059,8 +1242,13 @@
         </w:rPr>
         <w:t xml:space="preserve"> </w:t>
       </w:r>
-      <w:r>
-        <w:t>線上菜單放大燈箱</w:t>
+      <w:proofErr w:type="gramStart"/>
+      <w:r>
+        <w:t>線上菜單</w:t>
+      </w:r>
+      <w:proofErr w:type="gramEnd"/>
+      <w:r>
+        <w:t>放大燈箱</w:t>
       </w:r>
       <w:r>
         <w:rPr>
@@ -1116,7 +1304,35 @@
         <w:rPr>
           <w:lang w:eastAsia="zh-CN"/>
         </w:rPr>
-        <w:t>線上菜單放大燈箱</w:t>
+        <w:t>線上菜</w:t>
+      </w:r>
+      <w:proofErr w:type="gramStart"/>
+      <w:r>
+        <w:rPr>
+          <w:lang w:eastAsia="zh-CN"/>
+        </w:rPr>
+        <w:t>單</w:t>
+      </w:r>
+      <w:proofErr w:type="gramEnd"/>
+      <w:r>
+        <w:rPr>
+          <w:lang w:eastAsia="zh-CN"/>
+        </w:rPr>
+        <w:t>放大</w:t>
+      </w:r>
+      <w:proofErr w:type="gramStart"/>
+      <w:r>
+        <w:rPr>
+          <w:lang w:eastAsia="zh-CN"/>
+        </w:rPr>
+        <w:t>燈</w:t>
+      </w:r>
+      <w:proofErr w:type="gramEnd"/>
+      <w:r>
+        <w:rPr>
+          <w:lang w:eastAsia="zh-CN"/>
+        </w:rPr>
+        <w:t>箱</w:t>
       </w:r>
       <w:r>
         <w:rPr>
@@ -1196,8 +1412,16 @@
         <w:rPr>
           <w:rFonts w:hint="eastAsia"/>
         </w:rPr>
-        <w:t xml:space="preserve"> shopDetail</w:t>
-      </w:r>
+        <w:t xml:space="preserve"> </w:t>
+      </w:r>
+      <w:proofErr w:type="spellStart"/>
+      <w:r>
+        <w:rPr>
+          <w:rFonts w:hint="eastAsia"/>
+        </w:rPr>
+        <w:t>shopDetail</w:t>
+      </w:r>
+      <w:proofErr w:type="spellEnd"/>
       <w:r>
         <w:rPr>
           <w:rFonts w:hint="eastAsia"/>
@@ -1413,7 +1637,23 @@
           <w:rFonts w:eastAsia="DengXian" w:hint="eastAsia"/>
           <w:lang w:eastAsia="zh-CN"/>
         </w:rPr>
-        <w:t xml:space="preserve"> 店家页根据当前星期调整营业时间</w:t>
+        <w:t xml:space="preserve"> 店家</w:t>
+      </w:r>
+      <w:proofErr w:type="gramStart"/>
+      <w:r>
+        <w:rPr>
+          <w:rFonts w:eastAsia="DengXian" w:hint="eastAsia"/>
+          <w:lang w:eastAsia="zh-CN"/>
+        </w:rPr>
+        <w:t>页根据</w:t>
+      </w:r>
+      <w:proofErr w:type="gramEnd"/>
+      <w:r>
+        <w:rPr>
+          <w:rFonts w:eastAsia="DengXian" w:hint="eastAsia"/>
+          <w:lang w:eastAsia="zh-CN"/>
+        </w:rPr>
+        <w:t>当前星期调整营业时间</w:t>
       </w:r>
     </w:p>
     <w:p>
@@ -1489,7 +1729,23 @@
           <w:rFonts w:eastAsia="DengXian" w:hint="eastAsia"/>
           <w:lang w:eastAsia="zh-CN"/>
         </w:rPr>
-        <w:t xml:space="preserve"> 地图页图标选取后，手机端保持配角呈现选取店家</w:t>
+        <w:t xml:space="preserve"> 地图页图标选取后，手机</w:t>
+      </w:r>
+      <w:proofErr w:type="gramStart"/>
+      <w:r>
+        <w:rPr>
+          <w:rFonts w:eastAsia="DengXian" w:hint="eastAsia"/>
+          <w:lang w:eastAsia="zh-CN"/>
+        </w:rPr>
+        <w:t>端保持</w:t>
+      </w:r>
+      <w:proofErr w:type="gramEnd"/>
+      <w:r>
+        <w:rPr>
+          <w:rFonts w:eastAsia="DengXian" w:hint="eastAsia"/>
+          <w:lang w:eastAsia="zh-CN"/>
+        </w:rPr>
+        <w:t>配角呈现选取店家</w:t>
       </w:r>
     </w:p>
     <w:p>
@@ -1725,14 +1981,24 @@
         <w:rPr>
           <w:rFonts w:hint="eastAsia"/>
         </w:rPr>
-        <w:t>、跳轉</w:t>
-      </w:r>
+        <w:t>、</w:t>
+      </w:r>
+      <w:proofErr w:type="gramStart"/>
+      <w:r>
+        <w:rPr>
+          <w:rFonts w:hint="eastAsia"/>
+        </w:rPr>
+        <w:t>跳轉</w:t>
+      </w:r>
+      <w:proofErr w:type="spellStart"/>
+      <w:proofErr w:type="gramEnd"/>
       <w:r>
         <w:rPr>
           <w:rFonts w:hint="eastAsia"/>
         </w:rPr>
         <w:t>shopDetail</w:t>
       </w:r>
+      <w:proofErr w:type="spellEnd"/>
       <w:r>
         <w:rPr>
           <w:rFonts w:hint="eastAsia"/>
@@ -1786,8 +2052,16 @@
         <w:rPr>
           <w:rFonts w:hint="eastAsia"/>
         </w:rPr>
-        <w:t>店家詳情頁跳轉</w:t>
-      </w:r>
+        <w:t>店家詳情</w:t>
+      </w:r>
+      <w:proofErr w:type="gramStart"/>
+      <w:r>
+        <w:rPr>
+          <w:rFonts w:hint="eastAsia"/>
+        </w:rPr>
+        <w:t>頁跳轉</w:t>
+      </w:r>
+      <w:proofErr w:type="gramEnd"/>
       <w:r>
         <w:rPr>
           <w:rFonts w:eastAsia="DengXian" w:hint="eastAsia"/>
@@ -1986,8 +2260,16 @@
         <w:rPr>
           <w:rFonts w:hint="eastAsia"/>
         </w:rPr>
-        <w:t xml:space="preserve"> shopDetail</w:t>
-      </w:r>
+        <w:t xml:space="preserve"> </w:t>
+      </w:r>
+      <w:proofErr w:type="spellStart"/>
+      <w:r>
+        <w:rPr>
+          <w:rFonts w:hint="eastAsia"/>
+        </w:rPr>
+        <w:t>shopDetail</w:t>
+      </w:r>
+      <w:proofErr w:type="spellEnd"/>
       <w:r>
         <w:rPr>
           <w:rFonts w:hint="eastAsia"/>
@@ -2023,18 +2305,22 @@
         </w:rPr>
         <w:t xml:space="preserve"> </w:t>
       </w:r>
+      <w:proofErr w:type="gramStart"/>
       <w:r>
         <w:rPr>
           <w:rFonts w:hint="eastAsia"/>
         </w:rPr>
         <w:t>跳轉</w:t>
       </w:r>
+      <w:proofErr w:type="spellStart"/>
+      <w:proofErr w:type="gramEnd"/>
       <w:r>
         <w:rPr>
           <w:rFonts w:hint="eastAsia"/>
         </w:rPr>
         <w:t>shopDetail</w:t>
       </w:r>
+      <w:proofErr w:type="spellEnd"/>
       <w:r>
         <w:rPr>
           <w:rFonts w:hint="eastAsia"/>
@@ -2579,7 +2865,35 @@
         <w:rPr>
           <w:rFonts w:hint="eastAsia"/>
         </w:rPr>
-        <w:t>不要五角圖，放食材、食材圖片和食材功用</w:t>
+        <w:t>不要五角圖，</w:t>
+      </w:r>
+      <w:proofErr w:type="gramStart"/>
+      <w:r>
+        <w:rPr>
+          <w:rFonts w:hint="eastAsia"/>
+        </w:rPr>
+        <w:t>放食材</w:t>
+      </w:r>
+      <w:proofErr w:type="gramEnd"/>
+      <w:r>
+        <w:rPr>
+          <w:rFonts w:hint="eastAsia"/>
+        </w:rPr>
+        <w:t>、食材圖片和</w:t>
+      </w:r>
+      <w:proofErr w:type="gramStart"/>
+      <w:r>
+        <w:rPr>
+          <w:rFonts w:hint="eastAsia"/>
+        </w:rPr>
+        <w:t>食材</w:t>
+      </w:r>
+      <w:proofErr w:type="gramEnd"/>
+      <w:r>
+        <w:rPr>
+          <w:rFonts w:hint="eastAsia"/>
+        </w:rPr>
+        <w:t>功用</w:t>
       </w:r>
       <w:r>
         <w:rPr>
@@ -2729,12 +3043,14 @@
         </w:rPr>
         <w:t>8.</w:t>
       </w:r>
+      <w:proofErr w:type="gramStart"/>
       <w:r>
         <w:rPr>
           <w:rFonts w:hint="eastAsia"/>
         </w:rPr>
         <w:t>跳轉邏輯</w:t>
       </w:r>
+      <w:proofErr w:type="gramEnd"/>
     </w:p>
     <w:p>
       <w:r>
@@ -2996,6 +3312,12 @@
     </w:p>
     <w:p/>
     <w:p>
+      <w:pPr>
+        <w:rPr>
+          <w:rFonts w:eastAsia="DengXian"/>
+          <w:lang w:eastAsia="zh-CN"/>
+        </w:rPr>
+      </w:pPr>
       <w:r>
         <w:rPr>
           <w:noProof/>
@@ -3157,6 +3479,1903 @@
           </wp:inline>
         </w:drawing>
       </w:r>
+    </w:p>
+    <w:p>
+      <w:pPr>
+        <w:rPr>
+          <w:rFonts w:eastAsia="DengXian"/>
+          <w:lang w:eastAsia="zh-CN"/>
+        </w:rPr>
+      </w:pPr>
+    </w:p>
+    <w:p>
+      <w:pPr>
+        <w:rPr>
+          <w:rFonts w:eastAsia="DengXian"/>
+          <w:lang w:eastAsia="zh-CN"/>
+        </w:rPr>
+      </w:pPr>
+      <w:r>
+        <w:rPr>
+          <w:rFonts w:eastAsia="DengXian" w:hint="eastAsia"/>
+          <w:lang w:eastAsia="zh-CN"/>
+        </w:rPr>
+        <w:t>问题一开始没有什么想法</w:t>
+      </w:r>
+    </w:p>
+    <w:p>
+      <w:pPr>
+        <w:rPr>
+          <w:rFonts w:eastAsia="DengXian" w:hint="eastAsia"/>
+          <w:lang w:eastAsia="zh-CN"/>
+        </w:rPr>
+      </w:pPr>
+      <w:r>
+        <w:rPr>
+          <w:rFonts w:eastAsia="DengXian" w:hint="eastAsia"/>
+          <w:lang w:eastAsia="zh-CN"/>
+        </w:rPr>
+        <w:t>解决方法：参考了许多店家的网页，如：</w:t>
+      </w:r>
+    </w:p>
+    <w:p>
+      <w:pPr>
+        <w:rPr>
+          <w:rFonts w:eastAsia="DengXian" w:hint="eastAsia"/>
+          <w:lang w:eastAsia="zh-CN"/>
+        </w:rPr>
+      </w:pPr>
+    </w:p>
+    <w:p>
+      <w:pPr>
+        <w:rPr>
+          <w:rFonts w:eastAsia="DengXian"/>
+          <w:lang w:eastAsia="zh-CN"/>
+        </w:rPr>
+      </w:pPr>
+      <w:r>
+        <w:rPr>
+          <w:lang w:eastAsia="zh-CN"/>
+        </w:rPr>
+        <w:t>F</w:t>
+      </w:r>
+      <w:r>
+        <w:rPr>
+          <w:rFonts w:hint="eastAsia"/>
+          <w:lang w:eastAsia="zh-CN"/>
+        </w:rPr>
+        <w:t xml:space="preserve">igma </w:t>
+      </w:r>
+      <w:r>
+        <w:rPr>
+          <w:rFonts w:eastAsia="DengXian" w:hint="eastAsia"/>
+          <w:lang w:eastAsia="zh-CN"/>
+        </w:rPr>
+        <w:t>连接prototype的时候同一张frame要同时连接在同一个frame上时，彼此</w:t>
+      </w:r>
+      <w:proofErr w:type="gramStart"/>
+      <w:r>
+        <w:rPr>
+          <w:rFonts w:eastAsia="DengXian" w:hint="eastAsia"/>
+          <w:lang w:eastAsia="zh-CN"/>
+        </w:rPr>
+        <w:t>会冲突</w:t>
+      </w:r>
+      <w:proofErr w:type="gramEnd"/>
+      <w:r>
+        <w:rPr>
+          <w:rFonts w:eastAsia="DengXian" w:hint="eastAsia"/>
+          <w:lang w:eastAsia="zh-CN"/>
+        </w:rPr>
+        <w:t>无法和想象中的一样跳转</w:t>
+      </w:r>
+    </w:p>
+    <w:p>
+      <w:pPr>
+        <w:rPr>
+          <w:rFonts w:eastAsia="DengXian"/>
+          <w:lang w:eastAsia="zh-CN"/>
+        </w:rPr>
+      </w:pPr>
+      <w:r>
+        <w:rPr>
+          <w:rFonts w:eastAsia="DengXian" w:hint="eastAsia"/>
+          <w:lang w:eastAsia="zh-CN"/>
+        </w:rPr>
+        <w:t>解决办法：直接用程式去完成跳转，不用</w:t>
+      </w:r>
+    </w:p>
+    <w:p>
+      <w:pPr>
+        <w:rPr>
+          <w:rFonts w:eastAsia="DengXian"/>
+          <w:lang w:eastAsia="zh-CN"/>
+        </w:rPr>
+      </w:pPr>
+    </w:p>
+    <w:p>
+      <w:pPr>
+        <w:rPr>
+          <w:rFonts w:eastAsia="DengXian"/>
+          <w:lang w:eastAsia="zh-CN"/>
+        </w:rPr>
+      </w:pPr>
+      <w:r>
+        <w:rPr>
+          <w:rFonts w:eastAsia="DengXian" w:hint="eastAsia"/>
+          <w:lang w:eastAsia="zh-CN"/>
+        </w:rPr>
+        <w:t>素食百科</w:t>
+      </w:r>
+    </w:p>
+    <w:p>
+      <w:pPr>
+        <w:rPr>
+          <w:rFonts w:eastAsia="DengXian" w:hint="eastAsia"/>
+          <w:lang w:eastAsia="zh-CN"/>
+        </w:rPr>
+      </w:pPr>
+    </w:p>
+    <w:p>
+      <w:pPr>
+        <w:rPr>
+          <w:rFonts w:eastAsia="DengXian"/>
+          <w:lang w:eastAsia="zh-CN"/>
+        </w:rPr>
+      </w:pPr>
+      <w:r>
+        <w:rPr>
+          <w:rFonts w:eastAsia="DengXian" w:hint="eastAsia"/>
+          <w:lang w:eastAsia="zh-CN"/>
+        </w:rPr>
+        <w:t>美</w:t>
+      </w:r>
+      <w:r>
+        <w:rPr>
+          <w:rFonts w:eastAsia="DengXian" w:hint="eastAsia"/>
+          <w:lang w:eastAsia="zh-CN"/>
+        </w:rPr>
+        <w:t>感</w:t>
+      </w:r>
+      <w:r>
+        <w:rPr>
+          <w:rFonts w:eastAsia="DengXian" w:hint="eastAsia"/>
+          <w:lang w:eastAsia="zh-CN"/>
+        </w:rPr>
+        <w:t>不足</w:t>
+      </w:r>
+      <w:r>
+        <w:rPr>
+          <w:rFonts w:eastAsia="DengXian" w:hint="eastAsia"/>
+          <w:lang w:eastAsia="zh-CN"/>
+        </w:rPr>
+        <w:t>无法调整出心目中的长相</w:t>
+      </w:r>
+    </w:p>
+    <w:p>
+      <w:pPr>
+        <w:rPr>
+          <w:rFonts w:eastAsia="DengXian" w:hint="eastAsia"/>
+          <w:lang w:eastAsia="zh-CN"/>
+        </w:rPr>
+      </w:pPr>
+    </w:p>
+    <w:p>
+      <w:pPr>
+        <w:rPr>
+          <w:rFonts w:eastAsia="DengXian"/>
+          <w:lang w:eastAsia="zh-CN"/>
+        </w:rPr>
+      </w:pPr>
+    </w:p>
+    <w:p>
+      <w:pPr>
+        <w:rPr>
+          <w:rFonts w:eastAsia="DengXian"/>
+          <w:lang w:eastAsia="zh-CN"/>
+        </w:rPr>
+      </w:pPr>
+    </w:p>
+    <w:p>
+      <w:pPr>
+        <w:rPr>
+          <w:rFonts w:eastAsia="DengXian"/>
+          <w:lang w:eastAsia="zh-CN"/>
+        </w:rPr>
+      </w:pPr>
+      <w:r>
+        <w:rPr>
+          <w:rFonts w:eastAsia="DengXian"/>
+          <w:lang w:eastAsia="zh-CN"/>
+        </w:rPr>
+        <w:t>遭遇問題與解決方式</w:t>
+      </w:r>
+    </w:p>
+    <w:p>
+      <w:pPr>
+        <w:pStyle w:val="1"/>
+        <w:rPr>
+          <w:rFonts w:ascii="標楷體" w:eastAsia="標楷體" w:hAnsi="標楷體"/>
+        </w:rPr>
+      </w:pPr>
+      <w:bookmarkStart w:id="0" w:name="_Toc231170777"/>
+      <w:r>
+        <w:rPr>
+          <w:rFonts w:ascii="標楷體" w:eastAsia="標楷體" w:hAnsi="標楷體"/>
+        </w:rPr>
+        <w:t>問題與解決方式</w:t>
+      </w:r>
+      <w:bookmarkEnd w:id="0"/>
+    </w:p>
+    <w:p>
+      <w:pPr>
+        <w:rPr>
+          <w:rFonts w:ascii="標楷體" w:eastAsia="標楷體" w:hAnsi="標楷體"/>
+          <w:b/>
+          <w:bCs/>
+        </w:rPr>
+      </w:pPr>
+      <w:r>
+        <w:rPr>
+          <w:rFonts w:ascii="Segoe UI Emoji" w:eastAsia="標楷體" w:hAnsi="Segoe UI Emoji" w:cs="Segoe UI Emoji"/>
+          <w:b/>
+          <w:bCs/>
+        </w:rPr>
+        <w:t>🎨</w:t>
+      </w:r>
+      <w:r>
+        <w:rPr>
+          <w:rFonts w:ascii="標楷體" w:eastAsia="標楷體" w:hAnsi="標楷體"/>
+          <w:b/>
+          <w:bCs/>
+        </w:rPr>
+        <w:t xml:space="preserve"> 1. 視覺設計與版面佈局 (UI &amp; Layout)</w:t>
+      </w:r>
+    </w:p>
+    <w:p>
+      <w:pPr>
+        <w:rPr>
+          <w:rFonts w:ascii="標楷體" w:eastAsia="標楷體" w:hAnsi="標楷體"/>
+          <w:b/>
+          <w:bCs/>
+        </w:rPr>
+      </w:pPr>
+      <w:r>
+        <w:rPr>
+          <w:rFonts w:ascii="Segoe UI Emoji" w:eastAsia="標楷體" w:hAnsi="Segoe UI Emoji" w:cs="Segoe UI Emoji"/>
+          <w:b/>
+          <w:bCs/>
+        </w:rPr>
+        <w:t>💡</w:t>
+      </w:r>
+      <w:r>
+        <w:rPr>
+          <w:rFonts w:ascii="標楷體" w:eastAsia="標楷體" w:hAnsi="標楷體"/>
+          <w:b/>
+          <w:bCs/>
+        </w:rPr>
+        <w:t xml:space="preserve"> 設計圖與實際程式碼產生落差</w:t>
+      </w:r>
+    </w:p>
+    <w:p>
+      <w:pPr>
+        <w:rPr>
+          <w:rFonts w:ascii="標楷體" w:eastAsia="標楷體" w:hAnsi="標楷體"/>
+          <w:b/>
+          <w:bCs/>
+        </w:rPr>
+      </w:pPr>
+    </w:p>
+    <w:p>
+      <w:pPr>
+        <w:rPr>
+          <w:rFonts w:ascii="標楷體" w:eastAsia="標楷體" w:hAnsi="標楷體"/>
+          <w:b/>
+          <w:bCs/>
+        </w:rPr>
+      </w:pPr>
+      <w:r>
+        <w:rPr>
+          <w:rFonts w:ascii="標楷體" w:eastAsia="標楷體" w:hAnsi="標楷體" w:hint="eastAsia"/>
+          <w:b/>
+          <w:bCs/>
+        </w:rPr>
+        <w:t>問題：團隊從零開始學習使用</w:t>
+      </w:r>
+      <w:r>
+        <w:rPr>
+          <w:rFonts w:ascii="標楷體" w:eastAsia="標楷體" w:hAnsi="標楷體"/>
+          <w:b/>
+          <w:bCs/>
+        </w:rPr>
+        <w:t xml:space="preserve"> Figma 繪製介面與 Prototype 連線，後續使用 MCP 輔助轉為 </w:t>
+      </w:r>
+      <w:proofErr w:type="spellStart"/>
+      <w:r>
+        <w:rPr>
+          <w:rFonts w:ascii="標楷體" w:eastAsia="標楷體" w:hAnsi="標楷體"/>
+          <w:b/>
+          <w:bCs/>
+        </w:rPr>
+        <w:t>VSCode</w:t>
+      </w:r>
+      <w:proofErr w:type="spellEnd"/>
+      <w:r>
+        <w:rPr>
+          <w:rFonts w:ascii="標楷體" w:eastAsia="標楷體" w:hAnsi="標楷體"/>
+          <w:b/>
+          <w:bCs/>
+        </w:rPr>
+        <w:t xml:space="preserve"> 程式碼時，常因 AI 預設的佈局邏輯死板（如絕對定位），導致實際網頁長相與設計稿不符。</w:t>
+      </w:r>
+    </w:p>
+    <w:p>
+      <w:pPr>
+        <w:rPr>
+          <w:rFonts w:ascii="標楷體" w:eastAsia="標楷體" w:hAnsi="標楷體"/>
+          <w:b/>
+          <w:bCs/>
+        </w:rPr>
+      </w:pPr>
+    </w:p>
+    <w:p>
+      <w:pPr>
+        <w:rPr>
+          <w:rFonts w:ascii="標楷體" w:eastAsia="標楷體" w:hAnsi="標楷體"/>
+          <w:b/>
+          <w:bCs/>
+        </w:rPr>
+      </w:pPr>
+      <w:r>
+        <w:rPr>
+          <w:rFonts w:ascii="標楷體" w:eastAsia="標楷體" w:hAnsi="標楷體" w:hint="eastAsia"/>
+          <w:b/>
+          <w:bCs/>
+        </w:rPr>
+        <w:t>解決：改</w:t>
+      </w:r>
+      <w:proofErr w:type="gramStart"/>
+      <w:r>
+        <w:rPr>
+          <w:rFonts w:ascii="標楷體" w:eastAsia="標楷體" w:hAnsi="標楷體" w:hint="eastAsia"/>
+          <w:b/>
+          <w:bCs/>
+        </w:rPr>
+        <w:t>採</w:t>
+      </w:r>
+      <w:proofErr w:type="gramEnd"/>
+      <w:r>
+        <w:rPr>
+          <w:rFonts w:ascii="標楷體" w:eastAsia="標楷體" w:hAnsi="標楷體"/>
+          <w:b/>
+          <w:bCs/>
+        </w:rPr>
+        <w:t xml:space="preserve"> 漸進式轉換程式碼。在轉譯過程中，人工給予更詳細的實際長相與功能說明指示，並手動微調 CSS 排版，確保視覺完美還原。</w:t>
+      </w:r>
+    </w:p>
+    <w:p>
+      <w:pPr>
+        <w:rPr>
+          <w:rFonts w:ascii="標楷體" w:eastAsia="標楷體" w:hAnsi="標楷體"/>
+          <w:b/>
+          <w:bCs/>
+        </w:rPr>
+      </w:pPr>
+    </w:p>
+    <w:p>
+      <w:pPr>
+        <w:rPr>
+          <w:rFonts w:ascii="標楷體" w:eastAsia="標楷體" w:hAnsi="標楷體"/>
+          <w:b/>
+          <w:bCs/>
+        </w:rPr>
+      </w:pPr>
+      <w:r>
+        <w:rPr>
+          <w:rFonts w:ascii="Segoe UI Emoji" w:eastAsia="標楷體" w:hAnsi="Segoe UI Emoji" w:cs="Segoe UI Emoji"/>
+          <w:b/>
+          <w:bCs/>
+        </w:rPr>
+        <w:t>💡</w:t>
+      </w:r>
+      <w:r>
+        <w:rPr>
+          <w:rFonts w:ascii="標楷體" w:eastAsia="標楷體" w:hAnsi="標楷體"/>
+          <w:b/>
+          <w:bCs/>
+        </w:rPr>
+        <w:t xml:space="preserve"> 手電筒特效干擾與卡片邊界感過重</w:t>
+      </w:r>
+    </w:p>
+    <w:p>
+      <w:pPr>
+        <w:rPr>
+          <w:rFonts w:ascii="標楷體" w:eastAsia="標楷體" w:hAnsi="標楷體"/>
+          <w:b/>
+          <w:bCs/>
+        </w:rPr>
+      </w:pPr>
+    </w:p>
+    <w:p>
+      <w:pPr>
+        <w:rPr>
+          <w:rFonts w:ascii="標楷體" w:eastAsia="標楷體" w:hAnsi="標楷體"/>
+          <w:b/>
+          <w:bCs/>
+        </w:rPr>
+      </w:pPr>
+      <w:r>
+        <w:rPr>
+          <w:rFonts w:ascii="標楷體" w:eastAsia="標楷體" w:hAnsi="標楷體" w:hint="eastAsia"/>
+          <w:b/>
+          <w:bCs/>
+        </w:rPr>
+        <w:t>問題：探照燈互動範圍過廣，導致背景頻繁切換；且卡片</w:t>
+      </w:r>
+      <w:proofErr w:type="gramStart"/>
+      <w:r>
+        <w:rPr>
+          <w:rFonts w:ascii="標楷體" w:eastAsia="標楷體" w:hAnsi="標楷體" w:hint="eastAsia"/>
+          <w:b/>
+          <w:bCs/>
+        </w:rPr>
+        <w:t>區塊感太</w:t>
+      </w:r>
+      <w:proofErr w:type="gramEnd"/>
+      <w:r>
+        <w:rPr>
+          <w:rFonts w:ascii="標楷體" w:eastAsia="標楷體" w:hAnsi="標楷體" w:hint="eastAsia"/>
+          <w:b/>
+          <w:bCs/>
+        </w:rPr>
+        <w:t>重，背景切換時顯得突兀不流暢。</w:t>
+      </w:r>
+    </w:p>
+    <w:p>
+      <w:pPr>
+        <w:rPr>
+          <w:rFonts w:ascii="標楷體" w:eastAsia="標楷體" w:hAnsi="標楷體"/>
+          <w:b/>
+          <w:bCs/>
+        </w:rPr>
+      </w:pPr>
+    </w:p>
+    <w:p>
+      <w:pPr>
+        <w:rPr>
+          <w:rFonts w:ascii="標楷體" w:eastAsia="標楷體" w:hAnsi="標楷體"/>
+          <w:b/>
+          <w:bCs/>
+        </w:rPr>
+      </w:pPr>
+      <w:r>
+        <w:rPr>
+          <w:rFonts w:ascii="標楷體" w:eastAsia="標楷體" w:hAnsi="標楷體" w:hint="eastAsia"/>
+          <w:b/>
+          <w:bCs/>
+        </w:rPr>
+        <w:t>解決：將探照燈觸發範圍</w:t>
+      </w:r>
+      <w:r>
+        <w:rPr>
+          <w:rFonts w:ascii="標楷體" w:eastAsia="標楷體" w:hAnsi="標楷體"/>
+          <w:b/>
+          <w:bCs/>
+        </w:rPr>
+        <w:t xml:space="preserve"> 極限縮減至店家 Logo 上，並利用透明度漸變（Opacity Transition）</w:t>
+      </w:r>
+      <w:proofErr w:type="gramStart"/>
+      <w:r>
+        <w:rPr>
+          <w:rFonts w:ascii="標楷體" w:eastAsia="標楷體" w:hAnsi="標楷體"/>
+          <w:b/>
+          <w:bCs/>
+        </w:rPr>
+        <w:t>疊加背景</w:t>
+      </w:r>
+      <w:proofErr w:type="gramEnd"/>
+      <w:r>
+        <w:rPr>
+          <w:rFonts w:ascii="標楷體" w:eastAsia="標楷體" w:hAnsi="標楷體"/>
+          <w:b/>
+          <w:bCs/>
+        </w:rPr>
+        <w:t>圖片，消除卡片實體邊界，達成 無縫銜接 的</w:t>
+      </w:r>
+      <w:proofErr w:type="gramStart"/>
+      <w:r>
+        <w:rPr>
+          <w:rFonts w:ascii="標楷體" w:eastAsia="標楷體" w:hAnsi="標楷體"/>
+          <w:b/>
+          <w:bCs/>
+        </w:rPr>
+        <w:t>沉</w:t>
+      </w:r>
+      <w:proofErr w:type="gramEnd"/>
+      <w:r>
+        <w:rPr>
+          <w:rFonts w:ascii="標楷體" w:eastAsia="標楷體" w:hAnsi="標楷體"/>
+          <w:b/>
+          <w:bCs/>
+        </w:rPr>
+        <w:t>浸式視覺體驗。</w:t>
+      </w:r>
+    </w:p>
+    <w:p>
+      <w:pPr>
+        <w:rPr>
+          <w:rFonts w:ascii="標楷體" w:eastAsia="標楷體" w:hAnsi="標楷體"/>
+          <w:b/>
+          <w:bCs/>
+        </w:rPr>
+      </w:pPr>
+    </w:p>
+    <w:p>
+      <w:pPr>
+        <w:rPr>
+          <w:rFonts w:ascii="標楷體" w:eastAsia="標楷體" w:hAnsi="標楷體"/>
+          <w:b/>
+          <w:bCs/>
+        </w:rPr>
+      </w:pPr>
+      <w:r>
+        <w:rPr>
+          <w:rFonts w:ascii="Segoe UI Emoji" w:eastAsia="標楷體" w:hAnsi="Segoe UI Emoji" w:cs="Segoe UI Emoji"/>
+          <w:b/>
+          <w:bCs/>
+        </w:rPr>
+        <w:t>💡</w:t>
+      </w:r>
+      <w:r>
+        <w:rPr>
+          <w:rFonts w:ascii="標楷體" w:eastAsia="標楷體" w:hAnsi="標楷體"/>
+          <w:b/>
+          <w:bCs/>
+        </w:rPr>
+        <w:t xml:space="preserve"> 店家詳情頁內容長短不一導致跑版</w:t>
+      </w:r>
+    </w:p>
+    <w:p>
+      <w:pPr>
+        <w:rPr>
+          <w:rFonts w:ascii="標楷體" w:eastAsia="標楷體" w:hAnsi="標楷體"/>
+          <w:b/>
+          <w:bCs/>
+        </w:rPr>
+      </w:pPr>
+    </w:p>
+    <w:p>
+      <w:pPr>
+        <w:rPr>
+          <w:rFonts w:ascii="標楷體" w:eastAsia="標楷體" w:hAnsi="標楷體"/>
+          <w:b/>
+          <w:bCs/>
+        </w:rPr>
+      </w:pPr>
+      <w:r>
+        <w:rPr>
+          <w:rFonts w:ascii="標楷體" w:eastAsia="標楷體" w:hAnsi="標楷體" w:hint="eastAsia"/>
+          <w:b/>
+          <w:bCs/>
+        </w:rPr>
+        <w:t>問題：每家店的「特色說明」與「營業時間」字數差異極大，若直接套用版型，會造成畫面忽長忽短、排版凌亂。</w:t>
+      </w:r>
+    </w:p>
+    <w:p>
+      <w:pPr>
+        <w:rPr>
+          <w:rFonts w:ascii="標楷體" w:eastAsia="標楷體" w:hAnsi="標楷體"/>
+          <w:b/>
+          <w:bCs/>
+        </w:rPr>
+      </w:pPr>
+    </w:p>
+    <w:p>
+      <w:pPr>
+        <w:rPr>
+          <w:rFonts w:ascii="標楷體" w:eastAsia="標楷體" w:hAnsi="標楷體"/>
+          <w:b/>
+          <w:bCs/>
+        </w:rPr>
+      </w:pPr>
+      <w:r>
+        <w:rPr>
+          <w:rFonts w:ascii="標楷體" w:eastAsia="標楷體" w:hAnsi="標楷體" w:hint="eastAsia"/>
+          <w:b/>
+          <w:bCs/>
+        </w:rPr>
+        <w:t>解決：重新規劃區塊排版位置，並針對營業時間導入</w:t>
+      </w:r>
+      <w:r>
+        <w:rPr>
+          <w:rFonts w:ascii="標楷體" w:eastAsia="標楷體" w:hAnsi="標楷體"/>
+          <w:b/>
+          <w:bCs/>
+        </w:rPr>
+        <w:t xml:space="preserve"> 自適應調整（Adaptive Layout） 機制。無論資訊多寡，版面皆能自動對齊並保持整潔統一。</w:t>
+      </w:r>
+    </w:p>
+    <w:p>
+      <w:pPr>
+        <w:rPr>
+          <w:rFonts w:ascii="標楷體" w:eastAsia="標楷體" w:hAnsi="標楷體"/>
+          <w:b/>
+          <w:bCs/>
+        </w:rPr>
+      </w:pPr>
+    </w:p>
+    <w:p>
+      <w:pPr>
+        <w:rPr>
+          <w:rFonts w:ascii="標楷體" w:eastAsia="標楷體" w:hAnsi="標楷體"/>
+          <w:b/>
+          <w:bCs/>
+        </w:rPr>
+      </w:pPr>
+      <w:r>
+        <w:rPr>
+          <w:rFonts w:ascii="Segoe UI Emoji" w:eastAsia="標楷體" w:hAnsi="Segoe UI Emoji" w:cs="Segoe UI Emoji"/>
+          <w:b/>
+          <w:bCs/>
+        </w:rPr>
+        <w:t>💡</w:t>
+      </w:r>
+      <w:r>
+        <w:rPr>
+          <w:rFonts w:ascii="標楷體" w:eastAsia="標楷體" w:hAnsi="標楷體"/>
+          <w:b/>
+          <w:bCs/>
+        </w:rPr>
+        <w:t xml:space="preserve"> 頂部導航欄佔據視覺空間</w:t>
+      </w:r>
+    </w:p>
+    <w:p>
+      <w:pPr>
+        <w:rPr>
+          <w:rFonts w:ascii="標楷體" w:eastAsia="標楷體" w:hAnsi="標楷體"/>
+          <w:b/>
+          <w:bCs/>
+        </w:rPr>
+      </w:pPr>
+    </w:p>
+    <w:p>
+      <w:pPr>
+        <w:rPr>
+          <w:rFonts w:ascii="標楷體" w:eastAsia="標楷體" w:hAnsi="標楷體"/>
+          <w:b/>
+          <w:bCs/>
+        </w:rPr>
+      </w:pPr>
+      <w:r>
+        <w:rPr>
+          <w:rFonts w:ascii="標楷體" w:eastAsia="標楷體" w:hAnsi="標楷體" w:hint="eastAsia"/>
+          <w:b/>
+          <w:bCs/>
+        </w:rPr>
+        <w:t>問題：導航列需要隨時能點擊，但一直固定在最上方會遮擋畫面、浪費寶貴的版面空間。</w:t>
+      </w:r>
+    </w:p>
+    <w:p>
+      <w:pPr>
+        <w:rPr>
+          <w:rFonts w:ascii="標楷體" w:eastAsia="標楷體" w:hAnsi="標楷體"/>
+          <w:b/>
+          <w:bCs/>
+        </w:rPr>
+      </w:pPr>
+    </w:p>
+    <w:p>
+      <w:pPr>
+        <w:rPr>
+          <w:rFonts w:ascii="標楷體" w:eastAsia="標楷體" w:hAnsi="標楷體"/>
+          <w:b/>
+          <w:bCs/>
+        </w:rPr>
+      </w:pPr>
+      <w:r>
+        <w:rPr>
+          <w:rFonts w:ascii="標楷體" w:eastAsia="標楷體" w:hAnsi="標楷體" w:hint="eastAsia"/>
+          <w:b/>
+          <w:bCs/>
+        </w:rPr>
+        <w:t>解決：導入</w:t>
+      </w:r>
+      <w:r>
+        <w:rPr>
+          <w:rFonts w:ascii="標楷體" w:eastAsia="標楷體" w:hAnsi="標楷體"/>
+          <w:b/>
+          <w:bCs/>
+        </w:rPr>
+        <w:t xml:space="preserve"> 毛玻璃懸浮效果。讓導航列呈現半透明狀態，既不遮擋底層內容，又能保持操作的 順手度。</w:t>
+      </w:r>
+    </w:p>
+    <w:p>
+      <w:pPr>
+        <w:rPr>
+          <w:rFonts w:ascii="標楷體" w:eastAsia="標楷體" w:hAnsi="標楷體"/>
+          <w:b/>
+          <w:bCs/>
+        </w:rPr>
+      </w:pPr>
+    </w:p>
+    <w:p>
+      <w:pPr>
+        <w:rPr>
+          <w:rFonts w:ascii="標楷體" w:eastAsia="標楷體" w:hAnsi="標楷體"/>
+          <w:b/>
+          <w:bCs/>
+        </w:rPr>
+      </w:pPr>
+      <w:r>
+        <w:rPr>
+          <w:rFonts w:ascii="Segoe UI Emoji" w:eastAsia="標楷體" w:hAnsi="Segoe UI Emoji" w:cs="Segoe UI Emoji"/>
+          <w:b/>
+          <w:bCs/>
+        </w:rPr>
+        <w:t>🕹️</w:t>
+      </w:r>
+      <w:r>
+        <w:rPr>
+          <w:rFonts w:ascii="標楷體" w:eastAsia="標楷體" w:hAnsi="標楷體"/>
+          <w:b/>
+          <w:bCs/>
+        </w:rPr>
+        <w:t xml:space="preserve"> 2. 互動體驗</w:t>
+      </w:r>
+      <w:proofErr w:type="gramStart"/>
+      <w:r>
+        <w:rPr>
+          <w:rFonts w:ascii="標楷體" w:eastAsia="標楷體" w:hAnsi="標楷體"/>
+          <w:b/>
+          <w:bCs/>
+        </w:rPr>
+        <w:t>與防呆機制</w:t>
+      </w:r>
+      <w:proofErr w:type="gramEnd"/>
+      <w:r>
+        <w:rPr>
+          <w:rFonts w:ascii="標楷體" w:eastAsia="標楷體" w:hAnsi="標楷體"/>
+          <w:b/>
+          <w:bCs/>
+        </w:rPr>
+        <w:t xml:space="preserve"> (Interaction)</w:t>
+      </w:r>
+    </w:p>
+    <w:p>
+      <w:pPr>
+        <w:rPr>
+          <w:rFonts w:ascii="標楷體" w:eastAsia="標楷體" w:hAnsi="標楷體"/>
+          <w:b/>
+          <w:bCs/>
+        </w:rPr>
+      </w:pPr>
+      <w:r>
+        <w:rPr>
+          <w:rFonts w:ascii="Segoe UI Emoji" w:eastAsia="標楷體" w:hAnsi="Segoe UI Emoji" w:cs="Segoe UI Emoji"/>
+          <w:b/>
+          <w:bCs/>
+        </w:rPr>
+        <w:t>💡</w:t>
+      </w:r>
+      <w:r>
+        <w:rPr>
+          <w:rFonts w:ascii="標楷體" w:eastAsia="標楷體" w:hAnsi="標楷體"/>
+          <w:b/>
+          <w:bCs/>
+        </w:rPr>
+        <w:t xml:space="preserve"> 原生選單與 3D 空間遮擋衝突</w:t>
+      </w:r>
+    </w:p>
+    <w:p>
+      <w:pPr>
+        <w:rPr>
+          <w:rFonts w:ascii="標楷體" w:eastAsia="標楷體" w:hAnsi="標楷體"/>
+          <w:b/>
+          <w:bCs/>
+        </w:rPr>
+      </w:pPr>
+    </w:p>
+    <w:p>
+      <w:pPr>
+        <w:rPr>
+          <w:rFonts w:ascii="標楷體" w:eastAsia="標楷體" w:hAnsi="標楷體"/>
+          <w:b/>
+          <w:bCs/>
+        </w:rPr>
+      </w:pPr>
+      <w:r>
+        <w:rPr>
+          <w:rFonts w:ascii="標楷體" w:eastAsia="標楷體" w:hAnsi="標楷體" w:hint="eastAsia"/>
+          <w:b/>
+          <w:bCs/>
+        </w:rPr>
+        <w:t>問題：在套用篩選素材時，發現原生</w:t>
+      </w:r>
+      <w:r>
+        <w:rPr>
+          <w:rFonts w:ascii="標楷體" w:eastAsia="標楷體" w:hAnsi="標楷體"/>
+          <w:b/>
+          <w:bCs/>
+        </w:rPr>
+        <w:t xml:space="preserve"> HTML 選單不支援置入圖示；若用其他方式模擬，在 3D 旋轉舞台中選單會被底層版面「吃掉」，完全點不到。</w:t>
+      </w:r>
+    </w:p>
+    <w:p>
+      <w:pPr>
+        <w:rPr>
+          <w:rFonts w:ascii="標楷體" w:eastAsia="標楷體" w:hAnsi="標楷體"/>
+          <w:b/>
+          <w:bCs/>
+        </w:rPr>
+      </w:pPr>
+    </w:p>
+    <w:p>
+      <w:pPr>
+        <w:rPr>
+          <w:rFonts w:ascii="標楷體" w:eastAsia="標楷體" w:hAnsi="標楷體"/>
+          <w:b/>
+          <w:bCs/>
+        </w:rPr>
+      </w:pPr>
+      <w:r>
+        <w:rPr>
+          <w:rFonts w:ascii="標楷體" w:eastAsia="標楷體" w:hAnsi="標楷體" w:hint="eastAsia"/>
+          <w:b/>
+          <w:bCs/>
+        </w:rPr>
+        <w:t>解決：全面捨棄下拉選單，改用</w:t>
+      </w:r>
+      <w:r>
+        <w:rPr>
+          <w:rFonts w:ascii="標楷體" w:eastAsia="標楷體" w:hAnsi="標楷體"/>
+          <w:b/>
+          <w:bCs/>
+        </w:rPr>
+        <w:t xml:space="preserve"> 橫向平鋪膠囊按鈕（Pill Buttons）。不僅解決了圖示顯示問題，</w:t>
+      </w:r>
+      <w:proofErr w:type="gramStart"/>
+      <w:r>
+        <w:rPr>
+          <w:rFonts w:ascii="標楷體" w:eastAsia="標楷體" w:hAnsi="標楷體"/>
+          <w:b/>
+          <w:bCs/>
+        </w:rPr>
+        <w:t>一鍵式的操作</w:t>
+      </w:r>
+      <w:proofErr w:type="gramEnd"/>
+      <w:r>
+        <w:rPr>
+          <w:rFonts w:ascii="標楷體" w:eastAsia="標楷體" w:hAnsi="標楷體"/>
+          <w:b/>
+          <w:bCs/>
+        </w:rPr>
+        <w:t>也規避了 3D 空間遮擋的 Bug。</w:t>
+      </w:r>
+    </w:p>
+    <w:p>
+      <w:pPr>
+        <w:rPr>
+          <w:rFonts w:ascii="標楷體" w:eastAsia="標楷體" w:hAnsi="標楷體"/>
+          <w:b/>
+          <w:bCs/>
+        </w:rPr>
+      </w:pPr>
+    </w:p>
+    <w:p>
+      <w:pPr>
+        <w:rPr>
+          <w:rFonts w:ascii="標楷體" w:eastAsia="標楷體" w:hAnsi="標楷體"/>
+          <w:b/>
+          <w:bCs/>
+        </w:rPr>
+      </w:pPr>
+      <w:r>
+        <w:rPr>
+          <w:rFonts w:ascii="Segoe UI Emoji" w:eastAsia="標楷體" w:hAnsi="Segoe UI Emoji" w:cs="Segoe UI Emoji"/>
+          <w:b/>
+          <w:bCs/>
+        </w:rPr>
+        <w:t>💡</w:t>
+      </w:r>
+      <w:r>
+        <w:rPr>
+          <w:rFonts w:ascii="標楷體" w:eastAsia="標楷體" w:hAnsi="標楷體"/>
+          <w:b/>
+          <w:bCs/>
+        </w:rPr>
+        <w:t xml:space="preserve"> 線上菜單燈箱檢視卡手</w:t>
+      </w:r>
+    </w:p>
+    <w:p>
+      <w:pPr>
+        <w:rPr>
+          <w:rFonts w:ascii="標楷體" w:eastAsia="標楷體" w:hAnsi="標楷體"/>
+          <w:b/>
+          <w:bCs/>
+        </w:rPr>
+      </w:pPr>
+    </w:p>
+    <w:p>
+      <w:pPr>
+        <w:rPr>
+          <w:rFonts w:ascii="標楷體" w:eastAsia="標楷體" w:hAnsi="標楷體"/>
+          <w:b/>
+          <w:bCs/>
+        </w:rPr>
+      </w:pPr>
+      <w:r>
+        <w:rPr>
+          <w:rFonts w:ascii="標楷體" w:eastAsia="標楷體" w:hAnsi="標楷體" w:hint="eastAsia"/>
+          <w:b/>
+          <w:bCs/>
+        </w:rPr>
+        <w:t>問題：使用者在看放大的菜單燈箱時，原本的操作邏輯不夠直覺，拖曳與關閉不順手。</w:t>
+      </w:r>
+    </w:p>
+    <w:p>
+      <w:pPr>
+        <w:rPr>
+          <w:rFonts w:ascii="標楷體" w:eastAsia="標楷體" w:hAnsi="標楷體"/>
+          <w:b/>
+          <w:bCs/>
+        </w:rPr>
+      </w:pPr>
+    </w:p>
+    <w:p>
+      <w:pPr>
+        <w:rPr>
+          <w:rFonts w:ascii="標楷體" w:eastAsia="標楷體" w:hAnsi="標楷體"/>
+          <w:b/>
+          <w:bCs/>
+        </w:rPr>
+      </w:pPr>
+      <w:r>
+        <w:rPr>
+          <w:rFonts w:ascii="標楷體" w:eastAsia="標楷體" w:hAnsi="標楷體" w:hint="eastAsia"/>
+          <w:b/>
+          <w:bCs/>
+        </w:rPr>
+        <w:t>解決：</w:t>
+      </w:r>
+      <w:proofErr w:type="gramStart"/>
+      <w:r>
+        <w:rPr>
+          <w:rFonts w:ascii="標楷體" w:eastAsia="標楷體" w:hAnsi="標楷體" w:hint="eastAsia"/>
+          <w:b/>
+          <w:bCs/>
+        </w:rPr>
+        <w:t>重構燈箱</w:t>
+      </w:r>
+      <w:proofErr w:type="gramEnd"/>
+      <w:r>
+        <w:rPr>
+          <w:rFonts w:ascii="標楷體" w:eastAsia="標楷體" w:hAnsi="標楷體" w:hint="eastAsia"/>
+          <w:b/>
+          <w:bCs/>
+        </w:rPr>
+        <w:t>檢視邏輯，加入支援拖曳滾動的手勢判斷，統一介面互動，讓使用者在電腦上也</w:t>
+      </w:r>
+      <w:proofErr w:type="gramStart"/>
+      <w:r>
+        <w:rPr>
+          <w:rFonts w:ascii="標楷體" w:eastAsia="標楷體" w:hAnsi="標楷體" w:hint="eastAsia"/>
+          <w:b/>
+          <w:bCs/>
+        </w:rPr>
+        <w:t>能像滑手機</w:t>
+      </w:r>
+      <w:proofErr w:type="gramEnd"/>
+      <w:r>
+        <w:rPr>
+          <w:rFonts w:ascii="標楷體" w:eastAsia="標楷體" w:hAnsi="標楷體" w:hint="eastAsia"/>
+          <w:b/>
+          <w:bCs/>
+        </w:rPr>
+        <w:t>一樣</w:t>
+      </w:r>
+      <w:r>
+        <w:rPr>
+          <w:rFonts w:ascii="標楷體" w:eastAsia="標楷體" w:hAnsi="標楷體"/>
+          <w:b/>
+          <w:bCs/>
+        </w:rPr>
+        <w:t xml:space="preserve"> 操作順手。</w:t>
+      </w:r>
+    </w:p>
+    <w:p>
+      <w:pPr>
+        <w:rPr>
+          <w:rFonts w:ascii="標楷體" w:eastAsia="標楷體" w:hAnsi="標楷體"/>
+          <w:b/>
+          <w:bCs/>
+        </w:rPr>
+      </w:pPr>
+    </w:p>
+    <w:p>
+      <w:pPr>
+        <w:rPr>
+          <w:rFonts w:ascii="標楷體" w:eastAsia="標楷體" w:hAnsi="標楷體"/>
+          <w:b/>
+          <w:bCs/>
+        </w:rPr>
+      </w:pPr>
+      <w:r>
+        <w:rPr>
+          <w:rFonts w:ascii="Segoe UI Emoji" w:eastAsia="標楷體" w:hAnsi="Segoe UI Emoji" w:cs="Segoe UI Emoji"/>
+          <w:b/>
+          <w:bCs/>
+        </w:rPr>
+        <w:t>💡</w:t>
+      </w:r>
+      <w:r>
+        <w:rPr>
+          <w:rFonts w:ascii="標楷體" w:eastAsia="標楷體" w:hAnsi="標楷體"/>
+          <w:b/>
+          <w:bCs/>
+        </w:rPr>
+        <w:t xml:space="preserve"> 導航欄連續點擊導致異常</w:t>
+      </w:r>
+    </w:p>
+    <w:p>
+      <w:pPr>
+        <w:rPr>
+          <w:rFonts w:ascii="標楷體" w:eastAsia="標楷體" w:hAnsi="標楷體"/>
+          <w:b/>
+          <w:bCs/>
+        </w:rPr>
+      </w:pPr>
+    </w:p>
+    <w:p>
+      <w:pPr>
+        <w:rPr>
+          <w:rFonts w:ascii="標楷體" w:eastAsia="標楷體" w:hAnsi="標楷體"/>
+          <w:b/>
+          <w:bCs/>
+        </w:rPr>
+      </w:pPr>
+      <w:r>
+        <w:rPr>
+          <w:rFonts w:ascii="標楷體" w:eastAsia="標楷體" w:hAnsi="標楷體" w:hint="eastAsia"/>
+          <w:b/>
+          <w:bCs/>
+        </w:rPr>
+        <w:t>問題：測試時發現，若連續快速點擊導航欄按鈕，頁面動畫會互相打架並</w:t>
+      </w:r>
+      <w:proofErr w:type="gramStart"/>
+      <w:r>
+        <w:rPr>
+          <w:rFonts w:ascii="標楷體" w:eastAsia="標楷體" w:hAnsi="標楷體" w:hint="eastAsia"/>
+          <w:b/>
+          <w:bCs/>
+        </w:rPr>
+        <w:t>反覆跳轉</w:t>
+      </w:r>
+      <w:proofErr w:type="gramEnd"/>
+      <w:r>
+        <w:rPr>
+          <w:rFonts w:ascii="標楷體" w:eastAsia="標楷體" w:hAnsi="標楷體" w:hint="eastAsia"/>
+          <w:b/>
+          <w:bCs/>
+        </w:rPr>
+        <w:t>。</w:t>
+      </w:r>
+    </w:p>
+    <w:p>
+      <w:pPr>
+        <w:rPr>
+          <w:rFonts w:ascii="標楷體" w:eastAsia="標楷體" w:hAnsi="標楷體"/>
+          <w:b/>
+          <w:bCs/>
+        </w:rPr>
+      </w:pPr>
+    </w:p>
+    <w:p>
+      <w:pPr>
+        <w:rPr>
+          <w:rFonts w:ascii="標楷體" w:eastAsia="標楷體" w:hAnsi="標楷體"/>
+          <w:b/>
+          <w:bCs/>
+        </w:rPr>
+      </w:pPr>
+      <w:r>
+        <w:rPr>
+          <w:rFonts w:ascii="標楷體" w:eastAsia="標楷體" w:hAnsi="標楷體" w:hint="eastAsia"/>
+          <w:b/>
+          <w:bCs/>
+        </w:rPr>
+        <w:t>解決：加入</w:t>
+      </w:r>
+      <w:r>
+        <w:rPr>
+          <w:rFonts w:ascii="標楷體" w:eastAsia="標楷體" w:hAnsi="標楷體"/>
+          <w:b/>
+          <w:bCs/>
+        </w:rPr>
+        <w:t xml:space="preserve"> 轉場鎖定（防呆機制）。在頁面切換動畫執行</w:t>
+      </w:r>
+      <w:proofErr w:type="gramStart"/>
+      <w:r>
+        <w:rPr>
+          <w:rFonts w:ascii="標楷體" w:eastAsia="標楷體" w:hAnsi="標楷體"/>
+          <w:b/>
+          <w:bCs/>
+        </w:rPr>
+        <w:t>期間，</w:t>
+      </w:r>
+      <w:proofErr w:type="gramEnd"/>
+      <w:r>
+        <w:rPr>
+          <w:rFonts w:ascii="標楷體" w:eastAsia="標楷體" w:hAnsi="標楷體"/>
+          <w:b/>
+          <w:bCs/>
+        </w:rPr>
+        <w:t>暫時忽略後續的</w:t>
+      </w:r>
+      <w:r>
+        <w:rPr>
+          <w:rFonts w:ascii="標楷體" w:eastAsia="標楷體" w:hAnsi="標楷體"/>
+          <w:b/>
+          <w:bCs/>
+        </w:rPr>
+        <w:lastRenderedPageBreak/>
+        <w:t>點擊指令，直到動畫跑完才放行。</w:t>
+      </w:r>
+    </w:p>
+    <w:p>
+      <w:pPr>
+        <w:rPr>
+          <w:rFonts w:ascii="標楷體" w:eastAsia="標楷體" w:hAnsi="標楷體"/>
+          <w:b/>
+          <w:bCs/>
+        </w:rPr>
+      </w:pPr>
+    </w:p>
+    <w:p>
+      <w:pPr>
+        <w:rPr>
+          <w:rFonts w:ascii="標楷體" w:eastAsia="標楷體" w:hAnsi="標楷體"/>
+          <w:b/>
+          <w:bCs/>
+        </w:rPr>
+      </w:pPr>
+      <w:r>
+        <w:rPr>
+          <w:rFonts w:ascii="Segoe UI Emoji" w:eastAsia="標楷體" w:hAnsi="Segoe UI Emoji" w:cs="Segoe UI Emoji"/>
+          <w:b/>
+          <w:bCs/>
+        </w:rPr>
+        <w:t>💡</w:t>
+      </w:r>
+      <w:r>
+        <w:rPr>
+          <w:rFonts w:ascii="標楷體" w:eastAsia="標楷體" w:hAnsi="標楷體"/>
+          <w:b/>
+          <w:bCs/>
+        </w:rPr>
+        <w:t xml:space="preserve"> 實體 3D 地圖操作當機</w:t>
+      </w:r>
+    </w:p>
+    <w:p>
+      <w:pPr>
+        <w:rPr>
+          <w:rFonts w:ascii="標楷體" w:eastAsia="標楷體" w:hAnsi="標楷體"/>
+          <w:b/>
+          <w:bCs/>
+        </w:rPr>
+      </w:pPr>
+    </w:p>
+    <w:p>
+      <w:pPr>
+        <w:rPr>
+          <w:rFonts w:ascii="標楷體" w:eastAsia="標楷體" w:hAnsi="標楷體"/>
+          <w:b/>
+          <w:bCs/>
+        </w:rPr>
+      </w:pPr>
+      <w:r>
+        <w:rPr>
+          <w:rFonts w:ascii="標楷體" w:eastAsia="標楷體" w:hAnsi="標楷體" w:hint="eastAsia"/>
+          <w:b/>
+          <w:bCs/>
+        </w:rPr>
+        <w:t>問題：原先將真實的</w:t>
+      </w:r>
+      <w:r>
+        <w:rPr>
+          <w:rFonts w:ascii="標楷體" w:eastAsia="標楷體" w:hAnsi="標楷體"/>
+          <w:b/>
+          <w:bCs/>
+        </w:rPr>
+        <w:t xml:space="preserve"> Google Map 放在 3D 空間中渲染，導致滑動地圖時非常卡頓，甚至會讓瀏覽器當機。</w:t>
+      </w:r>
+    </w:p>
+    <w:p>
+      <w:pPr>
+        <w:rPr>
+          <w:rFonts w:ascii="標楷體" w:eastAsia="標楷體" w:hAnsi="標楷體"/>
+          <w:b/>
+          <w:bCs/>
+        </w:rPr>
+      </w:pPr>
+    </w:p>
+    <w:p>
+      <w:pPr>
+        <w:rPr>
+          <w:rFonts w:ascii="標楷體" w:eastAsia="標楷體" w:hAnsi="標楷體"/>
+          <w:b/>
+          <w:bCs/>
+        </w:rPr>
+      </w:pPr>
+      <w:r>
+        <w:rPr>
+          <w:rFonts w:ascii="標楷體" w:eastAsia="標楷體" w:hAnsi="標楷體" w:hint="eastAsia"/>
+          <w:b/>
+          <w:bCs/>
+        </w:rPr>
+        <w:t>解決：調整架構為</w:t>
+      </w:r>
+      <w:r>
+        <w:rPr>
+          <w:rFonts w:ascii="標楷體" w:eastAsia="標楷體" w:hAnsi="標楷體"/>
+          <w:b/>
+          <w:bCs/>
+        </w:rPr>
+        <w:t xml:space="preserve"> 「內部 2D、外部 3D 框」。地圖本體維持平面的 2D 渲染以確保順暢操作，僅讓最外層的手機/平板邊框進行 3D 傾斜視覺處理。</w:t>
+      </w:r>
+    </w:p>
+    <w:p>
+      <w:pPr>
+        <w:rPr>
+          <w:rFonts w:ascii="標楷體" w:eastAsia="標楷體" w:hAnsi="標楷體"/>
+          <w:b/>
+          <w:bCs/>
+        </w:rPr>
+      </w:pPr>
+    </w:p>
+    <w:p>
+      <w:pPr>
+        <w:rPr>
+          <w:rFonts w:ascii="標楷體" w:eastAsia="標楷體" w:hAnsi="標楷體"/>
+          <w:b/>
+          <w:bCs/>
+        </w:rPr>
+      </w:pPr>
+      <w:r>
+        <w:rPr>
+          <w:rFonts w:ascii="Segoe UI Emoji" w:eastAsia="標楷體" w:hAnsi="Segoe UI Emoji" w:cs="Segoe UI Emoji"/>
+          <w:b/>
+          <w:bCs/>
+        </w:rPr>
+        <w:t>🧠</w:t>
+      </w:r>
+      <w:r>
+        <w:rPr>
+          <w:rFonts w:ascii="標楷體" w:eastAsia="標楷體" w:hAnsi="標楷體"/>
+          <w:b/>
+          <w:bCs/>
+        </w:rPr>
+        <w:t xml:space="preserve"> 3. 狀態管理與資料邏輯 (State &amp; Data)</w:t>
+      </w:r>
+    </w:p>
+    <w:p>
+      <w:pPr>
+        <w:rPr>
+          <w:rFonts w:ascii="標楷體" w:eastAsia="標楷體" w:hAnsi="標楷體"/>
+          <w:b/>
+          <w:bCs/>
+        </w:rPr>
+      </w:pPr>
+      <w:r>
+        <w:rPr>
+          <w:rFonts w:ascii="Segoe UI Emoji" w:eastAsia="標楷體" w:hAnsi="Segoe UI Emoji" w:cs="Segoe UI Emoji"/>
+          <w:b/>
+          <w:bCs/>
+        </w:rPr>
+        <w:t>💡</w:t>
+      </w:r>
+      <w:r>
+        <w:rPr>
+          <w:rFonts w:ascii="標楷體" w:eastAsia="標楷體" w:hAnsi="標楷體"/>
+          <w:b/>
+          <w:bCs/>
+        </w:rPr>
+        <w:t xml:space="preserve"> 返回鍵迷航與高度遺失</w:t>
+      </w:r>
+    </w:p>
+    <w:p>
+      <w:pPr>
+        <w:rPr>
+          <w:rFonts w:ascii="標楷體" w:eastAsia="標楷體" w:hAnsi="標楷體"/>
+          <w:b/>
+          <w:bCs/>
+        </w:rPr>
+      </w:pPr>
+    </w:p>
+    <w:p>
+      <w:pPr>
+        <w:rPr>
+          <w:rFonts w:ascii="標楷體" w:eastAsia="標楷體" w:hAnsi="標楷體"/>
+          <w:b/>
+          <w:bCs/>
+        </w:rPr>
+      </w:pPr>
+      <w:r>
+        <w:rPr>
+          <w:rFonts w:ascii="標楷體" w:eastAsia="標楷體" w:hAnsi="標楷體" w:hint="eastAsia"/>
+          <w:b/>
+          <w:bCs/>
+        </w:rPr>
+        <w:t>問題：從</w:t>
+      </w:r>
+      <w:proofErr w:type="gramStart"/>
+      <w:r>
+        <w:rPr>
+          <w:rFonts w:ascii="標楷體" w:eastAsia="標楷體" w:hAnsi="標楷體" w:hint="eastAsia"/>
+          <w:b/>
+          <w:bCs/>
+        </w:rPr>
+        <w:t>店家頁點擊</w:t>
+      </w:r>
+      <w:proofErr w:type="gramEnd"/>
+      <w:r>
+        <w:rPr>
+          <w:rFonts w:ascii="標楷體" w:eastAsia="標楷體" w:hAnsi="標楷體" w:hint="eastAsia"/>
+          <w:b/>
+          <w:bCs/>
+        </w:rPr>
+        <w:t>返回時，系統不會回到剛才的來源頁，且網頁會回到</w:t>
+      </w:r>
+      <w:proofErr w:type="gramStart"/>
+      <w:r>
+        <w:rPr>
+          <w:rFonts w:ascii="標楷體" w:eastAsia="標楷體" w:hAnsi="標楷體" w:hint="eastAsia"/>
+          <w:b/>
+          <w:bCs/>
+        </w:rPr>
+        <w:t>最</w:t>
+      </w:r>
+      <w:proofErr w:type="gramEnd"/>
+      <w:r>
+        <w:rPr>
+          <w:rFonts w:ascii="標楷體" w:eastAsia="標楷體" w:hAnsi="標楷體" w:hint="eastAsia"/>
+          <w:b/>
+          <w:bCs/>
+        </w:rPr>
+        <w:t>頂端，使用者每次都要重頭向下滑。</w:t>
+      </w:r>
+    </w:p>
+    <w:p>
+      <w:pPr>
+        <w:rPr>
+          <w:rFonts w:ascii="標楷體" w:eastAsia="標楷體" w:hAnsi="標楷體"/>
+          <w:b/>
+          <w:bCs/>
+        </w:rPr>
+      </w:pPr>
+    </w:p>
+    <w:p>
+      <w:pPr>
+        <w:rPr>
+          <w:rFonts w:ascii="標楷體" w:eastAsia="標楷體" w:hAnsi="標楷體"/>
+          <w:b/>
+          <w:bCs/>
+        </w:rPr>
+      </w:pPr>
+      <w:r>
+        <w:rPr>
+          <w:rFonts w:ascii="標楷體" w:eastAsia="標楷體" w:hAnsi="標楷體" w:hint="eastAsia"/>
+          <w:b/>
+          <w:bCs/>
+        </w:rPr>
+        <w:t>解決：開發全域的</w:t>
+      </w:r>
+      <w:r>
+        <w:rPr>
+          <w:rFonts w:ascii="標楷體" w:eastAsia="標楷體" w:hAnsi="標楷體"/>
+          <w:b/>
+          <w:bCs/>
+        </w:rPr>
+        <w:t xml:space="preserve"> 導航記憶系統。自動記錄使用者的「</w:t>
+      </w:r>
+      <w:proofErr w:type="gramStart"/>
+      <w:r>
+        <w:rPr>
+          <w:rFonts w:ascii="標楷體" w:eastAsia="標楷體" w:hAnsi="標楷體"/>
+          <w:b/>
+          <w:bCs/>
+        </w:rPr>
+        <w:t>來時頁面</w:t>
+      </w:r>
+      <w:proofErr w:type="gramEnd"/>
+      <w:r>
+        <w:rPr>
+          <w:rFonts w:ascii="標楷體" w:eastAsia="標楷體" w:hAnsi="標楷體"/>
+          <w:b/>
+          <w:bCs/>
+        </w:rPr>
+        <w:t>」與「捲動高度」，點擊返回時能精</w:t>
+      </w:r>
+      <w:proofErr w:type="gramStart"/>
+      <w:r>
+        <w:rPr>
+          <w:rFonts w:ascii="標楷體" w:eastAsia="標楷體" w:hAnsi="標楷體"/>
+          <w:b/>
+          <w:bCs/>
+        </w:rPr>
+        <w:t>準</w:t>
+      </w:r>
+      <w:proofErr w:type="gramEnd"/>
+      <w:r>
+        <w:rPr>
+          <w:rFonts w:ascii="標楷體" w:eastAsia="標楷體" w:hAnsi="標楷體"/>
+          <w:b/>
+          <w:bCs/>
+        </w:rPr>
+        <w:t>、順暢地回到</w:t>
+      </w:r>
+      <w:proofErr w:type="gramStart"/>
+      <w:r>
+        <w:rPr>
+          <w:rFonts w:ascii="標楷體" w:eastAsia="標楷體" w:hAnsi="標楷體"/>
+          <w:b/>
+          <w:bCs/>
+        </w:rPr>
+        <w:t>跳轉前</w:t>
+      </w:r>
+      <w:proofErr w:type="gramEnd"/>
+      <w:r>
+        <w:rPr>
+          <w:rFonts w:ascii="標楷體" w:eastAsia="標楷體" w:hAnsi="標楷體"/>
+          <w:b/>
+          <w:bCs/>
+        </w:rPr>
+        <w:t>的原位。</w:t>
+      </w:r>
+    </w:p>
+    <w:p>
+      <w:pPr>
+        <w:rPr>
+          <w:rFonts w:ascii="標楷體" w:eastAsia="標楷體" w:hAnsi="標楷體"/>
+          <w:b/>
+          <w:bCs/>
+        </w:rPr>
+      </w:pPr>
+    </w:p>
+    <w:p>
+      <w:pPr>
+        <w:rPr>
+          <w:rFonts w:ascii="標楷體" w:eastAsia="標楷體" w:hAnsi="標楷體"/>
+          <w:b/>
+          <w:bCs/>
+        </w:rPr>
+      </w:pPr>
+      <w:r>
+        <w:rPr>
+          <w:rFonts w:ascii="Segoe UI Emoji" w:eastAsia="標楷體" w:hAnsi="Segoe UI Emoji" w:cs="Segoe UI Emoji"/>
+          <w:b/>
+          <w:bCs/>
+        </w:rPr>
+        <w:t>💡</w:t>
+      </w:r>
+      <w:r>
+        <w:rPr>
+          <w:rFonts w:ascii="標楷體" w:eastAsia="標楷體" w:hAnsi="標楷體"/>
+          <w:b/>
+          <w:bCs/>
+        </w:rPr>
+        <w:t xml:space="preserve"> 地圖與手機端資料同步不順暢</w:t>
+      </w:r>
+    </w:p>
+    <w:p>
+      <w:pPr>
+        <w:rPr>
+          <w:rFonts w:ascii="標楷體" w:eastAsia="標楷體" w:hAnsi="標楷體"/>
+          <w:b/>
+          <w:bCs/>
+        </w:rPr>
+      </w:pPr>
+    </w:p>
+    <w:p>
+      <w:pPr>
+        <w:rPr>
+          <w:rFonts w:ascii="標楷體" w:eastAsia="標楷體" w:hAnsi="標楷體"/>
+          <w:b/>
+          <w:bCs/>
+        </w:rPr>
+      </w:pPr>
+      <w:r>
+        <w:rPr>
+          <w:rFonts w:ascii="標楷體" w:eastAsia="標楷體" w:hAnsi="標楷體" w:hint="eastAsia"/>
+          <w:b/>
+          <w:bCs/>
+        </w:rPr>
+        <w:t>問題：在地圖頁面中，點擊</w:t>
+      </w:r>
+      <w:r>
+        <w:rPr>
+          <w:rFonts w:ascii="標楷體" w:eastAsia="標楷體" w:hAnsi="標楷體"/>
+          <w:b/>
+          <w:bCs/>
+        </w:rPr>
+        <w:t xml:space="preserve"> 3D 平板上的地標，與旁邊手機框裡的詳細資料無法即時連動。</w:t>
+      </w:r>
+    </w:p>
+    <w:p>
+      <w:pPr>
+        <w:rPr>
+          <w:rFonts w:ascii="標楷體" w:eastAsia="標楷體" w:hAnsi="標楷體"/>
+          <w:b/>
+          <w:bCs/>
+        </w:rPr>
+      </w:pPr>
+    </w:p>
+    <w:p>
+      <w:pPr>
+        <w:rPr>
+          <w:rFonts w:ascii="標楷體" w:eastAsia="標楷體" w:hAnsi="標楷體"/>
+          <w:b/>
+          <w:bCs/>
+        </w:rPr>
+      </w:pPr>
+      <w:r>
+        <w:rPr>
+          <w:rFonts w:ascii="標楷體" w:eastAsia="標楷體" w:hAnsi="標楷體" w:hint="eastAsia"/>
+          <w:b/>
+          <w:bCs/>
+        </w:rPr>
+        <w:t>解決：將地圖端與手機端綁定至同一</w:t>
+      </w:r>
+      <w:proofErr w:type="gramStart"/>
+      <w:r>
+        <w:rPr>
+          <w:rFonts w:ascii="標楷體" w:eastAsia="標楷體" w:hAnsi="標楷體" w:hint="eastAsia"/>
+          <w:b/>
+          <w:bCs/>
+        </w:rPr>
+        <w:t>個</w:t>
+      </w:r>
+      <w:proofErr w:type="gramEnd"/>
+      <w:r>
+        <w:rPr>
+          <w:rFonts w:ascii="標楷體" w:eastAsia="標楷體" w:hAnsi="標楷體"/>
+          <w:b/>
+          <w:bCs/>
+        </w:rPr>
+        <w:t xml:space="preserve"> 全局選取狀態（Selected State）。只要地圖一發送點擊事件，</w:t>
+      </w:r>
+      <w:proofErr w:type="gramStart"/>
+      <w:r>
+        <w:rPr>
+          <w:rFonts w:ascii="標楷體" w:eastAsia="標楷體" w:hAnsi="標楷體"/>
+          <w:b/>
+          <w:bCs/>
+        </w:rPr>
+        <w:t>手機端便立即</w:t>
+      </w:r>
+      <w:proofErr w:type="gramEnd"/>
+      <w:r>
+        <w:rPr>
+          <w:rFonts w:ascii="標楷體" w:eastAsia="標楷體" w:hAnsi="標楷體"/>
+          <w:b/>
+          <w:bCs/>
+        </w:rPr>
+        <w:t>攔截資料並同步切換內容。</w:t>
+      </w:r>
+    </w:p>
+    <w:p>
+      <w:pPr>
+        <w:rPr>
+          <w:rFonts w:ascii="標楷體" w:eastAsia="標楷體" w:hAnsi="標楷體"/>
+          <w:b/>
+          <w:bCs/>
+        </w:rPr>
+      </w:pPr>
+    </w:p>
+    <w:p>
+      <w:pPr>
+        <w:rPr>
+          <w:rFonts w:ascii="標楷體" w:eastAsia="標楷體" w:hAnsi="標楷體"/>
+          <w:b/>
+          <w:bCs/>
+        </w:rPr>
+      </w:pPr>
+      <w:r>
+        <w:rPr>
+          <w:rFonts w:ascii="Segoe UI Emoji" w:eastAsia="標楷體" w:hAnsi="Segoe UI Emoji" w:cs="Segoe UI Emoji"/>
+          <w:b/>
+          <w:bCs/>
+        </w:rPr>
+        <w:t>💡</w:t>
+      </w:r>
+      <w:r>
+        <w:rPr>
+          <w:rFonts w:ascii="標楷體" w:eastAsia="標楷體" w:hAnsi="標楷體"/>
+          <w:b/>
+          <w:bCs/>
+        </w:rPr>
+        <w:t xml:space="preserve"> 篩選邏輯不符使用者真實情境</w:t>
+      </w:r>
+    </w:p>
+    <w:p>
+      <w:pPr>
+        <w:rPr>
+          <w:rFonts w:ascii="標楷體" w:eastAsia="標楷體" w:hAnsi="標楷體"/>
+          <w:b/>
+          <w:bCs/>
+        </w:rPr>
+      </w:pPr>
+    </w:p>
+    <w:p>
+      <w:pPr>
+        <w:rPr>
+          <w:rFonts w:ascii="標楷體" w:eastAsia="標楷體" w:hAnsi="標楷體"/>
+          <w:b/>
+          <w:bCs/>
+        </w:rPr>
+      </w:pPr>
+      <w:r>
+        <w:rPr>
+          <w:rFonts w:ascii="標楷體" w:eastAsia="標楷體" w:hAnsi="標楷體" w:hint="eastAsia"/>
+          <w:b/>
+          <w:bCs/>
+        </w:rPr>
+        <w:t>問題：原先使用「素食分類」與「交通方式」作為主要篩選，但實測發現不夠實用。</w:t>
+      </w:r>
+    </w:p>
+    <w:p>
+      <w:pPr>
+        <w:rPr>
+          <w:rFonts w:ascii="標楷體" w:eastAsia="標楷體" w:hAnsi="標楷體"/>
+          <w:b/>
+          <w:bCs/>
+        </w:rPr>
+      </w:pPr>
+    </w:p>
+    <w:p>
+      <w:pPr>
+        <w:rPr>
+          <w:rFonts w:ascii="標楷體" w:eastAsia="標楷體" w:hAnsi="標楷體"/>
+          <w:b/>
+          <w:bCs/>
+        </w:rPr>
+      </w:pPr>
+      <w:r>
+        <w:rPr>
+          <w:rFonts w:ascii="標楷體" w:eastAsia="標楷體" w:hAnsi="標楷體" w:hint="eastAsia"/>
+          <w:b/>
+          <w:bCs/>
+        </w:rPr>
+        <w:t>解決：將篩選機制重構為更實用的</w:t>
+      </w:r>
+      <w:r>
+        <w:rPr>
+          <w:rFonts w:ascii="標楷體" w:eastAsia="標楷體" w:hAnsi="標楷體"/>
+          <w:b/>
+          <w:bCs/>
+        </w:rPr>
+        <w:t xml:space="preserve"> 「交通方式」與「時間分類」，</w:t>
+      </w:r>
+      <w:proofErr w:type="gramStart"/>
+      <w:r>
+        <w:rPr>
+          <w:rFonts w:ascii="標楷體" w:eastAsia="標楷體" w:hAnsi="標楷體"/>
+          <w:b/>
+          <w:bCs/>
+        </w:rPr>
+        <w:t>並實裝</w:t>
+      </w:r>
+      <w:proofErr w:type="gramEnd"/>
+      <w:r>
+        <w:rPr>
+          <w:rFonts w:ascii="標楷體" w:eastAsia="標楷體" w:hAnsi="標楷體"/>
+          <w:b/>
+          <w:bCs/>
+        </w:rPr>
+        <w:t>了單鍵切換的營業中/公休按鈕，更貼近大學生找餐廳的決策邏輯。</w:t>
+      </w:r>
+    </w:p>
+    <w:p>
+      <w:pPr>
+        <w:rPr>
+          <w:rFonts w:ascii="標楷體" w:eastAsia="標楷體" w:hAnsi="標楷體"/>
+          <w:b/>
+          <w:bCs/>
+        </w:rPr>
+      </w:pPr>
+    </w:p>
+    <w:p>
+      <w:pPr>
+        <w:rPr>
+          <w:rFonts w:ascii="標楷體" w:eastAsia="標楷體" w:hAnsi="標楷體"/>
+          <w:b/>
+          <w:bCs/>
+        </w:rPr>
+      </w:pPr>
+      <w:r>
+        <w:rPr>
+          <w:rFonts w:ascii="Segoe UI Emoji" w:eastAsia="標楷體" w:hAnsi="Segoe UI Emoji" w:cs="Segoe UI Emoji"/>
+          <w:b/>
+          <w:bCs/>
+        </w:rPr>
+        <w:t>⚙️</w:t>
+      </w:r>
+      <w:r>
+        <w:rPr>
+          <w:rFonts w:ascii="標楷體" w:eastAsia="標楷體" w:hAnsi="標楷體"/>
+          <w:b/>
+          <w:bCs/>
+        </w:rPr>
+        <w:t xml:space="preserve"> 4. 環境部署與檔案配置 (DevOps &amp; Setup)</w:t>
+      </w:r>
+    </w:p>
+    <w:p>
+      <w:pPr>
+        <w:rPr>
+          <w:rFonts w:ascii="標楷體" w:eastAsia="標楷體" w:hAnsi="標楷體"/>
+          <w:b/>
+          <w:bCs/>
+        </w:rPr>
+      </w:pPr>
+      <w:r>
+        <w:rPr>
+          <w:rFonts w:ascii="Segoe UI Emoji" w:eastAsia="標楷體" w:hAnsi="Segoe UI Emoji" w:cs="Segoe UI Emoji"/>
+          <w:b/>
+          <w:bCs/>
+        </w:rPr>
+        <w:t>💡</w:t>
+      </w:r>
+      <w:r>
+        <w:rPr>
+          <w:rFonts w:ascii="標楷體" w:eastAsia="標楷體" w:hAnsi="標楷體"/>
+          <w:b/>
+          <w:bCs/>
+        </w:rPr>
+        <w:t xml:space="preserve"> 團隊跨裝置部署與執行權限障礙</w:t>
+      </w:r>
+    </w:p>
+    <w:p>
+      <w:pPr>
+        <w:rPr>
+          <w:rFonts w:ascii="標楷體" w:eastAsia="標楷體" w:hAnsi="標楷體"/>
+          <w:b/>
+          <w:bCs/>
+        </w:rPr>
+      </w:pPr>
+    </w:p>
+    <w:p>
+      <w:pPr>
+        <w:rPr>
+          <w:rFonts w:ascii="標楷體" w:eastAsia="標楷體" w:hAnsi="標楷體"/>
+          <w:b/>
+          <w:bCs/>
+        </w:rPr>
+      </w:pPr>
+      <w:r>
+        <w:rPr>
+          <w:rFonts w:ascii="標楷體" w:eastAsia="標楷體" w:hAnsi="標楷體" w:hint="eastAsia"/>
+          <w:b/>
+          <w:bCs/>
+        </w:rPr>
+        <w:lastRenderedPageBreak/>
+        <w:t>問題：團隊在不同電腦上共同瀏覽成果時，常因缺乏環境或系統安全限制，導致終端機報錯，無法順利啟動專案（如</w:t>
+      </w:r>
+      <w:r>
+        <w:rPr>
+          <w:rFonts w:ascii="標楷體" w:eastAsia="標楷體" w:hAnsi="標楷體"/>
+          <w:b/>
+          <w:bCs/>
+        </w:rPr>
+        <w:t xml:space="preserve"> </w:t>
+      </w:r>
+      <w:proofErr w:type="spellStart"/>
+      <w:r>
+        <w:rPr>
+          <w:rFonts w:ascii="標楷體" w:eastAsia="標楷體" w:hAnsi="標楷體"/>
+          <w:b/>
+          <w:bCs/>
+        </w:rPr>
+        <w:t>npm</w:t>
+      </w:r>
+      <w:proofErr w:type="spellEnd"/>
+      <w:r>
+        <w:rPr>
+          <w:rFonts w:ascii="標楷體" w:eastAsia="標楷體" w:hAnsi="標楷體"/>
+          <w:b/>
+          <w:bCs/>
+        </w:rPr>
+        <w:t xml:space="preserve"> 指令失效）。</w:t>
+      </w:r>
+    </w:p>
+    <w:p>
+      <w:pPr>
+        <w:rPr>
+          <w:rFonts w:ascii="標楷體" w:eastAsia="標楷體" w:hAnsi="標楷體"/>
+          <w:b/>
+          <w:bCs/>
+        </w:rPr>
+      </w:pPr>
+    </w:p>
+    <w:p>
+      <w:pPr>
+        <w:rPr>
+          <w:rFonts w:ascii="標楷體" w:eastAsia="DengXian" w:hAnsi="標楷體"/>
+          <w:b/>
+          <w:bCs/>
+          <w:lang w:eastAsia="zh-CN"/>
+        </w:rPr>
+      </w:pPr>
+      <w:r>
+        <w:rPr>
+          <w:rFonts w:ascii="標楷體" w:eastAsia="標楷體" w:hAnsi="標楷體" w:hint="eastAsia"/>
+          <w:b/>
+          <w:bCs/>
+        </w:rPr>
+        <w:t>解決：建立標準化的</w:t>
+      </w:r>
+      <w:r>
+        <w:rPr>
+          <w:rFonts w:ascii="標楷體" w:eastAsia="標楷體" w:hAnsi="標楷體"/>
+          <w:b/>
+          <w:bCs/>
+        </w:rPr>
+        <w:t xml:space="preserve"> 檔案管理與環境配置流程。統一要求安裝 Node.js，並明文指引組員需以 「系統管理員」 身分開啟 </w:t>
+      </w:r>
+      <w:proofErr w:type="spellStart"/>
+      <w:r>
+        <w:rPr>
+          <w:rFonts w:ascii="標楷體" w:eastAsia="標楷體" w:hAnsi="標楷體"/>
+          <w:b/>
+          <w:bCs/>
+        </w:rPr>
+        <w:t>VSCode</w:t>
+      </w:r>
+      <w:proofErr w:type="spellEnd"/>
+      <w:r>
+        <w:rPr>
+          <w:rFonts w:ascii="標楷體" w:eastAsia="標楷體" w:hAnsi="標楷體"/>
+          <w:b/>
+          <w:bCs/>
+        </w:rPr>
+        <w:t xml:space="preserve"> 終端機，</w:t>
+      </w:r>
+      <w:proofErr w:type="gramStart"/>
+      <w:r>
+        <w:rPr>
+          <w:rFonts w:ascii="標楷體" w:eastAsia="標楷體" w:hAnsi="標楷體"/>
+          <w:b/>
+          <w:bCs/>
+        </w:rPr>
+        <w:t>解鎖本機</w:t>
+      </w:r>
+      <w:proofErr w:type="gramEnd"/>
+      <w:r>
+        <w:rPr>
+          <w:rFonts w:ascii="標楷體" w:eastAsia="標楷體" w:hAnsi="標楷體"/>
+          <w:b/>
+          <w:bCs/>
+        </w:rPr>
+        <w:t>執行權限，確保所有人都能無痛建置並順利啟動共同開發環境。</w:t>
+      </w:r>
+    </w:p>
+    <w:p>
+      <w:pPr>
+        <w:rPr>
+          <w:rFonts w:ascii="標楷體" w:eastAsia="DengXian" w:hAnsi="標楷體"/>
+          <w:b/>
+          <w:bCs/>
+          <w:lang w:eastAsia="zh-CN"/>
+        </w:rPr>
+      </w:pPr>
+    </w:p>
+    <w:p>
+      <w:pPr>
+        <w:rPr>
+          <w:rFonts w:ascii="標楷體" w:eastAsia="DengXian" w:hAnsi="標楷體" w:hint="eastAsia"/>
+          <w:b/>
+          <w:bCs/>
+          <w:lang w:eastAsia="zh-CN"/>
+        </w:rPr>
+      </w:pPr>
     </w:p>
     <w:sectPr>
       <w:pgSz w:w="11906" w:h="16838"/>
@@ -3815,6 +6034,7 @@
   <w:style w:type="paragraph" w:default="1" w:styleId="a">
     <w:name w:val="Normal"/>
     <w:qFormat/>
+    <w:rsid w:val="00FD78E1"/>
     <w:pPr>
       <w:jc w:val="both"/>
     </w:pPr>
@@ -4020,7 +6240,6 @@
   <w:style w:type="character" w:default="1" w:styleId="a0">
     <w:name w:val="Default Paragraph Font"/>
     <w:uiPriority w:val="1"/>
-    <w:semiHidden/>
     <w:unhideWhenUsed/>
   </w:style>
   <w:style w:type="table" w:default="1" w:styleId="a1">

</xml_diff>

<commit_message>
feat(map): implement dynamic route navigation via Directions API v0.4.51
</commit_message>
<xml_diff>
--- a/TO DO.docx
+++ b/TO DO.docx
@@ -447,7 +447,7 @@
     <w:p>
       <w:pPr>
         <w:rPr>
-          <w:rFonts w:ascii="標楷體" w:eastAsia="標楷體" w:hAnsi="標楷體"/>
+          <w:rFonts w:ascii="標楷體" w:eastAsia="DengXian" w:hAnsi="標楷體"/>
           <w:lang w:eastAsia="zh-CN"/>
         </w:rPr>
       </w:pPr>
@@ -547,6 +547,7 @@
       <w:pPr>
         <w:rPr>
           <w:rFonts w:ascii="標楷體" w:eastAsia="標楷體" w:hAnsi="標楷體"/>
+          <w:lang w:eastAsia="zh-CN"/>
         </w:rPr>
       </w:pPr>
       <w:sdt>
@@ -583,7 +584,122 @@
     <w:p>
       <w:pPr>
         <w:rPr>
-          <w:rFonts w:ascii="標楷體" w:eastAsia="標楷體" w:hAnsi="標楷體"/>
+          <w:rFonts w:ascii="標楷體" w:eastAsia="標楷體" w:hAnsi="標楷體" w:hint="eastAsia"/>
+          <w:lang w:eastAsia="zh-CN"/>
+        </w:rPr>
+      </w:pPr>
+      <w:sdt>
+        <w:sdtPr>
+          <w:rPr>
+            <w:rFonts w:ascii="標楷體" w:eastAsia="標楷體" w:hAnsi="標楷體" w:hint="eastAsia"/>
+            <w:lang w:eastAsia="zh-CN"/>
+          </w:rPr>
+          <w:id w:val="283710037"/>
+          <w14:checkbox>
+            <w14:checked w14:val="1"/>
+            <w14:checkedState w14:val="2612" w14:font="MS Gothic"/>
+            <w14:uncheckedState w14:val="2610" w14:font="MS Gothic"/>
+          </w14:checkbox>
+        </w:sdtPr>
+        <w:sdtContent>
+          <w:r>
+            <w:rPr>
+              <w:rFonts w:ascii="MS Gothic" w:eastAsia="MS Gothic" w:hAnsi="MS Gothic" w:hint="eastAsia"/>
+              <w:lang w:eastAsia="zh-CN"/>
+            </w:rPr>
+            <w:t>☒</w:t>
+          </w:r>
+        </w:sdtContent>
+      </w:sdt>
+      <w:r>
+        <w:rPr>
+          <w:rFonts w:ascii="標楷體" w:eastAsia="標楷體" w:hAnsi="標楷體" w:hint="eastAsia"/>
+          <w:lang w:eastAsia="zh-CN"/>
+        </w:rPr>
+        <w:t xml:space="preserve"> </w:t>
+      </w:r>
+      <w:r>
+        <w:rPr>
+          <w:rFonts w:ascii="標楷體" w:eastAsia="標楷體" w:hAnsi="標楷體" w:hint="eastAsia"/>
+          <w:lang w:eastAsia="zh-CN"/>
+        </w:rPr>
+        <w:t>地图导航路线</w:t>
+      </w:r>
+    </w:p>
+    <w:p>
+      <w:pPr>
+        <w:rPr>
+          <w:rFonts w:ascii="標楷體" w:eastAsia="DengXian" w:hAnsi="標楷體" w:hint="eastAsia"/>
+          <w:lang w:eastAsia="zh-CN"/>
+        </w:rPr>
+      </w:pPr>
+      <w:sdt>
+        <w:sdtPr>
+          <w:rPr>
+            <w:rFonts w:ascii="標楷體" w:eastAsia="標楷體" w:hAnsi="標楷體" w:hint="eastAsia"/>
+            <w:lang w:eastAsia="zh-CN"/>
+          </w:rPr>
+          <w:id w:val="1176080323"/>
+          <w14:checkbox>
+            <w14:checked w14:val="0"/>
+            <w14:checkedState w14:val="2612" w14:font="MS Gothic"/>
+            <w14:uncheckedState w14:val="2610" w14:font="MS Gothic"/>
+          </w14:checkbox>
+        </w:sdtPr>
+        <w:sdtContent>
+          <w:r>
+            <w:rPr>
+              <w:rFonts w:ascii="Segoe UI Symbol" w:eastAsia="標楷體" w:hAnsi="Segoe UI Symbol" w:cs="Segoe UI Symbol"/>
+              <w:lang w:eastAsia="zh-CN"/>
+            </w:rPr>
+            <w:t>☐</w:t>
+          </w:r>
+        </w:sdtContent>
+      </w:sdt>
+      <w:r>
+        <w:rPr>
+          <w:rFonts w:ascii="標楷體" w:eastAsia="標楷體" w:hAnsi="標楷體" w:hint="eastAsia"/>
+          <w:lang w:eastAsia="zh-CN"/>
+        </w:rPr>
+        <w:t xml:space="preserve"> </w:t>
+      </w:r>
+      <w:r>
+        <w:rPr>
+          <w:rFonts w:ascii="標楷體" w:eastAsia="標楷體" w:hAnsi="標楷體" w:hint="eastAsia"/>
+          <w:lang w:eastAsia="zh-CN"/>
+        </w:rPr>
+        <w:t>定位開</w:t>
+      </w:r>
+      <w:proofErr w:type="gramStart"/>
+      <w:r>
+        <w:rPr>
+          <w:rFonts w:ascii="標楷體" w:eastAsia="標楷體" w:hAnsi="標楷體" w:hint="eastAsia"/>
+          <w:lang w:eastAsia="zh-CN"/>
+        </w:rPr>
+        <w:t>啟</w:t>
+      </w:r>
+      <w:proofErr w:type="gramEnd"/>
+      <w:r>
+        <w:rPr>
+          <w:rFonts w:ascii="標楷體" w:eastAsia="標楷體" w:hAnsi="標楷體" w:hint="eastAsia"/>
+          <w:lang w:eastAsia="zh-CN"/>
+        </w:rPr>
+        <w:t>圖</w:t>
+      </w:r>
+      <w:proofErr w:type="gramStart"/>
+      <w:r>
+        <w:rPr>
+          <w:rFonts w:ascii="標楷體" w:eastAsia="標楷體" w:hAnsi="標楷體" w:hint="eastAsia"/>
+          <w:lang w:eastAsia="zh-CN"/>
+        </w:rPr>
+        <w:t>標</w:t>
+      </w:r>
+      <w:proofErr w:type="gramEnd"/>
+    </w:p>
+    <w:p>
+      <w:pPr>
+        <w:rPr>
+          <w:rFonts w:ascii="標楷體" w:eastAsia="標楷體" w:hAnsi="標楷體" w:hint="eastAsia"/>
           <w:lang w:eastAsia="zh-CN"/>
         </w:rPr>
       </w:pPr>
@@ -603,7 +719,7 @@
         <w:sdtContent>
           <w:r>
             <w:rPr>
-              <w:rFonts w:ascii="MS Gothic" w:eastAsia="MS Gothic" w:hAnsi="MS Gothic" w:hint="eastAsia"/>
+              <w:rFonts w:ascii="Segoe UI Symbol" w:eastAsia="標楷體" w:hAnsi="Segoe UI Symbol" w:cs="Segoe UI Symbol"/>
               <w:lang w:eastAsia="zh-CN"/>
             </w:rPr>
             <w:t>☒</w:t>
@@ -613,15 +729,9 @@
       <w:r>
         <w:rPr>
           <w:rFonts w:ascii="標楷體" w:eastAsia="標楷體" w:hAnsi="標楷體" w:hint="eastAsia"/>
-        </w:rPr>
-        <w:t xml:space="preserve"> </w:t>
-      </w:r>
-      <w:r>
-        <w:rPr>
-          <w:rFonts w:ascii="標楷體" w:eastAsia="標楷體" w:hAnsi="標楷體" w:hint="eastAsia"/>
-          <w:lang w:eastAsia="zh-CN"/>
-        </w:rPr>
-        <w:t>当前位置</w:t>
+          <w:lang w:eastAsia="zh-CN"/>
+        </w:rPr>
+        <w:t xml:space="preserve"> 当前位置</w:t>
       </w:r>
       <w:r>
         <w:rPr>
@@ -629,50 +739,6 @@
           <w:lang w:eastAsia="zh-CN"/>
         </w:rPr>
         <w:t>图标</w:t>
-      </w:r>
-    </w:p>
-    <w:p>
-      <w:pPr>
-        <w:rPr>
-          <w:rFonts w:ascii="標楷體" w:eastAsia="標楷體" w:hAnsi="標楷體" w:hint="eastAsia"/>
-        </w:rPr>
-      </w:pPr>
-      <w:sdt>
-        <w:sdtPr>
-          <w:rPr>
-            <w:rFonts w:ascii="標楷體" w:eastAsia="標楷體" w:hAnsi="標楷體" w:hint="eastAsia"/>
-            <w:lang w:eastAsia="zh-CN"/>
-          </w:rPr>
-          <w:id w:val="283710037"/>
-          <w14:checkbox>
-            <w14:checked w14:val="0"/>
-            <w14:checkedState w14:val="2612" w14:font="MS Gothic"/>
-            <w14:uncheckedState w14:val="2610" w14:font="MS Gothic"/>
-          </w14:checkbox>
-        </w:sdtPr>
-        <w:sdtContent>
-          <w:r>
-            <w:rPr>
-              <w:rFonts w:ascii="Segoe UI Symbol" w:eastAsia="標楷體" w:hAnsi="Segoe UI Symbol" w:cs="Segoe UI Symbol"/>
-              <w:lang w:eastAsia="zh-CN"/>
-            </w:rPr>
-            <w:t>☐</w:t>
-          </w:r>
-        </w:sdtContent>
-      </w:sdt>
-      <w:r>
-        <w:rPr>
-          <w:rFonts w:ascii="標楷體" w:eastAsia="標楷體" w:hAnsi="標楷體" w:hint="eastAsia"/>
-          <w:lang w:eastAsia="zh-CN"/>
-        </w:rPr>
-        <w:t xml:space="preserve"> </w:t>
-      </w:r>
-      <w:r>
-        <w:rPr>
-          <w:rFonts w:ascii="DengXian" w:eastAsia="DengXian" w:hAnsi="DengXian" w:hint="eastAsia"/>
-          <w:lang w:eastAsia="zh-CN"/>
-        </w:rPr>
-        <w:t>地图导航路线</w:t>
       </w:r>
     </w:p>
     <w:p>

</xml_diff>

<commit_message>
fix(map): resolve white screen crash caused by direct DOM manipulation v0.4.58
</commit_message>
<xml_diff>
--- a/TO DO.docx
+++ b/TO DO.docx
@@ -5,6 +5,11 @@
     <w:sdt>
       <w:sdtPr>
         <w:rPr>
+          <w:rFonts w:asciiTheme="minorHAnsi" w:eastAsiaTheme="minorEastAsia" w:hAnsiTheme="minorHAnsi" w:cstheme="minorBidi"/>
+          <w:color w:val="auto"/>
+          <w:kern w:val="2"/>
+          <w:sz w:val="24"/>
+          <w:szCs w:val="22"/>
           <w:lang w:val="zh-TW"/>
         </w:rPr>
         <w:id w:val="-551311017"/>
@@ -15,13 +20,8 @@
       </w:sdtPr>
       <w:sdtEndPr>
         <w:rPr>
-          <w:rFonts w:asciiTheme="minorHAnsi" w:eastAsiaTheme="minorEastAsia" w:hAnsiTheme="minorHAnsi" w:cstheme="minorBidi"/>
           <w:b/>
           <w:bCs/>
-          <w:color w:val="auto"/>
-          <w:kern w:val="2"/>
-          <w:sz w:val="24"/>
-          <w:szCs w:val="22"/>
         </w:rPr>
       </w:sdtEndPr>
       <w:sdtContent>
@@ -372,12 +372,14 @@
       <w:pPr>
         <w:rPr>
           <w:rFonts w:ascii="標楷體" w:eastAsia="標楷體" w:hAnsi="標楷體"/>
+          <w:lang w:eastAsia="zh-CN"/>
         </w:rPr>
       </w:pPr>
       <w:sdt>
         <w:sdtPr>
           <w:rPr>
             <w:rFonts w:ascii="標楷體" w:eastAsia="標楷體" w:hAnsi="標楷體" w:hint="eastAsia"/>
+            <w:lang w:eastAsia="zh-CN"/>
           </w:rPr>
           <w:id w:val="32860994"/>
           <w14:checkbox>
@@ -390,6 +392,7 @@
           <w:r>
             <w:rPr>
               <w:rFonts w:ascii="MS Gothic" w:eastAsia="MS Gothic" w:hAnsi="MS Gothic" w:hint="eastAsia"/>
+              <w:lang w:eastAsia="zh-CN"/>
             </w:rPr>
             <w:t>☒</w:t>
           </w:r>
@@ -398,6 +401,7 @@
       <w:r>
         <w:rPr>
           <w:rFonts w:ascii="標楷體" w:eastAsia="標楷體" w:hAnsi="標楷體" w:hint="eastAsia"/>
+          <w:lang w:eastAsia="zh-CN"/>
         </w:rPr>
         <w:t>返回纽實裝(或者只修改返回方式)</w:t>
       </w:r>
@@ -433,16 +437,8 @@
         <w:rPr>
           <w:rFonts w:ascii="標楷體" w:eastAsia="標楷體" w:hAnsi="標楷體" w:hint="eastAsia"/>
         </w:rPr>
-        <w:t xml:space="preserve"> 地圖頁店家營業狀態標</w:t>
-      </w:r>
-      <w:proofErr w:type="gramStart"/>
-      <w:r>
-        <w:rPr>
-          <w:rFonts w:ascii="標楷體" w:eastAsia="標楷體" w:hAnsi="標楷體" w:hint="eastAsia"/>
-        </w:rPr>
-        <w:t>註</w:t>
-      </w:r>
-      <w:proofErr w:type="gramEnd"/>
+        <w:t xml:space="preserve"> 地圖頁店家營業狀態標註</w:t>
+      </w:r>
     </w:p>
     <w:p>
       <w:pPr>
@@ -479,23 +475,7 @@
           <w:rFonts w:ascii="標楷體" w:eastAsia="標楷體" w:hAnsi="標楷體" w:hint="eastAsia"/>
           <w:lang w:eastAsia="zh-CN"/>
         </w:rPr>
-        <w:t xml:space="preserve"> 店家详情</w:t>
-      </w:r>
-      <w:proofErr w:type="gramStart"/>
-      <w:r>
-        <w:rPr>
-          <w:rFonts w:ascii="標楷體" w:eastAsia="標楷體" w:hAnsi="標楷體" w:hint="eastAsia"/>
-          <w:lang w:eastAsia="zh-CN"/>
-        </w:rPr>
-        <w:t>页交通</w:t>
-      </w:r>
-      <w:proofErr w:type="gramEnd"/>
-      <w:r>
-        <w:rPr>
-          <w:rFonts w:ascii="標楷體" w:eastAsia="標楷體" w:hAnsi="標楷體" w:hint="eastAsia"/>
-          <w:lang w:eastAsia="zh-CN"/>
-        </w:rPr>
-        <w:t>时间数据动态调整</w:t>
+        <w:t xml:space="preserve"> 店家详情页交通时间数据动态调整</w:t>
       </w:r>
     </w:p>
     <w:p>
@@ -556,7 +536,7 @@
             <w:rFonts w:ascii="標楷體" w:eastAsia="標楷體" w:hAnsi="標楷體" w:hint="eastAsia"/>
             <w:lang w:eastAsia="zh-CN"/>
           </w:rPr>
-          <w:id w:val="1938634204"/>
+          <w:id w:val="-942916307"/>
           <w14:checkbox>
             <w14:checked w14:val="0"/>
             <w14:checkedState w14:val="2612" w14:font="MS Gothic"/>
@@ -576,23 +556,61 @@
       <w:r>
         <w:rPr>
           <w:rFonts w:ascii="標楷體" w:eastAsia="標楷體" w:hAnsi="標楷體" w:hint="eastAsia"/>
-          <w:lang w:eastAsia="zh-CN"/>
-        </w:rPr>
-        <w:t xml:space="preserve"> 團體成員</w:t>
-      </w:r>
-    </w:p>
-    <w:p>
-      <w:pPr>
-        <w:rPr>
-          <w:rFonts w:ascii="標楷體" w:eastAsia="標楷體" w:hAnsi="標楷體" w:hint="eastAsia"/>
-          <w:lang w:eastAsia="zh-CN"/>
+        </w:rPr>
+        <w:t xml:space="preserve"> </w:t>
+      </w:r>
+      <w:r>
+        <w:rPr>
+          <w:rFonts w:ascii="標楷體" w:eastAsia="標楷體" w:hAnsi="標楷體" w:hint="eastAsia"/>
+          <w:lang w:eastAsia="zh-CN"/>
+        </w:rPr>
+        <w:t>開始導航</w:t>
+      </w:r>
+    </w:p>
+    <w:p>
+      <w:pPr>
+        <w:rPr>
+          <w:rFonts w:ascii="標楷體" w:eastAsia="標楷體" w:hAnsi="標楷體"/>
         </w:rPr>
       </w:pPr>
       <w:sdt>
         <w:sdtPr>
           <w:rPr>
             <w:rFonts w:ascii="標楷體" w:eastAsia="標楷體" w:hAnsi="標楷體" w:hint="eastAsia"/>
-            <w:lang w:eastAsia="zh-CN"/>
+          </w:rPr>
+          <w:id w:val="1938634204"/>
+          <w14:checkbox>
+            <w14:checked w14:val="0"/>
+            <w14:checkedState w14:val="2612" w14:font="MS Gothic"/>
+            <w14:uncheckedState w14:val="2610" w14:font="MS Gothic"/>
+          </w14:checkbox>
+        </w:sdtPr>
+        <w:sdtContent>
+          <w:r>
+            <w:rPr>
+              <w:rFonts w:ascii="Segoe UI Symbol" w:eastAsia="標楷體" w:hAnsi="Segoe UI Symbol" w:cs="Segoe UI Symbol"/>
+            </w:rPr>
+            <w:t>☐</w:t>
+          </w:r>
+        </w:sdtContent>
+      </w:sdt>
+      <w:r>
+        <w:rPr>
+          <w:rFonts w:ascii="標楷體" w:eastAsia="標楷體" w:hAnsi="標楷體" w:hint="eastAsia"/>
+        </w:rPr>
+        <w:t xml:space="preserve"> 團體成員</w:t>
+      </w:r>
+    </w:p>
+    <w:p>
+      <w:pPr>
+        <w:rPr>
+          <w:rFonts w:ascii="標楷體" w:eastAsia="標楷體" w:hAnsi="標楷體"/>
+        </w:rPr>
+      </w:pPr>
+      <w:sdt>
+        <w:sdtPr>
+          <w:rPr>
+            <w:rFonts w:ascii="標楷體" w:eastAsia="標楷體" w:hAnsi="標楷體" w:hint="eastAsia"/>
           </w:rPr>
           <w:id w:val="283710037"/>
           <w14:checkbox>
@@ -605,7 +623,6 @@
           <w:r>
             <w:rPr>
               <w:rFonts w:ascii="MS Gothic" w:eastAsia="MS Gothic" w:hAnsi="MS Gothic" w:hint="eastAsia"/>
-              <w:lang w:eastAsia="zh-CN"/>
             </w:rPr>
             <w:t>☒</w:t>
           </w:r>
@@ -614,14 +631,12 @@
       <w:r>
         <w:rPr>
           <w:rFonts w:ascii="標楷體" w:eastAsia="標楷體" w:hAnsi="標楷體" w:hint="eastAsia"/>
-          <w:lang w:eastAsia="zh-CN"/>
         </w:rPr>
         <w:t xml:space="preserve"> </w:t>
       </w:r>
       <w:r>
         <w:rPr>
           <w:rFonts w:ascii="標楷體" w:eastAsia="標楷體" w:hAnsi="標楷體" w:hint="eastAsia"/>
-          <w:lang w:eastAsia="zh-CN"/>
         </w:rPr>
         <w:t>地图导航路线</w:t>
       </w:r>
@@ -629,15 +644,13 @@
     <w:p>
       <w:pPr>
         <w:rPr>
-          <w:rFonts w:ascii="標楷體" w:eastAsia="DengXian" w:hAnsi="標楷體" w:hint="eastAsia"/>
-          <w:lang w:eastAsia="zh-CN"/>
+          <w:rFonts w:ascii="標楷體" w:eastAsia="DengXian" w:hAnsi="標楷體"/>
         </w:rPr>
       </w:pPr>
       <w:sdt>
         <w:sdtPr>
           <w:rPr>
             <w:rFonts w:ascii="標楷體" w:eastAsia="標楷體" w:hAnsi="標楷體" w:hint="eastAsia"/>
-            <w:lang w:eastAsia="zh-CN"/>
           </w:rPr>
           <w:id w:val="1176080323"/>
           <w14:checkbox>
@@ -650,7 +663,6 @@
           <w:r>
             <w:rPr>
               <w:rFonts w:ascii="Segoe UI Symbol" w:eastAsia="標楷體" w:hAnsi="Segoe UI Symbol" w:cs="Segoe UI Symbol"/>
-              <w:lang w:eastAsia="zh-CN"/>
             </w:rPr>
             <w:t>☐</w:t>
           </w:r>
@@ -659,55 +671,38 @@
       <w:r>
         <w:rPr>
           <w:rFonts w:ascii="標楷體" w:eastAsia="標楷體" w:hAnsi="標楷體" w:hint="eastAsia"/>
-          <w:lang w:eastAsia="zh-CN"/>
         </w:rPr>
         <w:t xml:space="preserve"> </w:t>
       </w:r>
       <w:r>
         <w:rPr>
           <w:rFonts w:ascii="標楷體" w:eastAsia="標楷體" w:hAnsi="標楷體" w:hint="eastAsia"/>
-          <w:lang w:eastAsia="zh-CN"/>
-        </w:rPr>
-        <w:t>定位開</w:t>
-      </w:r>
-      <w:proofErr w:type="gramStart"/>
-      <w:r>
-        <w:rPr>
-          <w:rFonts w:ascii="標楷體" w:eastAsia="標楷體" w:hAnsi="標楷體" w:hint="eastAsia"/>
-          <w:lang w:eastAsia="zh-CN"/>
-        </w:rPr>
-        <w:t>啟</w:t>
-      </w:r>
-      <w:proofErr w:type="gramEnd"/>
-      <w:r>
-        <w:rPr>
-          <w:rFonts w:ascii="標楷體" w:eastAsia="標楷體" w:hAnsi="標楷體" w:hint="eastAsia"/>
-          <w:lang w:eastAsia="zh-CN"/>
-        </w:rPr>
-        <w:t>圖</w:t>
-      </w:r>
-      <w:proofErr w:type="gramStart"/>
-      <w:r>
-        <w:rPr>
-          <w:rFonts w:ascii="標楷體" w:eastAsia="標楷體" w:hAnsi="標楷體" w:hint="eastAsia"/>
-          <w:lang w:eastAsia="zh-CN"/>
-        </w:rPr>
-        <w:t>標</w:t>
-      </w:r>
-      <w:proofErr w:type="gramEnd"/>
-    </w:p>
-    <w:p>
-      <w:pPr>
-        <w:rPr>
-          <w:rFonts w:ascii="標楷體" w:eastAsia="標楷體" w:hAnsi="標楷體" w:hint="eastAsia"/>
-          <w:lang w:eastAsia="zh-CN"/>
+        </w:rPr>
+        <w:t>定位開啟</w:t>
+      </w:r>
+      <w:r>
+        <w:rPr>
+          <w:rFonts w:ascii="標楷體" w:eastAsia="標楷體" w:hAnsi="標楷體" w:hint="eastAsia"/>
+        </w:rPr>
+        <w:t>/關閉</w:t>
+      </w:r>
+      <w:r>
+        <w:rPr>
+          <w:rFonts w:ascii="標楷體" w:eastAsia="標楷體" w:hAnsi="標楷體" w:hint="eastAsia"/>
+        </w:rPr>
+        <w:t>圖標</w:t>
+      </w:r>
+    </w:p>
+    <w:p>
+      <w:pPr>
+        <w:rPr>
+          <w:rFonts w:ascii="標楷體" w:eastAsia="標楷體" w:hAnsi="標楷體"/>
         </w:rPr>
       </w:pPr>
       <w:sdt>
         <w:sdtPr>
           <w:rPr>
             <w:rFonts w:ascii="標楷體" w:eastAsia="標楷體" w:hAnsi="標楷體" w:hint="eastAsia"/>
-            <w:lang w:eastAsia="zh-CN"/>
           </w:rPr>
           <w:id w:val="65087427"/>
           <w14:checkbox>
@@ -720,7 +715,6 @@
           <w:r>
             <w:rPr>
               <w:rFonts w:ascii="Segoe UI Symbol" w:eastAsia="標楷體" w:hAnsi="Segoe UI Symbol" w:cs="Segoe UI Symbol"/>
-              <w:lang w:eastAsia="zh-CN"/>
             </w:rPr>
             <w:t>☒</w:t>
           </w:r>
@@ -729,14 +723,12 @@
       <w:r>
         <w:rPr>
           <w:rFonts w:ascii="標楷體" w:eastAsia="標楷體" w:hAnsi="標楷體" w:hint="eastAsia"/>
-          <w:lang w:eastAsia="zh-CN"/>
         </w:rPr>
         <w:t xml:space="preserve"> 当前位置</w:t>
       </w:r>
       <w:r>
         <w:rPr>
           <w:rFonts w:ascii="標楷體" w:eastAsia="標楷體" w:hAnsi="標楷體" w:hint="eastAsia"/>
-          <w:lang w:eastAsia="zh-CN"/>
         </w:rPr>
         <w:t>图标</w:t>
       </w:r>
@@ -776,23 +768,7 @@
           <w:rFonts w:ascii="標楷體" w:eastAsia="標楷體" w:hAnsi="標楷體" w:hint="eastAsia"/>
           <w:lang w:eastAsia="zh-CN"/>
         </w:rPr>
-        <w:t xml:space="preserve"> 封面</w:t>
-      </w:r>
-      <w:proofErr w:type="gramStart"/>
-      <w:r>
-        <w:rPr>
-          <w:rFonts w:ascii="標楷體" w:eastAsia="標楷體" w:hAnsi="標楷體" w:hint="eastAsia"/>
-          <w:lang w:eastAsia="zh-CN"/>
-        </w:rPr>
-        <w:t>樣</w:t>
-      </w:r>
-      <w:proofErr w:type="gramEnd"/>
-      <w:r>
-        <w:rPr>
-          <w:rFonts w:ascii="標楷體" w:eastAsia="標楷體" w:hAnsi="標楷體" w:hint="eastAsia"/>
-          <w:lang w:eastAsia="zh-CN"/>
-        </w:rPr>
-        <w:t>式(可不修改)</w:t>
+        <w:t xml:space="preserve"> 封面樣式(可不修改)</w:t>
       </w:r>
     </w:p>
     <w:p>
@@ -830,23 +806,7 @@
           <w:rFonts w:ascii="標楷體" w:eastAsia="標楷體" w:hAnsi="標楷體" w:hint="eastAsia"/>
           <w:lang w:eastAsia="zh-CN"/>
         </w:rPr>
-        <w:t xml:space="preserve"> 营业中筛选</w:t>
-      </w:r>
-      <w:proofErr w:type="gramStart"/>
-      <w:r>
-        <w:rPr>
-          <w:rFonts w:ascii="標楷體" w:eastAsia="標楷體" w:hAnsi="標楷體" w:hint="eastAsia"/>
-          <w:lang w:eastAsia="zh-CN"/>
-        </w:rPr>
-        <w:t>纽</w:t>
-      </w:r>
-      <w:proofErr w:type="gramEnd"/>
-      <w:r>
-        <w:rPr>
-          <w:rFonts w:ascii="標楷體" w:eastAsia="標楷體" w:hAnsi="標楷體" w:hint="eastAsia"/>
-          <w:lang w:eastAsia="zh-CN"/>
-        </w:rPr>
-        <w:t>实装</w:t>
+        <w:t xml:space="preserve"> 营业中筛选纽实装</w:t>
       </w:r>
     </w:p>
     <w:p>
@@ -1053,23 +1013,7 @@
           <w:rFonts w:ascii="標楷體" w:eastAsia="標楷體" w:hAnsi="標楷體" w:hint="eastAsia"/>
           <w:lang w:eastAsia="zh-CN"/>
         </w:rPr>
-        <w:t xml:space="preserve"> 店家</w:t>
-      </w:r>
-      <w:proofErr w:type="gramStart"/>
-      <w:r>
-        <w:rPr>
-          <w:rFonts w:ascii="標楷體" w:eastAsia="標楷體" w:hAnsi="標楷體" w:hint="eastAsia"/>
-          <w:lang w:eastAsia="zh-CN"/>
-        </w:rPr>
-        <w:t>页特色餐点</w:t>
-      </w:r>
-      <w:proofErr w:type="gramEnd"/>
-      <w:r>
-        <w:rPr>
-          <w:rFonts w:ascii="標楷體" w:eastAsia="標楷體" w:hAnsi="標楷體" w:hint="eastAsia"/>
-          <w:lang w:eastAsia="zh-CN"/>
-        </w:rPr>
-        <w:t>放大检视，文字描述</w:t>
+        <w:t xml:space="preserve"> 店家页特色餐点放大检视，文字描述</w:t>
       </w:r>
       <w:r>
         <w:rPr>
@@ -1114,23 +1058,7 @@
           <w:rFonts w:ascii="標楷體" w:eastAsia="標楷體" w:hAnsi="標楷體" w:hint="eastAsia"/>
           <w:lang w:eastAsia="zh-CN"/>
         </w:rPr>
-        <w:t xml:space="preserve"> 菜单灯箱置顶</w:t>
-      </w:r>
-      <w:proofErr w:type="gramStart"/>
-      <w:r>
-        <w:rPr>
-          <w:rFonts w:ascii="標楷體" w:eastAsia="標楷體" w:hAnsi="標楷體" w:hint="eastAsia"/>
-          <w:lang w:eastAsia="zh-CN"/>
-        </w:rPr>
-        <w:t>纽</w:t>
-      </w:r>
-      <w:proofErr w:type="gramEnd"/>
-      <w:r>
-        <w:rPr>
-          <w:rFonts w:ascii="標楷體" w:eastAsia="標楷體" w:hAnsi="標楷體" w:hint="eastAsia"/>
-          <w:lang w:eastAsia="zh-CN"/>
-        </w:rPr>
-        <w:t>不该出现</w:t>
+        <w:t xml:space="preserve"> 菜单灯箱置顶纽不该出现</w:t>
       </w:r>
     </w:p>
     <w:p>
@@ -1168,23 +1096,7 @@
           <w:rFonts w:ascii="標楷體" w:eastAsia="標楷體" w:hAnsi="標楷體" w:hint="eastAsia"/>
           <w:lang w:eastAsia="zh-CN"/>
         </w:rPr>
-        <w:t xml:space="preserve"> 店家详情</w:t>
-      </w:r>
-      <w:proofErr w:type="gramStart"/>
-      <w:r>
-        <w:rPr>
-          <w:rFonts w:ascii="標楷體" w:eastAsia="標楷體" w:hAnsi="標楷體" w:hint="eastAsia"/>
-          <w:lang w:eastAsia="zh-CN"/>
-        </w:rPr>
-        <w:t>页特色餐点</w:t>
-      </w:r>
-      <w:proofErr w:type="gramEnd"/>
-      <w:r>
-        <w:rPr>
-          <w:rFonts w:ascii="標楷體" w:eastAsia="標楷體" w:hAnsi="標楷體" w:hint="eastAsia"/>
-          <w:lang w:eastAsia="zh-CN"/>
-        </w:rPr>
-        <w:t>hover效果去除</w:t>
+        <w:t xml:space="preserve"> 店家详情页特色餐点hover效果去除</w:t>
       </w:r>
     </w:p>
     <w:p>
@@ -1256,21 +1168,7 @@
         <w:rPr>
           <w:rFonts w:ascii="標楷體" w:eastAsia="標楷體" w:hAnsi="標楷體" w:hint="eastAsia"/>
         </w:rPr>
-        <w:t xml:space="preserve"> 公休</w:t>
-      </w:r>
-      <w:proofErr w:type="gramStart"/>
-      <w:r>
-        <w:rPr>
-          <w:rFonts w:ascii="標楷體" w:eastAsia="標楷體" w:hAnsi="標楷體" w:hint="eastAsia"/>
-        </w:rPr>
-        <w:t>圖標換成</w:t>
-      </w:r>
-      <w:proofErr w:type="gramEnd"/>
-      <w:r>
-        <w:rPr>
-          <w:rFonts w:ascii="標楷體" w:eastAsia="標楷體" w:hAnsi="標楷體" w:hint="eastAsia"/>
-        </w:rPr>
-        <w:t>純文字</w:t>
+        <w:t xml:space="preserve"> 公休圖標換成純文字</w:t>
       </w:r>
     </w:p>
     <w:p>
@@ -1362,21 +1260,7 @@
         <w:rPr>
           <w:rFonts w:ascii="標楷體" w:eastAsia="標楷體" w:hAnsi="標楷體" w:hint="eastAsia"/>
         </w:rPr>
-        <w:t>nfo文本及圖片替換成</w:t>
-      </w:r>
-      <w:proofErr w:type="spellStart"/>
-      <w:r>
-        <w:rPr>
-          <w:rFonts w:ascii="標楷體" w:eastAsia="標楷體" w:hAnsi="標楷體" w:hint="eastAsia"/>
-        </w:rPr>
-        <w:t>figma</w:t>
-      </w:r>
-      <w:proofErr w:type="spellEnd"/>
-      <w:r>
-        <w:rPr>
-          <w:rFonts w:ascii="標楷體" w:eastAsia="標楷體" w:hAnsi="標楷體" w:hint="eastAsia"/>
-        </w:rPr>
-        <w:t>上的、</w:t>
+        <w:t>nfo文本及圖片替換成figma上的、</w:t>
       </w:r>
       <w:r>
         <w:rPr>
@@ -1515,14 +1399,12 @@
         </w:rPr>
         <w:t>con(或文本圖替代)</w:t>
       </w:r>
-      <w:proofErr w:type="gramStart"/>
       <w:r>
         <w:rPr>
           <w:rFonts w:ascii="標楷體" w:eastAsia="標楷體" w:hAnsi="標楷體" w:hint="eastAsia"/>
         </w:rPr>
         <w:t>——</w:t>
       </w:r>
-      <w:proofErr w:type="gramEnd"/>
     </w:p>
     <w:p>
       <w:pPr>
@@ -1544,23 +1426,7 @@
           <w:rFonts w:ascii="標楷體" w:eastAsia="標楷體" w:hAnsi="標楷體" w:hint="eastAsia"/>
           <w:lang w:eastAsia="zh-CN"/>
         </w:rPr>
-        <w:t>1.原生select中的option无法使用</w:t>
-      </w:r>
-      <w:proofErr w:type="spellStart"/>
-      <w:r>
-        <w:rPr>
-          <w:rFonts w:ascii="標楷體" w:eastAsia="標楷體" w:hAnsi="標楷體" w:hint="eastAsia"/>
-          <w:lang w:eastAsia="zh-CN"/>
-        </w:rPr>
-        <w:t>img</w:t>
-      </w:r>
-      <w:proofErr w:type="spellEnd"/>
-      <w:r>
-        <w:rPr>
-          <w:rFonts w:ascii="標楷體" w:eastAsia="標楷體" w:hAnsi="標楷體" w:hint="eastAsia"/>
-          <w:lang w:eastAsia="zh-CN"/>
-        </w:rPr>
-        <w:t>。</w:t>
+        <w:t>1.原生select中的option无法使用img。</w:t>
       </w:r>
     </w:p>
     <w:p>
@@ -1599,23 +1465,7 @@
           <w:rFonts w:ascii="標楷體" w:eastAsia="標楷體" w:hAnsi="標楷體"/>
           <w:lang w:eastAsia="zh-CN"/>
         </w:rPr>
-        <w:t>簡化成「1 鍵」的平面化</w:t>
-      </w:r>
-      <w:proofErr w:type="gramStart"/>
-      <w:r>
-        <w:rPr>
-          <w:rFonts w:ascii="標楷體" w:eastAsia="標楷體" w:hAnsi="標楷體"/>
-          <w:lang w:eastAsia="zh-CN"/>
-        </w:rPr>
-        <w:t>標</w:t>
-      </w:r>
-      <w:proofErr w:type="gramEnd"/>
-      <w:r>
-        <w:rPr>
-          <w:rFonts w:ascii="標楷體" w:eastAsia="標楷體" w:hAnsi="標楷體"/>
-          <w:lang w:eastAsia="zh-CN"/>
-        </w:rPr>
-        <w:t>籤</w:t>
+        <w:t>簡化成「1 鍵」的平面化標籤</w:t>
       </w:r>
       <w:r>
         <w:rPr>
@@ -1629,23 +1479,7 @@
           <w:rFonts w:ascii="標楷體" w:eastAsia="標楷體" w:hAnsi="標楷體"/>
           <w:lang w:eastAsia="zh-CN"/>
         </w:rPr>
-        <w:t>橫向膠囊</w:t>
-      </w:r>
-      <w:proofErr w:type="gramStart"/>
-      <w:r>
-        <w:rPr>
-          <w:rFonts w:ascii="標楷體" w:eastAsia="標楷體" w:hAnsi="標楷體"/>
-          <w:lang w:eastAsia="zh-CN"/>
-        </w:rPr>
-        <w:t>標</w:t>
-      </w:r>
-      <w:proofErr w:type="gramEnd"/>
-      <w:r>
-        <w:rPr>
-          <w:rFonts w:ascii="標楷體" w:eastAsia="標楷體" w:hAnsi="標楷體"/>
-          <w:lang w:eastAsia="zh-CN"/>
-        </w:rPr>
-        <w:t>籤（Pill/Chip Buttons）</w:t>
+        <w:t>橫向膠囊標籤（Pill/Chip Buttons）</w:t>
       </w:r>
     </w:p>
     <w:p>
@@ -1681,19 +1515,11 @@
         </w:rPr>
         <w:t xml:space="preserve"> </w:t>
       </w:r>
-      <w:proofErr w:type="gramStart"/>
-      <w:r>
-        <w:rPr>
-          <w:rFonts w:ascii="標楷體" w:eastAsia="標楷體" w:hAnsi="標楷體"/>
-        </w:rPr>
-        <w:t>線上菜單</w:t>
-      </w:r>
-      <w:proofErr w:type="gramEnd"/>
-      <w:r>
-        <w:rPr>
-          <w:rFonts w:ascii="標楷體" w:eastAsia="標楷體" w:hAnsi="標楷體"/>
-        </w:rPr>
-        <w:t>放大燈箱</w:t>
+      <w:r>
+        <w:rPr>
+          <w:rFonts w:ascii="標楷體" w:eastAsia="標楷體" w:hAnsi="標楷體"/>
+        </w:rPr>
+        <w:t>線上菜單放大燈箱</w:t>
       </w:r>
       <w:r>
         <w:rPr>
@@ -1744,39 +1570,7 @@
           <w:rFonts w:ascii="標楷體" w:eastAsia="標楷體" w:hAnsi="標楷體"/>
           <w:lang w:eastAsia="zh-CN"/>
         </w:rPr>
-        <w:t>線上菜</w:t>
-      </w:r>
-      <w:proofErr w:type="gramStart"/>
-      <w:r>
-        <w:rPr>
-          <w:rFonts w:ascii="標楷體" w:eastAsia="標楷體" w:hAnsi="標楷體"/>
-          <w:lang w:eastAsia="zh-CN"/>
-        </w:rPr>
-        <w:t>單</w:t>
-      </w:r>
-      <w:proofErr w:type="gramEnd"/>
-      <w:r>
-        <w:rPr>
-          <w:rFonts w:ascii="標楷體" w:eastAsia="標楷體" w:hAnsi="標楷體"/>
-          <w:lang w:eastAsia="zh-CN"/>
-        </w:rPr>
-        <w:t>放大</w:t>
-      </w:r>
-      <w:proofErr w:type="gramStart"/>
-      <w:r>
-        <w:rPr>
-          <w:rFonts w:ascii="標楷體" w:eastAsia="標楷體" w:hAnsi="標楷體"/>
-          <w:lang w:eastAsia="zh-CN"/>
-        </w:rPr>
-        <w:t>燈</w:t>
-      </w:r>
-      <w:proofErr w:type="gramEnd"/>
-      <w:r>
-        <w:rPr>
-          <w:rFonts w:ascii="標楷體" w:eastAsia="標楷體" w:hAnsi="標楷體"/>
-          <w:lang w:eastAsia="zh-CN"/>
-        </w:rPr>
-        <w:t>箱</w:t>
+        <w:t>線上菜單放大燈箱</w:t>
       </w:r>
       <w:r>
         <w:rPr>
@@ -1856,21 +1650,7 @@
         <w:rPr>
           <w:rFonts w:ascii="標楷體" w:eastAsia="標楷體" w:hAnsi="標楷體" w:hint="eastAsia"/>
         </w:rPr>
-        <w:t xml:space="preserve"> </w:t>
-      </w:r>
-      <w:proofErr w:type="spellStart"/>
-      <w:r>
-        <w:rPr>
-          <w:rFonts w:ascii="標楷體" w:eastAsia="標楷體" w:hAnsi="標楷體" w:hint="eastAsia"/>
-        </w:rPr>
-        <w:t>shopDetail</w:t>
-      </w:r>
-      <w:proofErr w:type="spellEnd"/>
-      <w:r>
-        <w:rPr>
-          <w:rFonts w:ascii="標楷體" w:eastAsia="標楷體" w:hAnsi="標楷體" w:hint="eastAsia"/>
-        </w:rPr>
-        <w:t>返回shops未維持原位</w:t>
+        <w:t xml:space="preserve"> shopDetail返回shops未維持原位</w:t>
       </w:r>
     </w:p>
     <w:p>
@@ -2057,23 +1837,7 @@
           <w:rFonts w:ascii="標楷體" w:eastAsia="標楷體" w:hAnsi="標楷體" w:hint="eastAsia"/>
           <w:lang w:eastAsia="zh-CN"/>
         </w:rPr>
-        <w:t xml:space="preserve"> 店家</w:t>
-      </w:r>
-      <w:proofErr w:type="gramStart"/>
-      <w:r>
-        <w:rPr>
-          <w:rFonts w:ascii="標楷體" w:eastAsia="標楷體" w:hAnsi="標楷體" w:hint="eastAsia"/>
-          <w:lang w:eastAsia="zh-CN"/>
-        </w:rPr>
-        <w:t>页根据</w:t>
-      </w:r>
-      <w:proofErr w:type="gramEnd"/>
-      <w:r>
-        <w:rPr>
-          <w:rFonts w:ascii="標楷體" w:eastAsia="標楷體" w:hAnsi="標楷體" w:hint="eastAsia"/>
-          <w:lang w:eastAsia="zh-CN"/>
-        </w:rPr>
-        <w:t>当前星期调整营业时间</w:t>
+        <w:t xml:space="preserve"> 店家页根据当前星期调整营业时间</w:t>
       </w:r>
     </w:p>
     <w:p>
@@ -2149,23 +1913,7 @@
           <w:rFonts w:ascii="標楷體" w:eastAsia="標楷體" w:hAnsi="標楷體" w:hint="eastAsia"/>
           <w:lang w:eastAsia="zh-CN"/>
         </w:rPr>
-        <w:t xml:space="preserve"> 地图页图标选取后，手机</w:t>
-      </w:r>
-      <w:proofErr w:type="gramStart"/>
-      <w:r>
-        <w:rPr>
-          <w:rFonts w:ascii="標楷體" w:eastAsia="標楷體" w:hAnsi="標楷體" w:hint="eastAsia"/>
-          <w:lang w:eastAsia="zh-CN"/>
-        </w:rPr>
-        <w:t>端保持</w:t>
-      </w:r>
-      <w:proofErr w:type="gramEnd"/>
-      <w:r>
-        <w:rPr>
-          <w:rFonts w:ascii="標楷體" w:eastAsia="標楷體" w:hAnsi="標楷體" w:hint="eastAsia"/>
-          <w:lang w:eastAsia="zh-CN"/>
-        </w:rPr>
-        <w:t>配角呈现选取店家</w:t>
+        <w:t xml:space="preserve"> 地图页图标选取后，手机端保持配角呈现选取店家</w:t>
       </w:r>
     </w:p>
     <w:p>
@@ -2386,29 +2134,7 @@
         <w:rPr>
           <w:rFonts w:ascii="標楷體" w:eastAsia="標楷體" w:hAnsi="標楷體" w:hint="eastAsia"/>
         </w:rPr>
-        <w:t>、</w:t>
-      </w:r>
-      <w:proofErr w:type="gramStart"/>
-      <w:r>
-        <w:rPr>
-          <w:rFonts w:ascii="標楷體" w:eastAsia="標楷體" w:hAnsi="標楷體" w:hint="eastAsia"/>
-        </w:rPr>
-        <w:t>跳轉</w:t>
-      </w:r>
-      <w:proofErr w:type="spellStart"/>
-      <w:proofErr w:type="gramEnd"/>
-      <w:r>
-        <w:rPr>
-          <w:rFonts w:ascii="標楷體" w:eastAsia="標楷體" w:hAnsi="標楷體" w:hint="eastAsia"/>
-        </w:rPr>
-        <w:t>shopDetail</w:t>
-      </w:r>
-      <w:proofErr w:type="spellEnd"/>
-      <w:r>
-        <w:rPr>
-          <w:rFonts w:ascii="標楷體" w:eastAsia="標楷體" w:hAnsi="標楷體" w:hint="eastAsia"/>
-        </w:rPr>
-        <w:t>邏輯沒寫</w:t>
+        <w:t>、跳轉shopDetail邏輯沒寫</w:t>
       </w:r>
     </w:p>
     <w:p>
@@ -2454,16 +2180,8 @@
         <w:rPr>
           <w:rFonts w:ascii="標楷體" w:eastAsia="標楷體" w:hAnsi="標楷體" w:hint="eastAsia"/>
         </w:rPr>
-        <w:t>ug 店家詳情</w:t>
-      </w:r>
-      <w:proofErr w:type="gramStart"/>
-      <w:r>
-        <w:rPr>
-          <w:rFonts w:ascii="標楷體" w:eastAsia="標楷體" w:hAnsi="標楷體" w:hint="eastAsia"/>
-        </w:rPr>
-        <w:t>頁跳轉</w:t>
-      </w:r>
-      <w:proofErr w:type="gramEnd"/>
+        <w:t>ug 店家詳情頁跳轉</w:t>
+      </w:r>
       <w:r>
         <w:rPr>
           <w:rFonts w:ascii="標楷體" w:eastAsia="標楷體" w:hAnsi="標楷體" w:hint="eastAsia"/>
@@ -2665,21 +2383,7 @@
         <w:rPr>
           <w:rFonts w:ascii="標楷體" w:eastAsia="標楷體" w:hAnsi="標楷體" w:hint="eastAsia"/>
         </w:rPr>
-        <w:t xml:space="preserve"> </w:t>
-      </w:r>
-      <w:proofErr w:type="spellStart"/>
-      <w:r>
-        <w:rPr>
-          <w:rFonts w:ascii="標楷體" w:eastAsia="標楷體" w:hAnsi="標楷體" w:hint="eastAsia"/>
-        </w:rPr>
-        <w:t>shopDetail</w:t>
-      </w:r>
-      <w:proofErr w:type="spellEnd"/>
-      <w:r>
-        <w:rPr>
-          <w:rFonts w:ascii="標楷體" w:eastAsia="標楷體" w:hAnsi="標楷體" w:hint="eastAsia"/>
-        </w:rPr>
-        <w:t>中的菜單布局調整</w:t>
+        <w:t xml:space="preserve"> shopDetail中的菜單布局調整</w:t>
       </w:r>
     </w:p>
     <w:p>
@@ -2713,24 +2417,8 @@
         <w:rPr>
           <w:rFonts w:ascii="標楷體" w:eastAsia="標楷體" w:hAnsi="標楷體" w:hint="eastAsia"/>
         </w:rPr>
-        <w:t xml:space="preserve"> </w:t>
-      </w:r>
-      <w:proofErr w:type="gramStart"/>
-      <w:r>
-        <w:rPr>
-          <w:rFonts w:ascii="標楷體" w:eastAsia="標楷體" w:hAnsi="標楷體" w:hint="eastAsia"/>
-        </w:rPr>
-        <w:t>跳轉</w:t>
-      </w:r>
-      <w:proofErr w:type="spellStart"/>
-      <w:proofErr w:type="gramEnd"/>
-      <w:r>
-        <w:rPr>
-          <w:rFonts w:ascii="標楷體" w:eastAsia="標楷體" w:hAnsi="標楷體" w:hint="eastAsia"/>
-        </w:rPr>
-        <w:t>shopDetail</w:t>
-      </w:r>
-      <w:proofErr w:type="spellEnd"/>
+        <w:t xml:space="preserve"> 跳轉shopDetail</w:t>
+      </w:r>
       <w:r>
         <w:rPr>
           <w:rFonts w:ascii="標楷體" w:eastAsia="標楷體" w:hAnsi="標楷體" w:hint="eastAsia"/>
@@ -3300,35 +2988,7 @@
         <w:rPr>
           <w:rFonts w:ascii="標楷體" w:eastAsia="標楷體" w:hAnsi="標楷體" w:hint="eastAsia"/>
         </w:rPr>
-        <w:t>5.不要五角圖，</w:t>
-      </w:r>
-      <w:proofErr w:type="gramStart"/>
-      <w:r>
-        <w:rPr>
-          <w:rFonts w:ascii="標楷體" w:eastAsia="標楷體" w:hAnsi="標楷體" w:hint="eastAsia"/>
-        </w:rPr>
-        <w:t>放食材</w:t>
-      </w:r>
-      <w:proofErr w:type="gramEnd"/>
-      <w:r>
-        <w:rPr>
-          <w:rFonts w:ascii="標楷體" w:eastAsia="標楷體" w:hAnsi="標楷體" w:hint="eastAsia"/>
-        </w:rPr>
-        <w:t>、食材圖片和</w:t>
-      </w:r>
-      <w:proofErr w:type="gramStart"/>
-      <w:r>
-        <w:rPr>
-          <w:rFonts w:ascii="標楷體" w:eastAsia="標楷體" w:hAnsi="標楷體" w:hint="eastAsia"/>
-        </w:rPr>
-        <w:t>食材</w:t>
-      </w:r>
-      <w:proofErr w:type="gramEnd"/>
-      <w:r>
-        <w:rPr>
-          <w:rFonts w:ascii="標楷體" w:eastAsia="標楷體" w:hAnsi="標楷體" w:hint="eastAsia"/>
-        </w:rPr>
-        <w:t>功用(如大量維生素B</w:t>
+        <w:t>5.不要五角圖，放食材、食材圖片和食材功用(如大量維生素B</w:t>
       </w:r>
       <w:r>
         <w:rPr>
@@ -3476,16 +3136,8 @@
         <w:rPr>
           <w:rFonts w:ascii="標楷體" w:eastAsia="標楷體" w:hAnsi="標楷體" w:hint="eastAsia"/>
         </w:rPr>
-        <w:t>8.</w:t>
-      </w:r>
-      <w:proofErr w:type="gramStart"/>
-      <w:r>
-        <w:rPr>
-          <w:rFonts w:ascii="標楷體" w:eastAsia="標楷體" w:hAnsi="標楷體" w:hint="eastAsia"/>
-        </w:rPr>
-        <w:t>跳轉邏輯</w:t>
-      </w:r>
-      <w:proofErr w:type="gramEnd"/>
+        <w:t>8.跳轉邏輯</w:t>
+      </w:r>
     </w:p>
     <w:p>
       <w:pPr>
@@ -4057,14 +3709,7 @@
         <w:rPr>
           <w:rFonts w:ascii="標楷體" w:eastAsia="標楷體" w:hAnsi="標楷體"/>
         </w:rPr>
-        <w:t xml:space="preserve"> 解決方式：參考市面上大量的</w:t>
-      </w:r>
-      <w:proofErr w:type="gramStart"/>
-      <w:r>
-        <w:rPr>
-          <w:rFonts w:ascii="標楷體" w:eastAsia="標楷體" w:hAnsi="標楷體"/>
-        </w:rPr>
-        <w:t>餐廳</w:t>
+        <w:t xml:space="preserve"> 解決方式：參考市面上大量的餐廳</w:t>
       </w:r>
       <w:r>
         <w:rPr>
@@ -4072,7 +3717,6 @@
         </w:rPr>
         <w:t>官網和</w:t>
       </w:r>
-      <w:proofErr w:type="gramEnd"/>
       <w:r>
         <w:rPr>
           <w:rFonts w:ascii="標楷體" w:eastAsia="標楷體" w:hAnsi="標楷體"/>
@@ -4137,21 +3781,7 @@
         <w:rPr>
           <w:rFonts w:ascii="標楷體" w:eastAsia="標楷體" w:hAnsi="標楷體"/>
         </w:rPr>
-        <w:t xml:space="preserve">輔助轉譯為 </w:t>
-      </w:r>
-      <w:proofErr w:type="spellStart"/>
-      <w:r>
-        <w:rPr>
-          <w:rFonts w:ascii="標楷體" w:eastAsia="標楷體" w:hAnsi="標楷體"/>
-        </w:rPr>
-        <w:t>VSCode</w:t>
-      </w:r>
-      <w:proofErr w:type="spellEnd"/>
-      <w:r>
-        <w:rPr>
-          <w:rFonts w:ascii="標楷體" w:eastAsia="標楷體" w:hAnsi="標楷體"/>
-        </w:rPr>
-        <w:t xml:space="preserve"> 程式碼時，常因預設的佈局邏輯死板（如絕對定位），導致實際網頁長相與設計稿不符。</w:t>
+        <w:t>輔助轉譯為 VSCode 程式碼時，常因預設的佈局邏輯死板（如絕對定位），導致實際網頁長相與設計稿不符。</w:t>
       </w:r>
     </w:p>
     <w:p>
@@ -4171,21 +3801,7 @@
         <w:rPr>
           <w:rFonts w:ascii="標楷體" w:eastAsia="標楷體" w:hAnsi="標楷體"/>
         </w:rPr>
-        <w:t xml:space="preserve"> 解決方式：改</w:t>
-      </w:r>
-      <w:proofErr w:type="gramStart"/>
-      <w:r>
-        <w:rPr>
-          <w:rFonts w:ascii="標楷體" w:eastAsia="標楷體" w:hAnsi="標楷體"/>
-        </w:rPr>
-        <w:t>採</w:t>
-      </w:r>
-      <w:proofErr w:type="gramEnd"/>
-      <w:r>
-        <w:rPr>
-          <w:rFonts w:ascii="標楷體" w:eastAsia="標楷體" w:hAnsi="標楷體"/>
-        </w:rPr>
-        <w:t xml:space="preserve"> 漸進式轉換程式碼。在轉譯過程中，人工給予更詳細的實際長相與功能說明指示，並手動微調 CSS Flexbox/Grid 排版，確保視覺完美還原。</w:t>
+        <w:t xml:space="preserve"> 解決方式：改採 漸進式轉換程式碼。在轉譯過程中，人工給予更詳細的實際長相與功能說明指示，並手動微調 CSS Flexbox/Grid 排版，確保視覺完美還原。</w:t>
       </w:r>
     </w:p>
     <w:p>
@@ -4233,35 +3849,7 @@
         <w:rPr>
           <w:rFonts w:ascii="標楷體" w:eastAsia="標楷體" w:hAnsi="標楷體"/>
         </w:rPr>
-        <w:t xml:space="preserve"> 遭遇問題：在 Figma 製作 Prototype 原型時，若同一</w:t>
-      </w:r>
-      <w:proofErr w:type="gramStart"/>
-      <w:r>
-        <w:rPr>
-          <w:rFonts w:ascii="標楷體" w:eastAsia="標楷體" w:hAnsi="標楷體"/>
-        </w:rPr>
-        <w:t>個</w:t>
-      </w:r>
-      <w:proofErr w:type="gramEnd"/>
-      <w:r>
-        <w:rPr>
-          <w:rFonts w:ascii="標楷體" w:eastAsia="標楷體" w:hAnsi="標楷體"/>
-        </w:rPr>
-        <w:t xml:space="preserve"> Frame 綁定了過多、過雜</w:t>
-      </w:r>
-      <w:proofErr w:type="gramStart"/>
-      <w:r>
-        <w:rPr>
-          <w:rFonts w:ascii="標楷體" w:eastAsia="標楷體" w:hAnsi="標楷體"/>
-        </w:rPr>
-        <w:t>的跳轉連線</w:t>
-      </w:r>
-      <w:proofErr w:type="gramEnd"/>
-      <w:r>
-        <w:rPr>
-          <w:rFonts w:ascii="標楷體" w:eastAsia="標楷體" w:hAnsi="標楷體"/>
-        </w:rPr>
-        <w:t>，彼此會產生邏輯衝突，無法達成想像中的互動效果。</w:t>
+        <w:t xml:space="preserve"> 遭遇問題：在 Figma 製作 Prototype 原型時，若同一個 Frame 綁定了過多、過雜的跳轉連線，彼此會產生邏輯衝突，無法達成想像中的互動效果。</w:t>
       </w:r>
     </w:p>
     <w:p>
@@ -4295,7 +3883,6 @@
         </w:rPr>
         <w:t>連線狀態，但實測後發現仍無法完全</w:t>
       </w:r>
-      <w:proofErr w:type="gramStart"/>
       <w:r>
         <w:rPr>
           <w:rFonts w:ascii="標楷體" w:eastAsia="標楷體" w:hAnsi="標楷體" w:hint="eastAsia"/>
@@ -4306,42 +3893,7 @@
         <w:rPr>
           <w:rFonts w:ascii="標楷體" w:eastAsia="標楷體" w:hAnsi="標楷體"/>
         </w:rPr>
-        <w:t>跳轉衝突</w:t>
-      </w:r>
-      <w:proofErr w:type="gramEnd"/>
-      <w:r>
-        <w:rPr>
-          <w:rFonts w:ascii="標楷體" w:eastAsia="標楷體" w:hAnsi="標楷體"/>
-        </w:rPr>
-        <w:t>的問題。最終決定改變設計策略，將 Figma 專注於 「視覺呈現與靜態排版」 的確認；而過於複雜的</w:t>
-      </w:r>
-      <w:proofErr w:type="gramStart"/>
-      <w:r>
-        <w:rPr>
-          <w:rFonts w:ascii="標楷體" w:eastAsia="標楷體" w:hAnsi="標楷體"/>
-        </w:rPr>
-        <w:t>動態跳轉與</w:t>
-      </w:r>
-      <w:proofErr w:type="gramEnd"/>
-      <w:r>
-        <w:rPr>
-          <w:rFonts w:ascii="標楷體" w:eastAsia="標楷體" w:hAnsi="標楷體"/>
-        </w:rPr>
-        <w:t>邏輯交互，則直接交由後續的 React 程式碼來精</w:t>
-      </w:r>
-      <w:proofErr w:type="gramStart"/>
-      <w:r>
-        <w:rPr>
-          <w:rFonts w:ascii="標楷體" w:eastAsia="標楷體" w:hAnsi="標楷體"/>
-        </w:rPr>
-        <w:t>準</w:t>
-      </w:r>
-      <w:proofErr w:type="gramEnd"/>
-      <w:r>
-        <w:rPr>
-          <w:rFonts w:ascii="標楷體" w:eastAsia="標楷體" w:hAnsi="標楷體"/>
-        </w:rPr>
-        <w:t>實現，確保專案邏輯的穩定性。</w:t>
+        <w:t>跳轉衝突的問題。最終決定改變設計策略，將 Figma 專注於 「視覺呈現與靜態排版」 的確認；而過於複雜的動態跳轉與邏輯交互，則直接交由後續的 React 程式碼來精準實現，確保專案邏輯的穩定性。</w:t>
       </w:r>
     </w:p>
     <w:p>
@@ -4389,21 +3941,7 @@
         <w:rPr>
           <w:rFonts w:ascii="標楷體" w:eastAsia="標楷體" w:hAnsi="標楷體"/>
         </w:rPr>
-        <w:t xml:space="preserve"> 遭遇問題：團隊在不同電腦上共同瀏覽成果時，常因缺乏環境或系統安全限制，導致終端機報錯，無法順利啟動專案（如 </w:t>
-      </w:r>
-      <w:proofErr w:type="spellStart"/>
-      <w:r>
-        <w:rPr>
-          <w:rFonts w:ascii="標楷體" w:eastAsia="標楷體" w:hAnsi="標楷體"/>
-        </w:rPr>
-        <w:t>npm</w:t>
-      </w:r>
-      <w:proofErr w:type="spellEnd"/>
-      <w:r>
-        <w:rPr>
-          <w:rFonts w:ascii="標楷體" w:eastAsia="標楷體" w:hAnsi="標楷體"/>
-        </w:rPr>
-        <w:t xml:space="preserve"> 指令失效）。</w:t>
+        <w:t xml:space="preserve"> 遭遇問題：團隊在不同電腦上共同瀏覽成果時，常因缺乏環境或系統安全限制，導致終端機報錯，無法順利啟動專案（如 npm 指令失效）。</w:t>
       </w:r>
     </w:p>
     <w:p>
@@ -4423,35 +3961,7 @@
         <w:rPr>
           <w:rFonts w:ascii="標楷體" w:eastAsia="標楷體" w:hAnsi="標楷體"/>
         </w:rPr>
-        <w:t xml:space="preserve"> 解決方式：建立標準化的 檔案管理與環境配置流程。統一要求安裝 Node.js，並明文指引組員需以 「系統管理員」 身分開啟 </w:t>
-      </w:r>
-      <w:proofErr w:type="spellStart"/>
-      <w:r>
-        <w:rPr>
-          <w:rFonts w:ascii="標楷體" w:eastAsia="標楷體" w:hAnsi="標楷體"/>
-        </w:rPr>
-        <w:t>VSCode</w:t>
-      </w:r>
-      <w:proofErr w:type="spellEnd"/>
-      <w:r>
-        <w:rPr>
-          <w:rFonts w:ascii="標楷體" w:eastAsia="標楷體" w:hAnsi="標楷體"/>
-        </w:rPr>
-        <w:t xml:space="preserve"> 終端機，</w:t>
-      </w:r>
-      <w:proofErr w:type="gramStart"/>
-      <w:r>
-        <w:rPr>
-          <w:rFonts w:ascii="標楷體" w:eastAsia="標楷體" w:hAnsi="標楷體"/>
-        </w:rPr>
-        <w:t>解鎖本機</w:t>
-      </w:r>
-      <w:proofErr w:type="gramEnd"/>
-      <w:r>
-        <w:rPr>
-          <w:rFonts w:ascii="標楷體" w:eastAsia="標楷體" w:hAnsi="標楷體"/>
-        </w:rPr>
-        <w:t>執行權限。</w:t>
+        <w:t xml:space="preserve"> 解決方式：建立標準化的 檔案管理與環境配置流程。統一要求安裝 Node.js，並明文指引組員需以 「系統管理員」 身分開啟 VSCode 終端機，解鎖本機執行權限。</w:t>
       </w:r>
     </w:p>
     <w:p>
@@ -4531,35 +4041,7 @@
         <w:rPr>
           <w:rFonts w:ascii="標楷體" w:eastAsia="標楷體" w:hAnsi="標楷體"/>
         </w:rPr>
-        <w:t xml:space="preserve"> 解決方式：導入 </w:t>
-      </w:r>
-      <w:proofErr w:type="spellStart"/>
-      <w:r>
-        <w:rPr>
-          <w:rFonts w:ascii="標楷體" w:eastAsia="標楷體" w:hAnsi="標楷體"/>
-        </w:rPr>
-        <w:t>Vercel</w:t>
-      </w:r>
-      <w:proofErr w:type="spellEnd"/>
-      <w:r>
-        <w:rPr>
-          <w:rFonts w:ascii="標楷體" w:eastAsia="標楷體" w:hAnsi="標楷體"/>
-        </w:rPr>
-        <w:t xml:space="preserve"> 自動化部署服務。將專案與 GitHub 連動，只要發布新版本就會自動</w:t>
-      </w:r>
-      <w:proofErr w:type="gramStart"/>
-      <w:r>
-        <w:rPr>
-          <w:rFonts w:ascii="標楷體" w:eastAsia="標楷體" w:hAnsi="標楷體"/>
-        </w:rPr>
-        <w:t>生成線上預覽</w:t>
-      </w:r>
-      <w:proofErr w:type="gramEnd"/>
-      <w:r>
-        <w:rPr>
-          <w:rFonts w:ascii="標楷體" w:eastAsia="標楷體" w:hAnsi="標楷體"/>
-        </w:rPr>
-        <w:t>連結，讓組員無需操作程式碼即可隨時瀏覽最新成果。</w:t>
+        <w:t xml:space="preserve"> 解決方式：導入 Vercel 自動化部署服務。將專案與 GitHub 連動，只要發布新版本就會自動生成線上預覽連結，讓組員無需操作程式碼即可隨時瀏覽最新成果。</w:t>
       </w:r>
     </w:p>
     <w:p>
@@ -4627,35 +4109,7 @@
         <w:rPr>
           <w:rFonts w:ascii="標楷體" w:eastAsia="標楷體" w:hAnsi="標楷體"/>
         </w:rPr>
-        <w:t xml:space="preserve"> 解決方式：導入 動態伸縮懸浮導航欄。設計智能伸縮收</w:t>
-      </w:r>
-      <w:proofErr w:type="gramStart"/>
-      <w:r>
-        <w:rPr>
-          <w:rFonts w:ascii="標楷體" w:eastAsia="標楷體" w:hAnsi="標楷體"/>
-        </w:rPr>
-        <w:t>摺</w:t>
-      </w:r>
-      <w:proofErr w:type="gramEnd"/>
-      <w:r>
-        <w:rPr>
-          <w:rFonts w:ascii="標楷體" w:eastAsia="標楷體" w:hAnsi="標楷體"/>
-        </w:rPr>
-        <w:t>機制，在特定視圖下會自動縮小為精簡狀態以釋放最大視覺空間，</w:t>
-      </w:r>
-      <w:proofErr w:type="gramStart"/>
-      <w:r>
-        <w:rPr>
-          <w:rFonts w:ascii="標楷體" w:eastAsia="標楷體" w:hAnsi="標楷體"/>
-        </w:rPr>
-        <w:t>滑鼠懸停時</w:t>
-      </w:r>
-      <w:proofErr w:type="gramEnd"/>
-      <w:r>
-        <w:rPr>
-          <w:rFonts w:ascii="標楷體" w:eastAsia="標楷體" w:hAnsi="標楷體"/>
-        </w:rPr>
-        <w:t>再行展開；同時搭配底層陰影區分，使導航列與網頁主體內容清晰隔離，既不遮擋畫面，又能保持操作的順手度。</w:t>
+        <w:t xml:space="preserve"> 解決方式：導入 動態伸縮懸浮導航欄。設計智能伸縮收摺機制，在特定視圖下會自動縮小為精簡狀態以釋放最大視覺空間，滑鼠懸停時再行展開；同時搭配底層陰影區分，使導航列與網頁主體內容清晰隔離，既不遮擋畫面，又能保持操作的順手度。</w:t>
       </w:r>
     </w:p>
     <w:p>
@@ -4703,21 +4157,7 @@
         <w:rPr>
           <w:rFonts w:ascii="標楷體" w:eastAsia="標楷體" w:hAnsi="標楷體"/>
         </w:rPr>
-        <w:t xml:space="preserve"> 遭遇問題：測試時發現，若連續快速點擊導航欄按鈕，頁面的轉場動畫會互相打架並</w:t>
-      </w:r>
-      <w:proofErr w:type="gramStart"/>
-      <w:r>
-        <w:rPr>
-          <w:rFonts w:ascii="標楷體" w:eastAsia="標楷體" w:hAnsi="標楷體"/>
-        </w:rPr>
-        <w:t>反覆跳轉</w:t>
-      </w:r>
-      <w:proofErr w:type="gramEnd"/>
-      <w:r>
-        <w:rPr>
-          <w:rFonts w:ascii="標楷體" w:eastAsia="標楷體" w:hAnsi="標楷體"/>
-        </w:rPr>
-        <w:t>。</w:t>
+        <w:t xml:space="preserve"> 遭遇問題：測試時發現，若連續快速點擊導航欄按鈕，頁面的轉場動畫會互相打架並反覆跳轉。</w:t>
       </w:r>
     </w:p>
     <w:p>
@@ -4737,49 +4177,7 @@
         <w:rPr>
           <w:rFonts w:ascii="標楷體" w:eastAsia="標楷體" w:hAnsi="標楷體"/>
         </w:rPr>
-        <w:t xml:space="preserve"> 解決方式：加入 轉場</w:t>
-      </w:r>
-      <w:proofErr w:type="gramStart"/>
-      <w:r>
-        <w:rPr>
-          <w:rFonts w:ascii="標楷體" w:eastAsia="標楷體" w:hAnsi="標楷體"/>
-        </w:rPr>
-        <w:t>鎖定防呆機制</w:t>
-      </w:r>
-      <w:proofErr w:type="gramEnd"/>
-      <w:r>
-        <w:rPr>
-          <w:rFonts w:ascii="標楷體" w:eastAsia="標楷體" w:hAnsi="標楷體"/>
-        </w:rPr>
-        <w:t>。在頁面切換動畫執行</w:t>
-      </w:r>
-      <w:proofErr w:type="gramStart"/>
-      <w:r>
-        <w:rPr>
-          <w:rFonts w:ascii="標楷體" w:eastAsia="標楷體" w:hAnsi="標楷體"/>
-        </w:rPr>
-        <w:t>期間，</w:t>
-      </w:r>
-      <w:proofErr w:type="gramEnd"/>
-      <w:r>
-        <w:rPr>
-          <w:rFonts w:ascii="標楷體" w:eastAsia="標楷體" w:hAnsi="標楷體"/>
-        </w:rPr>
-        <w:t xml:space="preserve">利用 </w:t>
-      </w:r>
-      <w:proofErr w:type="spellStart"/>
-      <w:r>
-        <w:rPr>
-          <w:rFonts w:ascii="標楷體" w:eastAsia="標楷體" w:hAnsi="標楷體"/>
-        </w:rPr>
-        <w:t>useRef</w:t>
-      </w:r>
-      <w:proofErr w:type="spellEnd"/>
-      <w:r>
-        <w:rPr>
-          <w:rFonts w:ascii="標楷體" w:eastAsia="標楷體" w:hAnsi="標楷體"/>
-        </w:rPr>
-        <w:t xml:space="preserve"> 暫時忽略後續的點擊指令，直到動畫跑完才放行。</w:t>
+        <w:t xml:space="preserve"> 解決方式：加入 轉場鎖定防呆機制。在頁面切換動畫執行期間，利用 useRef 暫時忽略後續的點擊指令，直到動畫跑完才放行。</w:t>
       </w:r>
     </w:p>
     <w:p>
@@ -4827,35 +4225,7 @@
         <w:rPr>
           <w:rFonts w:ascii="標楷體" w:eastAsia="標楷體" w:hAnsi="標楷體"/>
         </w:rPr>
-        <w:t xml:space="preserve"> 遭遇問題：從店家頁或</w:t>
-      </w:r>
-      <w:proofErr w:type="gramStart"/>
-      <w:r>
-        <w:rPr>
-          <w:rFonts w:ascii="標楷體" w:eastAsia="標楷體" w:hAnsi="標楷體"/>
-        </w:rPr>
-        <w:t>餐點頁點擊</w:t>
-      </w:r>
-      <w:proofErr w:type="gramEnd"/>
-      <w:r>
-        <w:rPr>
-          <w:rFonts w:ascii="標楷體" w:eastAsia="標楷體" w:hAnsi="標楷體"/>
-        </w:rPr>
-        <w:t>進入詳情後，按返回會被強制踢回預設頁面，且因為組件掛載時強制回到</w:t>
-      </w:r>
-      <w:proofErr w:type="gramStart"/>
-      <w:r>
-        <w:rPr>
-          <w:rFonts w:ascii="標楷體" w:eastAsia="標楷體" w:hAnsi="標楷體"/>
-        </w:rPr>
-        <w:t>頂部，</w:t>
-      </w:r>
-      <w:proofErr w:type="gramEnd"/>
-      <w:r>
-        <w:rPr>
-          <w:rFonts w:ascii="標楷體" w:eastAsia="標楷體" w:hAnsi="標楷體"/>
-        </w:rPr>
-        <w:t>導致使用者每次都要重頭向下滑。</w:t>
+        <w:t xml:space="preserve"> 遭遇問題：從店家頁或餐點頁點擊進入詳情後，按返回會被強制踢回預設頁面，且因為組件掛載時強制回到頂部，導致使用者每次都要重頭向下滑。</w:t>
       </w:r>
     </w:p>
     <w:p>
@@ -4875,63 +4245,7 @@
         <w:rPr>
           <w:rFonts w:ascii="標楷體" w:eastAsia="標楷體" w:hAnsi="標楷體"/>
         </w:rPr>
-        <w:t xml:space="preserve"> 解決方式：開發全域的 </w:t>
-      </w:r>
-      <w:proofErr w:type="spellStart"/>
-      <w:r>
-        <w:rPr>
-          <w:rFonts w:ascii="標楷體" w:eastAsia="標楷體" w:hAnsi="標楷體"/>
-        </w:rPr>
-        <w:t>useNavigationMemory</w:t>
-      </w:r>
-      <w:proofErr w:type="spellEnd"/>
-      <w:r>
-        <w:rPr>
-          <w:rFonts w:ascii="標楷體" w:eastAsia="標楷體" w:hAnsi="標楷體"/>
-        </w:rPr>
-        <w:t xml:space="preserve"> 導航記憶系統。攔截傳統</w:t>
-      </w:r>
-      <w:proofErr w:type="gramStart"/>
-      <w:r>
-        <w:rPr>
-          <w:rFonts w:ascii="標楷體" w:eastAsia="標楷體" w:hAnsi="標楷體"/>
-        </w:rPr>
-        <w:t>的跳轉邏輯</w:t>
-      </w:r>
-      <w:proofErr w:type="gramEnd"/>
-      <w:r>
-        <w:rPr>
-          <w:rFonts w:ascii="標楷體" w:eastAsia="標楷體" w:hAnsi="標楷體"/>
-        </w:rPr>
-        <w:t>，強制將使用者的「</w:t>
-      </w:r>
-      <w:proofErr w:type="gramStart"/>
-      <w:r>
-        <w:rPr>
-          <w:rFonts w:ascii="標楷體" w:eastAsia="標楷體" w:hAnsi="標楷體"/>
-        </w:rPr>
-        <w:t>來時頁面</w:t>
-      </w:r>
-      <w:proofErr w:type="gramEnd"/>
-      <w:r>
-        <w:rPr>
-          <w:rFonts w:ascii="標楷體" w:eastAsia="標楷體" w:hAnsi="標楷體"/>
-        </w:rPr>
-        <w:t>名稱」與「捲動高度」寫入 sessionStorage，實現「從哪裡來，就回哪裡去」的精</w:t>
-      </w:r>
-      <w:proofErr w:type="gramStart"/>
-      <w:r>
-        <w:rPr>
-          <w:rFonts w:ascii="標楷體" w:eastAsia="標楷體" w:hAnsi="標楷體"/>
-        </w:rPr>
-        <w:t>準</w:t>
-      </w:r>
-      <w:proofErr w:type="gramEnd"/>
-      <w:r>
-        <w:rPr>
-          <w:rFonts w:ascii="標楷體" w:eastAsia="標楷體" w:hAnsi="標楷體"/>
-        </w:rPr>
-        <w:t>定位。</w:t>
+        <w:t xml:space="preserve"> 解決方式：開發全域的 useNavigationMemory 導航記憶系統。攔截傳統的跳轉邏輯，強制將使用者的「來時頁面名稱」與「捲動高度」寫入 sessionStorage，實現「從哪裡來，就回哪裡去」的精準定位。</w:t>
       </w:r>
     </w:p>
     <w:p>
@@ -4979,21 +4293,7 @@
         <w:rPr>
           <w:rFonts w:ascii="標楷體" w:eastAsia="標楷體" w:hAnsi="標楷體"/>
         </w:rPr>
-        <w:t xml:space="preserve"> 遭遇問題：探照燈互動範圍過廣，導致背景頻繁切換；單一卡片在切換明暗狀態</w:t>
-      </w:r>
-      <w:proofErr w:type="gramStart"/>
-      <w:r>
-        <w:rPr>
-          <w:rFonts w:ascii="標楷體" w:eastAsia="標楷體" w:hAnsi="標楷體"/>
-        </w:rPr>
-        <w:t>時區塊感太</w:t>
-      </w:r>
-      <w:proofErr w:type="gramEnd"/>
-      <w:r>
-        <w:rPr>
-          <w:rFonts w:ascii="標楷體" w:eastAsia="標楷體" w:hAnsi="標楷體"/>
-        </w:rPr>
-        <w:t>重，顯得突兀不流暢。</w:t>
+        <w:t xml:space="preserve"> 遭遇問題：探照燈互動範圍過廣，導致背景頻繁切換；單一卡片在切換明暗狀態時區塊感太重，顯得突兀不流暢。</w:t>
       </w:r>
     </w:p>
     <w:p>
@@ -5013,49 +4313,7 @@
         <w:rPr>
           <w:rFonts w:ascii="標楷體" w:eastAsia="標楷體" w:hAnsi="標楷體"/>
         </w:rPr>
-        <w:t xml:space="preserve"> 解決方式：將背景切換的觸發範圍極限縮減至店家 Logo 上，並在互動介面導入「</w:t>
-      </w:r>
-      <w:proofErr w:type="gramStart"/>
-      <w:r>
-        <w:rPr>
-          <w:rFonts w:ascii="標楷體" w:eastAsia="標楷體" w:hAnsi="標楷體"/>
-        </w:rPr>
-        <w:t>雙圖層</w:t>
-      </w:r>
-      <w:proofErr w:type="gramEnd"/>
-      <w:r>
-        <w:rPr>
-          <w:rFonts w:ascii="標楷體" w:eastAsia="標楷體" w:hAnsi="標楷體"/>
-        </w:rPr>
-        <w:t>設計」與 CSS 遮罩技術。底層放置預設的暗色灰階卡片，</w:t>
-      </w:r>
-      <w:proofErr w:type="gramStart"/>
-      <w:r>
-        <w:rPr>
-          <w:rFonts w:ascii="標楷體" w:eastAsia="標楷體" w:hAnsi="標楷體"/>
-        </w:rPr>
-        <w:t>上層疊加</w:t>
-      </w:r>
-      <w:proofErr w:type="gramEnd"/>
-      <w:r>
-        <w:rPr>
-          <w:rFonts w:ascii="標楷體" w:eastAsia="標楷體" w:hAnsi="標楷體"/>
-        </w:rPr>
-        <w:t>完全一致的高光卡片，透過動態追蹤滑鼠座標來渲染 radial-gradient 遮罩範圍，讓手電筒光源能平滑且</w:t>
-      </w:r>
-      <w:proofErr w:type="gramStart"/>
-      <w:r>
-        <w:rPr>
-          <w:rFonts w:ascii="標楷體" w:eastAsia="標楷體" w:hAnsi="標楷體"/>
-        </w:rPr>
-        <w:t>無縫地透</w:t>
-      </w:r>
-      <w:proofErr w:type="gramEnd"/>
-      <w:r>
-        <w:rPr>
-          <w:rFonts w:ascii="標楷體" w:eastAsia="標楷體" w:hAnsi="標楷體"/>
-        </w:rPr>
-        <w:t>出上層亮光，徹底消除實體邊界的生硬感。</w:t>
+        <w:t xml:space="preserve"> 解決方式：將背景切換的觸發範圍極限縮減至店家 Logo 上，並在互動介面導入「雙圖層設計」與 CSS 遮罩技術。底層放置預設的暗色灰階卡片，上層疊加完全一致的高光卡片，透過動態追蹤滑鼠座標來渲染 radial-gradient 遮罩範圍，讓手電筒光源能平滑且無縫地透出上層亮光，徹底消除實體邊界的生硬感。</w:t>
       </w:r>
     </w:p>
     <w:p>
@@ -5123,35 +4381,7 @@
         <w:rPr>
           <w:rFonts w:ascii="標楷體" w:eastAsia="標楷體" w:hAnsi="標楷體"/>
         </w:rPr>
-        <w:t xml:space="preserve"> 解決方式：</w:t>
-      </w:r>
-      <w:proofErr w:type="gramStart"/>
-      <w:r>
-        <w:rPr>
-          <w:rFonts w:ascii="標楷體" w:eastAsia="標楷體" w:hAnsi="標楷體"/>
-        </w:rPr>
-        <w:t>重構燈箱</w:t>
-      </w:r>
-      <w:proofErr w:type="gramEnd"/>
-      <w:r>
-        <w:rPr>
-          <w:rFonts w:ascii="標楷體" w:eastAsia="標楷體" w:hAnsi="標楷體"/>
-        </w:rPr>
-        <w:t xml:space="preserve">檢視邏輯，加入 </w:t>
-      </w:r>
-      <w:proofErr w:type="gramStart"/>
-      <w:r>
-        <w:rPr>
-          <w:rFonts w:ascii="標楷體" w:eastAsia="標楷體" w:hAnsi="標楷體"/>
-        </w:rPr>
-        <w:t>直覺式的游標</w:t>
-      </w:r>
-      <w:proofErr w:type="gramEnd"/>
-      <w:r>
-        <w:rPr>
-          <w:rFonts w:ascii="標楷體" w:eastAsia="標楷體" w:hAnsi="標楷體"/>
-        </w:rPr>
-        <w:t>拖曳機制，統一介面互動視覺，也能 享受直覺</w:t>
+        <w:t xml:space="preserve"> 解決方式：重構燈箱檢視邏輯，加入 直覺式的游標拖曳機制，統一介面互動視覺，也能 享受直覺</w:t>
       </w:r>
       <w:r>
         <w:rPr>
@@ -5280,21 +4510,7 @@
         <w:rPr>
           <w:rFonts w:ascii="標楷體" w:eastAsia="標楷體" w:hAnsi="標楷體"/>
         </w:rPr>
-        <w:t xml:space="preserve"> 遭遇問題：原先的營業時間資料結構未能對齊，導致程式邏輯在判斷「今日星期幾」</w:t>
-      </w:r>
-      <w:proofErr w:type="gramStart"/>
-      <w:r>
-        <w:rPr>
-          <w:rFonts w:ascii="標楷體" w:eastAsia="標楷體" w:hAnsi="標楷體"/>
-        </w:rPr>
-        <w:t>時抓不到</w:t>
-      </w:r>
-      <w:proofErr w:type="gramEnd"/>
-      <w:r>
-        <w:rPr>
-          <w:rFonts w:ascii="標楷體" w:eastAsia="標楷體" w:hAnsi="標楷體"/>
-        </w:rPr>
-        <w:t>資料而失效。</w:t>
+        <w:t xml:space="preserve"> 遭遇問題：原先的營業時間資料結構未能對齊，導致程式邏輯在判斷「今日星期幾」時抓不到資料而失效。</w:t>
       </w:r>
     </w:p>
     <w:p>
@@ -5314,35 +4530,7 @@
         <w:rPr>
           <w:rFonts w:ascii="標楷體" w:eastAsia="標楷體" w:hAnsi="標楷體"/>
         </w:rPr>
-        <w:t xml:space="preserve"> 解決方式：修正資料判斷演算法，利用 </w:t>
-      </w:r>
-      <w:proofErr w:type="spellStart"/>
-      <w:r>
-        <w:rPr>
-          <w:rFonts w:ascii="標楷體" w:eastAsia="標楷體" w:hAnsi="標楷體"/>
-        </w:rPr>
-        <w:t>Array.find</w:t>
-      </w:r>
-      <w:proofErr w:type="spellEnd"/>
-      <w:r>
-        <w:rPr>
-          <w:rFonts w:ascii="標楷體" w:eastAsia="標楷體" w:hAnsi="標楷體"/>
-        </w:rPr>
-        <w:t>() 精</w:t>
-      </w:r>
-      <w:proofErr w:type="gramStart"/>
-      <w:r>
-        <w:rPr>
-          <w:rFonts w:ascii="標楷體" w:eastAsia="標楷體" w:hAnsi="標楷體"/>
-        </w:rPr>
-        <w:t>準</w:t>
-      </w:r>
-      <w:proofErr w:type="gramEnd"/>
-      <w:r>
-        <w:rPr>
-          <w:rFonts w:ascii="標楷體" w:eastAsia="標楷體" w:hAnsi="標楷體"/>
-        </w:rPr>
-        <w:t>抓取當日陣列，並加入時間換算機制，讓系統能正確比對當下時間是否落在店家的營業區間內。</w:t>
+        <w:t xml:space="preserve"> 解決方式：修正資料判斷演算法，利用 Array.find() 精準抓取當日陣列，並加入時間換算機制，讓系統能正確比對當下時間是否落在店家的營業區間內。</w:t>
       </w:r>
     </w:p>
     <w:p>
@@ -5410,21 +4598,7 @@
         <w:rPr>
           <w:rFonts w:ascii="標楷體" w:eastAsia="標楷體" w:hAnsi="標楷體"/>
         </w:rPr>
-        <w:t xml:space="preserve"> 解決方式：重構視覺邏輯，將全站狀態徽章統一。不論狀態為何皆加上圓角外框，並將公休樣式加深為 </w:t>
-      </w:r>
-      <w:proofErr w:type="gramStart"/>
-      <w:r>
-        <w:rPr>
-          <w:rFonts w:ascii="標楷體" w:eastAsia="標楷體" w:hAnsi="標楷體"/>
-        </w:rPr>
-        <w:t>灰色底框與</w:t>
-      </w:r>
-      <w:proofErr w:type="gramEnd"/>
-      <w:r>
-        <w:rPr>
-          <w:rFonts w:ascii="標楷體" w:eastAsia="標楷體" w:hAnsi="標楷體"/>
-        </w:rPr>
-        <w:t>深黑字體，大幅提升畫面的一致性與資訊辨識度。</w:t>
+        <w:t xml:space="preserve"> 解決方式：重構視覺邏輯，將全站狀態徽章統一。不論狀態為何皆加上圓角外框，並將公休樣式加深為 灰色底框與深黑字體，大幅提升畫面的一致性與資訊辨識度。</w:t>
       </w:r>
     </w:p>
     <w:p>
@@ -5492,21 +4666,7 @@
         <w:rPr>
           <w:rFonts w:ascii="標楷體" w:eastAsia="標楷體" w:hAnsi="標楷體"/>
         </w:rPr>
-        <w:t xml:space="preserve"> 解決方式：全面捨棄下拉選單，改用 橫向平鋪膠囊按鈕。不僅解決了圖示顯示問題，</w:t>
-      </w:r>
-      <w:proofErr w:type="gramStart"/>
-      <w:r>
-        <w:rPr>
-          <w:rFonts w:ascii="標楷體" w:eastAsia="標楷體" w:hAnsi="標楷體"/>
-        </w:rPr>
-        <w:t>一鍵式的操作</w:t>
-      </w:r>
-      <w:proofErr w:type="gramEnd"/>
-      <w:r>
-        <w:rPr>
-          <w:rFonts w:ascii="標楷體" w:eastAsia="標楷體" w:hAnsi="標楷體"/>
-        </w:rPr>
-        <w:t>也完美規避了 3D 空間遮擋的 Bug。</w:t>
+        <w:t xml:space="preserve"> 解決方式：全面捨棄下拉選單，改用 橫向平鋪膠囊按鈕。不僅解決了圖示顯示問題，一鍵式的操作也完美規避了 3D 空間遮擋的 Bug。</w:t>
       </w:r>
     </w:p>
     <w:p>
@@ -5642,42 +4802,14 @@
         <w:rPr>
           <w:rFonts w:ascii="標楷體" w:eastAsia="標楷體" w:hAnsi="標楷體"/>
         </w:rPr>
-        <w:t xml:space="preserve"> 解決方式：將地圖端與手機端綁定至同一</w:t>
-      </w:r>
-      <w:proofErr w:type="gramStart"/>
-      <w:r>
-        <w:rPr>
-          <w:rFonts w:ascii="標楷體" w:eastAsia="標楷體" w:hAnsi="標楷體"/>
-        </w:rPr>
-        <w:t>個</w:t>
-      </w:r>
-      <w:proofErr w:type="gramEnd"/>
-      <w:r>
-        <w:rPr>
-          <w:rFonts w:ascii="標楷體" w:eastAsia="標楷體" w:hAnsi="標楷體"/>
-        </w:rPr>
-        <w:t xml:space="preserve"> 全局選取狀態。只要地圖一發</w:t>
+        <w:t xml:space="preserve"> 解決方式：將地圖端與手機端綁定至同一個 全局選取狀態。只要地圖一發</w:t>
       </w:r>
       <w:r>
         <w:rPr>
           <w:rFonts w:ascii="標楷體" w:eastAsia="標楷體" w:hAnsi="標楷體"/>
         </w:rPr>
         <w:lastRenderedPageBreak/>
-        <w:t>送點擊事件，</w:t>
-      </w:r>
-      <w:proofErr w:type="gramStart"/>
-      <w:r>
-        <w:rPr>
-          <w:rFonts w:ascii="標楷體" w:eastAsia="標楷體" w:hAnsi="標楷體"/>
-        </w:rPr>
-        <w:t>手機端便立即</w:t>
-      </w:r>
-      <w:proofErr w:type="gramEnd"/>
-      <w:r>
-        <w:rPr>
-          <w:rFonts w:ascii="標楷體" w:eastAsia="標楷體" w:hAnsi="標楷體"/>
-        </w:rPr>
-        <w:t>攔截資料並同步切換內容。</w:t>
+        <w:t>送點擊事件，手機端便立即攔截資料並同步切換內容。</w:t>
       </w:r>
     </w:p>
     <w:p>
@@ -5726,21 +4858,7 @@
         <w:rPr>
           <w:rFonts w:ascii="標楷體" w:eastAsia="標楷體" w:hAnsi="標楷體"/>
         </w:rPr>
-        <w:t xml:space="preserve"> 遭遇問題：為了將交通時間從「靜態假資料」升級為「即時 API 運算」，在導入動態資料流時，因元件漏接參數（如 </w:t>
-      </w:r>
-      <w:proofErr w:type="spellStart"/>
-      <w:r>
-        <w:rPr>
-          <w:rFonts w:ascii="標楷體" w:eastAsia="標楷體" w:hAnsi="標楷體"/>
-        </w:rPr>
-        <w:t>shopsData</w:t>
-      </w:r>
-      <w:proofErr w:type="spellEnd"/>
-      <w:r>
-        <w:rPr>
-          <w:rFonts w:ascii="標楷體" w:eastAsia="標楷體" w:hAnsi="標楷體"/>
-        </w:rPr>
-        <w:t>），導致出現 Cannot read properties of null 的白畫面當機錯誤。</w:t>
+        <w:t xml:space="preserve"> 遭遇問題：為了將交通時間從「靜態假資料」升級為「即時 API 運算」，在導入動態資料流時，因元件漏接參數（如 shopsData），導致出現 Cannot read properties of null 的白畫面當機錯誤。</w:t>
       </w:r>
     </w:p>
     <w:p>
@@ -5760,35 +4878,7 @@
         <w:rPr>
           <w:rFonts w:ascii="標楷體" w:eastAsia="標楷體" w:hAnsi="標楷體"/>
         </w:rPr>
-        <w:t xml:space="preserve"> 解決方式：重新梳理 全域資料流架構。由最上層 </w:t>
-      </w:r>
-      <w:proofErr w:type="spellStart"/>
-      <w:r>
-        <w:rPr>
-          <w:rFonts w:ascii="標楷體" w:eastAsia="標楷體" w:hAnsi="標楷體"/>
-        </w:rPr>
-        <w:t>App.jsx</w:t>
-      </w:r>
-      <w:proofErr w:type="spellEnd"/>
-      <w:r>
-        <w:rPr>
-          <w:rFonts w:ascii="標楷體" w:eastAsia="標楷體" w:hAnsi="標楷體"/>
-        </w:rPr>
-        <w:t xml:space="preserve"> 集中呼叫 </w:t>
-      </w:r>
-      <w:proofErr w:type="spellStart"/>
-      <w:r>
-        <w:rPr>
-          <w:rFonts w:ascii="標楷體" w:eastAsia="標楷體" w:hAnsi="標楷體"/>
-        </w:rPr>
-        <w:t>useDynamicDistances</w:t>
-      </w:r>
-      <w:proofErr w:type="spellEnd"/>
-      <w:r>
-        <w:rPr>
-          <w:rFonts w:ascii="標楷體" w:eastAsia="標楷體" w:hAnsi="標楷體"/>
-        </w:rPr>
-        <w:t xml:space="preserve"> 獲取真實通勤時間，再將算好的資料</w:t>
+        <w:t xml:space="preserve"> 解決方式：重新梳理 全域資料流架構。由最上層 App.jsx 集中呼叫 useDynamicDistances 獲取真實通勤時間，再將算好的資料</w:t>
       </w:r>
       <w:r>
         <w:rPr>
@@ -5807,7 +4897,6 @@
       <w:pPr>
         <w:rPr>
           <w:rFonts w:eastAsia="DengXian"/>
-          <w:lang w:eastAsia="zh-CN"/>
         </w:rPr>
       </w:pPr>
     </w:p>
@@ -5815,15 +4904,13 @@
       <w:pPr>
         <w:rPr>
           <w:rFonts w:eastAsia="DengXian"/>
-          <w:lang w:eastAsia="zh-CN"/>
-        </w:rPr>
-      </w:pPr>
-    </w:p>
-    <w:p>
-      <w:pPr>
-        <w:rPr>
-          <w:rFonts w:eastAsia="DengXian" w:hint="eastAsia"/>
-          <w:lang w:eastAsia="zh-CN"/>
+        </w:rPr>
+      </w:pPr>
+    </w:p>
+    <w:p>
+      <w:pPr>
+        <w:rPr>
+          <w:rFonts w:eastAsia="DengXian"/>
         </w:rPr>
       </w:pPr>
     </w:p>
@@ -6690,6 +5777,7 @@
   <w:style w:type="character" w:default="1" w:styleId="a0">
     <w:name w:val="Default Paragraph Font"/>
     <w:uiPriority w:val="1"/>
+    <w:semiHidden/>
     <w:unhideWhenUsed/>
   </w:style>
   <w:style w:type="table" w:default="1" w:styleId="a1">

</xml_diff>

<commit_message>
chore: remove legacy assets and code, update README v0.4.62
</commit_message>
<xml_diff>
--- a/TO DO.docx
+++ b/TO DO.docx
@@ -372,14 +372,12 @@
       <w:pPr>
         <w:rPr>
           <w:rFonts w:ascii="標楷體" w:eastAsia="標楷體" w:hAnsi="標楷體"/>
-          <w:lang w:eastAsia="zh-CN"/>
         </w:rPr>
       </w:pPr>
       <w:sdt>
         <w:sdtPr>
           <w:rPr>
             <w:rFonts w:ascii="標楷體" w:eastAsia="標楷體" w:hAnsi="標楷體" w:hint="eastAsia"/>
-            <w:lang w:eastAsia="zh-CN"/>
           </w:rPr>
           <w:id w:val="32860994"/>
           <w14:checkbox>
@@ -392,7 +390,6 @@
           <w:r>
             <w:rPr>
               <w:rFonts w:ascii="MS Gothic" w:eastAsia="MS Gothic" w:hAnsi="MS Gothic" w:hint="eastAsia"/>
-              <w:lang w:eastAsia="zh-CN"/>
             </w:rPr>
             <w:t>☒</w:t>
           </w:r>
@@ -401,7 +398,6 @@
       <w:r>
         <w:rPr>
           <w:rFonts w:ascii="標楷體" w:eastAsia="標楷體" w:hAnsi="標楷體" w:hint="eastAsia"/>
-          <w:lang w:eastAsia="zh-CN"/>
         </w:rPr>
         <w:t>返回纽實裝(或者只修改返回方式)</w:t>
       </w:r>
@@ -437,8 +433,16 @@
         <w:rPr>
           <w:rFonts w:ascii="標楷體" w:eastAsia="標楷體" w:hAnsi="標楷體" w:hint="eastAsia"/>
         </w:rPr>
-        <w:t xml:space="preserve"> 地圖頁店家營業狀態標註</w:t>
-      </w:r>
+        <w:t xml:space="preserve"> 地圖頁店家營業狀態標</w:t>
+      </w:r>
+      <w:proofErr w:type="gramStart"/>
+      <w:r>
+        <w:rPr>
+          <w:rFonts w:ascii="標楷體" w:eastAsia="標楷體" w:hAnsi="標楷體" w:hint="eastAsia"/>
+        </w:rPr>
+        <w:t>註</w:t>
+      </w:r>
+      <w:proofErr w:type="gramEnd"/>
     </w:p>
     <w:p>
       <w:pPr>
@@ -475,7 +479,23 @@
           <w:rFonts w:ascii="標楷體" w:eastAsia="標楷體" w:hAnsi="標楷體" w:hint="eastAsia"/>
           <w:lang w:eastAsia="zh-CN"/>
         </w:rPr>
-        <w:t xml:space="preserve"> 店家详情页交通时间数据动态调整</w:t>
+        <w:t xml:space="preserve"> 店家详情</w:t>
+      </w:r>
+      <w:proofErr w:type="gramStart"/>
+      <w:r>
+        <w:rPr>
+          <w:rFonts w:ascii="標楷體" w:eastAsia="標楷體" w:hAnsi="標楷體" w:hint="eastAsia"/>
+          <w:lang w:eastAsia="zh-CN"/>
+        </w:rPr>
+        <w:t>页交通</w:t>
+      </w:r>
+      <w:proofErr w:type="gramEnd"/>
+      <w:r>
+        <w:rPr>
+          <w:rFonts w:ascii="標楷體" w:eastAsia="標楷體" w:hAnsi="標楷體" w:hint="eastAsia"/>
+          <w:lang w:eastAsia="zh-CN"/>
+        </w:rPr>
+        <w:t>时间数据动态调整</w:t>
       </w:r>
     </w:p>
     <w:p>
@@ -501,7 +521,7 @@
         <w:sdtContent>
           <w:r>
             <w:rPr>
-              <w:rFonts w:ascii="Segoe UI Symbol" w:eastAsia="標楷體" w:hAnsi="Segoe UI Symbol" w:cs="Segoe UI Symbol"/>
+              <w:rFonts w:ascii="MS Gothic" w:eastAsia="MS Gothic" w:hAnsi="MS Gothic" w:hint="eastAsia"/>
               <w:lang w:eastAsia="zh-CN"/>
             </w:rPr>
             <w:t>☐</w:t>
@@ -526,15 +546,13 @@
     <w:p>
       <w:pPr>
         <w:rPr>
-          <w:rFonts w:ascii="標楷體" w:eastAsia="標楷體" w:hAnsi="標楷體"/>
-          <w:lang w:eastAsia="zh-CN"/>
+          <w:rFonts w:ascii="標楷體" w:eastAsia="DengXian" w:hAnsi="標楷體"/>
         </w:rPr>
       </w:pPr>
       <w:sdt>
         <w:sdtPr>
           <w:rPr>
             <w:rFonts w:ascii="標楷體" w:eastAsia="標楷體" w:hAnsi="標楷體" w:hint="eastAsia"/>
-            <w:lang w:eastAsia="zh-CN"/>
           </w:rPr>
           <w:id w:val="-942916307"/>
           <w14:checkbox>
@@ -547,7 +565,6 @@
           <w:r>
             <w:rPr>
               <w:rFonts w:ascii="Segoe UI Symbol" w:eastAsia="標楷體" w:hAnsi="Segoe UI Symbol" w:cs="Segoe UI Symbol"/>
-              <w:lang w:eastAsia="zh-CN"/>
             </w:rPr>
             <w:t>☐</w:t>
           </w:r>
@@ -557,20 +574,13 @@
         <w:rPr>
           <w:rFonts w:ascii="標楷體" w:eastAsia="標楷體" w:hAnsi="標楷體" w:hint="eastAsia"/>
         </w:rPr>
-        <w:t xml:space="preserve"> </w:t>
-      </w:r>
-      <w:r>
-        <w:rPr>
-          <w:rFonts w:ascii="標楷體" w:eastAsia="標楷體" w:hAnsi="標楷體" w:hint="eastAsia"/>
-          <w:lang w:eastAsia="zh-CN"/>
-        </w:rPr>
-        <w:t>開始導航</w:t>
-      </w:r>
-    </w:p>
-    <w:p>
-      <w:pPr>
-        <w:rPr>
-          <w:rFonts w:ascii="標楷體" w:eastAsia="標楷體" w:hAnsi="標楷體"/>
+        <w:t xml:space="preserve"> 開始導航</w:t>
+      </w:r>
+    </w:p>
+    <w:p>
+      <w:pPr>
+        <w:rPr>
+          <w:rFonts w:ascii="標楷體" w:eastAsia="DengXian" w:hAnsi="標楷體"/>
         </w:rPr>
       </w:pPr>
       <w:sdt>
@@ -768,7 +778,23 @@
           <w:rFonts w:ascii="標楷體" w:eastAsia="標楷體" w:hAnsi="標楷體" w:hint="eastAsia"/>
           <w:lang w:eastAsia="zh-CN"/>
         </w:rPr>
-        <w:t xml:space="preserve"> 封面樣式(可不修改)</w:t>
+        <w:t xml:space="preserve"> 封面</w:t>
+      </w:r>
+      <w:proofErr w:type="gramStart"/>
+      <w:r>
+        <w:rPr>
+          <w:rFonts w:ascii="標楷體" w:eastAsia="標楷體" w:hAnsi="標楷體" w:hint="eastAsia"/>
+          <w:lang w:eastAsia="zh-CN"/>
+        </w:rPr>
+        <w:t>樣</w:t>
+      </w:r>
+      <w:proofErr w:type="gramEnd"/>
+      <w:r>
+        <w:rPr>
+          <w:rFonts w:ascii="標楷體" w:eastAsia="標楷體" w:hAnsi="標楷體" w:hint="eastAsia"/>
+          <w:lang w:eastAsia="zh-CN"/>
+        </w:rPr>
+        <w:t>式(可不修改)</w:t>
       </w:r>
     </w:p>
     <w:p>
@@ -806,7 +832,23 @@
           <w:rFonts w:ascii="標楷體" w:eastAsia="標楷體" w:hAnsi="標楷體" w:hint="eastAsia"/>
           <w:lang w:eastAsia="zh-CN"/>
         </w:rPr>
-        <w:t xml:space="preserve"> 营业中筛选纽实装</w:t>
+        <w:t xml:space="preserve"> 营业中筛选</w:t>
+      </w:r>
+      <w:proofErr w:type="gramStart"/>
+      <w:r>
+        <w:rPr>
+          <w:rFonts w:ascii="標楷體" w:eastAsia="標楷體" w:hAnsi="標楷體" w:hint="eastAsia"/>
+          <w:lang w:eastAsia="zh-CN"/>
+        </w:rPr>
+        <w:t>纽</w:t>
+      </w:r>
+      <w:proofErr w:type="gramEnd"/>
+      <w:r>
+        <w:rPr>
+          <w:rFonts w:ascii="標楷體" w:eastAsia="標楷體" w:hAnsi="標楷體" w:hint="eastAsia"/>
+          <w:lang w:eastAsia="zh-CN"/>
+        </w:rPr>
+        <w:t>实装</w:t>
       </w:r>
     </w:p>
     <w:p>
@@ -1013,7 +1055,23 @@
           <w:rFonts w:ascii="標楷體" w:eastAsia="標楷體" w:hAnsi="標楷體" w:hint="eastAsia"/>
           <w:lang w:eastAsia="zh-CN"/>
         </w:rPr>
-        <w:t xml:space="preserve"> 店家页特色餐点放大检视，文字描述</w:t>
+        <w:t xml:space="preserve"> 店家</w:t>
+      </w:r>
+      <w:proofErr w:type="gramStart"/>
+      <w:r>
+        <w:rPr>
+          <w:rFonts w:ascii="標楷體" w:eastAsia="標楷體" w:hAnsi="標楷體" w:hint="eastAsia"/>
+          <w:lang w:eastAsia="zh-CN"/>
+        </w:rPr>
+        <w:t>页特色餐点</w:t>
+      </w:r>
+      <w:proofErr w:type="gramEnd"/>
+      <w:r>
+        <w:rPr>
+          <w:rFonts w:ascii="標楷體" w:eastAsia="標楷體" w:hAnsi="標楷體" w:hint="eastAsia"/>
+          <w:lang w:eastAsia="zh-CN"/>
+        </w:rPr>
+        <w:t>放大检视，文字描述</w:t>
       </w:r>
       <w:r>
         <w:rPr>
@@ -1058,7 +1116,23 @@
           <w:rFonts w:ascii="標楷體" w:eastAsia="標楷體" w:hAnsi="標楷體" w:hint="eastAsia"/>
           <w:lang w:eastAsia="zh-CN"/>
         </w:rPr>
-        <w:t xml:space="preserve"> 菜单灯箱置顶纽不该出现</w:t>
+        <w:t xml:space="preserve"> 菜单灯箱置顶</w:t>
+      </w:r>
+      <w:proofErr w:type="gramStart"/>
+      <w:r>
+        <w:rPr>
+          <w:rFonts w:ascii="標楷體" w:eastAsia="標楷體" w:hAnsi="標楷體" w:hint="eastAsia"/>
+          <w:lang w:eastAsia="zh-CN"/>
+        </w:rPr>
+        <w:t>纽</w:t>
+      </w:r>
+      <w:proofErr w:type="gramEnd"/>
+      <w:r>
+        <w:rPr>
+          <w:rFonts w:ascii="標楷體" w:eastAsia="標楷體" w:hAnsi="標楷體" w:hint="eastAsia"/>
+          <w:lang w:eastAsia="zh-CN"/>
+        </w:rPr>
+        <w:t>不该出现</w:t>
       </w:r>
     </w:p>
     <w:p>
@@ -1096,7 +1170,23 @@
           <w:rFonts w:ascii="標楷體" w:eastAsia="標楷體" w:hAnsi="標楷體" w:hint="eastAsia"/>
           <w:lang w:eastAsia="zh-CN"/>
         </w:rPr>
-        <w:t xml:space="preserve"> 店家详情页特色餐点hover效果去除</w:t>
+        <w:t xml:space="preserve"> 店家详情</w:t>
+      </w:r>
+      <w:proofErr w:type="gramStart"/>
+      <w:r>
+        <w:rPr>
+          <w:rFonts w:ascii="標楷體" w:eastAsia="標楷體" w:hAnsi="標楷體" w:hint="eastAsia"/>
+          <w:lang w:eastAsia="zh-CN"/>
+        </w:rPr>
+        <w:t>页特色餐点</w:t>
+      </w:r>
+      <w:proofErr w:type="gramEnd"/>
+      <w:r>
+        <w:rPr>
+          <w:rFonts w:ascii="標楷體" w:eastAsia="標楷體" w:hAnsi="標楷體" w:hint="eastAsia"/>
+          <w:lang w:eastAsia="zh-CN"/>
+        </w:rPr>
+        <w:t>hover效果去除</w:t>
       </w:r>
     </w:p>
     <w:p>
@@ -1168,7 +1258,21 @@
         <w:rPr>
           <w:rFonts w:ascii="標楷體" w:eastAsia="標楷體" w:hAnsi="標楷體" w:hint="eastAsia"/>
         </w:rPr>
-        <w:t xml:space="preserve"> 公休圖標換成純文字</w:t>
+        <w:t xml:space="preserve"> 公休</w:t>
+      </w:r>
+      <w:proofErr w:type="gramStart"/>
+      <w:r>
+        <w:rPr>
+          <w:rFonts w:ascii="標楷體" w:eastAsia="標楷體" w:hAnsi="標楷體" w:hint="eastAsia"/>
+        </w:rPr>
+        <w:t>圖標換成</w:t>
+      </w:r>
+      <w:proofErr w:type="gramEnd"/>
+      <w:r>
+        <w:rPr>
+          <w:rFonts w:ascii="標楷體" w:eastAsia="標楷體" w:hAnsi="標楷體" w:hint="eastAsia"/>
+        </w:rPr>
+        <w:t>純文字</w:t>
       </w:r>
     </w:p>
     <w:p>
@@ -1260,7 +1364,21 @@
         <w:rPr>
           <w:rFonts w:ascii="標楷體" w:eastAsia="標楷體" w:hAnsi="標楷體" w:hint="eastAsia"/>
         </w:rPr>
-        <w:t>nfo文本及圖片替換成figma上的、</w:t>
+        <w:t>nfo文本及圖片替換成</w:t>
+      </w:r>
+      <w:proofErr w:type="spellStart"/>
+      <w:r>
+        <w:rPr>
+          <w:rFonts w:ascii="標楷體" w:eastAsia="標楷體" w:hAnsi="標楷體" w:hint="eastAsia"/>
+        </w:rPr>
+        <w:t>figma</w:t>
+      </w:r>
+      <w:proofErr w:type="spellEnd"/>
+      <w:r>
+        <w:rPr>
+          <w:rFonts w:ascii="標楷體" w:eastAsia="標楷體" w:hAnsi="標楷體" w:hint="eastAsia"/>
+        </w:rPr>
+        <w:t>上的、</w:t>
       </w:r>
       <w:r>
         <w:rPr>
@@ -1399,12 +1517,14 @@
         </w:rPr>
         <w:t>con(或文本圖替代)</w:t>
       </w:r>
+      <w:proofErr w:type="gramStart"/>
       <w:r>
         <w:rPr>
           <w:rFonts w:ascii="標楷體" w:eastAsia="標楷體" w:hAnsi="標楷體" w:hint="eastAsia"/>
         </w:rPr>
         <w:t>——</w:t>
       </w:r>
+      <w:proofErr w:type="gramEnd"/>
     </w:p>
     <w:p>
       <w:pPr>
@@ -1426,7 +1546,23 @@
           <w:rFonts w:ascii="標楷體" w:eastAsia="標楷體" w:hAnsi="標楷體" w:hint="eastAsia"/>
           <w:lang w:eastAsia="zh-CN"/>
         </w:rPr>
-        <w:t>1.原生select中的option无法使用img。</w:t>
+        <w:t>1.原生select中的option无法使用</w:t>
+      </w:r>
+      <w:proofErr w:type="spellStart"/>
+      <w:r>
+        <w:rPr>
+          <w:rFonts w:ascii="標楷體" w:eastAsia="標楷體" w:hAnsi="標楷體" w:hint="eastAsia"/>
+          <w:lang w:eastAsia="zh-CN"/>
+        </w:rPr>
+        <w:t>img</w:t>
+      </w:r>
+      <w:proofErr w:type="spellEnd"/>
+      <w:r>
+        <w:rPr>
+          <w:rFonts w:ascii="標楷體" w:eastAsia="標楷體" w:hAnsi="標楷體" w:hint="eastAsia"/>
+          <w:lang w:eastAsia="zh-CN"/>
+        </w:rPr>
+        <w:t>。</w:t>
       </w:r>
     </w:p>
     <w:p>
@@ -1465,7 +1601,23 @@
           <w:rFonts w:ascii="標楷體" w:eastAsia="標楷體" w:hAnsi="標楷體"/>
           <w:lang w:eastAsia="zh-CN"/>
         </w:rPr>
-        <w:t>簡化成「1 鍵」的平面化標籤</w:t>
+        <w:t>簡化成「1 鍵」的平面化</w:t>
+      </w:r>
+      <w:proofErr w:type="gramStart"/>
+      <w:r>
+        <w:rPr>
+          <w:rFonts w:ascii="標楷體" w:eastAsia="標楷體" w:hAnsi="標楷體"/>
+          <w:lang w:eastAsia="zh-CN"/>
+        </w:rPr>
+        <w:t>標</w:t>
+      </w:r>
+      <w:proofErr w:type="gramEnd"/>
+      <w:r>
+        <w:rPr>
+          <w:rFonts w:ascii="標楷體" w:eastAsia="標楷體" w:hAnsi="標楷體"/>
+          <w:lang w:eastAsia="zh-CN"/>
+        </w:rPr>
+        <w:t>籤</w:t>
       </w:r>
       <w:r>
         <w:rPr>
@@ -1479,7 +1631,23 @@
           <w:rFonts w:ascii="標楷體" w:eastAsia="標楷體" w:hAnsi="標楷體"/>
           <w:lang w:eastAsia="zh-CN"/>
         </w:rPr>
-        <w:t>橫向膠囊標籤（Pill/Chip Buttons）</w:t>
+        <w:t>橫向膠囊</w:t>
+      </w:r>
+      <w:proofErr w:type="gramStart"/>
+      <w:r>
+        <w:rPr>
+          <w:rFonts w:ascii="標楷體" w:eastAsia="標楷體" w:hAnsi="標楷體"/>
+          <w:lang w:eastAsia="zh-CN"/>
+        </w:rPr>
+        <w:t>標</w:t>
+      </w:r>
+      <w:proofErr w:type="gramEnd"/>
+      <w:r>
+        <w:rPr>
+          <w:rFonts w:ascii="標楷體" w:eastAsia="標楷體" w:hAnsi="標楷體"/>
+          <w:lang w:eastAsia="zh-CN"/>
+        </w:rPr>
+        <w:t>籤（Pill/Chip Buttons）</w:t>
       </w:r>
     </w:p>
     <w:p>
@@ -1515,11 +1683,19 @@
         </w:rPr>
         <w:t xml:space="preserve"> </w:t>
       </w:r>
-      <w:r>
-        <w:rPr>
-          <w:rFonts w:ascii="標楷體" w:eastAsia="標楷體" w:hAnsi="標楷體"/>
-        </w:rPr>
-        <w:t>線上菜單放大燈箱</w:t>
+      <w:proofErr w:type="gramStart"/>
+      <w:r>
+        <w:rPr>
+          <w:rFonts w:ascii="標楷體" w:eastAsia="標楷體" w:hAnsi="標楷體"/>
+        </w:rPr>
+        <w:t>線上菜單</w:t>
+      </w:r>
+      <w:proofErr w:type="gramEnd"/>
+      <w:r>
+        <w:rPr>
+          <w:rFonts w:ascii="標楷體" w:eastAsia="標楷體" w:hAnsi="標楷體"/>
+        </w:rPr>
+        <w:t>放大燈箱</w:t>
       </w:r>
       <w:r>
         <w:rPr>
@@ -1570,7 +1746,39 @@
           <w:rFonts w:ascii="標楷體" w:eastAsia="標楷體" w:hAnsi="標楷體"/>
           <w:lang w:eastAsia="zh-CN"/>
         </w:rPr>
-        <w:t>線上菜單放大燈箱</w:t>
+        <w:t>線上菜</w:t>
+      </w:r>
+      <w:proofErr w:type="gramStart"/>
+      <w:r>
+        <w:rPr>
+          <w:rFonts w:ascii="標楷體" w:eastAsia="標楷體" w:hAnsi="標楷體"/>
+          <w:lang w:eastAsia="zh-CN"/>
+        </w:rPr>
+        <w:t>單</w:t>
+      </w:r>
+      <w:proofErr w:type="gramEnd"/>
+      <w:r>
+        <w:rPr>
+          <w:rFonts w:ascii="標楷體" w:eastAsia="標楷體" w:hAnsi="標楷體"/>
+          <w:lang w:eastAsia="zh-CN"/>
+        </w:rPr>
+        <w:t>放大</w:t>
+      </w:r>
+      <w:proofErr w:type="gramStart"/>
+      <w:r>
+        <w:rPr>
+          <w:rFonts w:ascii="標楷體" w:eastAsia="標楷體" w:hAnsi="標楷體"/>
+          <w:lang w:eastAsia="zh-CN"/>
+        </w:rPr>
+        <w:t>燈</w:t>
+      </w:r>
+      <w:proofErr w:type="gramEnd"/>
+      <w:r>
+        <w:rPr>
+          <w:rFonts w:ascii="標楷體" w:eastAsia="標楷體" w:hAnsi="標楷體"/>
+          <w:lang w:eastAsia="zh-CN"/>
+        </w:rPr>
+        <w:t>箱</w:t>
       </w:r>
       <w:r>
         <w:rPr>
@@ -1650,7 +1858,21 @@
         <w:rPr>
           <w:rFonts w:ascii="標楷體" w:eastAsia="標楷體" w:hAnsi="標楷體" w:hint="eastAsia"/>
         </w:rPr>
-        <w:t xml:space="preserve"> shopDetail返回shops未維持原位</w:t>
+        <w:t xml:space="preserve"> </w:t>
+      </w:r>
+      <w:proofErr w:type="spellStart"/>
+      <w:r>
+        <w:rPr>
+          <w:rFonts w:ascii="標楷體" w:eastAsia="標楷體" w:hAnsi="標楷體" w:hint="eastAsia"/>
+        </w:rPr>
+        <w:t>shopDetail</w:t>
+      </w:r>
+      <w:proofErr w:type="spellEnd"/>
+      <w:r>
+        <w:rPr>
+          <w:rFonts w:ascii="標楷體" w:eastAsia="標楷體" w:hAnsi="標楷體" w:hint="eastAsia"/>
+        </w:rPr>
+        <w:t>返回shops未維持原位</w:t>
       </w:r>
     </w:p>
     <w:p>
@@ -1837,7 +2059,23 @@
           <w:rFonts w:ascii="標楷體" w:eastAsia="標楷體" w:hAnsi="標楷體" w:hint="eastAsia"/>
           <w:lang w:eastAsia="zh-CN"/>
         </w:rPr>
-        <w:t xml:space="preserve"> 店家页根据当前星期调整营业时间</w:t>
+        <w:t xml:space="preserve"> 店家</w:t>
+      </w:r>
+      <w:proofErr w:type="gramStart"/>
+      <w:r>
+        <w:rPr>
+          <w:rFonts w:ascii="標楷體" w:eastAsia="標楷體" w:hAnsi="標楷體" w:hint="eastAsia"/>
+          <w:lang w:eastAsia="zh-CN"/>
+        </w:rPr>
+        <w:t>页根据</w:t>
+      </w:r>
+      <w:proofErr w:type="gramEnd"/>
+      <w:r>
+        <w:rPr>
+          <w:rFonts w:ascii="標楷體" w:eastAsia="標楷體" w:hAnsi="標楷體" w:hint="eastAsia"/>
+          <w:lang w:eastAsia="zh-CN"/>
+        </w:rPr>
+        <w:t>当前星期调整营业时间</w:t>
       </w:r>
     </w:p>
     <w:p>
@@ -1913,7 +2151,23 @@
           <w:rFonts w:ascii="標楷體" w:eastAsia="標楷體" w:hAnsi="標楷體" w:hint="eastAsia"/>
           <w:lang w:eastAsia="zh-CN"/>
         </w:rPr>
-        <w:t xml:space="preserve"> 地图页图标选取后，手机端保持配角呈现选取店家</w:t>
+        <w:t xml:space="preserve"> 地图页图标选取后，手机</w:t>
+      </w:r>
+      <w:proofErr w:type="gramStart"/>
+      <w:r>
+        <w:rPr>
+          <w:rFonts w:ascii="標楷體" w:eastAsia="標楷體" w:hAnsi="標楷體" w:hint="eastAsia"/>
+          <w:lang w:eastAsia="zh-CN"/>
+        </w:rPr>
+        <w:t>端保持</w:t>
+      </w:r>
+      <w:proofErr w:type="gramEnd"/>
+      <w:r>
+        <w:rPr>
+          <w:rFonts w:ascii="標楷體" w:eastAsia="標楷體" w:hAnsi="標楷體" w:hint="eastAsia"/>
+          <w:lang w:eastAsia="zh-CN"/>
+        </w:rPr>
+        <w:t>配角呈现选取店家</w:t>
       </w:r>
     </w:p>
     <w:p>
@@ -2134,7 +2388,29 @@
         <w:rPr>
           <w:rFonts w:ascii="標楷體" w:eastAsia="標楷體" w:hAnsi="標楷體" w:hint="eastAsia"/>
         </w:rPr>
-        <w:t>、跳轉shopDetail邏輯沒寫</w:t>
+        <w:t>、</w:t>
+      </w:r>
+      <w:proofErr w:type="gramStart"/>
+      <w:r>
+        <w:rPr>
+          <w:rFonts w:ascii="標楷體" w:eastAsia="標楷體" w:hAnsi="標楷體" w:hint="eastAsia"/>
+        </w:rPr>
+        <w:t>跳轉</w:t>
+      </w:r>
+      <w:proofErr w:type="spellStart"/>
+      <w:proofErr w:type="gramEnd"/>
+      <w:r>
+        <w:rPr>
+          <w:rFonts w:ascii="標楷體" w:eastAsia="標楷體" w:hAnsi="標楷體" w:hint="eastAsia"/>
+        </w:rPr>
+        <w:t>shopDetail</w:t>
+      </w:r>
+      <w:proofErr w:type="spellEnd"/>
+      <w:r>
+        <w:rPr>
+          <w:rFonts w:ascii="標楷體" w:eastAsia="標楷體" w:hAnsi="標楷體" w:hint="eastAsia"/>
+        </w:rPr>
+        <w:t>邏輯沒寫</w:t>
       </w:r>
     </w:p>
     <w:p>
@@ -2180,8 +2456,16 @@
         <w:rPr>
           <w:rFonts w:ascii="標楷體" w:eastAsia="標楷體" w:hAnsi="標楷體" w:hint="eastAsia"/>
         </w:rPr>
-        <w:t>ug 店家詳情頁跳轉</w:t>
-      </w:r>
+        <w:t>ug 店家詳情</w:t>
+      </w:r>
+      <w:proofErr w:type="gramStart"/>
+      <w:r>
+        <w:rPr>
+          <w:rFonts w:ascii="標楷體" w:eastAsia="標楷體" w:hAnsi="標楷體" w:hint="eastAsia"/>
+        </w:rPr>
+        <w:t>頁跳轉</w:t>
+      </w:r>
+      <w:proofErr w:type="gramEnd"/>
       <w:r>
         <w:rPr>
           <w:rFonts w:ascii="標楷體" w:eastAsia="標楷體" w:hAnsi="標楷體" w:hint="eastAsia"/>
@@ -2383,7 +2667,21 @@
         <w:rPr>
           <w:rFonts w:ascii="標楷體" w:eastAsia="標楷體" w:hAnsi="標楷體" w:hint="eastAsia"/>
         </w:rPr>
-        <w:t xml:space="preserve"> shopDetail中的菜單布局調整</w:t>
+        <w:t xml:space="preserve"> </w:t>
+      </w:r>
+      <w:proofErr w:type="spellStart"/>
+      <w:r>
+        <w:rPr>
+          <w:rFonts w:ascii="標楷體" w:eastAsia="標楷體" w:hAnsi="標楷體" w:hint="eastAsia"/>
+        </w:rPr>
+        <w:t>shopDetail</w:t>
+      </w:r>
+      <w:proofErr w:type="spellEnd"/>
+      <w:r>
+        <w:rPr>
+          <w:rFonts w:ascii="標楷體" w:eastAsia="標楷體" w:hAnsi="標楷體" w:hint="eastAsia"/>
+        </w:rPr>
+        <w:t>中的菜單布局調整</w:t>
       </w:r>
     </w:p>
     <w:p>
@@ -2417,8 +2715,24 @@
         <w:rPr>
           <w:rFonts w:ascii="標楷體" w:eastAsia="標楷體" w:hAnsi="標楷體" w:hint="eastAsia"/>
         </w:rPr>
-        <w:t xml:space="preserve"> 跳轉shopDetail</w:t>
-      </w:r>
+        <w:t xml:space="preserve"> </w:t>
+      </w:r>
+      <w:proofErr w:type="gramStart"/>
+      <w:r>
+        <w:rPr>
+          <w:rFonts w:ascii="標楷體" w:eastAsia="標楷體" w:hAnsi="標楷體" w:hint="eastAsia"/>
+        </w:rPr>
+        <w:t>跳轉</w:t>
+      </w:r>
+      <w:proofErr w:type="spellStart"/>
+      <w:proofErr w:type="gramEnd"/>
+      <w:r>
+        <w:rPr>
+          <w:rFonts w:ascii="標楷體" w:eastAsia="標楷體" w:hAnsi="標楷體" w:hint="eastAsia"/>
+        </w:rPr>
+        <w:t>shopDetail</w:t>
+      </w:r>
+      <w:proofErr w:type="spellEnd"/>
       <w:r>
         <w:rPr>
           <w:rFonts w:ascii="標楷體" w:eastAsia="標楷體" w:hAnsi="標楷體" w:hint="eastAsia"/>
@@ -2512,7 +2826,6 @@
       <w:pPr>
         <w:rPr>
           <w:rFonts w:ascii="標楷體" w:eastAsia="標楷體" w:hAnsi="標楷體"/>
-          <w:lang w:eastAsia="zh-CN"/>
         </w:rPr>
       </w:pPr>
       <w:sdt>
@@ -2551,13 +2864,695 @@
         <w:jc w:val="left"/>
         <w:rPr>
           <w:rFonts w:ascii="標楷體" w:eastAsia="標楷體" w:hAnsi="標楷體"/>
-          <w:lang w:eastAsia="zh-CN"/>
-        </w:rPr>
-      </w:pPr>
-      <w:r>
-        <w:rPr>
-          <w:rFonts w:ascii="標楷體" w:eastAsia="標楷體" w:hAnsi="標楷體"/>
-          <w:lang w:eastAsia="zh-CN"/>
+          <w:sz w:val="20"/>
+          <w:szCs w:val="20"/>
+        </w:rPr>
+      </w:pPr>
+      <w:r>
+        <w:rPr>
+          <w:rFonts w:ascii="Segoe UI Emoji" w:eastAsia="標楷體" w:hAnsi="Segoe UI Emoji" w:cs="Segoe UI Emoji"/>
+          <w:sz w:val="20"/>
+          <w:szCs w:val="20"/>
+        </w:rPr>
+        <w:t>🚨</w:t>
+      </w:r>
+      <w:r>
+        <w:rPr>
+          <w:rFonts w:ascii="標楷體" w:eastAsia="標楷體" w:hAnsi="標楷體"/>
+          <w:sz w:val="20"/>
+          <w:szCs w:val="20"/>
+        </w:rPr>
+        <w:t xml:space="preserve"> 優先級二：潛在的效能與 API 呼叫浪費</w:t>
+      </w:r>
+    </w:p>
+    <w:p>
+      <w:pPr>
+        <w:jc w:val="left"/>
+        <w:rPr>
+          <w:rFonts w:ascii="標楷體" w:eastAsia="標楷體" w:hAnsi="標楷體" w:hint="eastAsia"/>
+          <w:sz w:val="20"/>
+          <w:szCs w:val="20"/>
+        </w:rPr>
+      </w:pPr>
+      <w:r>
+        <w:rPr>
+          <w:rFonts w:ascii="標楷體" w:eastAsia="標楷體" w:hAnsi="標楷體" w:hint="eastAsia"/>
+          <w:sz w:val="20"/>
+          <w:szCs w:val="20"/>
+        </w:rPr>
+        <w:t>這會導致使用者一進網頁，瀏覽器可能發出重複的定位請求，甚至拖慢網頁載入速度。</w:t>
+      </w:r>
+    </w:p>
+    <w:p>
+      <w:pPr>
+        <w:jc w:val="left"/>
+        <w:rPr>
+          <w:rFonts w:ascii="標楷體" w:eastAsia="標楷體" w:hAnsi="標楷體" w:hint="eastAsia"/>
+          <w:sz w:val="20"/>
+          <w:szCs w:val="20"/>
+        </w:rPr>
+      </w:pPr>
+      <w:r>
+        <w:rPr>
+          <w:rFonts w:ascii="Segoe UI Emoji" w:eastAsia="標楷體" w:hAnsi="Segoe UI Emoji" w:cs="Segoe UI Emoji"/>
+          <w:sz w:val="20"/>
+          <w:szCs w:val="20"/>
+        </w:rPr>
+        <w:t>🔍</w:t>
+      </w:r>
+      <w:r>
+        <w:rPr>
+          <w:rFonts w:ascii="標楷體" w:eastAsia="標楷體" w:hAnsi="標楷體"/>
+          <w:sz w:val="20"/>
+          <w:szCs w:val="20"/>
+        </w:rPr>
+        <w:t xml:space="preserve"> 發現問題：在 </w:t>
+      </w:r>
+      <w:proofErr w:type="spellStart"/>
+      <w:r>
+        <w:rPr>
+          <w:rFonts w:ascii="標楷體" w:eastAsia="標楷體" w:hAnsi="標楷體"/>
+          <w:sz w:val="20"/>
+          <w:szCs w:val="20"/>
+        </w:rPr>
+        <w:t>App.jsx</w:t>
+      </w:r>
+      <w:proofErr w:type="spellEnd"/>
+      <w:r>
+        <w:rPr>
+          <w:rFonts w:ascii="標楷體" w:eastAsia="標楷體" w:hAnsi="標楷體"/>
+          <w:sz w:val="20"/>
+          <w:szCs w:val="20"/>
+        </w:rPr>
+        <w:t xml:space="preserve"> 中，您已經宣告了 const { location } = </w:t>
+      </w:r>
+      <w:proofErr w:type="spellStart"/>
+      <w:r>
+        <w:rPr>
+          <w:rFonts w:ascii="標楷體" w:eastAsia="標楷體" w:hAnsi="標楷體"/>
+          <w:sz w:val="20"/>
+          <w:szCs w:val="20"/>
+        </w:rPr>
+        <w:t>useUserLocation</w:t>
+      </w:r>
+      <w:proofErr w:type="spellEnd"/>
+      <w:r>
+        <w:rPr>
+          <w:rFonts w:ascii="標楷體" w:eastAsia="標楷體" w:hAnsi="標楷體"/>
+          <w:sz w:val="20"/>
+          <w:szCs w:val="20"/>
+        </w:rPr>
+        <w:t xml:space="preserve">(); 作為全域定位。但是，在 </w:t>
+      </w:r>
+      <w:proofErr w:type="spellStart"/>
+      <w:r>
+        <w:rPr>
+          <w:rFonts w:ascii="標楷體" w:eastAsia="標楷體" w:hAnsi="標楷體"/>
+          <w:sz w:val="20"/>
+          <w:szCs w:val="20"/>
+        </w:rPr>
+        <w:t>Header.jsx</w:t>
+      </w:r>
+      <w:proofErr w:type="spellEnd"/>
+      <w:r>
+        <w:rPr>
+          <w:rFonts w:ascii="標楷體" w:eastAsia="標楷體" w:hAnsi="標楷體"/>
+          <w:sz w:val="20"/>
+          <w:szCs w:val="20"/>
+        </w:rPr>
+        <w:t xml:space="preserve"> 中，您又再次呼叫了 const { location, error, </w:t>
+      </w:r>
+      <w:proofErr w:type="spellStart"/>
+      <w:r>
+        <w:rPr>
+          <w:rFonts w:ascii="標楷體" w:eastAsia="標楷體" w:hAnsi="標楷體"/>
+          <w:sz w:val="20"/>
+          <w:szCs w:val="20"/>
+        </w:rPr>
+        <w:t>isLoading</w:t>
+      </w:r>
+      <w:proofErr w:type="spellEnd"/>
+      <w:r>
+        <w:rPr>
+          <w:rFonts w:ascii="標楷體" w:eastAsia="標楷體" w:hAnsi="標楷體"/>
+          <w:sz w:val="20"/>
+          <w:szCs w:val="20"/>
+        </w:rPr>
+        <w:t xml:space="preserve"> } = </w:t>
+      </w:r>
+      <w:proofErr w:type="spellStart"/>
+      <w:r>
+        <w:rPr>
+          <w:rFonts w:ascii="標楷體" w:eastAsia="標楷體" w:hAnsi="標楷體"/>
+          <w:sz w:val="20"/>
+          <w:szCs w:val="20"/>
+        </w:rPr>
+        <w:t>useUserLocation</w:t>
+      </w:r>
+      <w:proofErr w:type="spellEnd"/>
+      <w:r>
+        <w:rPr>
+          <w:rFonts w:ascii="標楷體" w:eastAsia="標楷體" w:hAnsi="標楷體"/>
+          <w:sz w:val="20"/>
+          <w:szCs w:val="20"/>
+        </w:rPr>
+        <w:t>();。這意味著同一</w:t>
+      </w:r>
+      <w:proofErr w:type="gramStart"/>
+      <w:r>
+        <w:rPr>
+          <w:rFonts w:ascii="標楷體" w:eastAsia="標楷體" w:hAnsi="標楷體"/>
+          <w:sz w:val="20"/>
+          <w:szCs w:val="20"/>
+        </w:rPr>
+        <w:t>個</w:t>
+      </w:r>
+      <w:proofErr w:type="gramEnd"/>
+      <w:r>
+        <w:rPr>
+          <w:rFonts w:ascii="標楷體" w:eastAsia="標楷體" w:hAnsi="標楷體"/>
+          <w:sz w:val="20"/>
+          <w:szCs w:val="20"/>
+        </w:rPr>
+        <w:t>時間點，系統會觸發兩次硬體定位 API。</w:t>
+      </w:r>
+    </w:p>
+    <w:p>
+      <w:pPr>
+        <w:jc w:val="left"/>
+        <w:rPr>
+          <w:rFonts w:ascii="標楷體" w:eastAsia="標楷體" w:hAnsi="標楷體" w:hint="eastAsia"/>
+          <w:sz w:val="20"/>
+          <w:szCs w:val="20"/>
+        </w:rPr>
+      </w:pPr>
+      <w:r>
+        <w:rPr>
+          <w:rFonts w:ascii="Segoe UI Emoji" w:eastAsia="標楷體" w:hAnsi="Segoe UI Emoji" w:cs="Segoe UI Emoji"/>
+          <w:sz w:val="20"/>
+          <w:szCs w:val="20"/>
+        </w:rPr>
+        <w:t>🛠️</w:t>
+      </w:r>
+      <w:r>
+        <w:rPr>
+          <w:rFonts w:ascii="標楷體" w:eastAsia="標楷體" w:hAnsi="標楷體"/>
+          <w:sz w:val="20"/>
+          <w:szCs w:val="20"/>
+        </w:rPr>
+        <w:t xml:space="preserve"> 重構方案：</w:t>
+      </w:r>
+    </w:p>
+    <w:p>
+      <w:pPr>
+        <w:jc w:val="left"/>
+        <w:rPr>
+          <w:rFonts w:ascii="標楷體" w:eastAsia="標楷體" w:hAnsi="標楷體" w:hint="eastAsia"/>
+          <w:sz w:val="20"/>
+          <w:szCs w:val="20"/>
+        </w:rPr>
+      </w:pPr>
+      <w:r>
+        <w:rPr>
+          <w:rFonts w:ascii="標楷體" w:eastAsia="標楷體" w:hAnsi="標楷體" w:hint="eastAsia"/>
+          <w:sz w:val="20"/>
+          <w:szCs w:val="20"/>
+        </w:rPr>
+        <w:t>移除</w:t>
+      </w:r>
+      <w:r>
+        <w:rPr>
+          <w:rFonts w:ascii="標楷體" w:eastAsia="標楷體" w:hAnsi="標楷體"/>
+          <w:sz w:val="20"/>
+          <w:szCs w:val="20"/>
+        </w:rPr>
+        <w:t xml:space="preserve"> </w:t>
+      </w:r>
+      <w:proofErr w:type="spellStart"/>
+      <w:r>
+        <w:rPr>
+          <w:rFonts w:ascii="標楷體" w:eastAsia="標楷體" w:hAnsi="標楷體"/>
+          <w:sz w:val="20"/>
+          <w:szCs w:val="20"/>
+        </w:rPr>
+        <w:t>Header.jsx</w:t>
+      </w:r>
+      <w:proofErr w:type="spellEnd"/>
+      <w:r>
+        <w:rPr>
+          <w:rFonts w:ascii="標楷體" w:eastAsia="標楷體" w:hAnsi="標楷體"/>
+          <w:sz w:val="20"/>
+          <w:szCs w:val="20"/>
+        </w:rPr>
+        <w:t xml:space="preserve"> 內對 </w:t>
+      </w:r>
+      <w:proofErr w:type="spellStart"/>
+      <w:r>
+        <w:rPr>
+          <w:rFonts w:ascii="標楷體" w:eastAsia="標楷體" w:hAnsi="標楷體"/>
+          <w:sz w:val="20"/>
+          <w:szCs w:val="20"/>
+        </w:rPr>
+        <w:t>useUserLocation</w:t>
+      </w:r>
+      <w:proofErr w:type="spellEnd"/>
+      <w:r>
+        <w:rPr>
+          <w:rFonts w:ascii="標楷體" w:eastAsia="標楷體" w:hAnsi="標楷體"/>
+          <w:sz w:val="20"/>
+          <w:szCs w:val="20"/>
+        </w:rPr>
+        <w:t xml:space="preserve"> 的呼叫與引入。</w:t>
+      </w:r>
+    </w:p>
+    <w:p>
+      <w:pPr>
+        <w:jc w:val="left"/>
+        <w:rPr>
+          <w:rFonts w:ascii="標楷體" w:eastAsia="標楷體" w:hAnsi="標楷體"/>
+          <w:sz w:val="20"/>
+          <w:szCs w:val="20"/>
+        </w:rPr>
+      </w:pPr>
+      <w:r>
+        <w:rPr>
+          <w:rFonts w:ascii="標楷體" w:eastAsia="標楷體" w:hAnsi="標楷體" w:hint="eastAsia"/>
+          <w:sz w:val="20"/>
+          <w:szCs w:val="20"/>
+        </w:rPr>
+        <w:t>如果</w:t>
+      </w:r>
+      <w:r>
+        <w:rPr>
+          <w:rFonts w:ascii="標楷體" w:eastAsia="標楷體" w:hAnsi="標楷體"/>
+          <w:sz w:val="20"/>
+          <w:szCs w:val="20"/>
+        </w:rPr>
+        <w:t xml:space="preserve"> Header 未來真的需要顯示定位資訊，應該由最上層的 </w:t>
+      </w:r>
+      <w:proofErr w:type="spellStart"/>
+      <w:r>
+        <w:rPr>
+          <w:rFonts w:ascii="標楷體" w:eastAsia="標楷體" w:hAnsi="標楷體"/>
+          <w:sz w:val="20"/>
+          <w:szCs w:val="20"/>
+        </w:rPr>
+        <w:t>App.jsx</w:t>
+      </w:r>
+      <w:proofErr w:type="spellEnd"/>
+      <w:r>
+        <w:rPr>
+          <w:rFonts w:ascii="標楷體" w:eastAsia="標楷體" w:hAnsi="標楷體"/>
+          <w:sz w:val="20"/>
+          <w:szCs w:val="20"/>
+        </w:rPr>
+        <w:t xml:space="preserve"> 透過 Props (</w:t>
+      </w:r>
+      <w:proofErr w:type="spellStart"/>
+      <w:r>
+        <w:rPr>
+          <w:rFonts w:ascii="標楷體" w:eastAsia="標楷體" w:hAnsi="標楷體"/>
+          <w:sz w:val="20"/>
+          <w:szCs w:val="20"/>
+        </w:rPr>
+        <w:t>userLocation</w:t>
+      </w:r>
+      <w:proofErr w:type="spellEnd"/>
+      <w:r>
+        <w:rPr>
+          <w:rFonts w:ascii="標楷體" w:eastAsia="標楷體" w:hAnsi="標楷體"/>
+          <w:sz w:val="20"/>
+          <w:szCs w:val="20"/>
+        </w:rPr>
+        <w:t>={location}) 將算好的座標直接傳遞給 Header，確保全站只依賴單一的定位資料源。</w:t>
+      </w:r>
+    </w:p>
+    <w:p>
+      <w:pPr>
+        <w:jc w:val="left"/>
+        <w:rPr>
+          <w:rFonts w:ascii="標楷體" w:eastAsia="標楷體" w:hAnsi="標楷體" w:hint="eastAsia"/>
+          <w:sz w:val="20"/>
+          <w:szCs w:val="20"/>
+        </w:rPr>
+      </w:pPr>
+    </w:p>
+    <w:p>
+      <w:pPr>
+        <w:jc w:val="left"/>
+        <w:rPr>
+          <w:rFonts w:ascii="標楷體" w:eastAsia="標楷體" w:hAnsi="標楷體"/>
+          <w:sz w:val="20"/>
+          <w:szCs w:val="20"/>
+        </w:rPr>
+      </w:pPr>
+      <w:r>
+        <w:rPr>
+          <w:rFonts w:ascii="Segoe UI Emoji" w:eastAsia="標楷體" w:hAnsi="Segoe UI Emoji" w:cs="Segoe UI Emoji"/>
+          <w:sz w:val="20"/>
+          <w:szCs w:val="20"/>
+        </w:rPr>
+        <w:t>💡</w:t>
+      </w:r>
+      <w:r>
+        <w:rPr>
+          <w:rFonts w:ascii="標楷體" w:eastAsia="標楷體" w:hAnsi="標楷體"/>
+          <w:sz w:val="20"/>
+          <w:szCs w:val="20"/>
+        </w:rPr>
+        <w:t xml:space="preserve"> 優先級四：嚴重的 Props Drilling (屬性鑽孔)</w:t>
+      </w:r>
+    </w:p>
+    <w:p>
+      <w:pPr>
+        <w:jc w:val="left"/>
+        <w:rPr>
+          <w:rFonts w:ascii="標楷體" w:eastAsia="標楷體" w:hAnsi="標楷體" w:hint="eastAsia"/>
+          <w:sz w:val="20"/>
+          <w:szCs w:val="20"/>
+        </w:rPr>
+      </w:pPr>
+      <w:r>
+        <w:rPr>
+          <w:rFonts w:ascii="標楷體" w:eastAsia="標楷體" w:hAnsi="標楷體" w:hint="eastAsia"/>
+          <w:sz w:val="20"/>
+          <w:szCs w:val="20"/>
+        </w:rPr>
+        <w:t>這屬於架構優化，能讓您的程式碼變得非常乾淨，不再需要把變數像接力賽一樣傳來傳去。</w:t>
+      </w:r>
+    </w:p>
+    <w:p>
+      <w:pPr>
+        <w:jc w:val="left"/>
+        <w:rPr>
+          <w:rFonts w:ascii="標楷體" w:eastAsia="標楷體" w:hAnsi="標楷體" w:hint="eastAsia"/>
+          <w:sz w:val="20"/>
+          <w:szCs w:val="20"/>
+        </w:rPr>
+      </w:pPr>
+      <w:r>
+        <w:rPr>
+          <w:rFonts w:ascii="Segoe UI Emoji" w:eastAsia="標楷體" w:hAnsi="Segoe UI Emoji" w:cs="Segoe UI Emoji"/>
+          <w:sz w:val="20"/>
+          <w:szCs w:val="20"/>
+        </w:rPr>
+        <w:t>🔍</w:t>
+      </w:r>
+      <w:r>
+        <w:rPr>
+          <w:rFonts w:ascii="標楷體" w:eastAsia="標楷體" w:hAnsi="標楷體"/>
+          <w:sz w:val="20"/>
+          <w:szCs w:val="20"/>
+        </w:rPr>
+        <w:t xml:space="preserve"> 發現問題：在 </w:t>
+      </w:r>
+      <w:proofErr w:type="spellStart"/>
+      <w:r>
+        <w:rPr>
+          <w:rFonts w:ascii="標楷體" w:eastAsia="標楷體" w:hAnsi="標楷體"/>
+          <w:sz w:val="20"/>
+          <w:szCs w:val="20"/>
+        </w:rPr>
+        <w:t>App.jsx</w:t>
+      </w:r>
+      <w:proofErr w:type="spellEnd"/>
+      <w:r>
+        <w:rPr>
+          <w:rFonts w:ascii="標楷體" w:eastAsia="標楷體" w:hAnsi="標楷體"/>
+          <w:sz w:val="20"/>
+          <w:szCs w:val="20"/>
+        </w:rPr>
+        <w:t xml:space="preserve"> 中，</w:t>
+      </w:r>
+      <w:proofErr w:type="spellStart"/>
+      <w:r>
+        <w:rPr>
+          <w:rFonts w:ascii="標楷體" w:eastAsia="標楷體" w:hAnsi="標楷體"/>
+          <w:sz w:val="20"/>
+          <w:szCs w:val="20"/>
+        </w:rPr>
+        <w:t>activeTab</w:t>
+      </w:r>
+      <w:proofErr w:type="spellEnd"/>
+      <w:r>
+        <w:rPr>
+          <w:rFonts w:ascii="標楷體" w:eastAsia="標楷體" w:hAnsi="標楷體"/>
+          <w:sz w:val="20"/>
+          <w:szCs w:val="20"/>
+        </w:rPr>
+        <w:t>、</w:t>
+      </w:r>
+      <w:proofErr w:type="spellStart"/>
+      <w:r>
+        <w:rPr>
+          <w:rFonts w:ascii="標楷體" w:eastAsia="標楷體" w:hAnsi="標楷體"/>
+          <w:sz w:val="20"/>
+          <w:szCs w:val="20"/>
+        </w:rPr>
+        <w:t>setActiveTab</w:t>
+      </w:r>
+      <w:proofErr w:type="spellEnd"/>
+      <w:r>
+        <w:rPr>
+          <w:rFonts w:ascii="標楷體" w:eastAsia="標楷體" w:hAnsi="標楷體"/>
+          <w:sz w:val="20"/>
+          <w:szCs w:val="20"/>
+        </w:rPr>
+        <w:t>、</w:t>
+      </w:r>
+      <w:proofErr w:type="spellStart"/>
+      <w:r>
+        <w:rPr>
+          <w:rFonts w:ascii="標楷體" w:eastAsia="標楷體" w:hAnsi="標楷體"/>
+          <w:sz w:val="20"/>
+          <w:szCs w:val="20"/>
+        </w:rPr>
+        <w:t>selectedShop</w:t>
+      </w:r>
+      <w:proofErr w:type="spellEnd"/>
+      <w:r>
+        <w:rPr>
+          <w:rFonts w:ascii="標楷體" w:eastAsia="標楷體" w:hAnsi="標楷體"/>
+          <w:sz w:val="20"/>
+          <w:szCs w:val="20"/>
+        </w:rPr>
+        <w:t>、</w:t>
+      </w:r>
+      <w:proofErr w:type="spellStart"/>
+      <w:r>
+        <w:rPr>
+          <w:rFonts w:ascii="標楷體" w:eastAsia="標楷體" w:hAnsi="標楷體"/>
+          <w:sz w:val="20"/>
+          <w:szCs w:val="20"/>
+        </w:rPr>
+        <w:t>setSelectedShop</w:t>
+      </w:r>
+      <w:proofErr w:type="spellEnd"/>
+      <w:r>
+        <w:rPr>
+          <w:rFonts w:ascii="標楷體" w:eastAsia="標楷體" w:hAnsi="標楷體"/>
+          <w:sz w:val="20"/>
+          <w:szCs w:val="20"/>
+        </w:rPr>
+        <w:t xml:space="preserve"> 這些狀態被當作參數，一層</w:t>
+      </w:r>
+      <w:proofErr w:type="gramStart"/>
+      <w:r>
+        <w:rPr>
+          <w:rFonts w:ascii="標楷體" w:eastAsia="標楷體" w:hAnsi="標楷體"/>
+          <w:sz w:val="20"/>
+          <w:szCs w:val="20"/>
+        </w:rPr>
+        <w:t>一層</w:t>
+      </w:r>
+      <w:proofErr w:type="gramEnd"/>
+      <w:r>
+        <w:rPr>
+          <w:rFonts w:ascii="標楷體" w:eastAsia="標楷體" w:hAnsi="標楷體"/>
+          <w:sz w:val="20"/>
+          <w:szCs w:val="20"/>
+        </w:rPr>
+        <w:t>硬塞給了每一個視圖元件。一旦組件層級變深（例如未來的子元件也需要切換分頁），程式碼會變得極度冗長且難以閱讀。</w:t>
+      </w:r>
+    </w:p>
+    <w:p>
+      <w:pPr>
+        <w:jc w:val="left"/>
+        <w:rPr>
+          <w:rFonts w:ascii="標楷體" w:eastAsia="標楷體" w:hAnsi="標楷體" w:hint="eastAsia"/>
+          <w:sz w:val="20"/>
+          <w:szCs w:val="20"/>
+        </w:rPr>
+      </w:pPr>
+      <w:r>
+        <w:rPr>
+          <w:rFonts w:ascii="Segoe UI Emoji" w:eastAsia="標楷體" w:hAnsi="Segoe UI Emoji" w:cs="Segoe UI Emoji"/>
+          <w:sz w:val="20"/>
+          <w:szCs w:val="20"/>
+        </w:rPr>
+        <w:t>🛠️</w:t>
+      </w:r>
+      <w:r>
+        <w:rPr>
+          <w:rFonts w:ascii="標楷體" w:eastAsia="標楷體" w:hAnsi="標楷體"/>
+          <w:sz w:val="20"/>
+          <w:szCs w:val="20"/>
+        </w:rPr>
+        <w:t xml:space="preserve"> 重構方案：</w:t>
+      </w:r>
+    </w:p>
+    <w:p>
+      <w:pPr>
+        <w:jc w:val="left"/>
+        <w:rPr>
+          <w:rFonts w:ascii="標楷體" w:eastAsia="標楷體" w:hAnsi="標楷體" w:hint="eastAsia"/>
+          <w:sz w:val="20"/>
+          <w:szCs w:val="20"/>
+        </w:rPr>
+      </w:pPr>
+      <w:r>
+        <w:rPr>
+          <w:rFonts w:ascii="標楷體" w:eastAsia="標楷體" w:hAnsi="標楷體" w:hint="eastAsia"/>
+          <w:sz w:val="20"/>
+          <w:szCs w:val="20"/>
+        </w:rPr>
+        <w:t>導入</w:t>
+      </w:r>
+      <w:r>
+        <w:rPr>
+          <w:rFonts w:ascii="標楷體" w:eastAsia="標楷體" w:hAnsi="標楷體"/>
+          <w:sz w:val="20"/>
+          <w:szCs w:val="20"/>
+        </w:rPr>
+        <w:t xml:space="preserve"> React Context API。建立一個 </w:t>
+      </w:r>
+      <w:proofErr w:type="spellStart"/>
+      <w:r>
+        <w:rPr>
+          <w:rFonts w:ascii="標楷體" w:eastAsia="標楷體" w:hAnsi="標楷體"/>
+          <w:sz w:val="20"/>
+          <w:szCs w:val="20"/>
+        </w:rPr>
+        <w:t>NavigationContext</w:t>
+      </w:r>
+      <w:proofErr w:type="spellEnd"/>
+      <w:r>
+        <w:rPr>
+          <w:rFonts w:ascii="標楷體" w:eastAsia="標楷體" w:hAnsi="標楷體"/>
+          <w:sz w:val="20"/>
+          <w:szCs w:val="20"/>
+        </w:rPr>
+        <w:t xml:space="preserve"> 或 </w:t>
+      </w:r>
+      <w:proofErr w:type="spellStart"/>
+      <w:r>
+        <w:rPr>
+          <w:rFonts w:ascii="標楷體" w:eastAsia="標楷體" w:hAnsi="標楷體"/>
+          <w:sz w:val="20"/>
+          <w:szCs w:val="20"/>
+        </w:rPr>
+        <w:t>GlobalStateContext</w:t>
+      </w:r>
+      <w:proofErr w:type="spellEnd"/>
+      <w:r>
+        <w:rPr>
+          <w:rFonts w:ascii="標楷體" w:eastAsia="標楷體" w:hAnsi="標楷體"/>
+          <w:sz w:val="20"/>
+          <w:szCs w:val="20"/>
+        </w:rPr>
+        <w:t>。</w:t>
+      </w:r>
+    </w:p>
+    <w:p>
+      <w:pPr>
+        <w:jc w:val="left"/>
+        <w:rPr>
+          <w:rFonts w:ascii="標楷體" w:eastAsia="標楷體" w:hAnsi="標楷體" w:hint="eastAsia"/>
+          <w:sz w:val="20"/>
+          <w:szCs w:val="20"/>
+        </w:rPr>
+      </w:pPr>
+      <w:r>
+        <w:rPr>
+          <w:rFonts w:ascii="標楷體" w:eastAsia="標楷體" w:hAnsi="標楷體" w:hint="eastAsia"/>
+          <w:sz w:val="20"/>
+          <w:szCs w:val="20"/>
+        </w:rPr>
+        <w:t>將導航狀態與選取狀態包裹在最外層，底下所有的元件只要透過</w:t>
+      </w:r>
+      <w:r>
+        <w:rPr>
+          <w:rFonts w:ascii="標楷體" w:eastAsia="標楷體" w:hAnsi="標楷體"/>
+          <w:sz w:val="20"/>
+          <w:szCs w:val="20"/>
+        </w:rPr>
+        <w:t xml:space="preserve"> </w:t>
+      </w:r>
+      <w:proofErr w:type="spellStart"/>
+      <w:r>
+        <w:rPr>
+          <w:rFonts w:ascii="標楷體" w:eastAsia="標楷體" w:hAnsi="標楷體"/>
+          <w:sz w:val="20"/>
+          <w:szCs w:val="20"/>
+        </w:rPr>
+        <w:t>useContext</w:t>
+      </w:r>
+      <w:proofErr w:type="spellEnd"/>
+      <w:r>
+        <w:rPr>
+          <w:rFonts w:ascii="標楷體" w:eastAsia="標楷體" w:hAnsi="標楷體"/>
+          <w:sz w:val="20"/>
+          <w:szCs w:val="20"/>
+        </w:rPr>
+        <w:t xml:space="preserve">() 就能直接取得需要的函式，徹底免除 </w:t>
+      </w:r>
+      <w:proofErr w:type="spellStart"/>
+      <w:r>
+        <w:rPr>
+          <w:rFonts w:ascii="標楷體" w:eastAsia="標楷體" w:hAnsi="標楷體"/>
+          <w:sz w:val="20"/>
+          <w:szCs w:val="20"/>
+        </w:rPr>
+        <w:t>App.jsx</w:t>
+      </w:r>
+      <w:proofErr w:type="spellEnd"/>
+      <w:r>
+        <w:rPr>
+          <w:rFonts w:ascii="標楷體" w:eastAsia="標楷體" w:hAnsi="標楷體"/>
+          <w:sz w:val="20"/>
+          <w:szCs w:val="20"/>
+        </w:rPr>
+        <w:t xml:space="preserve"> 裡落落長</w:t>
+      </w:r>
+      <w:proofErr w:type="gramStart"/>
+      <w:r>
+        <w:rPr>
+          <w:rFonts w:ascii="標楷體" w:eastAsia="標楷體" w:hAnsi="標楷體"/>
+          <w:sz w:val="20"/>
+          <w:szCs w:val="20"/>
+        </w:rPr>
+        <w:t>的傳參寫法</w:t>
+      </w:r>
+      <w:proofErr w:type="gramEnd"/>
+      <w:r>
+        <w:rPr>
+          <w:rFonts w:ascii="標楷體" w:eastAsia="標楷體" w:hAnsi="標楷體"/>
+          <w:sz w:val="20"/>
+          <w:szCs w:val="20"/>
+        </w:rPr>
+        <w:t>。</w:t>
+      </w:r>
+    </w:p>
+    <w:p>
+      <w:pPr>
+        <w:jc w:val="left"/>
+        <w:rPr>
+          <w:rFonts w:ascii="標楷體" w:eastAsia="標楷體" w:hAnsi="標楷體"/>
+        </w:rPr>
+      </w:pPr>
+      <w:r>
+        <w:rPr>
+          <w:rFonts w:ascii="標楷體" w:eastAsia="標楷體" w:hAnsi="標楷體"/>
         </w:rPr>
         <w:br w:type="page"/>
       </w:r>
@@ -2988,7 +3983,35 @@
         <w:rPr>
           <w:rFonts w:ascii="標楷體" w:eastAsia="標楷體" w:hAnsi="標楷體" w:hint="eastAsia"/>
         </w:rPr>
-        <w:t>5.不要五角圖，放食材、食材圖片和食材功用(如大量維生素B</w:t>
+        <w:t>5.不要五角圖，</w:t>
+      </w:r>
+      <w:proofErr w:type="gramStart"/>
+      <w:r>
+        <w:rPr>
+          <w:rFonts w:ascii="標楷體" w:eastAsia="標楷體" w:hAnsi="標楷體" w:hint="eastAsia"/>
+        </w:rPr>
+        <w:t>放食材</w:t>
+      </w:r>
+      <w:proofErr w:type="gramEnd"/>
+      <w:r>
+        <w:rPr>
+          <w:rFonts w:ascii="標楷體" w:eastAsia="標楷體" w:hAnsi="標楷體" w:hint="eastAsia"/>
+        </w:rPr>
+        <w:t>、食材圖片和</w:t>
+      </w:r>
+      <w:proofErr w:type="gramStart"/>
+      <w:r>
+        <w:rPr>
+          <w:rFonts w:ascii="標楷體" w:eastAsia="標楷體" w:hAnsi="標楷體" w:hint="eastAsia"/>
+        </w:rPr>
+        <w:t>食材</w:t>
+      </w:r>
+      <w:proofErr w:type="gramEnd"/>
+      <w:r>
+        <w:rPr>
+          <w:rFonts w:ascii="標楷體" w:eastAsia="標楷體" w:hAnsi="標楷體" w:hint="eastAsia"/>
+        </w:rPr>
+        <w:t>功用(如大量維生素B</w:t>
       </w:r>
       <w:r>
         <w:rPr>
@@ -3136,8 +4159,16 @@
         <w:rPr>
           <w:rFonts w:ascii="標楷體" w:eastAsia="標楷體" w:hAnsi="標楷體" w:hint="eastAsia"/>
         </w:rPr>
-        <w:t>8.跳轉邏輯</w:t>
-      </w:r>
+        <w:t>8.</w:t>
+      </w:r>
+      <w:proofErr w:type="gramStart"/>
+      <w:r>
+        <w:rPr>
+          <w:rFonts w:ascii="標楷體" w:eastAsia="標楷體" w:hAnsi="標楷體" w:hint="eastAsia"/>
+        </w:rPr>
+        <w:t>跳轉邏輯</w:t>
+      </w:r>
+      <w:proofErr w:type="gramEnd"/>
     </w:p>
     <w:p>
       <w:pPr>
@@ -3709,7 +4740,14 @@
         <w:rPr>
           <w:rFonts w:ascii="標楷體" w:eastAsia="標楷體" w:hAnsi="標楷體"/>
         </w:rPr>
-        <w:t xml:space="preserve"> 解決方式：參考市面上大量的餐廳</w:t>
+        <w:t xml:space="preserve"> 解決方式：參考市面上大量的</w:t>
+      </w:r>
+      <w:proofErr w:type="gramStart"/>
+      <w:r>
+        <w:rPr>
+          <w:rFonts w:ascii="標楷體" w:eastAsia="標楷體" w:hAnsi="標楷體"/>
+        </w:rPr>
+        <w:t>餐廳</w:t>
       </w:r>
       <w:r>
         <w:rPr>
@@ -3717,6 +4755,7 @@
         </w:rPr>
         <w:t>官網和</w:t>
       </w:r>
+      <w:proofErr w:type="gramEnd"/>
       <w:r>
         <w:rPr>
           <w:rFonts w:ascii="標楷體" w:eastAsia="標楷體" w:hAnsi="標楷體"/>
@@ -3781,7 +4820,21 @@
         <w:rPr>
           <w:rFonts w:ascii="標楷體" w:eastAsia="標楷體" w:hAnsi="標楷體"/>
         </w:rPr>
-        <w:t>輔助轉譯為 VSCode 程式碼時，常因預設的佈局邏輯死板（如絕對定位），導致實際網頁長相與設計稿不符。</w:t>
+        <w:t xml:space="preserve">輔助轉譯為 </w:t>
+      </w:r>
+      <w:proofErr w:type="spellStart"/>
+      <w:r>
+        <w:rPr>
+          <w:rFonts w:ascii="標楷體" w:eastAsia="標楷體" w:hAnsi="標楷體"/>
+        </w:rPr>
+        <w:t>VSCode</w:t>
+      </w:r>
+      <w:proofErr w:type="spellEnd"/>
+      <w:r>
+        <w:rPr>
+          <w:rFonts w:ascii="標楷體" w:eastAsia="標楷體" w:hAnsi="標楷體"/>
+        </w:rPr>
+        <w:t xml:space="preserve"> 程式碼時，常因預設的佈局邏輯死板（如絕對定位），導致實際網頁長相與設計稿不符。</w:t>
       </w:r>
     </w:p>
     <w:p>
@@ -3801,7 +4854,21 @@
         <w:rPr>
           <w:rFonts w:ascii="標楷體" w:eastAsia="標楷體" w:hAnsi="標楷體"/>
         </w:rPr>
-        <w:t xml:space="preserve"> 解決方式：改採 漸進式轉換程式碼。在轉譯過程中，人工給予更詳細的實際長相與功能說明指示，並手動微調 CSS Flexbox/Grid 排版，確保視覺完美還原。</w:t>
+        <w:t xml:space="preserve"> 解決方式：改</w:t>
+      </w:r>
+      <w:proofErr w:type="gramStart"/>
+      <w:r>
+        <w:rPr>
+          <w:rFonts w:ascii="標楷體" w:eastAsia="標楷體" w:hAnsi="標楷體"/>
+        </w:rPr>
+        <w:t>採</w:t>
+      </w:r>
+      <w:proofErr w:type="gramEnd"/>
+      <w:r>
+        <w:rPr>
+          <w:rFonts w:ascii="標楷體" w:eastAsia="標楷體" w:hAnsi="標楷體"/>
+        </w:rPr>
+        <w:t xml:space="preserve"> 漸進式轉換程式碼。在轉譯過程中，人工給予更詳細的實際長相與功能說明指示，並手動微調 CSS Flexbox/Grid 排版，確保視覺完美還原。</w:t>
       </w:r>
     </w:p>
     <w:p>
@@ -3849,7 +4916,35 @@
         <w:rPr>
           <w:rFonts w:ascii="標楷體" w:eastAsia="標楷體" w:hAnsi="標楷體"/>
         </w:rPr>
-        <w:t xml:space="preserve"> 遭遇問題：在 Figma 製作 Prototype 原型時，若同一個 Frame 綁定了過多、過雜的跳轉連線，彼此會產生邏輯衝突，無法達成想像中的互動效果。</w:t>
+        <w:t xml:space="preserve"> 遭遇問題：在 Figma 製作 Prototype 原型時，若同一</w:t>
+      </w:r>
+      <w:proofErr w:type="gramStart"/>
+      <w:r>
+        <w:rPr>
+          <w:rFonts w:ascii="標楷體" w:eastAsia="標楷體" w:hAnsi="標楷體"/>
+        </w:rPr>
+        <w:t>個</w:t>
+      </w:r>
+      <w:proofErr w:type="gramEnd"/>
+      <w:r>
+        <w:rPr>
+          <w:rFonts w:ascii="標楷體" w:eastAsia="標楷體" w:hAnsi="標楷體"/>
+        </w:rPr>
+        <w:t xml:space="preserve"> Frame 綁定了過多、過雜</w:t>
+      </w:r>
+      <w:proofErr w:type="gramStart"/>
+      <w:r>
+        <w:rPr>
+          <w:rFonts w:ascii="標楷體" w:eastAsia="標楷體" w:hAnsi="標楷體"/>
+        </w:rPr>
+        <w:t>的跳轉連線</w:t>
+      </w:r>
+      <w:proofErr w:type="gramEnd"/>
+      <w:r>
+        <w:rPr>
+          <w:rFonts w:ascii="標楷體" w:eastAsia="標楷體" w:hAnsi="標楷體"/>
+        </w:rPr>
+        <w:t>，彼此會產生邏輯衝突，無法達成想像中的互動效果。</w:t>
       </w:r>
     </w:p>
     <w:p>
@@ -3883,6 +4978,7 @@
         </w:rPr>
         <w:t>連線狀態，但實測後發現仍無法完全</w:t>
       </w:r>
+      <w:proofErr w:type="gramStart"/>
       <w:r>
         <w:rPr>
           <w:rFonts w:ascii="標楷體" w:eastAsia="標楷體" w:hAnsi="標楷體" w:hint="eastAsia"/>
@@ -3893,7 +4989,42 @@
         <w:rPr>
           <w:rFonts w:ascii="標楷體" w:eastAsia="標楷體" w:hAnsi="標楷體"/>
         </w:rPr>
-        <w:t>跳轉衝突的問題。最終決定改變設計策略，將 Figma 專注於 「視覺呈現與靜態排版」 的確認；而過於複雜的動態跳轉與邏輯交互，則直接交由後續的 React 程式碼來精準實現，確保專案邏輯的穩定性。</w:t>
+        <w:t>跳轉衝突</w:t>
+      </w:r>
+      <w:proofErr w:type="gramEnd"/>
+      <w:r>
+        <w:rPr>
+          <w:rFonts w:ascii="標楷體" w:eastAsia="標楷體" w:hAnsi="標楷體"/>
+        </w:rPr>
+        <w:t>的問題。最終決定改變設計策略，將 Figma 專注於 「視覺呈現與靜態排版」 的確認；而過於複雜的</w:t>
+      </w:r>
+      <w:proofErr w:type="gramStart"/>
+      <w:r>
+        <w:rPr>
+          <w:rFonts w:ascii="標楷體" w:eastAsia="標楷體" w:hAnsi="標楷體"/>
+        </w:rPr>
+        <w:t>動態跳轉與</w:t>
+      </w:r>
+      <w:proofErr w:type="gramEnd"/>
+      <w:r>
+        <w:rPr>
+          <w:rFonts w:ascii="標楷體" w:eastAsia="標楷體" w:hAnsi="標楷體"/>
+        </w:rPr>
+        <w:t>邏輯交互，則直接交由後續的 React 程式碼來精</w:t>
+      </w:r>
+      <w:proofErr w:type="gramStart"/>
+      <w:r>
+        <w:rPr>
+          <w:rFonts w:ascii="標楷體" w:eastAsia="標楷體" w:hAnsi="標楷體"/>
+        </w:rPr>
+        <w:t>準</w:t>
+      </w:r>
+      <w:proofErr w:type="gramEnd"/>
+      <w:r>
+        <w:rPr>
+          <w:rFonts w:ascii="標楷體" w:eastAsia="標楷體" w:hAnsi="標楷體"/>
+        </w:rPr>
+        <w:t>實現，確保專案邏輯的穩定性。</w:t>
       </w:r>
     </w:p>
     <w:p>
@@ -3941,7 +5072,21 @@
         <w:rPr>
           <w:rFonts w:ascii="標楷體" w:eastAsia="標楷體" w:hAnsi="標楷體"/>
         </w:rPr>
-        <w:t xml:space="preserve"> 遭遇問題：團隊在不同電腦上共同瀏覽成果時，常因缺乏環境或系統安全限制，導致終端機報錯，無法順利啟動專案（如 npm 指令失效）。</w:t>
+        <w:t xml:space="preserve"> 遭遇問題：團隊在不同電腦上共同瀏覽成果時，常因缺乏環境或系統安全限制，導致終端機報錯，無法順利啟動專案（如 </w:t>
+      </w:r>
+      <w:proofErr w:type="spellStart"/>
+      <w:r>
+        <w:rPr>
+          <w:rFonts w:ascii="標楷體" w:eastAsia="標楷體" w:hAnsi="標楷體"/>
+        </w:rPr>
+        <w:t>npm</w:t>
+      </w:r>
+      <w:proofErr w:type="spellEnd"/>
+      <w:r>
+        <w:rPr>
+          <w:rFonts w:ascii="標楷體" w:eastAsia="標楷體" w:hAnsi="標楷體"/>
+        </w:rPr>
+        <w:t xml:space="preserve"> 指令失效）。</w:t>
       </w:r>
     </w:p>
     <w:p>
@@ -3961,7 +5106,35 @@
         <w:rPr>
           <w:rFonts w:ascii="標楷體" w:eastAsia="標楷體" w:hAnsi="標楷體"/>
         </w:rPr>
-        <w:t xml:space="preserve"> 解決方式：建立標準化的 檔案管理與環境配置流程。統一要求安裝 Node.js，並明文指引組員需以 「系統管理員」 身分開啟 VSCode 終端機，解鎖本機執行權限。</w:t>
+        <w:t xml:space="preserve"> 解決方式：建立標準化的 檔案管理與環境配置流程。統一要求安裝 Node.js，並明文指引組員需以 「系統管理員」 身分開啟 </w:t>
+      </w:r>
+      <w:proofErr w:type="spellStart"/>
+      <w:r>
+        <w:rPr>
+          <w:rFonts w:ascii="標楷體" w:eastAsia="標楷體" w:hAnsi="標楷體"/>
+        </w:rPr>
+        <w:t>VSCode</w:t>
+      </w:r>
+      <w:proofErr w:type="spellEnd"/>
+      <w:r>
+        <w:rPr>
+          <w:rFonts w:ascii="標楷體" w:eastAsia="標楷體" w:hAnsi="標楷體"/>
+        </w:rPr>
+        <w:t xml:space="preserve"> 終端機，</w:t>
+      </w:r>
+      <w:proofErr w:type="gramStart"/>
+      <w:r>
+        <w:rPr>
+          <w:rFonts w:ascii="標楷體" w:eastAsia="標楷體" w:hAnsi="標楷體"/>
+        </w:rPr>
+        <w:t>解鎖本機</w:t>
+      </w:r>
+      <w:proofErr w:type="gramEnd"/>
+      <w:r>
+        <w:rPr>
+          <w:rFonts w:ascii="標楷體" w:eastAsia="標楷體" w:hAnsi="標楷體"/>
+        </w:rPr>
+        <w:t>執行權限。</w:t>
       </w:r>
     </w:p>
     <w:p>
@@ -4041,7 +5214,35 @@
         <w:rPr>
           <w:rFonts w:ascii="標楷體" w:eastAsia="標楷體" w:hAnsi="標楷體"/>
         </w:rPr>
-        <w:t xml:space="preserve"> 解決方式：導入 Vercel 自動化部署服務。將專案與 GitHub 連動，只要發布新版本就會自動生成線上預覽連結，讓組員無需操作程式碼即可隨時瀏覽最新成果。</w:t>
+        <w:t xml:space="preserve"> 解決方式：導入 </w:t>
+      </w:r>
+      <w:proofErr w:type="spellStart"/>
+      <w:r>
+        <w:rPr>
+          <w:rFonts w:ascii="標楷體" w:eastAsia="標楷體" w:hAnsi="標楷體"/>
+        </w:rPr>
+        <w:t>Vercel</w:t>
+      </w:r>
+      <w:proofErr w:type="spellEnd"/>
+      <w:r>
+        <w:rPr>
+          <w:rFonts w:ascii="標楷體" w:eastAsia="標楷體" w:hAnsi="標楷體"/>
+        </w:rPr>
+        <w:t xml:space="preserve"> 自動化部署服務。將專案與 GitHub 連動，只要發布新版本就會自動</w:t>
+      </w:r>
+      <w:proofErr w:type="gramStart"/>
+      <w:r>
+        <w:rPr>
+          <w:rFonts w:ascii="標楷體" w:eastAsia="標楷體" w:hAnsi="標楷體"/>
+        </w:rPr>
+        <w:t>生成線上預覽</w:t>
+      </w:r>
+      <w:proofErr w:type="gramEnd"/>
+      <w:r>
+        <w:rPr>
+          <w:rFonts w:ascii="標楷體" w:eastAsia="標楷體" w:hAnsi="標楷體"/>
+        </w:rPr>
+        <w:t>連結，讓組員無需操作程式碼即可隨時瀏覽最新成果。</w:t>
       </w:r>
     </w:p>
     <w:p>
@@ -4109,7 +5310,35 @@
         <w:rPr>
           <w:rFonts w:ascii="標楷體" w:eastAsia="標楷體" w:hAnsi="標楷體"/>
         </w:rPr>
-        <w:t xml:space="preserve"> 解決方式：導入 動態伸縮懸浮導航欄。設計智能伸縮收摺機制，在特定視圖下會自動縮小為精簡狀態以釋放最大視覺空間，滑鼠懸停時再行展開；同時搭配底層陰影區分，使導航列與網頁主體內容清晰隔離，既不遮擋畫面，又能保持操作的順手度。</w:t>
+        <w:t xml:space="preserve"> 解決方式：導入 動態伸縮懸浮導航欄。設計智能伸縮收</w:t>
+      </w:r>
+      <w:proofErr w:type="gramStart"/>
+      <w:r>
+        <w:rPr>
+          <w:rFonts w:ascii="標楷體" w:eastAsia="標楷體" w:hAnsi="標楷體"/>
+        </w:rPr>
+        <w:t>摺</w:t>
+      </w:r>
+      <w:proofErr w:type="gramEnd"/>
+      <w:r>
+        <w:rPr>
+          <w:rFonts w:ascii="標楷體" w:eastAsia="標楷體" w:hAnsi="標楷體"/>
+        </w:rPr>
+        <w:t>機制，在特定視圖下會自動縮小為精簡狀態以釋放最大視覺空間，</w:t>
+      </w:r>
+      <w:proofErr w:type="gramStart"/>
+      <w:r>
+        <w:rPr>
+          <w:rFonts w:ascii="標楷體" w:eastAsia="標楷體" w:hAnsi="標楷體"/>
+        </w:rPr>
+        <w:t>滑鼠懸停時</w:t>
+      </w:r>
+      <w:proofErr w:type="gramEnd"/>
+      <w:r>
+        <w:rPr>
+          <w:rFonts w:ascii="標楷體" w:eastAsia="標楷體" w:hAnsi="標楷體"/>
+        </w:rPr>
+        <w:t>再行展開；同時搭配底層陰影區分，使導航列與網頁主體內容清晰隔離，既不遮擋畫面，又能保持操作的順手度。</w:t>
       </w:r>
     </w:p>
     <w:p>
@@ -4157,7 +5386,21 @@
         <w:rPr>
           <w:rFonts w:ascii="標楷體" w:eastAsia="標楷體" w:hAnsi="標楷體"/>
         </w:rPr>
-        <w:t xml:space="preserve"> 遭遇問題：測試時發現，若連續快速點擊導航欄按鈕，頁面的轉場動畫會互相打架並反覆跳轉。</w:t>
+        <w:t xml:space="preserve"> 遭遇問題：測試時發現，若連續快速點擊導航欄按鈕，頁面的轉場動畫會互相打架並</w:t>
+      </w:r>
+      <w:proofErr w:type="gramStart"/>
+      <w:r>
+        <w:rPr>
+          <w:rFonts w:ascii="標楷體" w:eastAsia="標楷體" w:hAnsi="標楷體"/>
+        </w:rPr>
+        <w:t>反覆跳轉</w:t>
+      </w:r>
+      <w:proofErr w:type="gramEnd"/>
+      <w:r>
+        <w:rPr>
+          <w:rFonts w:ascii="標楷體" w:eastAsia="標楷體" w:hAnsi="標楷體"/>
+        </w:rPr>
+        <w:t>。</w:t>
       </w:r>
     </w:p>
     <w:p>
@@ -4177,7 +5420,49 @@
         <w:rPr>
           <w:rFonts w:ascii="標楷體" w:eastAsia="標楷體" w:hAnsi="標楷體"/>
         </w:rPr>
-        <w:t xml:space="preserve"> 解決方式：加入 轉場鎖定防呆機制。在頁面切換動畫執行期間，利用 useRef 暫時忽略後續的點擊指令，直到動畫跑完才放行。</w:t>
+        <w:t xml:space="preserve"> 解決方式：加入 轉場</w:t>
+      </w:r>
+      <w:proofErr w:type="gramStart"/>
+      <w:r>
+        <w:rPr>
+          <w:rFonts w:ascii="標楷體" w:eastAsia="標楷體" w:hAnsi="標楷體"/>
+        </w:rPr>
+        <w:t>鎖定防呆機制</w:t>
+      </w:r>
+      <w:proofErr w:type="gramEnd"/>
+      <w:r>
+        <w:rPr>
+          <w:rFonts w:ascii="標楷體" w:eastAsia="標楷體" w:hAnsi="標楷體"/>
+        </w:rPr>
+        <w:t>。在頁面切換動畫執行</w:t>
+      </w:r>
+      <w:proofErr w:type="gramStart"/>
+      <w:r>
+        <w:rPr>
+          <w:rFonts w:ascii="標楷體" w:eastAsia="標楷體" w:hAnsi="標楷體"/>
+        </w:rPr>
+        <w:t>期間，</w:t>
+      </w:r>
+      <w:proofErr w:type="gramEnd"/>
+      <w:r>
+        <w:rPr>
+          <w:rFonts w:ascii="標楷體" w:eastAsia="標楷體" w:hAnsi="標楷體"/>
+        </w:rPr>
+        <w:t xml:space="preserve">利用 </w:t>
+      </w:r>
+      <w:proofErr w:type="spellStart"/>
+      <w:r>
+        <w:rPr>
+          <w:rFonts w:ascii="標楷體" w:eastAsia="標楷體" w:hAnsi="標楷體"/>
+        </w:rPr>
+        <w:t>useRef</w:t>
+      </w:r>
+      <w:proofErr w:type="spellEnd"/>
+      <w:r>
+        <w:rPr>
+          <w:rFonts w:ascii="標楷體" w:eastAsia="標楷體" w:hAnsi="標楷體"/>
+        </w:rPr>
+        <w:t xml:space="preserve"> 暫時忽略後續的點擊指令，直到動畫跑完才放行。</w:t>
       </w:r>
     </w:p>
     <w:p>
@@ -4225,7 +5510,35 @@
         <w:rPr>
           <w:rFonts w:ascii="標楷體" w:eastAsia="標楷體" w:hAnsi="標楷體"/>
         </w:rPr>
-        <w:t xml:space="preserve"> 遭遇問題：從店家頁或餐點頁點擊進入詳情後，按返回會被強制踢回預設頁面，且因為組件掛載時強制回到頂部，導致使用者每次都要重頭向下滑。</w:t>
+        <w:t xml:space="preserve"> 遭遇問題：從店家頁或</w:t>
+      </w:r>
+      <w:proofErr w:type="gramStart"/>
+      <w:r>
+        <w:rPr>
+          <w:rFonts w:ascii="標楷體" w:eastAsia="標楷體" w:hAnsi="標楷體"/>
+        </w:rPr>
+        <w:t>餐點頁點擊</w:t>
+      </w:r>
+      <w:proofErr w:type="gramEnd"/>
+      <w:r>
+        <w:rPr>
+          <w:rFonts w:ascii="標楷體" w:eastAsia="標楷體" w:hAnsi="標楷體"/>
+        </w:rPr>
+        <w:t>進入詳情後，按返回會被強制踢回預設頁面，且因為組件掛載時強制回到</w:t>
+      </w:r>
+      <w:proofErr w:type="gramStart"/>
+      <w:r>
+        <w:rPr>
+          <w:rFonts w:ascii="標楷體" w:eastAsia="標楷體" w:hAnsi="標楷體"/>
+        </w:rPr>
+        <w:t>頂部，</w:t>
+      </w:r>
+      <w:proofErr w:type="gramEnd"/>
+      <w:r>
+        <w:rPr>
+          <w:rFonts w:ascii="標楷體" w:eastAsia="標楷體" w:hAnsi="標楷體"/>
+        </w:rPr>
+        <w:t>導致使用者每次都要重頭向下滑。</w:t>
       </w:r>
     </w:p>
     <w:p>
@@ -4245,7 +5558,63 @@
         <w:rPr>
           <w:rFonts w:ascii="標楷體" w:eastAsia="標楷體" w:hAnsi="標楷體"/>
         </w:rPr>
-        <w:t xml:space="preserve"> 解決方式：開發全域的 useNavigationMemory 導航記憶系統。攔截傳統的跳轉邏輯，強制將使用者的「來時頁面名稱」與「捲動高度」寫入 sessionStorage，實現「從哪裡來，就回哪裡去」的精準定位。</w:t>
+        <w:t xml:space="preserve"> 解決方式：開發全域的 </w:t>
+      </w:r>
+      <w:proofErr w:type="spellStart"/>
+      <w:r>
+        <w:rPr>
+          <w:rFonts w:ascii="標楷體" w:eastAsia="標楷體" w:hAnsi="標楷體"/>
+        </w:rPr>
+        <w:t>useNavigationMemory</w:t>
+      </w:r>
+      <w:proofErr w:type="spellEnd"/>
+      <w:r>
+        <w:rPr>
+          <w:rFonts w:ascii="標楷體" w:eastAsia="標楷體" w:hAnsi="標楷體"/>
+        </w:rPr>
+        <w:t xml:space="preserve"> 導航記憶系統。攔截傳統</w:t>
+      </w:r>
+      <w:proofErr w:type="gramStart"/>
+      <w:r>
+        <w:rPr>
+          <w:rFonts w:ascii="標楷體" w:eastAsia="標楷體" w:hAnsi="標楷體"/>
+        </w:rPr>
+        <w:t>的跳轉邏輯</w:t>
+      </w:r>
+      <w:proofErr w:type="gramEnd"/>
+      <w:r>
+        <w:rPr>
+          <w:rFonts w:ascii="標楷體" w:eastAsia="標楷體" w:hAnsi="標楷體"/>
+        </w:rPr>
+        <w:t>，強制將使用者的「</w:t>
+      </w:r>
+      <w:proofErr w:type="gramStart"/>
+      <w:r>
+        <w:rPr>
+          <w:rFonts w:ascii="標楷體" w:eastAsia="標楷體" w:hAnsi="標楷體"/>
+        </w:rPr>
+        <w:t>來時頁面</w:t>
+      </w:r>
+      <w:proofErr w:type="gramEnd"/>
+      <w:r>
+        <w:rPr>
+          <w:rFonts w:ascii="標楷體" w:eastAsia="標楷體" w:hAnsi="標楷體"/>
+        </w:rPr>
+        <w:t>名稱」與「捲動高度」寫入 sessionStorage，實現「從哪裡來，就回哪裡去」的精</w:t>
+      </w:r>
+      <w:proofErr w:type="gramStart"/>
+      <w:r>
+        <w:rPr>
+          <w:rFonts w:ascii="標楷體" w:eastAsia="標楷體" w:hAnsi="標楷體"/>
+        </w:rPr>
+        <w:t>準</w:t>
+      </w:r>
+      <w:proofErr w:type="gramEnd"/>
+      <w:r>
+        <w:rPr>
+          <w:rFonts w:ascii="標楷體" w:eastAsia="標楷體" w:hAnsi="標楷體"/>
+        </w:rPr>
+        <w:t>定位。</w:t>
       </w:r>
     </w:p>
     <w:p>
@@ -4293,7 +5662,21 @@
         <w:rPr>
           <w:rFonts w:ascii="標楷體" w:eastAsia="標楷體" w:hAnsi="標楷體"/>
         </w:rPr>
-        <w:t xml:space="preserve"> 遭遇問題：探照燈互動範圍過廣，導致背景頻繁切換；單一卡片在切換明暗狀態時區塊感太重，顯得突兀不流暢。</w:t>
+        <w:t xml:space="preserve"> 遭遇問題：探照燈互動範圍過廣，導致背景頻繁切換；單一卡片在切換明暗狀態</w:t>
+      </w:r>
+      <w:proofErr w:type="gramStart"/>
+      <w:r>
+        <w:rPr>
+          <w:rFonts w:ascii="標楷體" w:eastAsia="標楷體" w:hAnsi="標楷體"/>
+        </w:rPr>
+        <w:t>時區塊感太</w:t>
+      </w:r>
+      <w:proofErr w:type="gramEnd"/>
+      <w:r>
+        <w:rPr>
+          <w:rFonts w:ascii="標楷體" w:eastAsia="標楷體" w:hAnsi="標楷體"/>
+        </w:rPr>
+        <w:t>重，顯得突兀不流暢。</w:t>
       </w:r>
     </w:p>
     <w:p>
@@ -4313,7 +5696,49 @@
         <w:rPr>
           <w:rFonts w:ascii="標楷體" w:eastAsia="標楷體" w:hAnsi="標楷體"/>
         </w:rPr>
-        <w:t xml:space="preserve"> 解決方式：將背景切換的觸發範圍極限縮減至店家 Logo 上，並在互動介面導入「雙圖層設計」與 CSS 遮罩技術。底層放置預設的暗色灰階卡片，上層疊加完全一致的高光卡片，透過動態追蹤滑鼠座標來渲染 radial-gradient 遮罩範圍，讓手電筒光源能平滑且無縫地透出上層亮光，徹底消除實體邊界的生硬感。</w:t>
+        <w:t xml:space="preserve"> 解決方式：將背景切換的觸發範圍極限縮減至店家 Logo 上，並在互動介面導入「</w:t>
+      </w:r>
+      <w:proofErr w:type="gramStart"/>
+      <w:r>
+        <w:rPr>
+          <w:rFonts w:ascii="標楷體" w:eastAsia="標楷體" w:hAnsi="標楷體"/>
+        </w:rPr>
+        <w:t>雙圖層</w:t>
+      </w:r>
+      <w:proofErr w:type="gramEnd"/>
+      <w:r>
+        <w:rPr>
+          <w:rFonts w:ascii="標楷體" w:eastAsia="標楷體" w:hAnsi="標楷體"/>
+        </w:rPr>
+        <w:t>設計」與 CSS 遮罩技術。底層放置預設的暗色灰階卡片，</w:t>
+      </w:r>
+      <w:proofErr w:type="gramStart"/>
+      <w:r>
+        <w:rPr>
+          <w:rFonts w:ascii="標楷體" w:eastAsia="標楷體" w:hAnsi="標楷體"/>
+        </w:rPr>
+        <w:t>上層疊加</w:t>
+      </w:r>
+      <w:proofErr w:type="gramEnd"/>
+      <w:r>
+        <w:rPr>
+          <w:rFonts w:ascii="標楷體" w:eastAsia="標楷體" w:hAnsi="標楷體"/>
+        </w:rPr>
+        <w:t>完全一致的高光卡片，透過動態追蹤滑鼠座標來渲染 radial-gradient 遮罩範圍，讓手電筒光源能平滑且</w:t>
+      </w:r>
+      <w:proofErr w:type="gramStart"/>
+      <w:r>
+        <w:rPr>
+          <w:rFonts w:ascii="標楷體" w:eastAsia="標楷體" w:hAnsi="標楷體"/>
+        </w:rPr>
+        <w:t>無縫地透</w:t>
+      </w:r>
+      <w:proofErr w:type="gramEnd"/>
+      <w:r>
+        <w:rPr>
+          <w:rFonts w:ascii="標楷體" w:eastAsia="標楷體" w:hAnsi="標楷體"/>
+        </w:rPr>
+        <w:t>出上層亮光，徹底消除實體邊界的生硬感。</w:t>
       </w:r>
     </w:p>
     <w:p>
@@ -4381,7 +5806,35 @@
         <w:rPr>
           <w:rFonts w:ascii="標楷體" w:eastAsia="標楷體" w:hAnsi="標楷體"/>
         </w:rPr>
-        <w:t xml:space="preserve"> 解決方式：重構燈箱檢視邏輯，加入 直覺式的游標拖曳機制，統一介面互動視覺，也能 享受直覺</w:t>
+        <w:t xml:space="preserve"> 解決方式：</w:t>
+      </w:r>
+      <w:proofErr w:type="gramStart"/>
+      <w:r>
+        <w:rPr>
+          <w:rFonts w:ascii="標楷體" w:eastAsia="標楷體" w:hAnsi="標楷體"/>
+        </w:rPr>
+        <w:t>重構燈箱</w:t>
+      </w:r>
+      <w:proofErr w:type="gramEnd"/>
+      <w:r>
+        <w:rPr>
+          <w:rFonts w:ascii="標楷體" w:eastAsia="標楷體" w:hAnsi="標楷體"/>
+        </w:rPr>
+        <w:t xml:space="preserve">檢視邏輯，加入 </w:t>
+      </w:r>
+      <w:proofErr w:type="gramStart"/>
+      <w:r>
+        <w:rPr>
+          <w:rFonts w:ascii="標楷體" w:eastAsia="標楷體" w:hAnsi="標楷體"/>
+        </w:rPr>
+        <w:t>直覺式的游標</w:t>
+      </w:r>
+      <w:proofErr w:type="gramEnd"/>
+      <w:r>
+        <w:rPr>
+          <w:rFonts w:ascii="標楷體" w:eastAsia="標楷體" w:hAnsi="標楷體"/>
+        </w:rPr>
+        <w:t>拖曳機制，統一介面互動視覺，也能 享受直覺</w:t>
       </w:r>
       <w:r>
         <w:rPr>
@@ -4510,7 +5963,21 @@
         <w:rPr>
           <w:rFonts w:ascii="標楷體" w:eastAsia="標楷體" w:hAnsi="標楷體"/>
         </w:rPr>
-        <w:t xml:space="preserve"> 遭遇問題：原先的營業時間資料結構未能對齊，導致程式邏輯在判斷「今日星期幾」時抓不到資料而失效。</w:t>
+        <w:t xml:space="preserve"> 遭遇問題：原先的營業時間資料結構未能對齊，導致程式邏輯在判斷「今日星期幾」</w:t>
+      </w:r>
+      <w:proofErr w:type="gramStart"/>
+      <w:r>
+        <w:rPr>
+          <w:rFonts w:ascii="標楷體" w:eastAsia="標楷體" w:hAnsi="標楷體"/>
+        </w:rPr>
+        <w:t>時抓不到</w:t>
+      </w:r>
+      <w:proofErr w:type="gramEnd"/>
+      <w:r>
+        <w:rPr>
+          <w:rFonts w:ascii="標楷體" w:eastAsia="標楷體" w:hAnsi="標楷體"/>
+        </w:rPr>
+        <w:t>資料而失效。</w:t>
       </w:r>
     </w:p>
     <w:p>
@@ -4530,7 +5997,35 @@
         <w:rPr>
           <w:rFonts w:ascii="標楷體" w:eastAsia="標楷體" w:hAnsi="標楷體"/>
         </w:rPr>
-        <w:t xml:space="preserve"> 解決方式：修正資料判斷演算法，利用 Array.find() 精準抓取當日陣列，並加入時間換算機制，讓系統能正確比對當下時間是否落在店家的營業區間內。</w:t>
+        <w:t xml:space="preserve"> 解決方式：修正資料判斷演算法，利用 </w:t>
+      </w:r>
+      <w:proofErr w:type="spellStart"/>
+      <w:r>
+        <w:rPr>
+          <w:rFonts w:ascii="標楷體" w:eastAsia="標楷體" w:hAnsi="標楷體"/>
+        </w:rPr>
+        <w:t>Array.find</w:t>
+      </w:r>
+      <w:proofErr w:type="spellEnd"/>
+      <w:r>
+        <w:rPr>
+          <w:rFonts w:ascii="標楷體" w:eastAsia="標楷體" w:hAnsi="標楷體"/>
+        </w:rPr>
+        <w:t>() 精</w:t>
+      </w:r>
+      <w:proofErr w:type="gramStart"/>
+      <w:r>
+        <w:rPr>
+          <w:rFonts w:ascii="標楷體" w:eastAsia="標楷體" w:hAnsi="標楷體"/>
+        </w:rPr>
+        <w:t>準</w:t>
+      </w:r>
+      <w:proofErr w:type="gramEnd"/>
+      <w:r>
+        <w:rPr>
+          <w:rFonts w:ascii="標楷體" w:eastAsia="標楷體" w:hAnsi="標楷體"/>
+        </w:rPr>
+        <w:t>抓取當日陣列，並加入時間換算機制，讓系統能正確比對當下時間是否落在店家的營業區間內。</w:t>
       </w:r>
     </w:p>
     <w:p>
@@ -4598,7 +6093,21 @@
         <w:rPr>
           <w:rFonts w:ascii="標楷體" w:eastAsia="標楷體" w:hAnsi="標楷體"/>
         </w:rPr>
-        <w:t xml:space="preserve"> 解決方式：重構視覺邏輯，將全站狀態徽章統一。不論狀態為何皆加上圓角外框，並將公休樣式加深為 灰色底框與深黑字體，大幅提升畫面的一致性與資訊辨識度。</w:t>
+        <w:t xml:space="preserve"> 解決方式：重構視覺邏輯，將全站狀態徽章統一。不論狀態為何皆加上圓角外框，並將公休樣式加深為 </w:t>
+      </w:r>
+      <w:proofErr w:type="gramStart"/>
+      <w:r>
+        <w:rPr>
+          <w:rFonts w:ascii="標楷體" w:eastAsia="標楷體" w:hAnsi="標楷體"/>
+        </w:rPr>
+        <w:t>灰色底框與</w:t>
+      </w:r>
+      <w:proofErr w:type="gramEnd"/>
+      <w:r>
+        <w:rPr>
+          <w:rFonts w:ascii="標楷體" w:eastAsia="標楷體" w:hAnsi="標楷體"/>
+        </w:rPr>
+        <w:t>深黑字體，大幅提升畫面的一致性與資訊辨識度。</w:t>
       </w:r>
     </w:p>
     <w:p>
@@ -4666,7 +6175,21 @@
         <w:rPr>
           <w:rFonts w:ascii="標楷體" w:eastAsia="標楷體" w:hAnsi="標楷體"/>
         </w:rPr>
-        <w:t xml:space="preserve"> 解決方式：全面捨棄下拉選單，改用 橫向平鋪膠囊按鈕。不僅解決了圖示顯示問題，一鍵式的操作也完美規避了 3D 空間遮擋的 Bug。</w:t>
+        <w:t xml:space="preserve"> 解決方式：全面捨棄下拉選單，改用 橫向平鋪膠囊按鈕。不僅解決了圖示顯示問題，</w:t>
+      </w:r>
+      <w:proofErr w:type="gramStart"/>
+      <w:r>
+        <w:rPr>
+          <w:rFonts w:ascii="標楷體" w:eastAsia="標楷體" w:hAnsi="標楷體"/>
+        </w:rPr>
+        <w:t>一鍵式的操作</w:t>
+      </w:r>
+      <w:proofErr w:type="gramEnd"/>
+      <w:r>
+        <w:rPr>
+          <w:rFonts w:ascii="標楷體" w:eastAsia="標楷體" w:hAnsi="標楷體"/>
+        </w:rPr>
+        <w:t>也完美規避了 3D 空間遮擋的 Bug。</w:t>
       </w:r>
     </w:p>
     <w:p>
@@ -4802,14 +6325,42 @@
         <w:rPr>
           <w:rFonts w:ascii="標楷體" w:eastAsia="標楷體" w:hAnsi="標楷體"/>
         </w:rPr>
-        <w:t xml:space="preserve"> 解決方式：將地圖端與手機端綁定至同一個 全局選取狀態。只要地圖一發</w:t>
+        <w:t xml:space="preserve"> 解決方式：將地圖端與手機端綁定至同一</w:t>
+      </w:r>
+      <w:proofErr w:type="gramStart"/>
+      <w:r>
+        <w:rPr>
+          <w:rFonts w:ascii="標楷體" w:eastAsia="標楷體" w:hAnsi="標楷體"/>
+        </w:rPr>
+        <w:t>個</w:t>
+      </w:r>
+      <w:proofErr w:type="gramEnd"/>
+      <w:r>
+        <w:rPr>
+          <w:rFonts w:ascii="標楷體" w:eastAsia="標楷體" w:hAnsi="標楷體"/>
+        </w:rPr>
+        <w:t xml:space="preserve"> 全局選取狀態。只要地圖一發</w:t>
       </w:r>
       <w:r>
         <w:rPr>
           <w:rFonts w:ascii="標楷體" w:eastAsia="標楷體" w:hAnsi="標楷體"/>
         </w:rPr>
         <w:lastRenderedPageBreak/>
-        <w:t>送點擊事件，手機端便立即攔截資料並同步切換內容。</w:t>
+        <w:t>送點擊事件，</w:t>
+      </w:r>
+      <w:proofErr w:type="gramStart"/>
+      <w:r>
+        <w:rPr>
+          <w:rFonts w:ascii="標楷體" w:eastAsia="標楷體" w:hAnsi="標楷體"/>
+        </w:rPr>
+        <w:t>手機端便立即</w:t>
+      </w:r>
+      <w:proofErr w:type="gramEnd"/>
+      <w:r>
+        <w:rPr>
+          <w:rFonts w:ascii="標楷體" w:eastAsia="標楷體" w:hAnsi="標楷體"/>
+        </w:rPr>
+        <w:t>攔截資料並同步切換內容。</w:t>
       </w:r>
     </w:p>
     <w:p>
@@ -4858,7 +6409,21 @@
         <w:rPr>
           <w:rFonts w:ascii="標楷體" w:eastAsia="標楷體" w:hAnsi="標楷體"/>
         </w:rPr>
-        <w:t xml:space="preserve"> 遭遇問題：為了將交通時間從「靜態假資料」升級為「即時 API 運算」，在導入動態資料流時，因元件漏接參數（如 shopsData），導致出現 Cannot read properties of null 的白畫面當機錯誤。</w:t>
+        <w:t xml:space="preserve"> 遭遇問題：為了將交通時間從「靜態假資料」升級為「即時 API 運算」，在導入動態資料流時，因元件漏接參數（如 </w:t>
+      </w:r>
+      <w:proofErr w:type="spellStart"/>
+      <w:r>
+        <w:rPr>
+          <w:rFonts w:ascii="標楷體" w:eastAsia="標楷體" w:hAnsi="標楷體"/>
+        </w:rPr>
+        <w:t>shopsData</w:t>
+      </w:r>
+      <w:proofErr w:type="spellEnd"/>
+      <w:r>
+        <w:rPr>
+          <w:rFonts w:ascii="標楷體" w:eastAsia="標楷體" w:hAnsi="標楷體"/>
+        </w:rPr>
+        <w:t>），導致出現 Cannot read properties of null 的白畫面當機錯誤。</w:t>
       </w:r>
     </w:p>
     <w:p>
@@ -4878,7 +6443,35 @@
         <w:rPr>
           <w:rFonts w:ascii="標楷體" w:eastAsia="標楷體" w:hAnsi="標楷體"/>
         </w:rPr>
-        <w:t xml:space="preserve"> 解決方式：重新梳理 全域資料流架構。由最上層 App.jsx 集中呼叫 useDynamicDistances 獲取真實通勤時間，再將算好的資料</w:t>
+        <w:t xml:space="preserve"> 解決方式：重新梳理 全域資料流架構。由最上層 </w:t>
+      </w:r>
+      <w:proofErr w:type="spellStart"/>
+      <w:r>
+        <w:rPr>
+          <w:rFonts w:ascii="標楷體" w:eastAsia="標楷體" w:hAnsi="標楷體"/>
+        </w:rPr>
+        <w:t>App.jsx</w:t>
+      </w:r>
+      <w:proofErr w:type="spellEnd"/>
+      <w:r>
+        <w:rPr>
+          <w:rFonts w:ascii="標楷體" w:eastAsia="標楷體" w:hAnsi="標楷體"/>
+        </w:rPr>
+        <w:t xml:space="preserve"> 集中呼叫 </w:t>
+      </w:r>
+      <w:proofErr w:type="spellStart"/>
+      <w:r>
+        <w:rPr>
+          <w:rFonts w:ascii="標楷體" w:eastAsia="標楷體" w:hAnsi="標楷體"/>
+        </w:rPr>
+        <w:t>useDynamicDistances</w:t>
+      </w:r>
+      <w:proofErr w:type="spellEnd"/>
+      <w:r>
+        <w:rPr>
+          <w:rFonts w:ascii="標楷體" w:eastAsia="標楷體" w:hAnsi="標楷體"/>
+        </w:rPr>
+        <w:t xml:space="preserve"> 獲取真實通勤時間，再將算好的資料</w:t>
       </w:r>
       <w:r>
         <w:rPr>
@@ -4895,22 +6488,434 @@
     </w:p>
     <w:p>
       <w:pPr>
-        <w:rPr>
-          <w:rFonts w:eastAsia="DengXian"/>
-        </w:rPr>
-      </w:pPr>
-    </w:p>
-    <w:p>
-      <w:pPr>
-        <w:rPr>
-          <w:rFonts w:eastAsia="DengXian"/>
-        </w:rPr>
-      </w:pPr>
-    </w:p>
-    <w:p>
-      <w:pPr>
-        <w:rPr>
-          <w:rFonts w:eastAsia="DengXian"/>
+        <w:jc w:val="left"/>
+        <w:rPr>
+          <w:rFonts w:ascii="標楷體" w:eastAsia="標楷體" w:hAnsi="標楷體"/>
+        </w:rPr>
+      </w:pPr>
+    </w:p>
+    <w:p>
+      <w:pPr>
+        <w:jc w:val="left"/>
+        <w:rPr>
+          <w:rFonts w:ascii="標楷體" w:eastAsia="標楷體" w:hAnsi="標楷體"/>
+        </w:rPr>
+      </w:pPr>
+      <w:r>
+        <w:rPr>
+          <w:rFonts w:ascii="Segoe UI Emoji" w:eastAsia="標楷體" w:hAnsi="Segoe UI Emoji" w:cs="Segoe UI Emoji"/>
+        </w:rPr>
+        <w:t>💡</w:t>
+      </w:r>
+      <w:r>
+        <w:rPr>
+          <w:rFonts w:ascii="標楷體" w:eastAsia="標楷體" w:hAnsi="標楷體"/>
+        </w:rPr>
+        <w:t xml:space="preserve"> 狀態生命週期不同步（</w:t>
+      </w:r>
+      <w:r>
+        <w:rPr>
+          <w:rFonts w:ascii="標楷體" w:eastAsia="標楷體" w:hAnsi="標楷體" w:hint="eastAsia"/>
+        </w:rPr>
+        <w:t>使用者定位</w:t>
+      </w:r>
+      <w:r>
+        <w:rPr>
+          <w:rFonts w:ascii="標楷體" w:eastAsia="標楷體" w:hAnsi="標楷體"/>
+        </w:rPr>
+        <w:t>點跳轉</w:t>
+      </w:r>
+      <w:r>
+        <w:rPr>
+          <w:rFonts w:ascii="標楷體" w:eastAsia="標楷體" w:hAnsi="標楷體" w:hint="eastAsia"/>
+        </w:rPr>
+        <w:t>頁面</w:t>
+      </w:r>
+      <w:r>
+        <w:rPr>
+          <w:rFonts w:ascii="標楷體" w:eastAsia="標楷體" w:hAnsi="標楷體"/>
+        </w:rPr>
+        <w:t>後消失）</w:t>
+      </w:r>
+    </w:p>
+    <w:p>
+      <w:pPr>
+        <w:jc w:val="left"/>
+        <w:rPr>
+          <w:rFonts w:ascii="標楷體" w:eastAsia="標楷體" w:hAnsi="標楷體"/>
+        </w:rPr>
+      </w:pPr>
+      <w:r>
+        <w:rPr>
+          <w:rFonts w:ascii="Segoe UI Emoji" w:eastAsia="標楷體" w:hAnsi="Segoe UI Emoji" w:cs="Segoe UI Emoji"/>
+        </w:rPr>
+        <w:t>🔍</w:t>
+      </w:r>
+      <w:r>
+        <w:rPr>
+          <w:rFonts w:ascii="標楷體" w:eastAsia="標楷體" w:hAnsi="標楷體"/>
+        </w:rPr>
+        <w:t xml:space="preserve"> 遭遇問題：當使用者從地圖頁切換至其他視圖再返回時，由於全域的 </w:t>
+      </w:r>
+      <w:proofErr w:type="spellStart"/>
+      <w:r>
+        <w:rPr>
+          <w:rFonts w:ascii="標楷體" w:eastAsia="標楷體" w:hAnsi="標楷體"/>
+        </w:rPr>
+        <w:t>userLocation</w:t>
+      </w:r>
+      <w:proofErr w:type="spellEnd"/>
+      <w:r>
+        <w:rPr>
+          <w:rFonts w:ascii="標楷體" w:eastAsia="標楷體" w:hAnsi="標楷體"/>
+        </w:rPr>
+        <w:t xml:space="preserve"> 座標已經存在，React 會瞬間觸發繪圖指令。但此時底層的 Google Maps API 仍在非同步載入中，導致指令因「地圖未準備好」被拋棄；待地圖載入完成後，又因座標未變動而不再觸發更新，最終造成當前位置圖標與導航路線永久消失。</w:t>
+      </w:r>
+    </w:p>
+    <w:p>
+      <w:pPr>
+        <w:jc w:val="left"/>
+        <w:rPr>
+          <w:rFonts w:ascii="標楷體" w:eastAsia="標楷體" w:hAnsi="標楷體"/>
+        </w:rPr>
+      </w:pPr>
+      <w:r>
+        <w:rPr>
+          <w:rFonts w:ascii="Segoe UI Emoji" w:eastAsia="標楷體" w:hAnsi="Segoe UI Emoji" w:cs="Segoe UI Emoji"/>
+        </w:rPr>
+        <w:t>🛠️</w:t>
+      </w:r>
+      <w:r>
+        <w:rPr>
+          <w:rFonts w:ascii="標楷體" w:eastAsia="標楷體" w:hAnsi="標楷體"/>
+        </w:rPr>
+        <w:t xml:space="preserve"> 解決方式：地圖元件內導入 </w:t>
+      </w:r>
+      <w:proofErr w:type="spellStart"/>
+      <w:r>
+        <w:rPr>
+          <w:rFonts w:ascii="標楷體" w:eastAsia="標楷體" w:hAnsi="標楷體"/>
+        </w:rPr>
+        <w:t>isMapReady</w:t>
+      </w:r>
+      <w:proofErr w:type="spellEnd"/>
+      <w:r>
+        <w:rPr>
+          <w:rFonts w:ascii="標楷體" w:eastAsia="標楷體" w:hAnsi="標楷體"/>
+        </w:rPr>
+        <w:t xml:space="preserve"> 狀態通知機制。強制 React 的 </w:t>
+      </w:r>
+      <w:proofErr w:type="spellStart"/>
+      <w:r>
+        <w:rPr>
+          <w:rFonts w:ascii="標楷體" w:eastAsia="標楷體" w:hAnsi="標楷體"/>
+        </w:rPr>
+        <w:t>useEffect</w:t>
+      </w:r>
+      <w:proofErr w:type="spellEnd"/>
+      <w:r>
+        <w:rPr>
+          <w:rFonts w:ascii="標楷體" w:eastAsia="標楷體" w:hAnsi="標楷體"/>
+        </w:rPr>
+        <w:t xml:space="preserve"> 必須等待 Google Maps 與導航工具（</w:t>
+      </w:r>
+      <w:proofErr w:type="spellStart"/>
+      <w:r>
+        <w:rPr>
+          <w:rFonts w:ascii="標楷體" w:eastAsia="標楷體" w:hAnsi="標楷體"/>
+        </w:rPr>
+        <w:t>DirectionsService</w:t>
+      </w:r>
+      <w:proofErr w:type="spellEnd"/>
+      <w:r>
+        <w:rPr>
+          <w:rFonts w:ascii="標楷體" w:eastAsia="標楷體" w:hAnsi="標楷體"/>
+        </w:rPr>
+        <w:t>）完全實體化並將狀態設為 true 後，才將暫存的座標拿出來進行二次渲染，完美對齊 React 與外部 API 的生命週期。</w:t>
+      </w:r>
+    </w:p>
+    <w:p>
+      <w:pPr>
+        <w:jc w:val="left"/>
+        <w:rPr>
+          <w:rFonts w:ascii="標楷體" w:eastAsia="標楷體" w:hAnsi="標楷體"/>
+        </w:rPr>
+      </w:pPr>
+    </w:p>
+    <w:p>
+      <w:pPr>
+        <w:jc w:val="left"/>
+        <w:rPr>
+          <w:rFonts w:ascii="標楷體" w:eastAsia="標楷體" w:hAnsi="標楷體"/>
+        </w:rPr>
+      </w:pPr>
+      <w:r>
+        <w:rPr>
+          <w:rFonts w:ascii="Segoe UI Emoji" w:eastAsia="標楷體" w:hAnsi="Segoe UI Emoji" w:cs="Segoe UI Emoji"/>
+        </w:rPr>
+        <w:t>💡</w:t>
+      </w:r>
+      <w:r>
+        <w:rPr>
+          <w:rFonts w:ascii="標楷體" w:eastAsia="標楷體" w:hAnsi="標楷體"/>
+        </w:rPr>
+        <w:t xml:space="preserve"> 初始載入時間差衝突（錯誤的預設路線）</w:t>
+      </w:r>
+    </w:p>
+    <w:p>
+      <w:pPr>
+        <w:jc w:val="left"/>
+        <w:rPr>
+          <w:rFonts w:ascii="標楷體" w:eastAsia="標楷體" w:hAnsi="標楷體"/>
+        </w:rPr>
+      </w:pPr>
+      <w:r>
+        <w:rPr>
+          <w:rFonts w:ascii="Segoe UI Emoji" w:eastAsia="標楷體" w:hAnsi="Segoe UI Emoji" w:cs="Segoe UI Emoji"/>
+        </w:rPr>
+        <w:t>🔍</w:t>
+      </w:r>
+      <w:r>
+        <w:rPr>
+          <w:rFonts w:ascii="標楷體" w:eastAsia="標楷體" w:hAnsi="標楷體"/>
+        </w:rPr>
+        <w:t xml:space="preserve"> 遭遇問題：在應用程式首次啟動、GPS 仍在讀取中時，頂層派發的 </w:t>
+      </w:r>
+      <w:proofErr w:type="spellStart"/>
+      <w:r>
+        <w:rPr>
+          <w:rFonts w:ascii="標楷體" w:eastAsia="標楷體" w:hAnsi="標楷體"/>
+        </w:rPr>
+        <w:t>userLocation</w:t>
+      </w:r>
+      <w:proofErr w:type="spellEnd"/>
+      <w:r>
+        <w:rPr>
+          <w:rFonts w:ascii="標楷體" w:eastAsia="標楷體" w:hAnsi="標楷體"/>
+        </w:rPr>
+        <w:t xml:space="preserve"> 為 null。地圖元件的導航邏輯誤將 null 判定為「找不到定位」，提早觸發了內部</w:t>
+      </w:r>
+      <w:proofErr w:type="gramStart"/>
+      <w:r>
+        <w:rPr>
+          <w:rFonts w:ascii="標楷體" w:eastAsia="標楷體" w:hAnsi="標楷體"/>
+        </w:rPr>
+        <w:t>寫死的防呆</w:t>
+      </w:r>
+      <w:proofErr w:type="gramEnd"/>
+      <w:r>
+        <w:rPr>
+          <w:rFonts w:ascii="標楷體" w:eastAsia="標楷體" w:hAnsi="標楷體"/>
+        </w:rPr>
+        <w:t>機制，導致使用者一進網頁，地圖就瞬間從「預設的學校座標」畫出錯誤的導航路線。</w:t>
+      </w:r>
+    </w:p>
+    <w:p>
+      <w:pPr>
+        <w:jc w:val="left"/>
+        <w:rPr>
+          <w:rFonts w:ascii="標楷體" w:eastAsia="標楷體" w:hAnsi="標楷體"/>
+        </w:rPr>
+      </w:pPr>
+      <w:r>
+        <w:rPr>
+          <w:rFonts w:ascii="Segoe UI Emoji" w:eastAsia="標楷體" w:hAnsi="Segoe UI Emoji" w:cs="Segoe UI Emoji"/>
+        </w:rPr>
+        <w:t>🛠️</w:t>
+      </w:r>
+      <w:r>
+        <w:rPr>
+          <w:rFonts w:ascii="標楷體" w:eastAsia="標楷體" w:hAnsi="標楷體"/>
+        </w:rPr>
+        <w:t xml:space="preserve"> 解決方式：移除地圖元件層級的</w:t>
+      </w:r>
+      <w:proofErr w:type="gramStart"/>
+      <w:r>
+        <w:rPr>
+          <w:rFonts w:ascii="標楷體" w:eastAsia="標楷體" w:hAnsi="標楷體"/>
+        </w:rPr>
+        <w:t>提早防呆邏輯</w:t>
+      </w:r>
+      <w:proofErr w:type="gramEnd"/>
+      <w:r>
+        <w:rPr>
+          <w:rFonts w:ascii="標楷體" w:eastAsia="標楷體" w:hAnsi="標楷體"/>
+        </w:rPr>
+        <w:t>，加入 if (!</w:t>
+      </w:r>
+      <w:proofErr w:type="spellStart"/>
+      <w:r>
+        <w:rPr>
+          <w:rFonts w:ascii="標楷體" w:eastAsia="標楷體" w:hAnsi="標楷體"/>
+        </w:rPr>
+        <w:t>userLocation</w:t>
+      </w:r>
+      <w:proofErr w:type="spellEnd"/>
+      <w:r>
+        <w:rPr>
+          <w:rFonts w:ascii="標楷體" w:eastAsia="標楷體" w:hAnsi="標楷體"/>
+        </w:rPr>
+        <w:t>) return; 阻斷提早渲染。將預設值的決定權 100% 交還給統籌定位的 Hook (</w:t>
+      </w:r>
+      <w:proofErr w:type="spellStart"/>
+      <w:r>
+        <w:rPr>
+          <w:rFonts w:ascii="標楷體" w:eastAsia="標楷體" w:hAnsi="標楷體"/>
+        </w:rPr>
+        <w:t>useUserLocation</w:t>
+      </w:r>
+      <w:proofErr w:type="spellEnd"/>
+      <w:r>
+        <w:rPr>
+          <w:rFonts w:ascii="標楷體" w:eastAsia="標楷體" w:hAnsi="標楷體"/>
+        </w:rPr>
+        <w:t>)，讓地圖信任並乖乖等待真實狀態派發後，才執行第一次的路線繪製。</w:t>
+      </w:r>
+    </w:p>
+    <w:p>
+      <w:pPr>
+        <w:jc w:val="left"/>
+        <w:rPr>
+          <w:rFonts w:ascii="標楷體" w:eastAsia="標楷體" w:hAnsi="標楷體"/>
+        </w:rPr>
+      </w:pPr>
+    </w:p>
+    <w:p>
+      <w:pPr>
+        <w:jc w:val="left"/>
+        <w:rPr>
+          <w:rFonts w:ascii="標楷體" w:eastAsia="標楷體" w:hAnsi="標楷體"/>
+        </w:rPr>
+      </w:pPr>
+      <w:r>
+        <w:rPr>
+          <w:rFonts w:ascii="Segoe UI Emoji" w:eastAsia="標楷體" w:hAnsi="Segoe UI Emoji" w:cs="Segoe UI Emoji"/>
+        </w:rPr>
+        <w:t>💡</w:t>
+      </w:r>
+      <w:r>
+        <w:rPr>
+          <w:rFonts w:ascii="標楷體" w:eastAsia="標楷體" w:hAnsi="標楷體"/>
+        </w:rPr>
+        <w:t xml:space="preserve"> 防呆座標與真實定位混淆（圖標與學校重疊）</w:t>
+      </w:r>
+    </w:p>
+    <w:p>
+      <w:pPr>
+        <w:jc w:val="left"/>
+        <w:rPr>
+          <w:rFonts w:ascii="標楷體" w:eastAsia="標楷體" w:hAnsi="標楷體"/>
+        </w:rPr>
+      </w:pPr>
+      <w:r>
+        <w:rPr>
+          <w:rFonts w:ascii="Segoe UI Emoji" w:eastAsia="標楷體" w:hAnsi="Segoe UI Emoji" w:cs="Segoe UI Emoji"/>
+        </w:rPr>
+        <w:t>🔍</w:t>
+      </w:r>
+      <w:r>
+        <w:rPr>
+          <w:rFonts w:ascii="標楷體" w:eastAsia="標楷體" w:hAnsi="標楷體"/>
+        </w:rPr>
+        <w:t xml:space="preserve"> 遭遇問題：當使用者「拒絕 GPS 權限」時，系統會自動傳入學校座標</w:t>
+      </w:r>
+      <w:proofErr w:type="gramStart"/>
+      <w:r>
+        <w:rPr>
+          <w:rFonts w:ascii="標楷體" w:eastAsia="標楷體" w:hAnsi="標楷體"/>
+        </w:rPr>
+        <w:t>作為防呆</w:t>
+      </w:r>
+      <w:proofErr w:type="gramEnd"/>
+      <w:r>
+        <w:rPr>
+          <w:rFonts w:ascii="標楷體" w:eastAsia="標楷體" w:hAnsi="標楷體"/>
+        </w:rPr>
+        <w:t>，以確保「路線導航」能正常運算。但負責渲染「使用者定位圖標」的程式碼無法分辨該座標的真偽，盲目將代表使用者的定位點畫在學校正中央，造成「學校地標」與「</w:t>
+      </w:r>
+      <w:r>
+        <w:rPr>
+          <w:rFonts w:ascii="標楷體" w:eastAsia="標楷體" w:hAnsi="標楷體" w:hint="eastAsia"/>
+        </w:rPr>
+        <w:t>定位</w:t>
+      </w:r>
+      <w:r>
+        <w:rPr>
+          <w:rFonts w:ascii="標楷體" w:eastAsia="標楷體" w:hAnsi="標楷體"/>
+        </w:rPr>
+        <w:t>點」重疊的</w:t>
+      </w:r>
+      <w:r>
+        <w:rPr>
+          <w:rFonts w:ascii="標楷體" w:eastAsia="標楷體" w:hAnsi="標楷體" w:hint="eastAsia"/>
+        </w:rPr>
+        <w:t>錯</w:t>
+      </w:r>
+      <w:r>
+        <w:rPr>
+          <w:rFonts w:ascii="標楷體" w:eastAsia="標楷體" w:hAnsi="標楷體"/>
+        </w:rPr>
+        <w:t>誤。</w:t>
+      </w:r>
+    </w:p>
+    <w:p>
+      <w:pPr>
+        <w:rPr>
+          <w:rFonts w:ascii="標楷體" w:eastAsia="標楷體" w:hAnsi="標楷體"/>
+        </w:rPr>
+      </w:pPr>
+      <w:r>
+        <w:rPr>
+          <w:rFonts w:ascii="Segoe UI Emoji" w:eastAsia="標楷體" w:hAnsi="Segoe UI Emoji" w:cs="Segoe UI Emoji"/>
+        </w:rPr>
+        <w:t>🛠️</w:t>
+      </w:r>
+      <w:r>
+        <w:rPr>
+          <w:rFonts w:ascii="標楷體" w:eastAsia="標楷體" w:hAnsi="標楷體"/>
+        </w:rPr>
+        <w:t xml:space="preserve"> 解決方式：在圖標渲染層引入 嚴格的座標身分驗證 (</w:t>
+      </w:r>
+      <w:proofErr w:type="spellStart"/>
+      <w:r>
+        <w:rPr>
+          <w:rFonts w:ascii="標楷體" w:eastAsia="標楷體" w:hAnsi="標楷體"/>
+        </w:rPr>
+        <w:t>isFallbackLocation</w:t>
+      </w:r>
+      <w:proofErr w:type="spellEnd"/>
+      <w:r>
+        <w:rPr>
+          <w:rFonts w:ascii="標楷體" w:eastAsia="標楷體" w:hAnsi="標楷體"/>
+        </w:rPr>
+        <w:t>)。當偵測到傳入的經緯度與</w:t>
+      </w:r>
+      <w:proofErr w:type="gramStart"/>
+      <w:r>
+        <w:rPr>
+          <w:rFonts w:ascii="標楷體" w:eastAsia="標楷體" w:hAnsi="標楷體"/>
+        </w:rPr>
+        <w:t>學校防呆座標</w:t>
+      </w:r>
+      <w:proofErr w:type="gramEnd"/>
+      <w:r>
+        <w:rPr>
+          <w:rFonts w:ascii="標楷體" w:eastAsia="標楷體" w:hAnsi="標楷體"/>
+        </w:rPr>
+        <w:t>完全吻合時，主動隱藏定位點；同時保留</w:t>
+      </w:r>
+      <w:r>
+        <w:rPr>
+          <w:rFonts w:ascii="標楷體" w:eastAsia="標楷體" w:hAnsi="標楷體"/>
+        </w:rPr>
+        <w:lastRenderedPageBreak/>
+        <w:t>該座標給底層導航引擎計算路線。</w:t>
+      </w:r>
+    </w:p>
+    <w:p>
+      <w:pPr>
+        <w:rPr>
+          <w:rFonts w:ascii="標楷體" w:eastAsia="標楷體" w:hAnsi="標楷體"/>
         </w:rPr>
       </w:pPr>
     </w:p>

</xml_diff>